<commit_message>
feat(proposal-generator#2593): add logos + rebuild master.docx with real header/footer logos
- Copy logo_horizontal.png and logo_stacked.png to templates/verticals/nbais-wc/
- Rebuild master.docx with logos embedded in real Word header (section.header API)
- 9 sections, each with unique footer right-label
- Cover page section 1: blank first-page header/footer (no header on cover)
- Sections 2-9: real Word headers with horizontal logo + doc-tag + 2pt navy rule
- All docxtemplater merge tags verified present in template
</commit_message>
<xml_diff>
--- a/services/proposal-generator/templates/verticals/nbais-wc/master.docx
+++ b/services/proposal-generator/templates/verticals/nbais-wc/master.docx
@@ -6490,14 +6490,38 @@
       </w:tabs>
     </w:pPr>
     <w:r>
-      <w:rPr>
-        <w:rFonts w:ascii="Arial" w:hAnsi="Arial"/>
-        <w:b/>
-        <w:i w:val="0"/>
-        <w:color w:val="1F3864"/>
-        <w:sz w:val="24"/>
-      </w:rPr>
-      <w:t>NBAIS</w:t>
+      <w:drawing>
+        <wp:inline xmlns:a="http://schemas.openxmlformats.org/drawingml/2006/main" xmlns:pic="http://schemas.openxmlformats.org/drawingml/2006/picture">
+          <wp:extent cx="1173113" cy="355600"/>
+          <wp:docPr id="1" name="Picture 1"/>
+          <wp:cNvGraphicFramePr>
+            <a:graphicFrameLocks noChangeAspect="1"/>
+          </wp:cNvGraphicFramePr>
+          <a:graphic>
+            <a:graphicData uri="http://schemas.openxmlformats.org/drawingml/2006/picture">
+              <pic:pic>
+                <pic:nvPicPr>
+                  <pic:cNvPr id="0" name="logo_horizontal.png"/>
+                  <pic:cNvPicPr/>
+                </pic:nvPicPr>
+                <pic:blipFill>
+                  <a:blip r:embed="rId1"/>
+                  <a:stretch>
+                    <a:fillRect/>
+                  </a:stretch>
+                </pic:blipFill>
+                <pic:spPr>
+                  <a:xfrm>
+                    <a:off x="0" y="0"/>
+                    <a:ext cx="1173113" cy="355600"/>
+                  </a:xfrm>
+                  <a:prstGeom prst="rect"/>
+                </pic:spPr>
+              </pic:pic>
+            </a:graphicData>
+          </a:graphic>
+        </wp:inline>
+      </w:drawing>
     </w:r>
     <w:r>
       <w:tab/>

</xml_diff>

<commit_message>
fix(ADO#2604): NBAIS WC visual polish — page size, logo, EL fee, banner/padding/column fixes
</commit_message>
<xml_diff>
--- a/services/proposal-generator/templates/verticals/nbais-wc/master.docx
+++ b/services/proposal-generator/templates/verticals/nbais-wc/master.docx
@@ -17,7 +17,7 @@
         <w:tblW w:w="12240" w:type="dxa"/>
       </w:tblPr>
       <w:tblGrid>
-        <w:gridCol w:w="14738"/>
+        <w:gridCol w:w="9360"/>
       </w:tblGrid>
       <w:tr>
         <w:trPr>
@@ -25,7 +25,7 @@
         </w:trPr>
         <w:tc>
           <w:tcPr>
-            <w:tcW w:type="dxa" w:w="14738"/>
+            <w:tcW w:type="dxa" w:w="9360"/>
             <w:shd w:val="clear" w:color="auto" w:fill="1F3864"/>
             <w:tcMar>
               <w:top w:w="0" w:type="dxa"/>
@@ -71,7 +71,7 @@
           <w:color w:val="1F3864"/>
           <w:sz w:val="20"/>
         </w:rPr>
-        <w:t>{@stackedLogoBase64}</w:t>
+        <w:t>{%stackedLogoBase64}</w:t>
       </w:r>
     </w:p>
     <w:p>
@@ -85,9 +85,9 @@
           <w:b/>
           <w:i w:val="0"/>
           <w:color w:val="1F3864"/>
-          <w:sz w:val="60"/>
+          <w:sz w:val="52"/>
         </w:rPr>
-        <w:t>Insurance Proposal</w:t>
+        <w:t>Workers’ Compensation Insurance Proposal</w:t>
       </w:r>
     </w:p>
     <w:p>
@@ -119,17 +119,17 @@
           <w:insideH w:val="none" w:sz="0" w:space="0" w:color="auto"/>
           <w:insideV w:val="none" w:sz="0" w:space="0" w:color="auto"/>
         </w:tblBorders>
-        <w:tblW w:w="10656" w:type="dxa"/>
+        <w:tblW w:w="9360" w:type="dxa"/>
       </w:tblPr>
       <w:tblGrid>
-        <w:gridCol w:w="7369"/>
-        <w:gridCol w:w="7369"/>
+        <w:gridCol w:w="4680"/>
+        <w:gridCol w:w="4680"/>
       </w:tblGrid>
       <w:tr>
         <w:tc>
           <w:tcPr>
-            <w:tcW w:type="dxa" w:w="7369"/>
-            <w:tcW w:w="3729" w:type="dxa"/>
+            <w:tcW w:type="dxa" w:w="4680"/>
+            <w:tcW w:w="3276" w:type="dxa"/>
             <w:tcMar>
               <w:top w:w="40" w:type="dxa"/>
               <w:bottom w:w="40" w:type="dxa"/>
@@ -155,8 +155,8 @@
         </w:tc>
         <w:tc>
           <w:tcPr>
-            <w:tcW w:type="dxa" w:w="7369"/>
-            <w:tcW w:w="6927" w:type="dxa"/>
+            <w:tcW w:type="dxa" w:w="4680"/>
+            <w:tcW w:w="6084" w:type="dxa"/>
             <w:tcMar>
               <w:top w:w="40" w:type="dxa"/>
               <w:bottom w:w="40" w:type="dxa"/>
@@ -181,8 +181,8 @@
       <w:tr>
         <w:tc>
           <w:tcPr>
-            <w:tcW w:type="dxa" w:w="7369"/>
-            <w:tcW w:w="3729" w:type="dxa"/>
+            <w:tcW w:type="dxa" w:w="4680"/>
+            <w:tcW w:w="3276" w:type="dxa"/>
             <w:tcMar>
               <w:top w:w="40" w:type="dxa"/>
               <w:bottom w:w="40" w:type="dxa"/>
@@ -208,8 +208,8 @@
         </w:tc>
         <w:tc>
           <w:tcPr>
-            <w:tcW w:type="dxa" w:w="7369"/>
-            <w:tcW w:w="6927" w:type="dxa"/>
+            <w:tcW w:type="dxa" w:w="4680"/>
+            <w:tcW w:w="6084" w:type="dxa"/>
             <w:tcMar>
               <w:top w:w="40" w:type="dxa"/>
               <w:bottom w:w="40" w:type="dxa"/>
@@ -234,8 +234,8 @@
       <w:tr>
         <w:tc>
           <w:tcPr>
-            <w:tcW w:type="dxa" w:w="7369"/>
-            <w:tcW w:w="3729" w:type="dxa"/>
+            <w:tcW w:type="dxa" w:w="4680"/>
+            <w:tcW w:w="3276" w:type="dxa"/>
             <w:tcMar>
               <w:top w:w="40" w:type="dxa"/>
               <w:bottom w:w="40" w:type="dxa"/>
@@ -261,8 +261,8 @@
         </w:tc>
         <w:tc>
           <w:tcPr>
-            <w:tcW w:type="dxa" w:w="7369"/>
-            <w:tcW w:w="6927" w:type="dxa"/>
+            <w:tcW w:type="dxa" w:w="4680"/>
+            <w:tcW w:w="6084" w:type="dxa"/>
             <w:tcMar>
               <w:top w:w="40" w:type="dxa"/>
               <w:bottom w:w="40" w:type="dxa"/>
@@ -287,8 +287,8 @@
       <w:tr>
         <w:tc>
           <w:tcPr>
-            <w:tcW w:type="dxa" w:w="7369"/>
-            <w:tcW w:w="3729" w:type="dxa"/>
+            <w:tcW w:type="dxa" w:w="4680"/>
+            <w:tcW w:w="3276" w:type="dxa"/>
             <w:tcMar>
               <w:top w:w="40" w:type="dxa"/>
               <w:bottom w:w="40" w:type="dxa"/>
@@ -314,8 +314,8 @@
         </w:tc>
         <w:tc>
           <w:tcPr>
-            <w:tcW w:type="dxa" w:w="7369"/>
-            <w:tcW w:w="6927" w:type="dxa"/>
+            <w:tcW w:type="dxa" w:w="4680"/>
+            <w:tcW w:w="6084" w:type="dxa"/>
             <w:tcMar>
               <w:top w:w="40" w:type="dxa"/>
               <w:bottom w:w="40" w:type="dxa"/>
@@ -340,8 +340,8 @@
       <w:tr>
         <w:tc>
           <w:tcPr>
-            <w:tcW w:type="dxa" w:w="7369"/>
-            <w:tcW w:w="3729" w:type="dxa"/>
+            <w:tcW w:type="dxa" w:w="4680"/>
+            <w:tcW w:w="3276" w:type="dxa"/>
             <w:tcMar>
               <w:top w:w="40" w:type="dxa"/>
               <w:bottom w:w="40" w:type="dxa"/>
@@ -367,8 +367,8 @@
         </w:tc>
         <w:tc>
           <w:tcPr>
-            <w:tcW w:type="dxa" w:w="7369"/>
-            <w:tcW w:w="6927" w:type="dxa"/>
+            <w:tcW w:type="dxa" w:w="4680"/>
+            <w:tcW w:w="6084" w:type="dxa"/>
             <w:tcMar>
               <w:top w:w="40" w:type="dxa"/>
               <w:bottom w:w="40" w:type="dxa"/>
@@ -435,7 +435,7 @@
         <w:sectPr>
           <w:headerReference w:type="first" r:id="rId9"/>
           <w:footerReference w:type="first" r:id="rId10"/>
-          <w:pgSz w:w="17618" w:h="22800"/>
+          <w:pgSz w:w="12240" w:h="15840"/>
           <w:pgMar w:top="0" w:right="0" w:bottom="0" w:left="0" w:header="720" w:footer="720" w:gutter="0"/>
           <w:cols w:space="720"/>
           <w:titlePg/>
@@ -446,112 +446,7 @@
     <w:p>
       <w:pPr>
         <w:shd w:val="clear" w:color="auto" w:fill="1F3864"/>
-        <w:spacing w:before="0" w:after="0"/>
-        <w:ind w:left="280"/>
-      </w:pPr>
-      <w:r>
-        <w:rPr>
-          <w:rFonts w:ascii="Arial" w:hAnsi="Arial"/>
-          <w:b/>
-          <w:i w:val="0"/>
-          <w:color w:val="FFFFFF"/>
-          <w:sz w:val="28"/>
-        </w:rPr>
-        <w:t>Table of Contents</w:t>
-      </w:r>
-    </w:p>
-    <w:p>
-      <w:pPr>
-        <w:spacing w:before="160" w:after="0"/>
-      </w:pPr>
-    </w:p>
-    <w:p>
-      <w:pPr>
-        <w:spacing w:before="0" w:after="0"/>
-      </w:pPr>
-      <w:r>
-        <w:fldChar w:fldCharType="begin"/>
-        <w:instrText xml:space="preserve"> TOC \o "1-3" \h \z \u </w:instrText>
-        <w:fldChar w:fldCharType="separate"/>
-        <w:fldChar w:fldCharType="end"/>
-      </w:r>
-    </w:p>
-    <w:p>
-      <w:pPr>
-        <w:spacing w:before="0" w:after="0"/>
-      </w:pPr>
-    </w:p>
-    <w:p>
-      <w:pPr>
-        <w:spacing w:before="0" w:after="0"/>
-      </w:pPr>
-    </w:p>
-    <w:p>
-      <w:pPr>
-        <w:spacing w:before="0" w:after="0"/>
-      </w:pPr>
-    </w:p>
-    <w:p>
-      <w:pPr>
-        <w:spacing w:before="0" w:after="0"/>
-      </w:pPr>
-    </w:p>
-    <w:p>
-      <w:pPr>
-        <w:spacing w:before="0" w:after="0"/>
-      </w:pPr>
-    </w:p>
-    <w:p>
-      <w:pPr>
-        <w:spacing w:before="0" w:after="0"/>
-      </w:pPr>
-    </w:p>
-    <w:p>
-      <w:pPr>
-        <w:spacing w:before="0" w:after="0"/>
-      </w:pPr>
-    </w:p>
-    <w:p>
-      <w:pPr>
-        <w:spacing w:before="0" w:after="0"/>
-      </w:pPr>
-    </w:p>
-    <w:p>
-      <w:pPr>
-        <w:spacing w:before="0" w:after="0"/>
-      </w:pPr>
-    </w:p>
-    <w:p>
-      <w:pPr>
-        <w:spacing w:before="0" w:after="0"/>
-      </w:pPr>
-    </w:p>
-    <w:p>
-      <w:pPr>
-        <w:spacing w:before="0" w:after="0"/>
-      </w:pPr>
-    </w:p>
-    <w:p>
-      <w:pPr>
-        <w:spacing w:before="0" w:after="0"/>
-      </w:pPr>
-    </w:p>
-    <w:p>
-      <w:pPr>
-        <w:sectPr>
-          <w:headerReference w:type="default" r:id="rId11"/>
-          <w:footerReference w:type="default" r:id="rId12"/>
-          <w:pgSz w:w="17618" w:h="22800"/>
-          <w:pgMar w:top="720" w:right="792" w:bottom="720" w:left="792" w:header="432" w:footer="432" w:gutter="0"/>
-          <w:cols w:space="720"/>
-          <w:docGrid w:linePitch="360"/>
-        </w:sectPr>
-      </w:pPr>
-    </w:p>
-    <w:p>
-      <w:pPr>
-        <w:shd w:val="clear" w:color="auto" w:fill="1F3864"/>
-        <w:spacing w:before="0" w:after="0"/>
+        <w:spacing w:before="160" w:after="160"/>
         <w:ind w:left="280"/>
       </w:pPr>
       <w:r>
@@ -1025,9 +920,10 @@
     <w:p>
       <w:pPr>
         <w:sectPr>
-          <w:footerReference w:type="default" r:id="rId13"/>
-          <w:pgSz w:w="17618" w:h="22800"/>
-          <w:pgMar w:top="720" w:right="792" w:bottom="720" w:left="792" w:header="432" w:footer="432" w:gutter="0"/>
+          <w:headerReference w:type="default" r:id="rId11"/>
+          <w:footerReference w:type="default" r:id="rId12"/>
+          <w:pgSz w:w="12240" w:h="15840"/>
+          <w:pgMar w:top="1440" w:right="1440" w:bottom="1440" w:left="1440" w:header="432" w:footer="432" w:gutter="0"/>
           <w:cols w:space="720"/>
           <w:docGrid w:linePitch="360"/>
         </w:sectPr>
@@ -1036,7 +932,7 @@
     <w:p>
       <w:pPr>
         <w:shd w:val="clear" w:color="auto" w:fill="1F3864"/>
-        <w:spacing w:before="0" w:after="0"/>
+        <w:spacing w:before="160" w:after="160"/>
         <w:ind w:left="280"/>
       </w:pPr>
       <w:r>
@@ -1077,16 +973,16 @@
           <w:insideH w:val="single" w:sz="4" w:space="0" w:color="CCCCCC"/>
           <w:insideV w:val="single" w:sz="4" w:space="0" w:color="CCCCCC"/>
         </w:tblBorders>
-        <w:tblW w:w="10656" w:type="dxa"/>
+        <w:tblW w:w="9360" w:type="dxa"/>
       </w:tblPr>
       <w:tblGrid>
-        <w:gridCol w:w="8017"/>
-        <w:gridCol w:w="8017"/>
+        <w:gridCol w:w="4680"/>
+        <w:gridCol w:w="4680"/>
       </w:tblGrid>
       <w:tr>
         <w:tc>
           <w:tcPr>
-            <w:tcW w:type="dxa" w:w="16034"/>
+            <w:tcW w:type="dxa" w:w="9360"/>
             <w:gridSpan w:val="2"/>
             <w:shd w:val="clear" w:color="auto" w:fill="1F3864"/>
             <w:tcMar>
@@ -1113,13 +1009,13 @@
       <w:tr>
         <w:tc>
           <w:tcPr>
-            <w:tcW w:type="dxa" w:w="8017"/>
-            <w:tcW w:w="4049" w:type="dxa"/>
+            <w:tcW w:type="dxa" w:w="4680"/>
+            <w:tcW w:w="3276" w:type="dxa"/>
             <w:tcMar>
-              <w:top w:w="60" w:type="dxa"/>
-              <w:bottom w:w="60" w:type="dxa"/>
-              <w:left w:w="80" w:type="dxa"/>
-              <w:right w:w="60" w:type="dxa"/>
+              <w:top w:w="80" w:type="dxa"/>
+              <w:bottom w:w="80" w:type="dxa"/>
+              <w:left w:w="115" w:type="dxa"/>
+              <w:right w:w="115" w:type="dxa"/>
             </w:tcMar>
             <w:shd w:val="clear" w:color="auto" w:fill="F5F5F5"/>
           </w:tcPr>
@@ -1138,13 +1034,13 @@
         </w:tc>
         <w:tc>
           <w:tcPr>
-            <w:tcW w:type="dxa" w:w="8017"/>
-            <w:tcW w:w="6607" w:type="dxa"/>
+            <w:tcW w:type="dxa" w:w="4680"/>
+            <w:tcW w:w="6084" w:type="dxa"/>
             <w:tcMar>
-              <w:top w:w="60" w:type="dxa"/>
-              <w:bottom w:w="60" w:type="dxa"/>
-              <w:left w:w="80" w:type="dxa"/>
-              <w:right w:w="60" w:type="dxa"/>
+              <w:top w:w="80" w:type="dxa"/>
+              <w:bottom w:w="80" w:type="dxa"/>
+              <w:left w:w="115" w:type="dxa"/>
+              <w:right w:w="115" w:type="dxa"/>
             </w:tcMar>
             <w:shd w:val="clear" w:color="auto" w:fill="F5F5F5"/>
           </w:tcPr>
@@ -1165,13 +1061,13 @@
       <w:tr>
         <w:tc>
           <w:tcPr>
-            <w:tcW w:type="dxa" w:w="8017"/>
-            <w:tcW w:w="4049" w:type="dxa"/>
+            <w:tcW w:type="dxa" w:w="4680"/>
+            <w:tcW w:w="3276" w:type="dxa"/>
             <w:tcMar>
-              <w:top w:w="60" w:type="dxa"/>
-              <w:bottom w:w="60" w:type="dxa"/>
-              <w:left w:w="80" w:type="dxa"/>
-              <w:right w:w="60" w:type="dxa"/>
+              <w:top w:w="80" w:type="dxa"/>
+              <w:bottom w:w="80" w:type="dxa"/>
+              <w:left w:w="115" w:type="dxa"/>
+              <w:right w:w="115" w:type="dxa"/>
             </w:tcMar>
           </w:tcPr>
           <w:p>
@@ -1189,13 +1085,13 @@
         </w:tc>
         <w:tc>
           <w:tcPr>
-            <w:tcW w:type="dxa" w:w="8017"/>
-            <w:tcW w:w="6607" w:type="dxa"/>
+            <w:tcW w:type="dxa" w:w="4680"/>
+            <w:tcW w:w="6084" w:type="dxa"/>
             <w:tcMar>
-              <w:top w:w="60" w:type="dxa"/>
-              <w:bottom w:w="60" w:type="dxa"/>
-              <w:left w:w="80" w:type="dxa"/>
-              <w:right w:w="60" w:type="dxa"/>
+              <w:top w:w="80" w:type="dxa"/>
+              <w:bottom w:w="80" w:type="dxa"/>
+              <w:left w:w="115" w:type="dxa"/>
+              <w:right w:w="115" w:type="dxa"/>
             </w:tcMar>
           </w:tcPr>
           <w:p>
@@ -1215,13 +1111,13 @@
       <w:tr>
         <w:tc>
           <w:tcPr>
-            <w:tcW w:type="dxa" w:w="8017"/>
-            <w:tcW w:w="4049" w:type="dxa"/>
+            <w:tcW w:type="dxa" w:w="4680"/>
+            <w:tcW w:w="3276" w:type="dxa"/>
             <w:tcMar>
-              <w:top w:w="60" w:type="dxa"/>
-              <w:bottom w:w="60" w:type="dxa"/>
-              <w:left w:w="80" w:type="dxa"/>
-              <w:right w:w="60" w:type="dxa"/>
+              <w:top w:w="80" w:type="dxa"/>
+              <w:bottom w:w="80" w:type="dxa"/>
+              <w:left w:w="115" w:type="dxa"/>
+              <w:right w:w="115" w:type="dxa"/>
             </w:tcMar>
             <w:shd w:val="clear" w:color="auto" w:fill="F5F5F5"/>
           </w:tcPr>
@@ -1240,13 +1136,13 @@
         </w:tc>
         <w:tc>
           <w:tcPr>
-            <w:tcW w:type="dxa" w:w="8017"/>
-            <w:tcW w:w="6607" w:type="dxa"/>
+            <w:tcW w:type="dxa" w:w="4680"/>
+            <w:tcW w:w="6084" w:type="dxa"/>
             <w:tcMar>
-              <w:top w:w="60" w:type="dxa"/>
-              <w:bottom w:w="60" w:type="dxa"/>
-              <w:left w:w="80" w:type="dxa"/>
-              <w:right w:w="60" w:type="dxa"/>
+              <w:top w:w="80" w:type="dxa"/>
+              <w:bottom w:w="80" w:type="dxa"/>
+              <w:left w:w="115" w:type="dxa"/>
+              <w:right w:w="115" w:type="dxa"/>
             </w:tcMar>
             <w:shd w:val="clear" w:color="auto" w:fill="F5F5F5"/>
           </w:tcPr>
@@ -1267,13 +1163,13 @@
       <w:tr>
         <w:tc>
           <w:tcPr>
-            <w:tcW w:type="dxa" w:w="8017"/>
-            <w:tcW w:w="4049" w:type="dxa"/>
+            <w:tcW w:type="dxa" w:w="4680"/>
+            <w:tcW w:w="3276" w:type="dxa"/>
             <w:tcMar>
-              <w:top w:w="60" w:type="dxa"/>
-              <w:bottom w:w="60" w:type="dxa"/>
-              <w:left w:w="80" w:type="dxa"/>
-              <w:right w:w="60" w:type="dxa"/>
+              <w:top w:w="80" w:type="dxa"/>
+              <w:bottom w:w="80" w:type="dxa"/>
+              <w:left w:w="115" w:type="dxa"/>
+              <w:right w:w="115" w:type="dxa"/>
             </w:tcMar>
           </w:tcPr>
           <w:p>
@@ -1291,13 +1187,13 @@
         </w:tc>
         <w:tc>
           <w:tcPr>
-            <w:tcW w:type="dxa" w:w="8017"/>
-            <w:tcW w:w="6607" w:type="dxa"/>
+            <w:tcW w:type="dxa" w:w="4680"/>
+            <w:tcW w:w="6084" w:type="dxa"/>
             <w:tcMar>
-              <w:top w:w="60" w:type="dxa"/>
-              <w:bottom w:w="60" w:type="dxa"/>
-              <w:left w:w="80" w:type="dxa"/>
-              <w:right w:w="60" w:type="dxa"/>
+              <w:top w:w="80" w:type="dxa"/>
+              <w:bottom w:w="80" w:type="dxa"/>
+              <w:left w:w="115" w:type="dxa"/>
+              <w:right w:w="115" w:type="dxa"/>
             </w:tcMar>
           </w:tcPr>
           <w:p>
@@ -1317,13 +1213,13 @@
       <w:tr>
         <w:tc>
           <w:tcPr>
-            <w:tcW w:type="dxa" w:w="8017"/>
-            <w:tcW w:w="4049" w:type="dxa"/>
+            <w:tcW w:type="dxa" w:w="4680"/>
+            <w:tcW w:w="3276" w:type="dxa"/>
             <w:tcMar>
-              <w:top w:w="60" w:type="dxa"/>
-              <w:bottom w:w="60" w:type="dxa"/>
-              <w:left w:w="80" w:type="dxa"/>
-              <w:right w:w="60" w:type="dxa"/>
+              <w:top w:w="80" w:type="dxa"/>
+              <w:bottom w:w="80" w:type="dxa"/>
+              <w:left w:w="115" w:type="dxa"/>
+              <w:right w:w="115" w:type="dxa"/>
             </w:tcMar>
             <w:shd w:val="clear" w:color="auto" w:fill="F5F5F5"/>
           </w:tcPr>
@@ -1342,13 +1238,13 @@
         </w:tc>
         <w:tc>
           <w:tcPr>
-            <w:tcW w:type="dxa" w:w="8017"/>
-            <w:tcW w:w="6607" w:type="dxa"/>
+            <w:tcW w:type="dxa" w:w="4680"/>
+            <w:tcW w:w="6084" w:type="dxa"/>
             <w:tcMar>
-              <w:top w:w="60" w:type="dxa"/>
-              <w:bottom w:w="60" w:type="dxa"/>
-              <w:left w:w="80" w:type="dxa"/>
-              <w:right w:w="60" w:type="dxa"/>
+              <w:top w:w="80" w:type="dxa"/>
+              <w:bottom w:w="80" w:type="dxa"/>
+              <w:left w:w="115" w:type="dxa"/>
+              <w:right w:w="115" w:type="dxa"/>
             </w:tcMar>
             <w:shd w:val="clear" w:color="auto" w:fill="F5F5F5"/>
           </w:tcPr>
@@ -1369,13 +1265,13 @@
       <w:tr>
         <w:tc>
           <w:tcPr>
-            <w:tcW w:type="dxa" w:w="8017"/>
-            <w:tcW w:w="4049" w:type="dxa"/>
+            <w:tcW w:type="dxa" w:w="4680"/>
+            <w:tcW w:w="3276" w:type="dxa"/>
             <w:tcMar>
-              <w:top w:w="60" w:type="dxa"/>
-              <w:bottom w:w="60" w:type="dxa"/>
-              <w:left w:w="80" w:type="dxa"/>
-              <w:right w:w="60" w:type="dxa"/>
+              <w:top w:w="80" w:type="dxa"/>
+              <w:bottom w:w="80" w:type="dxa"/>
+              <w:left w:w="115" w:type="dxa"/>
+              <w:right w:w="115" w:type="dxa"/>
             </w:tcMar>
           </w:tcPr>
           <w:p>
@@ -1393,13 +1289,13 @@
         </w:tc>
         <w:tc>
           <w:tcPr>
-            <w:tcW w:type="dxa" w:w="8017"/>
-            <w:tcW w:w="6607" w:type="dxa"/>
+            <w:tcW w:type="dxa" w:w="4680"/>
+            <w:tcW w:w="6084" w:type="dxa"/>
             <w:tcMar>
-              <w:top w:w="60" w:type="dxa"/>
-              <w:bottom w:w="60" w:type="dxa"/>
-              <w:left w:w="80" w:type="dxa"/>
-              <w:right w:w="60" w:type="dxa"/>
+              <w:top w:w="80" w:type="dxa"/>
+              <w:bottom w:w="80" w:type="dxa"/>
+              <w:left w:w="115" w:type="dxa"/>
+              <w:right w:w="115" w:type="dxa"/>
             </w:tcMar>
           </w:tcPr>
           <w:p>
@@ -1419,13 +1315,13 @@
       <w:tr>
         <w:tc>
           <w:tcPr>
-            <w:tcW w:type="dxa" w:w="8017"/>
-            <w:tcW w:w="4049" w:type="dxa"/>
+            <w:tcW w:type="dxa" w:w="4680"/>
+            <w:tcW w:w="3276" w:type="dxa"/>
             <w:tcMar>
-              <w:top w:w="60" w:type="dxa"/>
-              <w:bottom w:w="60" w:type="dxa"/>
-              <w:left w:w="80" w:type="dxa"/>
-              <w:right w:w="60" w:type="dxa"/>
+              <w:top w:w="80" w:type="dxa"/>
+              <w:bottom w:w="80" w:type="dxa"/>
+              <w:left w:w="115" w:type="dxa"/>
+              <w:right w:w="115" w:type="dxa"/>
             </w:tcMar>
             <w:shd w:val="clear" w:color="auto" w:fill="F5F5F5"/>
           </w:tcPr>
@@ -1444,13 +1340,13 @@
         </w:tc>
         <w:tc>
           <w:tcPr>
-            <w:tcW w:type="dxa" w:w="8017"/>
-            <w:tcW w:w="6607" w:type="dxa"/>
+            <w:tcW w:type="dxa" w:w="4680"/>
+            <w:tcW w:w="6084" w:type="dxa"/>
             <w:tcMar>
-              <w:top w:w="60" w:type="dxa"/>
-              <w:bottom w:w="60" w:type="dxa"/>
-              <w:left w:w="80" w:type="dxa"/>
-              <w:right w:w="60" w:type="dxa"/>
+              <w:top w:w="80" w:type="dxa"/>
+              <w:bottom w:w="80" w:type="dxa"/>
+              <w:left w:w="115" w:type="dxa"/>
+              <w:right w:w="115" w:type="dxa"/>
             </w:tcMar>
             <w:shd w:val="clear" w:color="auto" w:fill="F5F5F5"/>
           </w:tcPr>
@@ -1471,13 +1367,13 @@
       <w:tr>
         <w:tc>
           <w:tcPr>
-            <w:tcW w:type="dxa" w:w="8017"/>
-            <w:tcW w:w="4049" w:type="dxa"/>
+            <w:tcW w:type="dxa" w:w="4680"/>
+            <w:tcW w:w="3276" w:type="dxa"/>
             <w:tcMar>
-              <w:top w:w="60" w:type="dxa"/>
-              <w:bottom w:w="60" w:type="dxa"/>
-              <w:left w:w="80" w:type="dxa"/>
-              <w:right w:w="60" w:type="dxa"/>
+              <w:top w:w="80" w:type="dxa"/>
+              <w:bottom w:w="80" w:type="dxa"/>
+              <w:left w:w="115" w:type="dxa"/>
+              <w:right w:w="115" w:type="dxa"/>
             </w:tcMar>
           </w:tcPr>
           <w:p>
@@ -1495,13 +1391,13 @@
         </w:tc>
         <w:tc>
           <w:tcPr>
-            <w:tcW w:type="dxa" w:w="8017"/>
-            <w:tcW w:w="6607" w:type="dxa"/>
+            <w:tcW w:type="dxa" w:w="4680"/>
+            <w:tcW w:w="6084" w:type="dxa"/>
             <w:tcMar>
-              <w:top w:w="60" w:type="dxa"/>
-              <w:bottom w:w="60" w:type="dxa"/>
-              <w:left w:w="80" w:type="dxa"/>
-              <w:right w:w="60" w:type="dxa"/>
+              <w:top w:w="80" w:type="dxa"/>
+              <w:bottom w:w="80" w:type="dxa"/>
+              <w:left w:w="115" w:type="dxa"/>
+              <w:right w:w="115" w:type="dxa"/>
             </w:tcMar>
           </w:tcPr>
           <w:p>
@@ -1521,13 +1417,13 @@
       <w:tr>
         <w:tc>
           <w:tcPr>
-            <w:tcW w:type="dxa" w:w="8017"/>
-            <w:tcW w:w="4049" w:type="dxa"/>
+            <w:tcW w:type="dxa" w:w="4680"/>
+            <w:tcW w:w="3276" w:type="dxa"/>
             <w:tcMar>
-              <w:top w:w="60" w:type="dxa"/>
-              <w:bottom w:w="60" w:type="dxa"/>
-              <w:left w:w="80" w:type="dxa"/>
-              <w:right w:w="60" w:type="dxa"/>
+              <w:top w:w="80" w:type="dxa"/>
+              <w:bottom w:w="80" w:type="dxa"/>
+              <w:left w:w="115" w:type="dxa"/>
+              <w:right w:w="115" w:type="dxa"/>
             </w:tcMar>
             <w:shd w:val="clear" w:color="auto" w:fill="F5F5F5"/>
           </w:tcPr>
@@ -1546,13 +1442,13 @@
         </w:tc>
         <w:tc>
           <w:tcPr>
-            <w:tcW w:type="dxa" w:w="8017"/>
-            <w:tcW w:w="6607" w:type="dxa"/>
+            <w:tcW w:type="dxa" w:w="4680"/>
+            <w:tcW w:w="6084" w:type="dxa"/>
             <w:tcMar>
-              <w:top w:w="60" w:type="dxa"/>
-              <w:bottom w:w="60" w:type="dxa"/>
-              <w:left w:w="80" w:type="dxa"/>
-              <w:right w:w="60" w:type="dxa"/>
+              <w:top w:w="80" w:type="dxa"/>
+              <w:bottom w:w="80" w:type="dxa"/>
+              <w:left w:w="115" w:type="dxa"/>
+              <w:right w:w="115" w:type="dxa"/>
             </w:tcMar>
             <w:shd w:val="clear" w:color="auto" w:fill="F5F5F5"/>
           </w:tcPr>
@@ -1573,7 +1469,7 @@
       <w:tr>
         <w:tc>
           <w:tcPr>
-            <w:tcW w:type="dxa" w:w="8017"/>
+            <w:tcW w:type="dxa" w:w="4680"/>
             <w:shd w:val="clear" w:color="auto" w:fill="EBF3FB"/>
             <w:tcMar>
               <w:top w:w="80" w:type="dxa"/>
@@ -1597,7 +1493,7 @@
         </w:tc>
         <w:tc>
           <w:tcPr>
-            <w:tcW w:type="dxa" w:w="8017"/>
+            <w:tcW w:type="dxa" w:w="4680"/>
             <w:shd w:val="clear" w:color="auto" w:fill="EBF3FB"/>
             <w:tcMar>
               <w:top w:w="80" w:type="dxa"/>
@@ -1623,7 +1519,7 @@
       <w:tr>
         <w:tc>
           <w:tcPr>
-            <w:tcW w:type="dxa" w:w="8017"/>
+            <w:tcW w:type="dxa" w:w="4680"/>
             <w:tcMar>
               <w:top w:w="60" w:type="dxa"/>
               <w:bottom w:w="60" w:type="dxa"/>
@@ -1646,7 +1542,7 @@
         </w:tc>
         <w:tc>
           <w:tcPr>
-            <w:tcW w:type="dxa" w:w="8017"/>
+            <w:tcW w:type="dxa" w:w="4680"/>
             <w:tcMar>
               <w:top w:w="60" w:type="dxa"/>
               <w:bottom w:w="60" w:type="dxa"/>
@@ -1672,7 +1568,7 @@
     <w:p>
       <w:pPr>
         <w:shd w:val="clear" w:color="auto" w:fill="1F3864"/>
-        <w:spacing w:before="0" w:after="0"/>
+        <w:spacing w:before="160" w:after="160"/>
         <w:ind w:left="280"/>
       </w:pPr>
       <w:r>
@@ -1716,22 +1612,22 @@
           <w:insideH w:val="single" w:sz="4" w:space="0" w:color="CCCCCC"/>
           <w:insideV w:val="single" w:sz="4" w:space="0" w:color="CCCCCC"/>
         </w:tblBorders>
-        <w:tblW w:w="10656" w:type="dxa"/>
+        <w:tblW w:w="9360" w:type="dxa"/>
       </w:tblPr>
       <w:tblGrid>
-        <w:gridCol w:w="8017"/>
-        <w:gridCol w:w="8017"/>
+        <w:gridCol w:w="4680"/>
+        <w:gridCol w:w="4680"/>
       </w:tblGrid>
       <w:tr>
         <w:tc>
           <w:tcPr>
-            <w:tcW w:type="dxa" w:w="8017"/>
-            <w:tcW w:w="3729" w:type="dxa"/>
+            <w:tcW w:type="dxa" w:w="4680"/>
+            <w:tcW w:w="3276" w:type="dxa"/>
             <w:tcMar>
-              <w:top w:w="60" w:type="dxa"/>
-              <w:bottom w:w="60" w:type="dxa"/>
-              <w:left w:w="80" w:type="dxa"/>
-              <w:right w:w="60" w:type="dxa"/>
+              <w:top w:w="80" w:type="dxa"/>
+              <w:bottom w:w="80" w:type="dxa"/>
+              <w:left w:w="115" w:type="dxa"/>
+              <w:right w:w="115" w:type="dxa"/>
             </w:tcMar>
             <w:shd w:val="clear" w:color="auto" w:fill="F5F5F5"/>
           </w:tcPr>
@@ -1750,13 +1646,13 @@
         </w:tc>
         <w:tc>
           <w:tcPr>
-            <w:tcW w:type="dxa" w:w="8017"/>
-            <w:tcW w:w="6927" w:type="dxa"/>
+            <w:tcW w:type="dxa" w:w="4680"/>
+            <w:tcW w:w="6084" w:type="dxa"/>
             <w:tcMar>
-              <w:top w:w="60" w:type="dxa"/>
-              <w:bottom w:w="60" w:type="dxa"/>
-              <w:left w:w="80" w:type="dxa"/>
-              <w:right w:w="60" w:type="dxa"/>
+              <w:top w:w="80" w:type="dxa"/>
+              <w:bottom w:w="80" w:type="dxa"/>
+              <w:left w:w="115" w:type="dxa"/>
+              <w:right w:w="115" w:type="dxa"/>
             </w:tcMar>
             <w:shd w:val="clear" w:color="auto" w:fill="F5F5F5"/>
           </w:tcPr>
@@ -1777,13 +1673,13 @@
       <w:tr>
         <w:tc>
           <w:tcPr>
-            <w:tcW w:type="dxa" w:w="8017"/>
-            <w:tcW w:w="3729" w:type="dxa"/>
+            <w:tcW w:type="dxa" w:w="4680"/>
+            <w:tcW w:w="3276" w:type="dxa"/>
             <w:tcMar>
-              <w:top w:w="60" w:type="dxa"/>
-              <w:bottom w:w="60" w:type="dxa"/>
-              <w:left w:w="80" w:type="dxa"/>
-              <w:right w:w="60" w:type="dxa"/>
+              <w:top w:w="80" w:type="dxa"/>
+              <w:bottom w:w="80" w:type="dxa"/>
+              <w:left w:w="115" w:type="dxa"/>
+              <w:right w:w="115" w:type="dxa"/>
             </w:tcMar>
           </w:tcPr>
           <w:p>
@@ -1801,13 +1697,13 @@
         </w:tc>
         <w:tc>
           <w:tcPr>
-            <w:tcW w:type="dxa" w:w="8017"/>
-            <w:tcW w:w="6927" w:type="dxa"/>
+            <w:tcW w:type="dxa" w:w="4680"/>
+            <w:tcW w:w="6084" w:type="dxa"/>
             <w:tcMar>
-              <w:top w:w="60" w:type="dxa"/>
-              <w:bottom w:w="60" w:type="dxa"/>
-              <w:left w:w="80" w:type="dxa"/>
-              <w:right w:w="60" w:type="dxa"/>
+              <w:top w:w="80" w:type="dxa"/>
+              <w:bottom w:w="80" w:type="dxa"/>
+              <w:left w:w="115" w:type="dxa"/>
+              <w:right w:w="115" w:type="dxa"/>
             </w:tcMar>
           </w:tcPr>
           <w:p>
@@ -1827,13 +1723,13 @@
       <w:tr>
         <w:tc>
           <w:tcPr>
-            <w:tcW w:type="dxa" w:w="8017"/>
-            <w:tcW w:w="3729" w:type="dxa"/>
+            <w:tcW w:type="dxa" w:w="4680"/>
+            <w:tcW w:w="3276" w:type="dxa"/>
             <w:tcMar>
-              <w:top w:w="60" w:type="dxa"/>
-              <w:bottom w:w="60" w:type="dxa"/>
-              <w:left w:w="80" w:type="dxa"/>
-              <w:right w:w="60" w:type="dxa"/>
+              <w:top w:w="80" w:type="dxa"/>
+              <w:bottom w:w="80" w:type="dxa"/>
+              <w:left w:w="115" w:type="dxa"/>
+              <w:right w:w="115" w:type="dxa"/>
             </w:tcMar>
             <w:shd w:val="clear" w:color="auto" w:fill="F5F5F5"/>
           </w:tcPr>
@@ -1852,13 +1748,13 @@
         </w:tc>
         <w:tc>
           <w:tcPr>
-            <w:tcW w:type="dxa" w:w="8017"/>
-            <w:tcW w:w="6927" w:type="dxa"/>
+            <w:tcW w:type="dxa" w:w="4680"/>
+            <w:tcW w:w="6084" w:type="dxa"/>
             <w:tcMar>
-              <w:top w:w="60" w:type="dxa"/>
-              <w:bottom w:w="60" w:type="dxa"/>
-              <w:left w:w="80" w:type="dxa"/>
-              <w:right w:w="60" w:type="dxa"/>
+              <w:top w:w="80" w:type="dxa"/>
+              <w:bottom w:w="80" w:type="dxa"/>
+              <w:left w:w="115" w:type="dxa"/>
+              <w:right w:w="115" w:type="dxa"/>
             </w:tcMar>
             <w:shd w:val="clear" w:color="auto" w:fill="F5F5F5"/>
           </w:tcPr>
@@ -1879,13 +1775,13 @@
       <w:tr>
         <w:tc>
           <w:tcPr>
-            <w:tcW w:type="dxa" w:w="8017"/>
-            <w:tcW w:w="3729" w:type="dxa"/>
+            <w:tcW w:type="dxa" w:w="4680"/>
+            <w:tcW w:w="3276" w:type="dxa"/>
             <w:tcMar>
-              <w:top w:w="60" w:type="dxa"/>
-              <w:bottom w:w="60" w:type="dxa"/>
-              <w:left w:w="80" w:type="dxa"/>
-              <w:right w:w="60" w:type="dxa"/>
+              <w:top w:w="80" w:type="dxa"/>
+              <w:bottom w:w="80" w:type="dxa"/>
+              <w:left w:w="115" w:type="dxa"/>
+              <w:right w:w="115" w:type="dxa"/>
             </w:tcMar>
           </w:tcPr>
           <w:p>
@@ -1903,13 +1799,13 @@
         </w:tc>
         <w:tc>
           <w:tcPr>
-            <w:tcW w:type="dxa" w:w="8017"/>
-            <w:tcW w:w="6927" w:type="dxa"/>
+            <w:tcW w:type="dxa" w:w="4680"/>
+            <w:tcW w:w="6084" w:type="dxa"/>
             <w:tcMar>
-              <w:top w:w="60" w:type="dxa"/>
-              <w:bottom w:w="60" w:type="dxa"/>
-              <w:left w:w="80" w:type="dxa"/>
-              <w:right w:w="60" w:type="dxa"/>
+              <w:top w:w="80" w:type="dxa"/>
+              <w:bottom w:w="80" w:type="dxa"/>
+              <w:left w:w="115" w:type="dxa"/>
+              <w:right w:w="115" w:type="dxa"/>
             </w:tcMar>
           </w:tcPr>
           <w:p>
@@ -1929,13 +1825,13 @@
       <w:tr>
         <w:tc>
           <w:tcPr>
-            <w:tcW w:type="dxa" w:w="8017"/>
-            <w:tcW w:w="3729" w:type="dxa"/>
+            <w:tcW w:type="dxa" w:w="4680"/>
+            <w:tcW w:w="3276" w:type="dxa"/>
             <w:tcMar>
-              <w:top w:w="60" w:type="dxa"/>
-              <w:bottom w:w="60" w:type="dxa"/>
-              <w:left w:w="80" w:type="dxa"/>
-              <w:right w:w="60" w:type="dxa"/>
+              <w:top w:w="80" w:type="dxa"/>
+              <w:bottom w:w="80" w:type="dxa"/>
+              <w:left w:w="115" w:type="dxa"/>
+              <w:right w:w="115" w:type="dxa"/>
             </w:tcMar>
             <w:shd w:val="clear" w:color="auto" w:fill="F5F5F5"/>
           </w:tcPr>
@@ -1954,13 +1850,13 @@
         </w:tc>
         <w:tc>
           <w:tcPr>
-            <w:tcW w:type="dxa" w:w="8017"/>
-            <w:tcW w:w="6927" w:type="dxa"/>
+            <w:tcW w:type="dxa" w:w="4680"/>
+            <w:tcW w:w="6084" w:type="dxa"/>
             <w:tcMar>
-              <w:top w:w="60" w:type="dxa"/>
-              <w:bottom w:w="60" w:type="dxa"/>
-              <w:left w:w="80" w:type="dxa"/>
-              <w:right w:w="60" w:type="dxa"/>
+              <w:top w:w="80" w:type="dxa"/>
+              <w:bottom w:w="80" w:type="dxa"/>
+              <w:left w:w="115" w:type="dxa"/>
+              <w:right w:w="115" w:type="dxa"/>
             </w:tcMar>
             <w:shd w:val="clear" w:color="auto" w:fill="F5F5F5"/>
           </w:tcPr>
@@ -1981,13 +1877,13 @@
       <w:tr>
         <w:tc>
           <w:tcPr>
-            <w:tcW w:type="dxa" w:w="8017"/>
-            <w:tcW w:w="3729" w:type="dxa"/>
+            <w:tcW w:type="dxa" w:w="4680"/>
+            <w:tcW w:w="3276" w:type="dxa"/>
             <w:tcMar>
-              <w:top w:w="60" w:type="dxa"/>
-              <w:bottom w:w="60" w:type="dxa"/>
-              <w:left w:w="80" w:type="dxa"/>
-              <w:right w:w="60" w:type="dxa"/>
+              <w:top w:w="80" w:type="dxa"/>
+              <w:bottom w:w="80" w:type="dxa"/>
+              <w:left w:w="115" w:type="dxa"/>
+              <w:right w:w="115" w:type="dxa"/>
             </w:tcMar>
           </w:tcPr>
           <w:p>
@@ -2005,13 +1901,13 @@
         </w:tc>
         <w:tc>
           <w:tcPr>
-            <w:tcW w:type="dxa" w:w="8017"/>
-            <w:tcW w:w="6927" w:type="dxa"/>
+            <w:tcW w:type="dxa" w:w="4680"/>
+            <w:tcW w:w="6084" w:type="dxa"/>
             <w:tcMar>
-              <w:top w:w="60" w:type="dxa"/>
-              <w:bottom w:w="60" w:type="dxa"/>
-              <w:left w:w="80" w:type="dxa"/>
-              <w:right w:w="60" w:type="dxa"/>
+              <w:top w:w="80" w:type="dxa"/>
+              <w:bottom w:w="80" w:type="dxa"/>
+              <w:left w:w="115" w:type="dxa"/>
+              <w:right w:w="115" w:type="dxa"/>
             </w:tcMar>
           </w:tcPr>
           <w:p>
@@ -2092,16 +1988,16 @@
           <w:insideH w:val="single" w:sz="4" w:space="0" w:color="CCCCCC"/>
           <w:insideV w:val="single" w:sz="4" w:space="0" w:color="CCCCCC"/>
         </w:tblBorders>
-        <w:tblW w:w="10656" w:type="dxa"/>
+        <w:tblW w:w="9360" w:type="dxa"/>
       </w:tblPr>
       <w:tblGrid>
-        <w:gridCol w:w="8017"/>
-        <w:gridCol w:w="8017"/>
+        <w:gridCol w:w="4680"/>
+        <w:gridCol w:w="4680"/>
       </w:tblGrid>
       <w:tr>
         <w:tc>
           <w:tcPr>
-            <w:tcW w:type="dxa" w:w="8017"/>
+            <w:tcW w:type="dxa" w:w="4680"/>
             <w:shd w:val="clear" w:color="auto" w:fill="1F3864"/>
             <w:tcMar>
               <w:top w:w="70" w:type="dxa"/>
@@ -2124,7 +2020,7 @@
         </w:tc>
         <w:tc>
           <w:tcPr>
-            <w:tcW w:type="dxa" w:w="8017"/>
+            <w:tcW w:type="dxa" w:w="4680"/>
             <w:shd w:val="clear" w:color="auto" w:fill="1F3864"/>
             <w:tcMar>
               <w:top w:w="70" w:type="dxa"/>
@@ -2149,8 +2045,8 @@
       <w:tr>
         <w:tc>
           <w:tcPr>
-            <w:tcW w:type="dxa" w:w="8017"/>
-            <w:tcW w:w="6926" w:type="dxa"/>
+            <w:tcW w:type="dxa" w:w="4680"/>
+            <w:tcW w:w="6084" w:type="dxa"/>
             <w:tcMar>
               <w:top w:w="60" w:type="dxa"/>
               <w:bottom w:w="60" w:type="dxa"/>
@@ -2174,8 +2070,8 @@
         </w:tc>
         <w:tc>
           <w:tcPr>
-            <w:tcW w:type="dxa" w:w="8017"/>
-            <w:tcW w:w="3730" w:type="dxa"/>
+            <w:tcW w:type="dxa" w:w="4680"/>
+            <w:tcW w:w="3276" w:type="dxa"/>
             <w:tcMar>
               <w:top w:w="60" w:type="dxa"/>
               <w:bottom w:w="60" w:type="dxa"/>
@@ -2201,8 +2097,8 @@
       <w:tr>
         <w:tc>
           <w:tcPr>
-            <w:tcW w:type="dxa" w:w="8017"/>
-            <w:tcW w:w="6926" w:type="dxa"/>
+            <w:tcW w:type="dxa" w:w="4680"/>
+            <w:tcW w:w="6084" w:type="dxa"/>
             <w:tcMar>
               <w:top w:w="60" w:type="dxa"/>
               <w:bottom w:w="60" w:type="dxa"/>
@@ -2225,8 +2121,8 @@
         </w:tc>
         <w:tc>
           <w:tcPr>
-            <w:tcW w:type="dxa" w:w="8017"/>
-            <w:tcW w:w="3730" w:type="dxa"/>
+            <w:tcW w:type="dxa" w:w="4680"/>
+            <w:tcW w:w="3276" w:type="dxa"/>
             <w:tcMar>
               <w:top w:w="60" w:type="dxa"/>
               <w:bottom w:w="60" w:type="dxa"/>
@@ -2251,8 +2147,8 @@
       <w:tr>
         <w:tc>
           <w:tcPr>
-            <w:tcW w:type="dxa" w:w="8017"/>
-            <w:tcW w:w="6926" w:type="dxa"/>
+            <w:tcW w:type="dxa" w:w="4680"/>
+            <w:tcW w:w="6084" w:type="dxa"/>
             <w:tcMar>
               <w:top w:w="60" w:type="dxa"/>
               <w:bottom w:w="60" w:type="dxa"/>
@@ -2276,8 +2172,8 @@
         </w:tc>
         <w:tc>
           <w:tcPr>
-            <w:tcW w:type="dxa" w:w="8017"/>
-            <w:tcW w:w="3730" w:type="dxa"/>
+            <w:tcW w:type="dxa" w:w="4680"/>
+            <w:tcW w:w="3276" w:type="dxa"/>
             <w:tcMar>
               <w:top w:w="60" w:type="dxa"/>
               <w:bottom w:w="60" w:type="dxa"/>
@@ -2303,8 +2199,8 @@
       <w:tr>
         <w:tc>
           <w:tcPr>
-            <w:tcW w:type="dxa" w:w="8017"/>
-            <w:tcW w:w="6926" w:type="dxa"/>
+            <w:tcW w:type="dxa" w:w="4680"/>
+            <w:tcW w:w="6084" w:type="dxa"/>
             <w:tcMar>
               <w:top w:w="60" w:type="dxa"/>
               <w:bottom w:w="60" w:type="dxa"/>
@@ -2327,8 +2223,8 @@
         </w:tc>
         <w:tc>
           <w:tcPr>
-            <w:tcW w:type="dxa" w:w="8017"/>
-            <w:tcW w:w="3730" w:type="dxa"/>
+            <w:tcW w:type="dxa" w:w="4680"/>
+            <w:tcW w:w="3276" w:type="dxa"/>
             <w:tcMar>
               <w:top w:w="60" w:type="dxa"/>
               <w:bottom w:w="60" w:type="dxa"/>
@@ -2388,9 +2284,9 @@
     <w:p>
       <w:pPr>
         <w:sectPr>
-          <w:footerReference w:type="default" r:id="rId14"/>
-          <w:pgSz w:w="17618" w:h="22800"/>
-          <w:pgMar w:top="720" w:right="792" w:bottom="720" w:left="792" w:header="432" w:footer="432" w:gutter="0"/>
+          <w:footerReference w:type="default" r:id="rId13"/>
+          <w:pgSz w:w="12240" w:h="15840"/>
+          <w:pgMar w:top="1440" w:right="1440" w:bottom="1440" w:left="1440" w:header="432" w:footer="432" w:gutter="0"/>
           <w:cols w:space="720"/>
           <w:docGrid w:linePitch="360"/>
         </w:sectPr>
@@ -2399,7 +2295,7 @@
     <w:p>
       <w:pPr>
         <w:shd w:val="clear" w:color="auto" w:fill="1F3864"/>
-        <w:spacing w:before="0" w:after="0"/>
+        <w:spacing w:before="160" w:after="160"/>
         <w:ind w:left="280"/>
       </w:pPr>
       <w:r>
@@ -2443,21 +2339,21 @@
           <w:insideH w:val="single" w:sz="4" w:space="0" w:color="CCCCCC"/>
           <w:insideV w:val="single" w:sz="4" w:space="0" w:color="CCCCCC"/>
         </w:tblBorders>
-        <w:tblW w:w="10656" w:type="dxa"/>
+        <w:tblW w:w="9360" w:type="dxa"/>
       </w:tblPr>
       <w:tblGrid>
-        <w:gridCol w:w="2672"/>
-        <w:gridCol w:w="2672"/>
-        <w:gridCol w:w="2672"/>
-        <w:gridCol w:w="2672"/>
-        <w:gridCol w:w="2672"/>
-        <w:gridCol w:w="2672"/>
+        <w:gridCol w:w="1560"/>
+        <w:gridCol w:w="1560"/>
+        <w:gridCol w:w="1560"/>
+        <w:gridCol w:w="1560"/>
+        <w:gridCol w:w="1560"/>
+        <w:gridCol w:w="1560"/>
       </w:tblGrid>
       <w:tr>
         <w:tc>
           <w:tcPr>
-            <w:tcW w:type="dxa" w:w="2672"/>
-            <w:tcW w:w="745" w:type="dxa"/>
+            <w:tcW w:type="dxa" w:w="1560"/>
+            <w:tcW w:w="655" w:type="dxa"/>
             <w:shd w:val="clear" w:color="auto" w:fill="1F3864"/>
             <w:tcMar>
               <w:top w:w="70" w:type="dxa"/>
@@ -2481,8 +2377,8 @@
         </w:tc>
         <w:tc>
           <w:tcPr>
-            <w:tcW w:type="dxa" w:w="2672"/>
-            <w:tcW w:w="1278" w:type="dxa"/>
+            <w:tcW w:type="dxa" w:w="1560"/>
+            <w:tcW w:w="1123" w:type="dxa"/>
             <w:shd w:val="clear" w:color="auto" w:fill="1F3864"/>
             <w:tcMar>
               <w:top w:w="70" w:type="dxa"/>
@@ -2506,8 +2402,8 @@
         </w:tc>
         <w:tc>
           <w:tcPr>
-            <w:tcW w:type="dxa" w:w="2672"/>
-            <w:tcW w:w="2983" w:type="dxa"/>
+            <w:tcW w:type="dxa" w:w="1560"/>
+            <w:tcW w:w="2620" w:type="dxa"/>
             <w:shd w:val="clear" w:color="auto" w:fill="1F3864"/>
             <w:tcMar>
               <w:top w:w="70" w:type="dxa"/>
@@ -2531,8 +2427,8 @@
         </w:tc>
         <w:tc>
           <w:tcPr>
-            <w:tcW w:type="dxa" w:w="2672"/>
-            <w:tcW w:w="2237" w:type="dxa"/>
+            <w:tcW w:type="dxa" w:w="1560"/>
+            <w:tcW w:w="1965" w:type="dxa"/>
             <w:shd w:val="clear" w:color="auto" w:fill="1F3864"/>
             <w:tcMar>
               <w:top w:w="70" w:type="dxa"/>
@@ -2556,8 +2452,8 @@
         </w:tc>
         <w:tc>
           <w:tcPr>
-            <w:tcW w:type="dxa" w:w="2672"/>
-            <w:tcW w:w="1278" w:type="dxa"/>
+            <w:tcW w:type="dxa" w:w="1560"/>
+            <w:tcW w:w="1123" w:type="dxa"/>
             <w:shd w:val="clear" w:color="auto" w:fill="1F3864"/>
             <w:tcMar>
               <w:top w:w="70" w:type="dxa"/>
@@ -2581,8 +2477,8 @@
         </w:tc>
         <w:tc>
           <w:tcPr>
-            <w:tcW w:type="dxa" w:w="2672"/>
-            <w:tcW w:w="2135" w:type="dxa"/>
+            <w:tcW w:type="dxa" w:w="1560"/>
+            <w:tcW w:w="1874" w:type="dxa"/>
             <w:shd w:val="clear" w:color="auto" w:fill="1F3864"/>
             <w:tcMar>
               <w:top w:w="70" w:type="dxa"/>
@@ -2608,13 +2504,13 @@
       <w:tr>
         <w:tc>
           <w:tcPr>
-            <w:tcW w:type="dxa" w:w="2672"/>
-            <w:tcW w:w="745" w:type="dxa"/>
+            <w:tcW w:type="dxa" w:w="1560"/>
+            <w:tcW w:w="655" w:type="dxa"/>
             <w:tcMar>
-              <w:top w:w="60" w:type="dxa"/>
-              <w:bottom w:w="60" w:type="dxa"/>
-              <w:left w:w="60" w:type="dxa"/>
-              <w:right w:w="60" w:type="dxa"/>
+              <w:top w:w="80" w:type="dxa"/>
+              <w:bottom w:w="80" w:type="dxa"/>
+              <w:left w:w="80" w:type="dxa"/>
+              <w:right w:w="80" w:type="dxa"/>
             </w:tcMar>
           </w:tcPr>
           <w:p>
@@ -2644,13 +2540,13 @@
         </w:tc>
         <w:tc>
           <w:tcPr>
-            <w:tcW w:type="dxa" w:w="2672"/>
-            <w:tcW w:w="1278" w:type="dxa"/>
+            <w:tcW w:type="dxa" w:w="1560"/>
+            <w:tcW w:w="1123" w:type="dxa"/>
             <w:tcMar>
-              <w:top w:w="60" w:type="dxa"/>
-              <w:bottom w:w="60" w:type="dxa"/>
-              <w:left w:w="60" w:type="dxa"/>
-              <w:right w:w="60" w:type="dxa"/>
+              <w:top w:w="80" w:type="dxa"/>
+              <w:bottom w:w="80" w:type="dxa"/>
+              <w:left w:w="80" w:type="dxa"/>
+              <w:right w:w="80" w:type="dxa"/>
             </w:tcMar>
           </w:tcPr>
           <w:p>
@@ -2668,13 +2564,13 @@
         </w:tc>
         <w:tc>
           <w:tcPr>
-            <w:tcW w:type="dxa" w:w="2672"/>
-            <w:tcW w:w="2983" w:type="dxa"/>
+            <w:tcW w:type="dxa" w:w="1560"/>
+            <w:tcW w:w="2620" w:type="dxa"/>
             <w:tcMar>
-              <w:top w:w="60" w:type="dxa"/>
-              <w:bottom w:w="60" w:type="dxa"/>
-              <w:left w:w="60" w:type="dxa"/>
-              <w:right w:w="60" w:type="dxa"/>
+              <w:top w:w="80" w:type="dxa"/>
+              <w:bottom w:w="80" w:type="dxa"/>
+              <w:left w:w="80" w:type="dxa"/>
+              <w:right w:w="80" w:type="dxa"/>
             </w:tcMar>
           </w:tcPr>
           <w:p>
@@ -2692,13 +2588,13 @@
         </w:tc>
         <w:tc>
           <w:tcPr>
-            <w:tcW w:type="dxa" w:w="2672"/>
-            <w:tcW w:w="2237" w:type="dxa"/>
+            <w:tcW w:type="dxa" w:w="1560"/>
+            <w:tcW w:w="1965" w:type="dxa"/>
             <w:tcMar>
-              <w:top w:w="60" w:type="dxa"/>
-              <w:bottom w:w="60" w:type="dxa"/>
-              <w:left w:w="60" w:type="dxa"/>
-              <w:right w:w="60" w:type="dxa"/>
+              <w:top w:w="80" w:type="dxa"/>
+              <w:bottom w:w="80" w:type="dxa"/>
+              <w:left w:w="80" w:type="dxa"/>
+              <w:right w:w="80" w:type="dxa"/>
             </w:tcMar>
           </w:tcPr>
           <w:p>
@@ -2716,13 +2612,13 @@
         </w:tc>
         <w:tc>
           <w:tcPr>
-            <w:tcW w:type="dxa" w:w="2672"/>
-            <w:tcW w:w="1278" w:type="dxa"/>
+            <w:tcW w:type="dxa" w:w="1560"/>
+            <w:tcW w:w="1123" w:type="dxa"/>
             <w:tcMar>
-              <w:top w:w="60" w:type="dxa"/>
-              <w:bottom w:w="60" w:type="dxa"/>
-              <w:left w:w="60" w:type="dxa"/>
-              <w:right w:w="60" w:type="dxa"/>
+              <w:top w:w="80" w:type="dxa"/>
+              <w:bottom w:w="80" w:type="dxa"/>
+              <w:left w:w="80" w:type="dxa"/>
+              <w:right w:w="80" w:type="dxa"/>
             </w:tcMar>
           </w:tcPr>
           <w:p>
@@ -2740,13 +2636,13 @@
         </w:tc>
         <w:tc>
           <w:tcPr>
-            <w:tcW w:type="dxa" w:w="2672"/>
-            <w:tcW w:w="2135" w:type="dxa"/>
+            <w:tcW w:type="dxa" w:w="1560"/>
+            <w:tcW w:w="1874" w:type="dxa"/>
             <w:tcMar>
-              <w:top w:w="60" w:type="dxa"/>
-              <w:bottom w:w="60" w:type="dxa"/>
-              <w:left w:w="60" w:type="dxa"/>
-              <w:right w:w="60" w:type="dxa"/>
+              <w:top w:w="80" w:type="dxa"/>
+              <w:bottom w:w="80" w:type="dxa"/>
+              <w:left w:w="80" w:type="dxa"/>
+              <w:right w:w="80" w:type="dxa"/>
             </w:tcMar>
           </w:tcPr>
           <w:p>
@@ -2778,8 +2674,8 @@
       <w:tr>
         <w:tc>
           <w:tcPr>
-            <w:tcW w:type="dxa" w:w="13360"/>
-            <w:tcW w:w="745" w:type="dxa"/>
+            <w:tcW w:type="dxa" w:w="7800"/>
+            <w:tcW w:w="655" w:type="dxa"/>
             <w:gridSpan w:val="5"/>
             <w:shd w:val="clear" w:color="auto" w:fill="F5F5F5"/>
             <w:tcMar>
@@ -2807,8 +2703,8 @@
         </w:tc>
         <w:tc>
           <w:tcPr>
-            <w:tcW w:type="dxa" w:w="2672"/>
-            <w:tcW w:w="2135" w:type="dxa"/>
+            <w:tcW w:type="dxa" w:w="1560"/>
+            <w:tcW w:w="1874" w:type="dxa"/>
             <w:shd w:val="clear" w:color="auto" w:fill="F5F5F5"/>
             <w:tcMar>
               <w:top w:w="70" w:type="dxa"/>
@@ -2893,16 +2789,16 @@
           <w:insideH w:val="single" w:sz="4" w:space="0" w:color="CCCCCC"/>
           <w:insideV w:val="single" w:sz="4" w:space="0" w:color="CCCCCC"/>
         </w:tblBorders>
-        <w:tblW w:w="10656" w:type="dxa"/>
+        <w:tblW w:w="9360" w:type="dxa"/>
       </w:tblPr>
       <w:tblGrid>
-        <w:gridCol w:w="8017"/>
-        <w:gridCol w:w="8017"/>
+        <w:gridCol w:w="4680"/>
+        <w:gridCol w:w="4680"/>
       </w:tblGrid>
       <w:tr>
         <w:tc>
           <w:tcPr>
-            <w:tcW w:type="dxa" w:w="8017"/>
+            <w:tcW w:type="dxa" w:w="4680"/>
             <w:shd w:val="clear" w:color="auto" w:fill="1F3864"/>
             <w:tcMar>
               <w:top w:w="70" w:type="dxa"/>
@@ -2925,7 +2821,7 @@
         </w:tc>
         <w:tc>
           <w:tcPr>
-            <w:tcW w:type="dxa" w:w="8017"/>
+            <w:tcW w:type="dxa" w:w="4680"/>
             <w:shd w:val="clear" w:color="auto" w:fill="1F3864"/>
             <w:tcMar>
               <w:top w:w="70" w:type="dxa"/>
@@ -2950,8 +2846,8 @@
       <w:tr>
         <w:tc>
           <w:tcPr>
-            <w:tcW w:type="dxa" w:w="8017"/>
-            <w:tcW w:w="5328" w:type="dxa"/>
+            <w:tcW w:type="dxa" w:w="4680"/>
+            <w:tcW w:w="4680" w:type="dxa"/>
             <w:tcMar>
               <w:top w:w="60" w:type="dxa"/>
               <w:bottom w:w="60" w:type="dxa"/>
@@ -2986,8 +2882,8 @@
         </w:tc>
         <w:tc>
           <w:tcPr>
-            <w:tcW w:type="dxa" w:w="8017"/>
-            <w:tcW w:w="5328" w:type="dxa"/>
+            <w:tcW w:type="dxa" w:w="4680"/>
+            <w:tcW w:w="4680" w:type="dxa"/>
             <w:tcMar>
               <w:top w:w="60" w:type="dxa"/>
               <w:bottom w:w="60" w:type="dxa"/>
@@ -3091,9 +2987,9 @@
     <w:p>
       <w:pPr>
         <w:sectPr>
-          <w:footerReference w:type="default" r:id="rId15"/>
-          <w:pgSz w:w="17618" w:h="22800"/>
-          <w:pgMar w:top="720" w:right="792" w:bottom="720" w:left="792" w:header="432" w:footer="432" w:gutter="0"/>
+          <w:footerReference w:type="default" r:id="rId14"/>
+          <w:pgSz w:w="12240" w:h="15840"/>
+          <w:pgMar w:top="1440" w:right="1440" w:bottom="1440" w:left="1440" w:header="432" w:footer="432" w:gutter="0"/>
           <w:cols w:space="720"/>
           <w:docGrid w:linePitch="360"/>
         </w:sectPr>
@@ -3102,7 +2998,7 @@
     <w:p>
       <w:pPr>
         <w:shd w:val="clear" w:color="auto" w:fill="1F3864"/>
-        <w:spacing w:before="0" w:after="0"/>
+        <w:spacing w:before="160" w:after="160"/>
         <w:ind w:left="280"/>
       </w:pPr>
       <w:r>
@@ -3144,17 +3040,17 @@
           <w:insideH w:val="single" w:sz="4" w:space="0" w:color="CCCCCC"/>
           <w:insideV w:val="single" w:sz="4" w:space="0" w:color="CCCCCC"/>
         </w:tblBorders>
-        <w:tblW w:w="10656" w:type="dxa"/>
+        <w:tblW w:w="9360" w:type="dxa"/>
       </w:tblPr>
       <w:tblGrid>
-        <w:gridCol w:w="8017"/>
-        <w:gridCol w:w="8017"/>
+        <w:gridCol w:w="4680"/>
+        <w:gridCol w:w="4680"/>
       </w:tblGrid>
       <w:tr>
         <w:tc>
           <w:tcPr>
-            <w:tcW w:type="dxa" w:w="8017"/>
-            <w:tcW w:w="5328" w:type="dxa"/>
+            <w:tcW w:type="dxa" w:w="4680"/>
+            <w:tcW w:w="4680" w:type="dxa"/>
             <w:shd w:val="clear" w:color="auto" w:fill="F5F5F5"/>
             <w:tcMar>
               <w:top w:w="100" w:type="dxa"/>
@@ -3226,8 +3122,8 @@
         </w:tc>
         <w:tc>
           <w:tcPr>
-            <w:tcW w:type="dxa" w:w="8017"/>
-            <w:tcW w:w="5328" w:type="dxa"/>
+            <w:tcW w:type="dxa" w:w="4680"/>
+            <w:tcW w:w="4680" w:type="dxa"/>
             <w:shd w:val="clear" w:color="auto" w:fill="F5F5F5"/>
             <w:tcMar>
               <w:top w:w="100" w:type="dxa"/>
@@ -3289,6 +3185,21 @@
     </w:tbl>
     <w:p>
       <w:pPr>
+        <w:spacing w:before="280" w:after="160"/>
+      </w:pPr>
+      <w:r>
+        <w:rPr>
+          <w:rFonts w:ascii="Arial" w:hAnsi="Arial"/>
+          <w:b/>
+          <w:i w:val="0"/>
+          <w:color w:val="C00000"/>
+          <w:sz w:val="26"/>
+        </w:rPr>
+        <w:t>What’s Next</w:t>
+      </w:r>
+    </w:p>
+    <w:p>
+      <w:pPr>
         <w:spacing w:before="240" w:after="120"/>
         <w:pBdr>
           <w:bottom w:val="single" w:sz="8" w:space="4" w:color="CCCCCC"/>
@@ -3333,17 +3244,17 @@
           <w:insideH w:val="none" w:sz="0" w:space="0" w:color="auto"/>
           <w:insideV w:val="none" w:sz="0" w:space="0" w:color="auto"/>
         </w:tblBorders>
-        <w:tblW w:w="10656" w:type="dxa"/>
+        <w:tblW w:w="9360" w:type="dxa"/>
       </w:tblPr>
       <w:tblGrid>
-        <w:gridCol w:w="8017"/>
-        <w:gridCol w:w="8017"/>
+        <w:gridCol w:w="4680"/>
+        <w:gridCol w:w="4680"/>
       </w:tblGrid>
       <w:tr>
         <w:tc>
           <w:tcPr>
-            <w:tcW w:type="dxa" w:w="8017"/>
-            <w:tcW w:w="2664" w:type="dxa"/>
+            <w:tcW w:type="dxa" w:w="4680"/>
+            <w:tcW w:w="2340" w:type="dxa"/>
             <w:tcMar>
               <w:top w:w="80" w:type="dxa"/>
               <w:bottom w:w="80" w:type="dxa"/>
@@ -3366,8 +3277,8 @@
         </w:tc>
         <w:tc>
           <w:tcPr>
-            <w:tcW w:type="dxa" w:w="8017"/>
-            <w:tcW w:w="7992" w:type="dxa"/>
+            <w:tcW w:type="dxa" w:w="4680"/>
+            <w:tcW w:w="7020" w:type="dxa"/>
             <w:tcMar>
               <w:top w:w="80" w:type="dxa"/>
               <w:bottom w:w="80" w:type="dxa"/>
@@ -3386,8 +3297,8 @@
       <w:tr>
         <w:tc>
           <w:tcPr>
-            <w:tcW w:type="dxa" w:w="8017"/>
-            <w:tcW w:w="2664" w:type="dxa"/>
+            <w:tcW w:type="dxa" w:w="4680"/>
+            <w:tcW w:w="2340" w:type="dxa"/>
             <w:tcMar>
               <w:top w:w="80" w:type="dxa"/>
               <w:bottom w:w="80" w:type="dxa"/>
@@ -3410,8 +3321,8 @@
         </w:tc>
         <w:tc>
           <w:tcPr>
-            <w:tcW w:type="dxa" w:w="8017"/>
-            <w:tcW w:w="7992" w:type="dxa"/>
+            <w:tcW w:type="dxa" w:w="4680"/>
+            <w:tcW w:w="7020" w:type="dxa"/>
             <w:tcMar>
               <w:top w:w="80" w:type="dxa"/>
               <w:bottom w:w="80" w:type="dxa"/>
@@ -3430,8 +3341,8 @@
       <w:tr>
         <w:tc>
           <w:tcPr>
-            <w:tcW w:type="dxa" w:w="8017"/>
-            <w:tcW w:w="2664" w:type="dxa"/>
+            <w:tcW w:type="dxa" w:w="4680"/>
+            <w:tcW w:w="2340" w:type="dxa"/>
             <w:tcMar>
               <w:top w:w="80" w:type="dxa"/>
               <w:bottom w:w="80" w:type="dxa"/>
@@ -3454,8 +3365,8 @@
         </w:tc>
         <w:tc>
           <w:tcPr>
-            <w:tcW w:type="dxa" w:w="8017"/>
-            <w:tcW w:w="7992" w:type="dxa"/>
+            <w:tcW w:type="dxa" w:w="4680"/>
+            <w:tcW w:w="7020" w:type="dxa"/>
             <w:tcMar>
               <w:top w:w="80" w:type="dxa"/>
               <w:bottom w:w="80" w:type="dxa"/>
@@ -3474,8 +3385,8 @@
       <w:tr>
         <w:tc>
           <w:tcPr>
-            <w:tcW w:type="dxa" w:w="8017"/>
-            <w:tcW w:w="2664" w:type="dxa"/>
+            <w:tcW w:type="dxa" w:w="4680"/>
+            <w:tcW w:w="2340" w:type="dxa"/>
             <w:tcMar>
               <w:top w:w="80" w:type="dxa"/>
               <w:bottom w:w="80" w:type="dxa"/>
@@ -3498,8 +3409,8 @@
         </w:tc>
         <w:tc>
           <w:tcPr>
-            <w:tcW w:type="dxa" w:w="8017"/>
-            <w:tcW w:w="7992" w:type="dxa"/>
+            <w:tcW w:type="dxa" w:w="4680"/>
+            <w:tcW w:w="7020" w:type="dxa"/>
             <w:tcMar>
               <w:top w:w="80" w:type="dxa"/>
               <w:bottom w:w="80" w:type="dxa"/>
@@ -3535,9 +3446,9 @@
     <w:p>
       <w:pPr>
         <w:sectPr>
-          <w:footerReference w:type="default" r:id="rId16"/>
-          <w:pgSz w:w="17618" w:h="22800"/>
-          <w:pgMar w:top="720" w:right="792" w:bottom="720" w:left="792" w:header="432" w:footer="432" w:gutter="0"/>
+          <w:footerReference w:type="default" r:id="rId15"/>
+          <w:pgSz w:w="12240" w:h="15840"/>
+          <w:pgMar w:top="1440" w:right="1440" w:bottom="1440" w:left="1440" w:header="432" w:footer="432" w:gutter="0"/>
           <w:cols w:space="720"/>
           <w:docGrid w:linePitch="360"/>
         </w:sectPr>
@@ -3546,7 +3457,7 @@
     <w:p>
       <w:pPr>
         <w:shd w:val="clear" w:color="auto" w:fill="1F3864"/>
-        <w:spacing w:before="0" w:after="0"/>
+        <w:spacing w:before="160" w:after="160"/>
         <w:ind w:left="280"/>
       </w:pPr>
       <w:r>
@@ -3605,17 +3516,17 @@
           <w:insideH w:val="none" w:sz="0" w:space="0" w:color="auto"/>
           <w:insideV w:val="none" w:sz="0" w:space="0" w:color="auto"/>
         </w:tblBorders>
-        <w:tblW w:w="10656" w:type="dxa"/>
+        <w:tblW w:w="9360" w:type="dxa"/>
       </w:tblPr>
       <w:tblGrid>
-        <w:gridCol w:w="8017"/>
-        <w:gridCol w:w="8017"/>
+        <w:gridCol w:w="4680"/>
+        <w:gridCol w:w="4680"/>
       </w:tblGrid>
       <w:tr>
         <w:tc>
           <w:tcPr>
-            <w:tcW w:type="dxa" w:w="8017"/>
-            <w:tcW w:w="5328" w:type="dxa"/>
+            <w:tcW w:type="dxa" w:w="4680"/>
+            <w:tcW w:w="4680" w:type="dxa"/>
             <w:tcMar>
               <w:top w:w="40" w:type="dxa"/>
               <w:bottom w:w="40" w:type="dxa"/>
@@ -3731,8 +3642,8 @@
         </w:tc>
         <w:tc>
           <w:tcPr>
-            <w:tcW w:type="dxa" w:w="8017"/>
-            <w:tcW w:w="5328" w:type="dxa"/>
+            <w:tcW w:type="dxa" w:w="4680"/>
+            <w:tcW w:w="4680" w:type="dxa"/>
             <w:tcMar>
               <w:top w:w="40" w:type="dxa"/>
               <w:bottom w:w="40" w:type="dxa"/>
@@ -3850,8 +3761,8 @@
       <w:tr>
         <w:tc>
           <w:tcPr>
-            <w:tcW w:type="dxa" w:w="8017"/>
-            <w:tcW w:w="5328" w:type="dxa"/>
+            <w:tcW w:type="dxa" w:w="4680"/>
+            <w:tcW w:w="4680" w:type="dxa"/>
             <w:tcMar>
               <w:top w:w="40" w:type="dxa"/>
               <w:bottom w:w="40" w:type="dxa"/>
@@ -3951,8 +3862,8 @@
         </w:tc>
         <w:tc>
           <w:tcPr>
-            <w:tcW w:type="dxa" w:w="8017"/>
-            <w:tcW w:w="5328" w:type="dxa"/>
+            <w:tcW w:type="dxa" w:w="4680"/>
+            <w:tcW w:w="4680" w:type="dxa"/>
             <w:tcMar>
               <w:top w:w="40" w:type="dxa"/>
               <w:bottom w:w="40" w:type="dxa"/>
@@ -4054,8 +3965,8 @@
       <w:tr>
         <w:tc>
           <w:tcPr>
-            <w:tcW w:type="dxa" w:w="8017"/>
-            <w:tcW w:w="5328" w:type="dxa"/>
+            <w:tcW w:type="dxa" w:w="4680"/>
+            <w:tcW w:w="4680" w:type="dxa"/>
             <w:tcMar>
               <w:top w:w="40" w:type="dxa"/>
               <w:bottom w:w="40" w:type="dxa"/>
@@ -4139,8 +4050,8 @@
         </w:tc>
         <w:tc>
           <w:tcPr>
-            <w:tcW w:type="dxa" w:w="8017"/>
-            <w:tcW w:w="5328" w:type="dxa"/>
+            <w:tcW w:type="dxa" w:w="4680"/>
+            <w:tcW w:w="4680" w:type="dxa"/>
             <w:tcMar>
               <w:top w:w="40" w:type="dxa"/>
               <w:bottom w:w="40" w:type="dxa"/>
@@ -4226,8 +4137,8 @@
       <w:tr>
         <w:tc>
           <w:tcPr>
-            <w:tcW w:type="dxa" w:w="8017"/>
-            <w:tcW w:w="5328" w:type="dxa"/>
+            <w:tcW w:type="dxa" w:w="4680"/>
+            <w:tcW w:w="4680" w:type="dxa"/>
             <w:tcMar>
               <w:top w:w="40" w:type="dxa"/>
               <w:bottom w:w="40" w:type="dxa"/>
@@ -4327,8 +4238,8 @@
         </w:tc>
         <w:tc>
           <w:tcPr>
-            <w:tcW w:type="dxa" w:w="8017"/>
-            <w:tcW w:w="5328" w:type="dxa"/>
+            <w:tcW w:type="dxa" w:w="4680"/>
+            <w:tcW w:w="4680" w:type="dxa"/>
             <w:tcMar>
               <w:top w:w="40" w:type="dxa"/>
               <w:bottom w:w="40" w:type="dxa"/>
@@ -4431,9 +4342,9 @@
     <w:p>
       <w:pPr>
         <w:sectPr>
-          <w:footerReference w:type="default" r:id="rId17"/>
-          <w:pgSz w:w="17618" w:h="22800"/>
-          <w:pgMar w:top="720" w:right="792" w:bottom="720" w:left="792" w:header="432" w:footer="432" w:gutter="0"/>
+          <w:footerReference w:type="default" r:id="rId16"/>
+          <w:pgSz w:w="12240" w:h="15840"/>
+          <w:pgMar w:top="1440" w:right="1440" w:bottom="1440" w:left="1440" w:header="432" w:footer="432" w:gutter="0"/>
           <w:cols w:space="720"/>
           <w:docGrid w:linePitch="360"/>
         </w:sectPr>
@@ -4442,7 +4353,7 @@
     <w:p>
       <w:pPr>
         <w:shd w:val="clear" w:color="auto" w:fill="1F3864"/>
-        <w:spacing w:before="0" w:after="0"/>
+        <w:spacing w:before="160" w:after="160"/>
         <w:ind w:left="280"/>
       </w:pPr>
       <w:r>
@@ -4486,17 +4397,17 @@
           <w:insideH w:val="none" w:sz="0" w:space="0" w:color="auto"/>
           <w:insideV w:val="none" w:sz="0" w:space="0" w:color="auto"/>
         </w:tblBorders>
-        <w:tblW w:w="10656" w:type="dxa"/>
+        <w:tblW w:w="9360" w:type="dxa"/>
       </w:tblPr>
       <w:tblGrid>
-        <w:gridCol w:w="8017"/>
-        <w:gridCol w:w="8017"/>
+        <w:gridCol w:w="4680"/>
+        <w:gridCol w:w="4680"/>
       </w:tblGrid>
       <w:tr>
         <w:tc>
           <w:tcPr>
-            <w:tcW w:type="dxa" w:w="8017"/>
-            <w:tcW w:w="5328" w:type="dxa"/>
+            <w:tcW w:type="dxa" w:w="4680"/>
+            <w:tcW w:w="4680" w:type="dxa"/>
             <w:tcMar>
               <w:top w:w="40" w:type="dxa"/>
               <w:bottom w:w="40" w:type="dxa"/>
@@ -4580,8 +4491,8 @@
         </w:tc>
         <w:tc>
           <w:tcPr>
-            <w:tcW w:type="dxa" w:w="8017"/>
-            <w:tcW w:w="5328" w:type="dxa"/>
+            <w:tcW w:type="dxa" w:w="4680"/>
+            <w:tcW w:w="4680" w:type="dxa"/>
             <w:tcMar>
               <w:top w:w="40" w:type="dxa"/>
               <w:bottom w:w="40" w:type="dxa"/>
@@ -4683,8 +4594,8 @@
       <w:tr>
         <w:tc>
           <w:tcPr>
-            <w:tcW w:type="dxa" w:w="8017"/>
-            <w:tcW w:w="5328" w:type="dxa"/>
+            <w:tcW w:type="dxa" w:w="4680"/>
+            <w:tcW w:w="4680" w:type="dxa"/>
             <w:tcMar>
               <w:top w:w="40" w:type="dxa"/>
               <w:bottom w:w="40" w:type="dxa"/>
@@ -4784,8 +4695,8 @@
         </w:tc>
         <w:tc>
           <w:tcPr>
-            <w:tcW w:type="dxa" w:w="8017"/>
-            <w:tcW w:w="5328" w:type="dxa"/>
+            <w:tcW w:type="dxa" w:w="4680"/>
+            <w:tcW w:w="4680" w:type="dxa"/>
             <w:tcMar>
               <w:top w:w="40" w:type="dxa"/>
               <w:bottom w:w="40" w:type="dxa"/>
@@ -4850,17 +4761,17 @@
           <w:insideH w:val="none" w:sz="0" w:space="0" w:color="auto"/>
           <w:insideV w:val="none" w:sz="0" w:space="0" w:color="auto"/>
         </w:tblBorders>
-        <w:tblW w:w="10656" w:type="dxa"/>
+        <w:tblW w:w="9360" w:type="dxa"/>
       </w:tblPr>
       <w:tblGrid>
-        <w:gridCol w:w="8017"/>
-        <w:gridCol w:w="8017"/>
+        <w:gridCol w:w="4680"/>
+        <w:gridCol w:w="4680"/>
       </w:tblGrid>
       <w:tr>
         <w:tc>
           <w:tcPr>
-            <w:tcW w:type="dxa" w:w="8017"/>
-            <w:tcW w:w="5328" w:type="dxa"/>
+            <w:tcW w:type="dxa" w:w="4680"/>
+            <w:tcW w:w="4680" w:type="dxa"/>
             <w:tcMar>
               <w:top w:w="40" w:type="dxa"/>
               <w:bottom w:w="40" w:type="dxa"/>
@@ -4976,8 +4887,8 @@
         </w:tc>
         <w:tc>
           <w:tcPr>
-            <w:tcW w:type="dxa" w:w="8017"/>
-            <w:tcW w:w="5328" w:type="dxa"/>
+            <w:tcW w:type="dxa" w:w="4680"/>
+            <w:tcW w:w="4680" w:type="dxa"/>
             <w:tcMar>
               <w:top w:w="40" w:type="dxa"/>
               <w:bottom w:w="40" w:type="dxa"/>
@@ -5091,17 +5002,17 @@
           <w:insideH w:val="none" w:sz="0" w:space="0" w:color="auto"/>
           <w:insideV w:val="none" w:sz="0" w:space="0" w:color="auto"/>
         </w:tblBorders>
-        <w:tblW w:w="10656" w:type="dxa"/>
+        <w:tblW w:w="9360" w:type="dxa"/>
       </w:tblPr>
       <w:tblGrid>
-        <w:gridCol w:w="8017"/>
-        <w:gridCol w:w="8017"/>
+        <w:gridCol w:w="4680"/>
+        <w:gridCol w:w="4680"/>
       </w:tblGrid>
       <w:tr>
         <w:tc>
           <w:tcPr>
-            <w:tcW w:type="dxa" w:w="8017"/>
-            <w:tcW w:w="5328" w:type="dxa"/>
+            <w:tcW w:type="dxa" w:w="4680"/>
+            <w:tcW w:w="4680" w:type="dxa"/>
             <w:tcMar>
               <w:top w:w="40" w:type="dxa"/>
               <w:bottom w:w="40" w:type="dxa"/>
@@ -5201,8 +5112,8 @@
         </w:tc>
         <w:tc>
           <w:tcPr>
-            <w:tcW w:type="dxa" w:w="8017"/>
-            <w:tcW w:w="5328" w:type="dxa"/>
+            <w:tcW w:type="dxa" w:w="4680"/>
+            <w:tcW w:w="4680" w:type="dxa"/>
             <w:tcMar>
               <w:top w:w="40" w:type="dxa"/>
               <w:bottom w:w="40" w:type="dxa"/>
@@ -5305,9 +5216,9 @@
     <w:p>
       <w:pPr>
         <w:sectPr>
-          <w:footerReference w:type="default" r:id="rId18"/>
-          <w:pgSz w:w="17618" w:h="22800"/>
-          <w:pgMar w:top="720" w:right="792" w:bottom="720" w:left="792" w:header="432" w:footer="432" w:gutter="0"/>
+          <w:footerReference w:type="default" r:id="rId17"/>
+          <w:pgSz w:w="12240" w:h="15840"/>
+          <w:pgMar w:top="1440" w:right="1440" w:bottom="1440" w:left="1440" w:header="432" w:footer="432" w:gutter="0"/>
           <w:cols w:space="720"/>
           <w:docGrid w:linePitch="360"/>
         </w:sectPr>
@@ -5316,7 +5227,7 @@
     <w:p>
       <w:pPr>
         <w:shd w:val="clear" w:color="auto" w:fill="1F3864"/>
-        <w:spacing w:before="0" w:after="0"/>
+        <w:spacing w:before="160" w:after="160"/>
         <w:ind w:left="280"/>
       </w:pPr>
       <w:r>
@@ -5376,17 +5287,17 @@
           <w:insideH w:val="none" w:sz="0" w:space="0" w:color="auto"/>
           <w:insideV w:val="none" w:sz="0" w:space="0" w:color="auto"/>
         </w:tblBorders>
-        <w:tblW w:w="10656" w:type="dxa"/>
+        <w:tblW w:w="9360" w:type="dxa"/>
       </w:tblPr>
       <w:tblGrid>
-        <w:gridCol w:w="8017"/>
-        <w:gridCol w:w="8017"/>
+        <w:gridCol w:w="4680"/>
+        <w:gridCol w:w="4680"/>
       </w:tblGrid>
       <w:tr>
         <w:tc>
           <w:tcPr>
-            <w:tcW w:type="dxa" w:w="8017"/>
-            <w:tcW w:w="5328" w:type="dxa"/>
+            <w:tcW w:type="dxa" w:w="4680"/>
+            <w:tcW w:w="4680" w:type="dxa"/>
             <w:tcMar>
               <w:top w:w="40" w:type="dxa"/>
               <w:bottom w:w="40" w:type="dxa"/>
@@ -5518,8 +5429,8 @@
         </w:tc>
         <w:tc>
           <w:tcPr>
-            <w:tcW w:type="dxa" w:w="8017"/>
-            <w:tcW w:w="5328" w:type="dxa"/>
+            <w:tcW w:type="dxa" w:w="4680"/>
+            <w:tcW w:w="4680" w:type="dxa"/>
             <w:tcMar>
               <w:top w:w="40" w:type="dxa"/>
               <w:bottom w:w="40" w:type="dxa"/>
@@ -5665,17 +5576,17 @@
           <w:insideH w:val="none" w:sz="0" w:space="0" w:color="auto"/>
           <w:insideV w:val="none" w:sz="0" w:space="0" w:color="auto"/>
         </w:tblBorders>
-        <w:tblW w:w="10656" w:type="dxa"/>
+        <w:tblW w:w="9360" w:type="dxa"/>
       </w:tblPr>
       <w:tblGrid>
-        <w:gridCol w:w="8017"/>
-        <w:gridCol w:w="8017"/>
+        <w:gridCol w:w="4680"/>
+        <w:gridCol w:w="4680"/>
       </w:tblGrid>
       <w:tr>
         <w:tc>
           <w:tcPr>
-            <w:tcW w:type="dxa" w:w="8017"/>
-            <w:tcW w:w="5328" w:type="dxa"/>
+            <w:tcW w:type="dxa" w:w="4680"/>
+            <w:tcW w:w="4680" w:type="dxa"/>
             <w:tcMar>
               <w:top w:w="40" w:type="dxa"/>
               <w:bottom w:w="40" w:type="dxa"/>
@@ -5775,8 +5686,8 @@
         </w:tc>
         <w:tc>
           <w:tcPr>
-            <w:tcW w:type="dxa" w:w="8017"/>
-            <w:tcW w:w="5328" w:type="dxa"/>
+            <w:tcW w:type="dxa" w:w="4680"/>
+            <w:tcW w:w="4680" w:type="dxa"/>
             <w:tcMar>
               <w:top w:w="40" w:type="dxa"/>
               <w:bottom w:w="40" w:type="dxa"/>
@@ -5906,17 +5817,17 @@
           <w:insideH w:val="none" w:sz="0" w:space="0" w:color="auto"/>
           <w:insideV w:val="none" w:sz="0" w:space="0" w:color="auto"/>
         </w:tblBorders>
-        <w:tblW w:w="10656" w:type="dxa"/>
+        <w:tblW w:w="9360" w:type="dxa"/>
       </w:tblPr>
       <w:tblGrid>
-        <w:gridCol w:w="8017"/>
-        <w:gridCol w:w="8017"/>
+        <w:gridCol w:w="4680"/>
+        <w:gridCol w:w="4680"/>
       </w:tblGrid>
       <w:tr>
         <w:tc>
           <w:tcPr>
-            <w:tcW w:type="dxa" w:w="8017"/>
-            <w:tcW w:w="5328" w:type="dxa"/>
+            <w:tcW w:type="dxa" w:w="4680"/>
+            <w:tcW w:w="4680" w:type="dxa"/>
             <w:tcMar>
               <w:top w:w="40" w:type="dxa"/>
               <w:bottom w:w="40" w:type="dxa"/>
@@ -6032,8 +5943,8 @@
         </w:tc>
         <w:tc>
           <w:tcPr>
-            <w:tcW w:type="dxa" w:w="8017"/>
-            <w:tcW w:w="5328" w:type="dxa"/>
+            <w:tcW w:type="dxa" w:w="4680"/>
+            <w:tcW w:w="4680" w:type="dxa"/>
             <w:tcMar>
               <w:top w:w="40" w:type="dxa"/>
               <w:bottom w:w="40" w:type="dxa"/>
@@ -6135,9 +6046,9 @@
       </w:r>
     </w:p>
     <w:sectPr>
-      <w:footerReference w:type="default" r:id="rId19"/>
-      <w:pgSz w:w="17618" w:h="22800"/>
-      <w:pgMar w:top="720" w:right="792" w:bottom="720" w:left="792" w:header="432" w:footer="432" w:gutter="0"/>
+      <w:footerReference w:type="default" r:id="rId18"/>
+      <w:pgSz w:w="12240" w:h="15840"/>
+      <w:pgMar w:top="1440" w:right="1440" w:bottom="1440" w:left="1440" w:header="432" w:footer="432" w:gutter="0"/>
       <w:cols w:space="720"/>
       <w:docGrid w:linePitch="360"/>
     </w:sectPr>
@@ -6164,7 +6075,7 @@
       </w:pBdr>
       <w:spacing w:before="80" w:after="0"/>
       <w:tabs>
-        <w:tab w:val="right" w:pos="10656"/>
+        <w:tab w:val="right" w:pos="9360"/>
       </w:tabs>
     </w:pPr>
     <w:r>
@@ -6188,7 +6099,7 @@
         <w:color w:val="595959"/>
         <w:sz w:val="15"/>
       </w:rPr>
-      <w:t>Table of Contents</w:t>
+      <w:t>Cover Letter</w:t>
     </w:r>
   </w:p>
 </w:ftr>
@@ -6203,7 +6114,7 @@
       </w:pBdr>
       <w:spacing w:before="80" w:after="0"/>
       <w:tabs>
-        <w:tab w:val="right" w:pos="10656"/>
+        <w:tab w:val="right" w:pos="9360"/>
       </w:tabs>
     </w:pPr>
     <w:r>
@@ -6227,7 +6138,7 @@
         <w:color w:val="595959"/>
         <w:sz w:val="15"/>
       </w:rPr>
-      <w:t>Cover Letter</w:t>
+      <w:t>Premium Summary</w:t>
     </w:r>
   </w:p>
 </w:ftr>
@@ -6242,7 +6153,7 @@
       </w:pBdr>
       <w:spacing w:before="80" w:after="0"/>
       <w:tabs>
-        <w:tab w:val="right" w:pos="10656"/>
+        <w:tab w:val="right" w:pos="9360"/>
       </w:tabs>
     </w:pPr>
     <w:r>
@@ -6266,7 +6177,7 @@
         <w:color w:val="595959"/>
         <w:sz w:val="15"/>
       </w:rPr>
-      <w:t>Premium Summary</w:t>
+      <w:t>Coverage Details (2 of 2)</w:t>
     </w:r>
   </w:p>
 </w:ftr>
@@ -6281,7 +6192,7 @@
       </w:pBdr>
       <w:spacing w:before="80" w:after="0"/>
       <w:tabs>
-        <w:tab w:val="right" w:pos="10656"/>
+        <w:tab w:val="right" w:pos="9360"/>
       </w:tabs>
     </w:pPr>
     <w:r>
@@ -6305,7 +6216,7 @@
         <w:color w:val="595959"/>
         <w:sz w:val="15"/>
       </w:rPr>
-      <w:t>Coverage Details (2 of 2)</w:t>
+      <w:t>Next Steps &amp; Authorization</w:t>
     </w:r>
   </w:p>
 </w:ftr>
@@ -6320,7 +6231,7 @@
       </w:pBdr>
       <w:spacing w:before="80" w:after="0"/>
       <w:tabs>
-        <w:tab w:val="right" w:pos="10656"/>
+        <w:tab w:val="right" w:pos="9360"/>
       </w:tabs>
     </w:pPr>
     <w:r>
@@ -6344,7 +6255,7 @@
         <w:color w:val="595959"/>
         <w:sz w:val="15"/>
       </w:rPr>
-      <w:t>Next Steps &amp; Authorization</w:t>
+      <w:t>Coverage Recommendations (1 of 3)</w:t>
     </w:r>
   </w:p>
 </w:ftr>
@@ -6359,7 +6270,7 @@
       </w:pBdr>
       <w:spacing w:before="80" w:after="0"/>
       <w:tabs>
-        <w:tab w:val="right" w:pos="10656"/>
+        <w:tab w:val="right" w:pos="9360"/>
       </w:tabs>
     </w:pPr>
     <w:r>
@@ -6383,7 +6294,7 @@
         <w:color w:val="595959"/>
         <w:sz w:val="15"/>
       </w:rPr>
-      <w:t>Coverage Recommendations (1 of 3)</w:t>
+      <w:t>Coverage Recommendations (2 of 3)</w:t>
     </w:r>
   </w:p>
 </w:ftr>
@@ -6398,46 +6309,7 @@
       </w:pBdr>
       <w:spacing w:before="80" w:after="0"/>
       <w:tabs>
-        <w:tab w:val="right" w:pos="10656"/>
-      </w:tabs>
-    </w:pPr>
-    <w:r>
-      <w:rPr>
-        <w:rFonts w:ascii="Arial" w:hAnsi="Arial"/>
-        <w:b w:val="0"/>
-        <w:i w:val="0"/>
-        <w:color w:val="595959"/>
-        <w:sz w:val="15"/>
-      </w:rPr>
-      <w:t>NBAIS Workers’ Compensation Proposal · {memberName} · Confidential</w:t>
-    </w:r>
-    <w:r>
-      <w:tab/>
-    </w:r>
-    <w:r>
-      <w:rPr>
-        <w:rFonts w:ascii="Arial" w:hAnsi="Arial"/>
-        <w:b w:val="0"/>
-        <w:i w:val="0"/>
-        <w:color w:val="595959"/>
-        <w:sz w:val="15"/>
-      </w:rPr>
-      <w:t>Coverage Recommendations (2 of 3)</w:t>
-    </w:r>
-  </w:p>
-</w:ftr>
-</file>
-
-<file path=word/footer9.xml><?xml version="1.0" encoding="utf-8"?>
-<w:ftr xmlns:m="http://schemas.openxmlformats.org/officeDocument/2006/math" xmlns:mc="http://schemas.openxmlformats.org/markup-compatibility/2006" xmlns:mo="http://schemas.microsoft.com/office/mac/office/2008/main" xmlns:mv="urn:schemas-microsoft-com:mac:vml" xmlns:o="urn:schemas-microsoft-com:office:office" xmlns:r="http://schemas.openxmlformats.org/officeDocument/2006/relationships" xmlns:v="urn:schemas-microsoft-com:vml" xmlns:w10="urn:schemas-microsoft-com:office:word" xmlns:w14="http://schemas.microsoft.com/office/word/2010/wordml" xmlns:w="http://schemas.openxmlformats.org/wordprocessingml/2006/main" xmlns:wne="http://schemas.microsoft.com/office/word/2006/wordml" xmlns:wp14="http://schemas.microsoft.com/office/word/2010/wordprocessingDrawing" xmlns:wp="http://schemas.openxmlformats.org/drawingml/2006/wordprocessingDrawing" xmlns:wpc="http://schemas.microsoft.com/office/word/2010/wordprocessingCanvas" xmlns:wpg="http://schemas.microsoft.com/office/word/2010/wordprocessingGroup" xmlns:wpi="http://schemas.microsoft.com/office/word/2010/wordprocessingInk" xmlns:wps="http://schemas.microsoft.com/office/word/2010/wordprocessingShape" mc:Ignorable="w14 wp14">
-  <w:p>
-    <w:pPr>
-      <w:pBdr>
-        <w:top w:val="single" w:sz="8" w:space="4" w:color="B0B0B0"/>
-      </w:pBdr>
-      <w:spacing w:before="80" w:after="0"/>
-      <w:tabs>
-        <w:tab w:val="right" w:pos="10656"/>
+        <w:tab w:val="right" w:pos="9360"/>
       </w:tabs>
     </w:pPr>
     <w:r>
@@ -6483,10 +6355,10 @@
     <w:pPr>
       <w:spacing w:before="0" w:after="60"/>
       <w:pBdr>
-        <w:bottom w:val="single" w:sz="16" w:space="4" w:color="1F3864"/>
+        <w:bottom w:val="single" w:sz="4" w:space="4" w:color="AAAAAA"/>
       </w:pBdr>
       <w:tabs>
-        <w:tab w:val="right" w:pos="10656"/>
+        <w:tab w:val="right" w:pos="9360"/>
       </w:tabs>
     </w:pPr>
     <w:r>

</xml_diff>

<commit_message>
fix(ADO#2631): NBAIS WC template fidelity pass — full visual match to Jay reference
</commit_message>
<xml_diff>
--- a/services/proposal-generator/templates/verticals/nbais-wc/master.docx
+++ b/services/proposal-generator/templates/verticals/nbais-wc/master.docx
@@ -87,7 +87,20 @@
           <w:color w:val="1F3864"/>
           <w:sz w:val="52"/>
         </w:rPr>
-        <w:t>Workers’ Compensation Insurance Proposal</w:t>
+        <w:t>Workers’ Compensation</w:t>
+      </w:r>
+      <w:r>
+        <w:br/>
+      </w:r>
+      <w:r>
+        <w:rPr>
+          <w:rFonts w:ascii="Arial" w:hAnsi="Arial"/>
+          <w:b/>
+          <w:i w:val="0"/>
+          <w:color w:val="1F3864"/>
+          <w:sz w:val="52"/>
+        </w:rPr>
+        <w:t>Insurance Proposal</w:t>
       </w:r>
     </w:p>
     <w:p>
@@ -445,23 +458,6 @@
     </w:p>
     <w:p>
       <w:pPr>
-        <w:shd w:val="clear" w:color="auto" w:fill="1F3864"/>
-        <w:spacing w:before="160" w:after="160"/>
-        <w:ind w:left="280"/>
-      </w:pPr>
-      <w:r>
-        <w:rPr>
-          <w:rFonts w:ascii="Arial" w:hAnsi="Arial"/>
-          <w:b/>
-          <w:i w:val="0"/>
-          <w:color w:val="FFFFFF"/>
-          <w:sz w:val="28"/>
-        </w:rPr>
-        <w:t>Cover Letter</w:t>
-      </w:r>
-    </w:p>
-    <w:p>
-      <w:pPr>
         <w:spacing w:before="60" w:after="60"/>
       </w:pPr>
       <w:r>
@@ -567,7 +563,7 @@
           <w:color w:val="595959"/>
           <w:sz w:val="20"/>
         </w:rPr>
-        <w:t>On behalf of Nevada Builders Alliance Insurance Solutions (NBAIS), we are pleased to present this Workers’ Compensation Insurance Proposal for your review. This proposal has been prepared specifically for your business based on the information provided and the Nevada Builders Alliance Member Program administered through NBAIS.</w:t>
+        <w:t>On behalf of Nevada Builders Alliance Insurance Services (NBAIS), we are pleased to present this Workers’ Compensation Insurance proposal exclusively for members of the Nevada Builders Alliance (NBA). This proposal has been prepared specifically for your organization and reflects the competitive program rates and enhanced coverage options available through your NBA membership.</w:t>
       </w:r>
     </w:p>
     <w:p>
@@ -583,7 +579,7 @@
           <w:color w:val="595959"/>
           <w:sz w:val="20"/>
         </w:rPr>
-        <w:t>The NBAIS Workers’ Compensation program is administered through the Builders Association of Western Nevada Self-Insured Group (BAWNSIG), a Nevada state-regulated self-insured group offering competitive rates and comprehensive coverage for member businesses.</w:t>
+        <w:t>NBAIS was established to serve the unique risk management needs of Nevada’s construction industry — from residential and commercial builders to specialty trade contractors. As an NBA member, your organization has access to a Workers’ Compensation program designed around the realities of your trade, not a one-size-fits-all solution.</w:t>
       </w:r>
     </w:p>
     <w:p>
@@ -606,19 +602,18 @@
     </w:p>
     <w:p>
       <w:pPr>
-        <w:spacing w:before="60" w:after="60"/>
-        <w:ind w:left="280"/>
-        <w:shd w:val="clear" w:color="auto" w:fill="EBF3FB"/>
+        <w:spacing w:before="40" w:after="40"/>
+        <w:ind w:left="360"/>
       </w:pPr>
       <w:r>
         <w:rPr>
           <w:rFonts w:ascii="Arial" w:hAnsi="Arial"/>
-          <w:b/>
+          <w:b w:val="0"/>
           <w:i w:val="0"/>
-          <w:color w:val="2E75B6"/>
+          <w:color w:val="595959"/>
           <w:sz w:val="20"/>
         </w:rPr>
-        <w:t xml:space="preserve">✓  </w:t>
+        <w:t xml:space="preserve">•  </w:t>
       </w:r>
       <w:r>
         <w:rPr>
@@ -628,24 +623,23 @@
           <w:color w:val="595959"/>
           <w:sz w:val="20"/>
         </w:rPr>
-        <w:t>Competitive rates designed for Nevada Builders Alliance members</w:t>
+        <w:t>Exclusive NBA member pricing — competitive group rates unavailable in the open market</w:t>
       </w:r>
     </w:p>
     <w:p>
       <w:pPr>
-        <w:spacing w:before="60" w:after="60"/>
-        <w:ind w:left="280"/>
-        <w:shd w:val="clear" w:color="auto" w:fill="EBF3FB"/>
+        <w:spacing w:before="40" w:after="40"/>
+        <w:ind w:left="360"/>
       </w:pPr>
       <w:r>
         <w:rPr>
           <w:rFonts w:ascii="Arial" w:hAnsi="Arial"/>
-          <w:b/>
+          <w:b w:val="0"/>
           <w:i w:val="0"/>
-          <w:color w:val="2E75B6"/>
+          <w:color w:val="595959"/>
           <w:sz w:val="20"/>
         </w:rPr>
-        <w:t xml:space="preserve">✓  </w:t>
+        <w:t xml:space="preserve">•  </w:t>
       </w:r>
       <w:r>
         <w:rPr>
@@ -655,24 +649,23 @@
           <w:color w:val="595959"/>
           <w:sz w:val="20"/>
         </w:rPr>
-        <w:t>Nevada statutory Workers’ Compensation coverage — Part I</w:t>
+        <w:t>Construction-class expertise — underwriting specialists who understand your trade</w:t>
       </w:r>
     </w:p>
     <w:p>
       <w:pPr>
-        <w:spacing w:before="60" w:after="60"/>
-        <w:ind w:left="280"/>
-        <w:shd w:val="clear" w:color="auto" w:fill="EBF3FB"/>
+        <w:spacing w:before="40" w:after="40"/>
+        <w:ind w:left="360"/>
       </w:pPr>
       <w:r>
         <w:rPr>
           <w:rFonts w:ascii="Arial" w:hAnsi="Arial"/>
-          <w:b/>
+          <w:b w:val="0"/>
           <w:i w:val="0"/>
-          <w:color w:val="2E75B6"/>
+          <w:color w:val="595959"/>
           <w:sz w:val="20"/>
         </w:rPr>
-        <w:t xml:space="preserve">✓  </w:t>
+        <w:t xml:space="preserve">•  </w:t>
       </w:r>
       <w:r>
         <w:rPr>
@@ -682,24 +675,23 @@
           <w:color w:val="595959"/>
           <w:sz w:val="20"/>
         </w:rPr>
-        <w:t>Employers’ Liability coverage — Part II, up to $1,000,000 per occurrence</w:t>
+        <w:t>Dividend potential — SIG participation with return of premium for favorable loss performance</w:t>
       </w:r>
     </w:p>
     <w:p>
       <w:pPr>
-        <w:spacing w:before="60" w:after="60"/>
-        <w:ind w:left="280"/>
-        <w:shd w:val="clear" w:color="auto" w:fill="EBF3FB"/>
+        <w:spacing w:before="40" w:after="40"/>
+        <w:ind w:left="360"/>
       </w:pPr>
       <w:r>
         <w:rPr>
           <w:rFonts w:ascii="Arial" w:hAnsi="Arial"/>
-          <w:b/>
+          <w:b w:val="0"/>
           <w:i w:val="0"/>
-          <w:color w:val="2E75B6"/>
+          <w:color w:val="595959"/>
           <w:sz w:val="20"/>
         </w:rPr>
-        <w:t xml:space="preserve">✓  </w:t>
+        <w:t xml:space="preserve">•  </w:t>
       </w:r>
       <w:r>
         <w:rPr>
@@ -709,24 +701,23 @@
           <w:color w:val="595959"/>
           <w:sz w:val="20"/>
         </w:rPr>
-        <w:t>Program managed by Lusense, an experienced WC program administrator</w:t>
+        <w:t>Loss control resources — proactive safety and claims management support</w:t>
       </w:r>
     </w:p>
     <w:p>
       <w:pPr>
-        <w:spacing w:before="60" w:after="60"/>
-        <w:ind w:left="280"/>
-        <w:shd w:val="clear" w:color="auto" w:fill="EBF3FB"/>
+        <w:spacing w:before="40" w:after="40"/>
+        <w:ind w:left="360"/>
       </w:pPr>
       <w:r>
         <w:rPr>
           <w:rFonts w:ascii="Arial" w:hAnsi="Arial"/>
-          <w:b/>
+          <w:b w:val="0"/>
           <w:i w:val="0"/>
-          <w:color w:val="2E75B6"/>
+          <w:color w:val="595959"/>
           <w:sz w:val="20"/>
         </w:rPr>
-        <w:t xml:space="preserve">✓  </w:t>
+        <w:t xml:space="preserve">•  </w:t>
       </w:r>
       <w:r>
         <w:rPr>
@@ -736,7 +727,7 @@
           <w:color w:val="595959"/>
           <w:sz w:val="20"/>
         </w:rPr>
-        <w:t>Secure online payment portal for convenient premium payment</w:t>
+        <w:t>Dedicated service team — NBAIS producers with direct carrier access</w:t>
       </w:r>
     </w:p>
     <w:p>
@@ -796,7 +787,7 @@
           <w:color w:val="595959"/>
           <w:sz w:val="20"/>
         </w:rPr>
-        <w:t>Premium Summary</w:t>
+        <w:t>Premium Summary &amp; Coverage at a Glance</w:t>
       </w:r>
       <w:r>
         <w:rPr>
@@ -806,7 +797,7 @@
           <w:color w:val="595959"/>
           <w:sz w:val="20"/>
         </w:rPr>
-        <w:t xml:space="preserve"> — Your estimated Workers’ Compensation premium for the policy period.</w:t>
+        <w:t xml:space="preserve"> — a summary of your proposed coverage terms and estimated premium.</w:t>
       </w:r>
     </w:p>
     <w:p>
@@ -832,7 +823,7 @@
           <w:color w:val="595959"/>
           <w:sz w:val="20"/>
         </w:rPr>
-        <w:t>Coverage Details</w:t>
+        <w:t>Workers’ Compensation Coverage Details</w:t>
       </w:r>
       <w:r>
         <w:rPr>
@@ -842,7 +833,7 @@
           <w:color w:val="595959"/>
           <w:sz w:val="20"/>
         </w:rPr>
-        <w:t xml:space="preserve"> — Policy terms, carrier information, coverage limits, and class schedule.</w:t>
+        <w:t xml:space="preserve"> — a detailed outline of the proposed coverage terms, limits, and exclusions applicable to your operation.</w:t>
       </w:r>
     </w:p>
     <w:p>
@@ -868,7 +859,7 @@
           <w:color w:val="595959"/>
           <w:sz w:val="20"/>
         </w:rPr>
-        <w:t>Next Steps &amp; Authorization</w:t>
+        <w:t>Carrier Quote</w:t>
       </w:r>
       <w:r>
         <w:rPr>
@@ -878,7 +869,7 @@
           <w:color w:val="595959"/>
           <w:sz w:val="20"/>
         </w:rPr>
-        <w:t xml:space="preserve"> — Instructions for binding coverage and member authorization.</w:t>
+        <w:t xml:space="preserve"> — the carrier quotation secured for your review, including the class code and payroll basis used to develop this quote. Please review for accuracy and notify us of any changes prior to binding.</w:t>
       </w:r>
     </w:p>
     <w:p>
@@ -914,7 +905,7 @@
           <w:color w:val="595959"/>
           <w:sz w:val="20"/>
         </w:rPr>
-        <w:t xml:space="preserve"> — Additional insurance lines available through NBAIS.</w:t>
+        <w:t xml:space="preserve"> — a comprehensive list of additional coverage lines for your consideration across commercial, personal, bond, employee benefits, and life planning categories.</w:t>
       </w:r>
     </w:p>
     <w:p>
@@ -929,23 +920,57 @@
         </w:sectPr>
       </w:pPr>
     </w:p>
-    <w:p>
-      <w:pPr>
-        <w:shd w:val="clear" w:color="auto" w:fill="1F3864"/>
-        <w:spacing w:before="160" w:after="160"/>
-        <w:ind w:left="280"/>
-      </w:pPr>
-      <w:r>
-        <w:rPr>
-          <w:rFonts w:ascii="Arial" w:hAnsi="Arial"/>
-          <w:b/>
-          <w:i w:val="0"/>
-          <w:color w:val="FFFFFF"/>
-          <w:sz w:val="28"/>
-        </w:rPr>
-        <w:t>Premium Summary</w:t>
-      </w:r>
-    </w:p>
+    <w:tbl>
+      <w:tblPr>
+        <w:tblW w:type="auto" w:w="0"/>
+        <w:tblLook w:firstColumn="1" w:firstRow="1" w:lastColumn="0" w:lastRow="0" w:noHBand="0" w:noVBand="1" w:val="04A0"/>
+        <w:tblBorders>
+          <w:top w:val="none" w:sz="0" w:space="0" w:color="auto"/>
+          <w:left w:val="none" w:sz="0" w:space="0" w:color="auto"/>
+          <w:bottom w:val="none" w:sz="0" w:space="0" w:color="auto"/>
+          <w:right w:val="none" w:sz="0" w:space="0" w:color="auto"/>
+          <w:insideH w:val="none" w:sz="0" w:space="0" w:color="auto"/>
+          <w:insideV w:val="none" w:sz="0" w:space="0" w:color="auto"/>
+        </w:tblBorders>
+        <w:tblW w:w="9360" w:type="dxa"/>
+      </w:tblPr>
+      <w:tblGrid>
+        <w:gridCol w:w="9360"/>
+      </w:tblGrid>
+      <w:tr>
+        <w:trPr>
+          <w:trHeight w:val="400" w:hRule="exact"/>
+        </w:trPr>
+        <w:tc>
+          <w:tcPr>
+            <w:tcW w:type="dxa" w:w="9360"/>
+            <w:shd w:val="clear" w:color="auto" w:fill="1F3864"/>
+            <w:tcMar>
+              <w:top w:w="60" w:type="dxa"/>
+              <w:bottom w:w="60" w:type="dxa"/>
+              <w:left w:w="115" w:type="dxa"/>
+              <w:right w:w="115" w:type="dxa"/>
+            </w:tcMar>
+            <w:vAlign w:val="center"/>
+          </w:tcPr>
+          <w:p>
+            <w:pPr>
+              <w:jc w:val="left"/>
+            </w:pPr>
+            <w:r>
+              <w:rPr>
+                <w:rFonts w:ascii="Arial" w:hAnsi="Arial"/>
+                <w:b/>
+                <w:i w:val="0"/>
+                <w:color w:val="FFFFFF"/>
+                <w:sz w:val="28"/>
+              </w:rPr>
+              <w:t>Premium Summary</w:t>
+            </w:r>
+          </w:p>
+        </w:tc>
+      </w:tr>
+    </w:tbl>
     <w:p>
       <w:pPr>
         <w:spacing w:before="160" w:after="200"/>
@@ -980,6 +1005,9 @@
         <w:gridCol w:w="4680"/>
       </w:tblGrid>
       <w:tr>
+        <w:trPr>
+          <w:tblHeader w:val="1"/>
+        </w:trPr>
         <w:tc>
           <w:tcPr>
             <w:tcW w:type="dxa" w:w="9360"/>
@@ -1017,6 +1045,7 @@
               <w:left w:w="115" w:type="dxa"/>
               <w:right w:w="115" w:type="dxa"/>
             </w:tcMar>
+            <w:vAlign w:val="center"/>
             <w:shd w:val="clear" w:color="auto" w:fill="F5F5F5"/>
           </w:tcPr>
           <w:p>
@@ -1042,6 +1071,7 @@
               <w:left w:w="115" w:type="dxa"/>
               <w:right w:w="115" w:type="dxa"/>
             </w:tcMar>
+            <w:vAlign w:val="center"/>
             <w:shd w:val="clear" w:color="auto" w:fill="F5F5F5"/>
           </w:tcPr>
           <w:p>
@@ -1069,6 +1099,7 @@
               <w:left w:w="115" w:type="dxa"/>
               <w:right w:w="115" w:type="dxa"/>
             </w:tcMar>
+            <w:vAlign w:val="center"/>
           </w:tcPr>
           <w:p>
             <w:r>
@@ -1093,6 +1124,7 @@
               <w:left w:w="115" w:type="dxa"/>
               <w:right w:w="115" w:type="dxa"/>
             </w:tcMar>
+            <w:vAlign w:val="center"/>
           </w:tcPr>
           <w:p>
             <w:r>
@@ -1119,6 +1151,7 @@
               <w:left w:w="115" w:type="dxa"/>
               <w:right w:w="115" w:type="dxa"/>
             </w:tcMar>
+            <w:vAlign w:val="center"/>
             <w:shd w:val="clear" w:color="auto" w:fill="F5F5F5"/>
           </w:tcPr>
           <w:p>
@@ -1144,6 +1177,7 @@
               <w:left w:w="115" w:type="dxa"/>
               <w:right w:w="115" w:type="dxa"/>
             </w:tcMar>
+            <w:vAlign w:val="center"/>
             <w:shd w:val="clear" w:color="auto" w:fill="F5F5F5"/>
           </w:tcPr>
           <w:p>
@@ -1171,6 +1205,7 @@
               <w:left w:w="115" w:type="dxa"/>
               <w:right w:w="115" w:type="dxa"/>
             </w:tcMar>
+            <w:vAlign w:val="center"/>
           </w:tcPr>
           <w:p>
             <w:r>
@@ -1195,6 +1230,7 @@
               <w:left w:w="115" w:type="dxa"/>
               <w:right w:w="115" w:type="dxa"/>
             </w:tcMar>
+            <w:vAlign w:val="center"/>
           </w:tcPr>
           <w:p>
             <w:r>
@@ -1221,6 +1257,7 @@
               <w:left w:w="115" w:type="dxa"/>
               <w:right w:w="115" w:type="dxa"/>
             </w:tcMar>
+            <w:vAlign w:val="center"/>
             <w:shd w:val="clear" w:color="auto" w:fill="F5F5F5"/>
           </w:tcPr>
           <w:p>
@@ -1246,6 +1283,7 @@
               <w:left w:w="115" w:type="dxa"/>
               <w:right w:w="115" w:type="dxa"/>
             </w:tcMar>
+            <w:vAlign w:val="center"/>
             <w:shd w:val="clear" w:color="auto" w:fill="F5F5F5"/>
           </w:tcPr>
           <w:p>
@@ -1273,6 +1311,7 @@
               <w:left w:w="115" w:type="dxa"/>
               <w:right w:w="115" w:type="dxa"/>
             </w:tcMar>
+            <w:vAlign w:val="center"/>
           </w:tcPr>
           <w:p>
             <w:r>
@@ -1297,6 +1336,7 @@
               <w:left w:w="115" w:type="dxa"/>
               <w:right w:w="115" w:type="dxa"/>
             </w:tcMar>
+            <w:vAlign w:val="center"/>
           </w:tcPr>
           <w:p>
             <w:r>
@@ -1323,6 +1363,7 @@
               <w:left w:w="115" w:type="dxa"/>
               <w:right w:w="115" w:type="dxa"/>
             </w:tcMar>
+            <w:vAlign w:val="center"/>
             <w:shd w:val="clear" w:color="auto" w:fill="F5F5F5"/>
           </w:tcPr>
           <w:p>
@@ -1348,6 +1389,7 @@
               <w:left w:w="115" w:type="dxa"/>
               <w:right w:w="115" w:type="dxa"/>
             </w:tcMar>
+            <w:vAlign w:val="center"/>
             <w:shd w:val="clear" w:color="auto" w:fill="F5F5F5"/>
           </w:tcPr>
           <w:p>
@@ -1375,6 +1417,7 @@
               <w:left w:w="115" w:type="dxa"/>
               <w:right w:w="115" w:type="dxa"/>
             </w:tcMar>
+            <w:vAlign w:val="center"/>
           </w:tcPr>
           <w:p>
             <w:r>
@@ -1399,6 +1442,7 @@
               <w:left w:w="115" w:type="dxa"/>
               <w:right w:w="115" w:type="dxa"/>
             </w:tcMar>
+            <w:vAlign w:val="center"/>
           </w:tcPr>
           <w:p>
             <w:r>
@@ -1425,6 +1469,7 @@
               <w:left w:w="115" w:type="dxa"/>
               <w:right w:w="115" w:type="dxa"/>
             </w:tcMar>
+            <w:vAlign w:val="center"/>
             <w:shd w:val="clear" w:color="auto" w:fill="F5F5F5"/>
           </w:tcPr>
           <w:p>
@@ -1450,6 +1495,7 @@
               <w:left w:w="115" w:type="dxa"/>
               <w:right w:w="115" w:type="dxa"/>
             </w:tcMar>
+            <w:vAlign w:val="center"/>
             <w:shd w:val="clear" w:color="auto" w:fill="F5F5F5"/>
           </w:tcPr>
           <w:p>
@@ -1567,21 +1613,97 @@
     </w:tbl>
     <w:p>
       <w:pPr>
-        <w:shd w:val="clear" w:color="auto" w:fill="1F3864"/>
-        <w:spacing w:before="160" w:after="160"/>
-        <w:ind w:left="280"/>
+        <w:spacing w:before="240" w:after="120"/>
+        <w:pBdr>
+          <w:bottom w:val="single" w:sz="8" w:space="4" w:color="CCCCCC"/>
+        </w:pBdr>
       </w:pPr>
       <w:r>
         <w:rPr>
           <w:rFonts w:ascii="Arial" w:hAnsi="Arial"/>
           <w:b/>
           <w:i w:val="0"/>
-          <w:color w:val="FFFFFF"/>
-          <w:sz w:val="26"/>
+          <w:color w:val="1F3864"/>
+          <w:sz w:val="22"/>
         </w:rPr>
-        <w:t>Coverage Details — Workers’ Compensation</w:t>
+        <w:t>What’s next</w:t>
       </w:r>
     </w:p>
+    <w:p>
+      <w:pPr>
+        <w:spacing w:before="0" w:after="160"/>
+        <w:jc w:val="left"/>
+      </w:pPr>
+      <w:r>
+        <w:rPr>
+          <w:rFonts w:ascii="Arial" w:hAnsi="Arial"/>
+          <w:b w:val="0"/>
+          <w:i w:val="0"/>
+          <w:color w:val="595959"/>
+          <w:sz w:val="20"/>
+        </w:rPr>
+        <w:t>Review the Coverage Details on the following page, confirm payroll and class code accuracy, and contact your NBAIS producer to bind. Final premium will be reconciled at audit.</w:t>
+      </w:r>
+    </w:p>
+    <w:p>
+      <w:pPr>
+        <w:spacing w:before="0" w:after="0"/>
+      </w:pPr>
+      <w:r>
+        <w:br w:type="page"/>
+      </w:r>
+    </w:p>
+    <w:tbl>
+      <w:tblPr>
+        <w:tblW w:type="auto" w:w="0"/>
+        <w:tblLook w:firstColumn="1" w:firstRow="1" w:lastColumn="0" w:lastRow="0" w:noHBand="0" w:noVBand="1" w:val="04A0"/>
+        <w:tblBorders>
+          <w:top w:val="none" w:sz="0" w:space="0" w:color="auto"/>
+          <w:left w:val="none" w:sz="0" w:space="0" w:color="auto"/>
+          <w:bottom w:val="none" w:sz="0" w:space="0" w:color="auto"/>
+          <w:right w:val="none" w:sz="0" w:space="0" w:color="auto"/>
+          <w:insideH w:val="none" w:sz="0" w:space="0" w:color="auto"/>
+          <w:insideV w:val="none" w:sz="0" w:space="0" w:color="auto"/>
+        </w:tblBorders>
+        <w:tblW w:w="9360" w:type="dxa"/>
+      </w:tblPr>
+      <w:tblGrid>
+        <w:gridCol w:w="9360"/>
+      </w:tblGrid>
+      <w:tr>
+        <w:trPr>
+          <w:trHeight w:val="400" w:hRule="exact"/>
+        </w:trPr>
+        <w:tc>
+          <w:tcPr>
+            <w:tcW w:type="dxa" w:w="9360"/>
+            <w:shd w:val="clear" w:color="auto" w:fill="1F3864"/>
+            <w:tcMar>
+              <w:top w:w="60" w:type="dxa"/>
+              <w:bottom w:w="60" w:type="dxa"/>
+              <w:left w:w="115" w:type="dxa"/>
+              <w:right w:w="115" w:type="dxa"/>
+            </w:tcMar>
+            <w:vAlign w:val="center"/>
+          </w:tcPr>
+          <w:p>
+            <w:pPr>
+              <w:jc w:val="left"/>
+            </w:pPr>
+            <w:r>
+              <w:rPr>
+                <w:rFonts w:ascii="Arial" w:hAnsi="Arial"/>
+                <w:b/>
+                <w:i w:val="0"/>
+                <w:color w:val="FFFFFF"/>
+                <w:sz w:val="26"/>
+              </w:rPr>
+              <w:t>Coverage Details — Workers’ Compensation</w:t>
+            </w:r>
+          </w:p>
+        </w:tc>
+      </w:tr>
+    </w:tbl>
     <w:p>
       <w:pPr>
         <w:spacing w:before="240" w:after="120"/>
@@ -1629,6 +1751,7 @@
               <w:left w:w="115" w:type="dxa"/>
               <w:right w:w="115" w:type="dxa"/>
             </w:tcMar>
+            <w:vAlign w:val="center"/>
             <w:shd w:val="clear" w:color="auto" w:fill="F5F5F5"/>
           </w:tcPr>
           <w:p>
@@ -1654,6 +1777,7 @@
               <w:left w:w="115" w:type="dxa"/>
               <w:right w:w="115" w:type="dxa"/>
             </w:tcMar>
+            <w:vAlign w:val="center"/>
             <w:shd w:val="clear" w:color="auto" w:fill="F5F5F5"/>
           </w:tcPr>
           <w:p>
@@ -1681,6 +1805,7 @@
               <w:left w:w="115" w:type="dxa"/>
               <w:right w:w="115" w:type="dxa"/>
             </w:tcMar>
+            <w:vAlign w:val="center"/>
           </w:tcPr>
           <w:p>
             <w:r>
@@ -1705,6 +1830,7 @@
               <w:left w:w="115" w:type="dxa"/>
               <w:right w:w="115" w:type="dxa"/>
             </w:tcMar>
+            <w:vAlign w:val="center"/>
           </w:tcPr>
           <w:p>
             <w:r>
@@ -1731,6 +1857,7 @@
               <w:left w:w="115" w:type="dxa"/>
               <w:right w:w="115" w:type="dxa"/>
             </w:tcMar>
+            <w:vAlign w:val="center"/>
             <w:shd w:val="clear" w:color="auto" w:fill="F5F5F5"/>
           </w:tcPr>
           <w:p>
@@ -1756,6 +1883,7 @@
               <w:left w:w="115" w:type="dxa"/>
               <w:right w:w="115" w:type="dxa"/>
             </w:tcMar>
+            <w:vAlign w:val="center"/>
             <w:shd w:val="clear" w:color="auto" w:fill="F5F5F5"/>
           </w:tcPr>
           <w:p>
@@ -1783,6 +1911,7 @@
               <w:left w:w="115" w:type="dxa"/>
               <w:right w:w="115" w:type="dxa"/>
             </w:tcMar>
+            <w:vAlign w:val="center"/>
           </w:tcPr>
           <w:p>
             <w:r>
@@ -1807,6 +1936,7 @@
               <w:left w:w="115" w:type="dxa"/>
               <w:right w:w="115" w:type="dxa"/>
             </w:tcMar>
+            <w:vAlign w:val="center"/>
           </w:tcPr>
           <w:p>
             <w:r>
@@ -1833,6 +1963,7 @@
               <w:left w:w="115" w:type="dxa"/>
               <w:right w:w="115" w:type="dxa"/>
             </w:tcMar>
+            <w:vAlign w:val="center"/>
             <w:shd w:val="clear" w:color="auto" w:fill="F5F5F5"/>
           </w:tcPr>
           <w:p>
@@ -1858,6 +1989,7 @@
               <w:left w:w="115" w:type="dxa"/>
               <w:right w:w="115" w:type="dxa"/>
             </w:tcMar>
+            <w:vAlign w:val="center"/>
             <w:shd w:val="clear" w:color="auto" w:fill="F5F5F5"/>
           </w:tcPr>
           <w:p>
@@ -1885,6 +2017,7 @@
               <w:left w:w="115" w:type="dxa"/>
               <w:right w:w="115" w:type="dxa"/>
             </w:tcMar>
+            <w:vAlign w:val="center"/>
           </w:tcPr>
           <w:p>
             <w:r>
@@ -1909,6 +2042,7 @@
               <w:left w:w="115" w:type="dxa"/>
               <w:right w:w="115" w:type="dxa"/>
             </w:tcMar>
+            <w:vAlign w:val="center"/>
           </w:tcPr>
           <w:p>
             <w:r>
@@ -1995,6 +2129,9 @@
         <w:gridCol w:w="4680"/>
       </w:tblGrid>
       <w:tr>
+        <w:trPr>
+          <w:tblHeader w:val="1"/>
+        </w:trPr>
         <w:tc>
           <w:tcPr>
             <w:tcW w:type="dxa" w:w="4680"/>
@@ -2053,6 +2190,7 @@
               <w:left w:w="80" w:type="dxa"/>
               <w:right w:w="60" w:type="dxa"/>
             </w:tcMar>
+            <w:vAlign w:val="center"/>
             <w:shd w:val="clear" w:color="auto" w:fill="F5F5F5"/>
           </w:tcPr>
           <w:p>
@@ -2078,6 +2216,7 @@
               <w:left w:w="80" w:type="dxa"/>
               <w:right w:w="60" w:type="dxa"/>
             </w:tcMar>
+            <w:vAlign w:val="center"/>
             <w:shd w:val="clear" w:color="auto" w:fill="F5F5F5"/>
           </w:tcPr>
           <w:p>
@@ -2105,6 +2244,7 @@
               <w:left w:w="80" w:type="dxa"/>
               <w:right w:w="60" w:type="dxa"/>
             </w:tcMar>
+            <w:vAlign w:val="center"/>
           </w:tcPr>
           <w:p>
             <w:r>
@@ -2129,6 +2269,7 @@
               <w:left w:w="80" w:type="dxa"/>
               <w:right w:w="60" w:type="dxa"/>
             </w:tcMar>
+            <w:vAlign w:val="center"/>
           </w:tcPr>
           <w:p>
             <w:r>
@@ -2155,6 +2296,7 @@
               <w:left w:w="80" w:type="dxa"/>
               <w:right w:w="60" w:type="dxa"/>
             </w:tcMar>
+            <w:vAlign w:val="center"/>
             <w:shd w:val="clear" w:color="auto" w:fill="F5F5F5"/>
           </w:tcPr>
           <w:p>
@@ -2180,6 +2322,7 @@
               <w:left w:w="80" w:type="dxa"/>
               <w:right w:w="60" w:type="dxa"/>
             </w:tcMar>
+            <w:vAlign w:val="center"/>
             <w:shd w:val="clear" w:color="auto" w:fill="F5F5F5"/>
           </w:tcPr>
           <w:p>
@@ -2207,6 +2350,7 @@
               <w:left w:w="80" w:type="dxa"/>
               <w:right w:w="60" w:type="dxa"/>
             </w:tcMar>
+            <w:vAlign w:val="center"/>
           </w:tcPr>
           <w:p>
             <w:r>
@@ -2231,6 +2375,7 @@
               <w:left w:w="80" w:type="dxa"/>
               <w:right w:w="60" w:type="dxa"/>
             </w:tcMar>
+            <w:vAlign w:val="center"/>
           </w:tcPr>
           <w:p>
             <w:r>
@@ -2268,7 +2413,6 @@
     <w:p>
       <w:pPr>
         <w:spacing w:before="80" w:after="80"/>
-        <w:jc w:val="left"/>
       </w:pPr>
       <w:r>
         <w:rPr>
@@ -2278,7 +2422,17 @@
           <w:color w:val="595959"/>
           <w:sz w:val="20"/>
         </w:rPr>
-        <w:t>A surplus contribution of 8% of the estimated premium is required for participation in the BAWNSIG self-insured group. This contribution is held in reserve and is not considered an insurance premium. It may be refundable upon cancellation per program terms.</w:t>
+        <w:t xml:space="preserve">As a self-insured group (SIG), BAWNSIG requires a surplus contribution in addition to the estimated premium. This contribution — calculated at 8% of the estimated premium — is a regulatory requirement for SIG participation in Nevada and supports the financial reserves of the group. </w:t>
+      </w:r>
+      <w:r>
+        <w:rPr>
+          <w:rFonts w:ascii="Arial" w:hAnsi="Arial"/>
+          <w:b/>
+          <w:i w:val="0"/>
+          <w:color w:val="595959"/>
+          <w:sz w:val="20"/>
+        </w:rPr>
+        <w:t>It is not a fee retained by NBAIS or your producer.</w:t>
       </w:r>
     </w:p>
     <w:p>
@@ -2292,23 +2446,57 @@
         </w:sectPr>
       </w:pPr>
     </w:p>
-    <w:p>
-      <w:pPr>
-        <w:shd w:val="clear" w:color="auto" w:fill="1F3864"/>
-        <w:spacing w:before="160" w:after="160"/>
-        <w:ind w:left="280"/>
-      </w:pPr>
-      <w:r>
-        <w:rPr>
-          <w:rFonts w:ascii="Arial" w:hAnsi="Arial"/>
-          <w:b/>
-          <w:i w:val="0"/>
-          <w:color w:val="FFFFFF"/>
-          <w:sz w:val="26"/>
-        </w:rPr>
-        <w:t>Coverage Details (continued)</w:t>
-      </w:r>
-    </w:p>
+    <w:tbl>
+      <w:tblPr>
+        <w:tblW w:type="auto" w:w="0"/>
+        <w:tblLook w:firstColumn="1" w:firstRow="1" w:lastColumn="0" w:lastRow="0" w:noHBand="0" w:noVBand="1" w:val="04A0"/>
+        <w:tblBorders>
+          <w:top w:val="none" w:sz="0" w:space="0" w:color="auto"/>
+          <w:left w:val="none" w:sz="0" w:space="0" w:color="auto"/>
+          <w:bottom w:val="none" w:sz="0" w:space="0" w:color="auto"/>
+          <w:right w:val="none" w:sz="0" w:space="0" w:color="auto"/>
+          <w:insideH w:val="none" w:sz="0" w:space="0" w:color="auto"/>
+          <w:insideV w:val="none" w:sz="0" w:space="0" w:color="auto"/>
+        </w:tblBorders>
+        <w:tblW w:w="9360" w:type="dxa"/>
+      </w:tblPr>
+      <w:tblGrid>
+        <w:gridCol w:w="9360"/>
+      </w:tblGrid>
+      <w:tr>
+        <w:trPr>
+          <w:trHeight w:val="400" w:hRule="exact"/>
+        </w:trPr>
+        <w:tc>
+          <w:tcPr>
+            <w:tcW w:type="dxa" w:w="9360"/>
+            <w:shd w:val="clear" w:color="auto" w:fill="1F3864"/>
+            <w:tcMar>
+              <w:top w:w="60" w:type="dxa"/>
+              <w:bottom w:w="60" w:type="dxa"/>
+              <w:left w:w="115" w:type="dxa"/>
+              <w:right w:w="115" w:type="dxa"/>
+            </w:tcMar>
+            <w:vAlign w:val="center"/>
+          </w:tcPr>
+          <w:p>
+            <w:pPr>
+              <w:jc w:val="left"/>
+            </w:pPr>
+            <w:r>
+              <w:rPr>
+                <w:rFonts w:ascii="Arial" w:hAnsi="Arial"/>
+                <w:b/>
+                <w:i w:val="0"/>
+                <w:color w:val="FFFFFF"/>
+                <w:sz w:val="26"/>
+              </w:rPr>
+              <w:t>Coverage Details (continued)</w:t>
+            </w:r>
+          </w:p>
+        </w:tc>
+      </w:tr>
+    </w:tbl>
     <w:p>
       <w:pPr>
         <w:spacing w:before="240" w:after="120"/>
@@ -2350,6 +2538,9 @@
         <w:gridCol w:w="1560"/>
       </w:tblGrid>
       <w:tr>
+        <w:trPr>
+          <w:tblHeader w:val="1"/>
+        </w:trPr>
         <w:tc>
           <w:tcPr>
             <w:tcW w:type="dxa" w:w="1560"/>
@@ -2512,6 +2703,7 @@
               <w:left w:w="80" w:type="dxa"/>
               <w:right w:w="80" w:type="dxa"/>
             </w:tcMar>
+            <w:vAlign w:val="center"/>
           </w:tcPr>
           <w:p>
             <w:r>
@@ -2548,6 +2740,7 @@
               <w:left w:w="80" w:type="dxa"/>
               <w:right w:w="80" w:type="dxa"/>
             </w:tcMar>
+            <w:vAlign w:val="center"/>
           </w:tcPr>
           <w:p>
             <w:r>
@@ -2572,6 +2765,7 @@
               <w:left w:w="80" w:type="dxa"/>
               <w:right w:w="80" w:type="dxa"/>
             </w:tcMar>
+            <w:vAlign w:val="center"/>
           </w:tcPr>
           <w:p>
             <w:r>
@@ -2596,6 +2790,7 @@
               <w:left w:w="80" w:type="dxa"/>
               <w:right w:w="80" w:type="dxa"/>
             </w:tcMar>
+            <w:vAlign w:val="center"/>
           </w:tcPr>
           <w:p>
             <w:r>
@@ -2620,6 +2815,7 @@
               <w:left w:w="80" w:type="dxa"/>
               <w:right w:w="80" w:type="dxa"/>
             </w:tcMar>
+            <w:vAlign w:val="center"/>
           </w:tcPr>
           <w:p>
             <w:r>
@@ -2644,6 +2840,7 @@
               <w:left w:w="80" w:type="dxa"/>
               <w:right w:w="80" w:type="dxa"/>
             </w:tcMar>
+            <w:vAlign w:val="center"/>
           </w:tcPr>
           <w:p>
             <w:r>
@@ -2796,6 +2993,9 @@
         <w:gridCol w:w="4680"/>
       </w:tblGrid>
       <w:tr>
+        <w:trPr>
+          <w:tblHeader w:val="1"/>
+        </w:trPr>
         <w:tc>
           <w:tcPr>
             <w:tcW w:type="dxa" w:w="4680"/>
@@ -2967,23 +3167,56 @@
         <w:t>Self-Insured Group Disclosure</w:t>
       </w:r>
     </w:p>
-    <w:p>
-      <w:pPr>
-        <w:spacing w:before="80" w:after="80"/>
-        <w:ind w:left="280"/>
-        <w:shd w:val="clear" w:color="auto" w:fill="F5F5F5"/>
-      </w:pPr>
-      <w:r>
-        <w:rPr>
-          <w:rFonts w:ascii="Arial" w:hAnsi="Arial"/>
-          <w:b w:val="0"/>
-          <w:i w:val="0"/>
-          <w:color w:val="595959"/>
-          <w:sz w:val="18"/>
-        </w:rPr>
-        <w:t>BAWNSIG is a Nevada state-regulated self-insured group, not an insurance company. Coverage is provided through the group’s self-insurance fund. This program is not guaranteed by the Nevada Insurance Guaranty Association. Members should review the program disclosure statement for full details regarding the self-insured group structure, surplus requirements, and financial stability.</w:t>
-      </w:r>
-    </w:p>
+    <w:tbl>
+      <w:tblPr>
+        <w:tblW w:type="auto" w:w="0"/>
+        <w:tblLook w:firstColumn="1" w:firstRow="1" w:lastColumn="0" w:lastRow="0" w:noHBand="0" w:noVBand="1" w:val="04A0"/>
+        <w:tblBorders>
+          <w:top w:val="none" w:sz="0" w:space="0" w:color="auto"/>
+          <w:left w:val="none" w:sz="0" w:space="0" w:color="auto"/>
+          <w:bottom w:val="none" w:sz="0" w:space="0" w:color="auto"/>
+          <w:right w:val="none" w:sz="0" w:space="0" w:color="auto"/>
+          <w:insideH w:val="none" w:sz="0" w:space="0" w:color="auto"/>
+          <w:insideV w:val="none" w:sz="0" w:space="0" w:color="auto"/>
+        </w:tblBorders>
+        <w:tblW w:w="9360" w:type="dxa"/>
+      </w:tblPr>
+      <w:tblGrid>
+        <w:gridCol w:w="9360"/>
+      </w:tblGrid>
+      <w:tr>
+        <w:tc>
+          <w:tcPr>
+            <w:tcW w:type="dxa" w:w="9360"/>
+            <w:shd w:val="clear" w:color="auto" w:fill="E8E8E8"/>
+            <w:tcMar>
+              <w:top w:w="100" w:type="dxa"/>
+              <w:bottom w:w="100" w:type="dxa"/>
+              <w:left w:w="130" w:type="dxa"/>
+              <w:right w:w="100" w:type="dxa"/>
+            </w:tcMar>
+            <w:tcBorders>
+              <w:left w:val="single" w:sz="24" w:space="0" w:color="2E75B6"/>
+              <w:top w:val="none" w:sz="0" w:space="0" w:color="auto"/>
+              <w:bottom w:val="none" w:sz="0" w:space="0" w:color="auto"/>
+              <w:right w:val="none" w:sz="0" w:space="0" w:color="auto"/>
+            </w:tcBorders>
+          </w:tcPr>
+          <w:p>
+            <w:r>
+              <w:rPr>
+                <w:rFonts w:ascii="Arial" w:hAnsi="Arial"/>
+                <w:b w:val="0"/>
+                <w:i w:val="0"/>
+                <w:color w:val="595959"/>
+                <w:sz w:val="19"/>
+              </w:rPr>
+              <w:t>BAWNSIG is a Nevada-regulated self-insured group, not a traditional insurance carrier, and therefore does not carry an AM Best financial strength rating. BAWNSIG operates under the regulatory oversight of the Nevada Division of Industrial Relations and maintains reserves in accordance with state requirements. Members of NBAIS benefit from the group’s long-standing solvency and claims-paying history as a construction industry SIG in Nevada.</w:t>
+            </w:r>
+          </w:p>
+        </w:tc>
+      </w:tr>
+    </w:tbl>
     <w:p>
       <w:pPr>
         <w:sectPr>
@@ -2995,23 +3228,57 @@
         </w:sectPr>
       </w:pPr>
     </w:p>
-    <w:p>
-      <w:pPr>
-        <w:shd w:val="clear" w:color="auto" w:fill="1F3864"/>
-        <w:spacing w:before="160" w:after="160"/>
-        <w:ind w:left="280"/>
-      </w:pPr>
-      <w:r>
-        <w:rPr>
-          <w:rFonts w:ascii="Arial" w:hAnsi="Arial"/>
-          <w:b/>
-          <w:i w:val="0"/>
-          <w:color w:val="FFFFFF"/>
-          <w:sz w:val="28"/>
-        </w:rPr>
-        <w:t>Next Steps &amp; Member Authorization</w:t>
-      </w:r>
-    </w:p>
+    <w:tbl>
+      <w:tblPr>
+        <w:tblW w:type="auto" w:w="0"/>
+        <w:tblLook w:firstColumn="1" w:firstRow="1" w:lastColumn="0" w:lastRow="0" w:noHBand="0" w:noVBand="1" w:val="04A0"/>
+        <w:tblBorders>
+          <w:top w:val="none" w:sz="0" w:space="0" w:color="auto"/>
+          <w:left w:val="none" w:sz="0" w:space="0" w:color="auto"/>
+          <w:bottom w:val="none" w:sz="0" w:space="0" w:color="auto"/>
+          <w:right w:val="none" w:sz="0" w:space="0" w:color="auto"/>
+          <w:insideH w:val="none" w:sz="0" w:space="0" w:color="auto"/>
+          <w:insideV w:val="none" w:sz="0" w:space="0" w:color="auto"/>
+        </w:tblBorders>
+        <w:tblW w:w="9360" w:type="dxa"/>
+      </w:tblPr>
+      <w:tblGrid>
+        <w:gridCol w:w="9360"/>
+      </w:tblGrid>
+      <w:tr>
+        <w:trPr>
+          <w:trHeight w:val="400" w:hRule="exact"/>
+        </w:trPr>
+        <w:tc>
+          <w:tcPr>
+            <w:tcW w:type="dxa" w:w="9360"/>
+            <w:shd w:val="clear" w:color="auto" w:fill="1F3864"/>
+            <w:tcMar>
+              <w:top w:w="60" w:type="dxa"/>
+              <w:bottom w:w="60" w:type="dxa"/>
+              <w:left w:w="115" w:type="dxa"/>
+              <w:right w:w="115" w:type="dxa"/>
+            </w:tcMar>
+            <w:vAlign w:val="center"/>
+          </w:tcPr>
+          <w:p>
+            <w:pPr>
+              <w:jc w:val="left"/>
+            </w:pPr>
+            <w:r>
+              <w:rPr>
+                <w:rFonts w:ascii="Arial" w:hAnsi="Arial"/>
+                <w:b/>
+                <w:i w:val="0"/>
+                <w:color w:val="FFFFFF"/>
+                <w:sz w:val="28"/>
+              </w:rPr>
+              <w:t>Next Steps &amp; Member Authorization</w:t>
+            </w:r>
+          </w:p>
+        </w:tc>
+      </w:tr>
+    </w:tbl>
     <w:p>
       <w:pPr>
         <w:spacing w:before="160" w:after="160"/>
@@ -3025,7 +3292,7 @@
           <w:color w:val="595959"/>
           <w:sz w:val="20"/>
         </w:rPr>
-        <w:t>To bind coverage under the NBAIS Workers’ Compensation program, please review this proposal, complete the Member Authorization below, and return it to your NBAIS producer. Coverage will be bound upon receipt of the signed authorization and initial down payment.</w:t>
+        <w:t>To bind coverage or to discuss this proposal in further detail, please contact your NBAIS producer using the information below. Please review all coverage details carefully and confirm payroll and class code accuracy prior to binding, as final premium is subject to audit.</w:t>
       </w:r>
     </w:p>
     <w:tbl>
@@ -3033,14 +3300,17 @@
         <w:tblW w:type="auto" w:w="0"/>
         <w:tblLook w:firstColumn="1" w:firstRow="1" w:lastColumn="0" w:lastRow="0" w:noHBand="0" w:noVBand="1" w:val="04A0"/>
         <w:tblBorders>
-          <w:top w:val="single" w:sz="4" w:space="0" w:color="CCCCCC"/>
-          <w:left w:val="single" w:sz="4" w:space="0" w:color="CCCCCC"/>
-          <w:bottom w:val="single" w:sz="4" w:space="0" w:color="CCCCCC"/>
-          <w:right w:val="single" w:sz="4" w:space="0" w:color="CCCCCC"/>
-          <w:insideH w:val="single" w:sz="4" w:space="0" w:color="CCCCCC"/>
+          <w:top w:val="none" w:sz="0" w:space="0" w:color="auto"/>
+          <w:left w:val="none" w:sz="0" w:space="0" w:color="auto"/>
+          <w:bottom w:val="none" w:sz="0" w:space="0" w:color="auto"/>
+          <w:right w:val="none" w:sz="0" w:space="0" w:color="auto"/>
+          <w:insideH w:val="none" w:sz="0" w:space="0" w:color="auto"/>
+          <w:insideV w:val="none" w:sz="0" w:space="0" w:color="auto"/>
+        </w:tblBorders>
+        <w:tblW w:w="9360" w:type="dxa"/>
+        <w:tblBorders>
           <w:insideV w:val="single" w:sz="4" w:space="0" w:color="CCCCCC"/>
         </w:tblBorders>
-        <w:tblW w:w="9360" w:type="dxa"/>
       </w:tblPr>
       <w:tblGrid>
         <w:gridCol w:w="4680"/>
@@ -3051,7 +3321,7 @@
           <w:tcPr>
             <w:tcW w:type="dxa" w:w="4680"/>
             <w:tcW w:w="4680" w:type="dxa"/>
-            <w:shd w:val="clear" w:color="auto" w:fill="F5F5F5"/>
+            <w:shd w:val="clear" w:color="auto" w:fill="E8E8E8"/>
             <w:tcMar>
               <w:top w:w="100" w:type="dxa"/>
               <w:bottom w:w="100" w:type="dxa"/>
@@ -3124,7 +3394,7 @@
           <w:tcPr>
             <w:tcW w:type="dxa" w:w="4680"/>
             <w:tcW w:w="4680" w:type="dxa"/>
-            <w:shd w:val="clear" w:color="auto" w:fill="F5F5F5"/>
+            <w:shd w:val="clear" w:color="auto" w:fill="E8E8E8"/>
             <w:tcMar>
               <w:top w:w="100" w:type="dxa"/>
               <w:bottom w:w="100" w:type="dxa"/>
@@ -3185,21 +3455,6 @@
     </w:tbl>
     <w:p>
       <w:pPr>
-        <w:spacing w:before="280" w:after="160"/>
-      </w:pPr>
-      <w:r>
-        <w:rPr>
-          <w:rFonts w:ascii="Arial" w:hAnsi="Arial"/>
-          <w:b/>
-          <w:i w:val="0"/>
-          <w:color w:val="C00000"/>
-          <w:sz w:val="26"/>
-        </w:rPr>
-        <w:t>What’s Next</w:t>
-      </w:r>
-    </w:p>
-    <w:p>
-      <w:pPr>
         <w:spacing w:before="240" w:after="120"/>
         <w:pBdr>
           <w:bottom w:val="single" w:sz="8" w:space="4" w:color="CCCCCC"/>
@@ -3229,7 +3484,7 @@
           <w:color w:val="595959"/>
           <w:sz w:val="20"/>
         </w:rPr>
-        <w:t>By signing below, the undersigned authorized representative of the named member acknowledges receipt of this Workers’ Compensation Insurance Proposal and authorizes NBAIS to bind coverage as outlined herein. The undersigned confirms that all information provided in connection with this application is accurate and complete to the best of their knowledge.</w:t>
+        <w:t>By signing below, the undersigned acknowledges receipt of this Workers’ Compensation Insurance proposal and authorizes Nevada Builders Alliance Insurance Services (NBAIS) to bind coverage as described herein, effective on the policy period stated above. The undersigned confirms that the payroll, classification codes, and excluded persons listed in this proposal are accurate to the best of their knowledge and understands that final premium is subject to audit. The required initial down payment will be remitted online via the secure payment link provided upon binding.</w:t>
       </w:r>
     </w:p>
     <w:tbl>
@@ -3271,7 +3526,7 @@
                 <w:color w:val="1F3864"/>
                 <w:sz w:val="20"/>
               </w:rPr>
-              <w:t>By (Signature)</w:t>
+              <w:t>By</w:t>
             </w:r>
           </w:p>
         </w:tc>
@@ -3440,7 +3695,7 @@
           <w:color w:val="595959"/>
           <w:sz w:val="17"/>
         </w:rPr>
-        <w:t>This proposal is not a guarantee of coverage. Final rates are subject to underwriting approval and audit. Coverage is effective only upon receipt of signed authorization and initial premium payment.</w:t>
+        <w:t>This proposal is not a binder or guarantee of coverage. All coverage is subject to underwriting approval, policy terms, conditions, and exclusions. Premium estimates are subject to final payroll audit. NBAIS is an insurance program administered on behalf of Nevada Builders Alliance members.</w:t>
       </w:r>
     </w:p>
     <w:p>
@@ -3454,23 +3709,57 @@
         </w:sectPr>
       </w:pPr>
     </w:p>
-    <w:p>
-      <w:pPr>
-        <w:shd w:val="clear" w:color="auto" w:fill="1F3864"/>
-        <w:spacing w:before="160" w:after="160"/>
-        <w:ind w:left="280"/>
-      </w:pPr>
-      <w:r>
-        <w:rPr>
-          <w:rFonts w:ascii="Arial" w:hAnsi="Arial"/>
-          <w:b/>
-          <w:i w:val="0"/>
-          <w:color w:val="FFFFFF"/>
-          <w:sz w:val="28"/>
-        </w:rPr>
-        <w:t>Coverage Recommendations</w:t>
-      </w:r>
-    </w:p>
+    <w:tbl>
+      <w:tblPr>
+        <w:tblW w:type="auto" w:w="0"/>
+        <w:tblLook w:firstColumn="1" w:firstRow="1" w:lastColumn="0" w:lastRow="0" w:noHBand="0" w:noVBand="1" w:val="04A0"/>
+        <w:tblBorders>
+          <w:top w:val="none" w:sz="0" w:space="0" w:color="auto"/>
+          <w:left w:val="none" w:sz="0" w:space="0" w:color="auto"/>
+          <w:bottom w:val="none" w:sz="0" w:space="0" w:color="auto"/>
+          <w:right w:val="none" w:sz="0" w:space="0" w:color="auto"/>
+          <w:insideH w:val="none" w:sz="0" w:space="0" w:color="auto"/>
+          <w:insideV w:val="none" w:sz="0" w:space="0" w:color="auto"/>
+        </w:tblBorders>
+        <w:tblW w:w="9360" w:type="dxa"/>
+      </w:tblPr>
+      <w:tblGrid>
+        <w:gridCol w:w="9360"/>
+      </w:tblGrid>
+      <w:tr>
+        <w:trPr>
+          <w:trHeight w:val="400" w:hRule="exact"/>
+        </w:trPr>
+        <w:tc>
+          <w:tcPr>
+            <w:tcW w:type="dxa" w:w="9360"/>
+            <w:shd w:val="clear" w:color="auto" w:fill="1F3864"/>
+            <w:tcMar>
+              <w:top w:w="60" w:type="dxa"/>
+              <w:bottom w:w="60" w:type="dxa"/>
+              <w:left w:w="115" w:type="dxa"/>
+              <w:right w:w="115" w:type="dxa"/>
+            </w:tcMar>
+            <w:vAlign w:val="center"/>
+          </w:tcPr>
+          <w:p>
+            <w:pPr>
+              <w:jc w:val="left"/>
+            </w:pPr>
+            <w:r>
+              <w:rPr>
+                <w:rFonts w:ascii="Arial" w:hAnsi="Arial"/>
+                <w:b/>
+                <w:i w:val="0"/>
+                <w:color w:val="FFFFFF"/>
+                <w:sz w:val="28"/>
+              </w:rPr>
+              <w:t>Coverage Recommendations</w:t>
+            </w:r>
+          </w:p>
+        </w:tc>
+      </w:tr>
+    </w:tbl>
     <w:p>
       <w:pPr>
         <w:spacing w:before="160" w:after="160"/>
@@ -3483,7 +3772,7 @@
           <w:color w:val="595959"/>
           <w:sz w:val="19"/>
         </w:rPr>
-        <w:t>The following list identifies common coverage areas for businesses like yours. Your NBAIS producer can help you assess your specific needs and obtain quotes for any of the coverages listed below.</w:t>
+        <w:t>The following list identifies common coverage areas for your consideration. Please review with your NBAIS producer to determine which lines are recommended, currently insured, or not applicable to your operation.</w:t>
       </w:r>
     </w:p>
     <w:p>
@@ -3572,7 +3861,7 @@
                 <w:color w:val="595959"/>
                 <w:sz w:val="18"/>
               </w:rPr>
-              <w:t>•  Commercial Building / Business Personal Property</w:t>
+              <w:t>•  Building / Business Personal Property</w:t>
             </w:r>
           </w:p>
           <w:p>
@@ -3620,7 +3909,7 @@
                 <w:color w:val="595959"/>
                 <w:sz w:val="18"/>
               </w:rPr>
-              <w:t>•  Inland Marine / Contractor’s Equipment</w:t>
+              <w:t>•  Inland Marine / Contractors Equipment</w:t>
             </w:r>
           </w:p>
           <w:p>
@@ -3636,7 +3925,23 @@
                 <w:color w:val="595959"/>
                 <w:sz w:val="18"/>
               </w:rPr>
-              <w:t>•  Flood (NFIP or Private Market)</w:t>
+              <w:t>•  Installation Floater</w:t>
+            </w:r>
+          </w:p>
+          <w:p>
+            <w:pPr>
+              <w:spacing w:before="40" w:after="40"/>
+              <w:ind w:left="200"/>
+            </w:pPr>
+            <w:r>
+              <w:rPr>
+                <w:rFonts w:ascii="Arial" w:hAnsi="Arial"/>
+                <w:b w:val="0"/>
+                <w:i w:val="0"/>
+                <w:color w:val="595959"/>
+                <w:sz w:val="18"/>
+              </w:rPr>
+              <w:t>•  Builders Risk</w:t>
             </w:r>
           </w:p>
         </w:tc>
@@ -3689,7 +3994,7 @@
                 <w:color w:val="595959"/>
                 <w:sz w:val="18"/>
               </w:rPr>
-              <w:t>•  Commercial General Liability (CGL)</w:t>
+              <w:t>•  Commercial General Liability</w:t>
             </w:r>
           </w:p>
           <w:p>
@@ -3721,22 +4026,6 @@
                 <w:color w:val="595959"/>
                 <w:sz w:val="18"/>
               </w:rPr>
-              <w:t>•  Liquor Liability</w:t>
-            </w:r>
-          </w:p>
-          <w:p>
-            <w:pPr>
-              <w:spacing w:before="40" w:after="40"/>
-              <w:ind w:left="200"/>
-            </w:pPr>
-            <w:r>
-              <w:rPr>
-                <w:rFonts w:ascii="Arial" w:hAnsi="Arial"/>
-                <w:b w:val="0"/>
-                <w:i w:val="0"/>
-                <w:color w:val="595959"/>
-                <w:sz w:val="18"/>
-              </w:rPr>
               <w:t>•  Contractual Liability</w:t>
             </w:r>
           </w:p>
@@ -3753,7 +4042,7 @@
                 <w:color w:val="595959"/>
                 <w:sz w:val="18"/>
               </w:rPr>
-              <w:t>•  Non-Owned &amp; Hired Auto Liability</w:t>
+              <w:t>•  Personal &amp; Advertising Injury</w:t>
             </w:r>
           </w:p>
         </w:tc>
@@ -3808,7 +4097,7 @@
                 <w:color w:val="595959"/>
                 <w:sz w:val="18"/>
               </w:rPr>
-              <w:t>•  Cyber Liability &amp; Data Breach Response</w:t>
+              <w:t>•  Cyber Liability</w:t>
             </w:r>
           </w:p>
           <w:p>
@@ -3824,23 +4113,7 @@
                 <w:color w:val="595959"/>
                 <w:sz w:val="18"/>
               </w:rPr>
-              <w:t>•  Employee Theft / Crime</w:t>
-            </w:r>
-          </w:p>
-          <w:p>
-            <w:pPr>
-              <w:spacing w:before="40" w:after="40"/>
-              <w:ind w:left="200"/>
-            </w:pPr>
-            <w:r>
-              <w:rPr>
-                <w:rFonts w:ascii="Arial" w:hAnsi="Arial"/>
-                <w:b w:val="0"/>
-                <w:i w:val="0"/>
-                <w:color w:val="595959"/>
-                <w:sz w:val="18"/>
-              </w:rPr>
-              <w:t>•  Social Engineering / Funds Transfer Fraud</w:t>
+              <w:t>•  Data Breach / Privacy Liability</w:t>
             </w:r>
           </w:p>
           <w:p>
@@ -3857,6 +4130,22 @@
                 <w:sz w:val="18"/>
               </w:rPr>
               <w:t>•  Identity Theft Protection</w:t>
+            </w:r>
+          </w:p>
+          <w:p>
+            <w:pPr>
+              <w:spacing w:before="40" w:after="40"/>
+              <w:ind w:left="200"/>
+            </w:pPr>
+            <w:r>
+              <w:rPr>
+                <w:rFonts w:ascii="Arial" w:hAnsi="Arial"/>
+                <w:b w:val="0"/>
+                <w:i w:val="0"/>
+                <w:color w:val="595959"/>
+                <w:sz w:val="18"/>
+              </w:rPr>
+              <w:t>•  Commercial Crime / Employee Dishonesty</w:t>
             </w:r>
           </w:p>
         </w:tc>
@@ -3909,7 +4198,23 @@
                 <w:color w:val="595959"/>
                 <w:sz w:val="18"/>
               </w:rPr>
-              <w:t>•  Commercial Auto — Owned Vehicles</w:t>
+              <w:t>•  Commercial Auto Liability</w:t>
+            </w:r>
+          </w:p>
+          <w:p>
+            <w:pPr>
+              <w:spacing w:before="40" w:after="40"/>
+              <w:ind w:left="200"/>
+            </w:pPr>
+            <w:r>
+              <w:rPr>
+                <w:rFonts w:ascii="Arial" w:hAnsi="Arial"/>
+                <w:b w:val="0"/>
+                <w:i w:val="0"/>
+                <w:color w:val="595959"/>
+                <w:sz w:val="18"/>
+              </w:rPr>
+              <w:t>•  Physical Damage (Comp &amp; Collision)</w:t>
             </w:r>
           </w:p>
           <w:p>
@@ -3941,23 +4246,7 @@
                 <w:color w:val="595959"/>
                 <w:sz w:val="18"/>
               </w:rPr>
-              <w:t>•  Motor Carrier / Truckers Liability</w:t>
-            </w:r>
-          </w:p>
-          <w:p>
-            <w:pPr>
-              <w:spacing w:before="40" w:after="40"/>
-              <w:ind w:left="200"/>
-            </w:pPr>
-            <w:r>
-              <w:rPr>
-                <w:rFonts w:ascii="Arial" w:hAnsi="Arial"/>
-                <w:b w:val="0"/>
-                <w:i w:val="0"/>
-                <w:color w:val="595959"/>
-                <w:sz w:val="18"/>
-              </w:rPr>
-              <w:t>•  Auto Physical Damage</w:t>
+              <w:t>•  Motor Truck Cargo</w:t>
             </w:r>
           </w:p>
         </w:tc>
@@ -4012,7 +4301,7 @@
                 <w:color w:val="595959"/>
                 <w:sz w:val="18"/>
               </w:rPr>
-              <w:t>•  Statutory Workers’ Compensation (NV) — current page</w:t>
+              <w:t>•  Workers’ Compensation — Statutory</w:t>
             </w:r>
           </w:p>
           <w:p>
@@ -4028,7 +4317,7 @@
                 <w:color w:val="595959"/>
                 <w:sz w:val="18"/>
               </w:rPr>
-              <w:t>•  Stop-Gap Employers’ Liability (monopolistic states)</w:t>
+              <w:t>•  Employers’ Liability</w:t>
             </w:r>
           </w:p>
           <w:p>
@@ -4044,7 +4333,7 @@
                 <w:color w:val="595959"/>
                 <w:sz w:val="18"/>
               </w:rPr>
-              <w:t>•  Voluntary Compensation &amp; Employers’ Liability</w:t>
+              <w:t>•  Stop Gap / Employers Liability (Monopolistic States)</w:t>
             </w:r>
           </w:p>
         </w:tc>
@@ -4113,23 +4402,7 @@
                 <w:color w:val="595959"/>
                 <w:sz w:val="18"/>
               </w:rPr>
-              <w:t>•  Excess Liability (follow-form)</w:t>
-            </w:r>
-          </w:p>
-          <w:p>
-            <w:pPr>
-              <w:spacing w:before="40" w:after="40"/>
-              <w:ind w:left="200"/>
-            </w:pPr>
-            <w:r>
-              <w:rPr>
-                <w:rFonts w:ascii="Arial" w:hAnsi="Arial"/>
-                <w:b w:val="0"/>
-                <w:i w:val="0"/>
-                <w:color w:val="595959"/>
-                <w:sz w:val="18"/>
-              </w:rPr>
-              <w:t>•  High-Limit Excess Towers</w:t>
+              <w:t>•  Excess Liability</w:t>
             </w:r>
           </w:p>
         </w:tc>
@@ -4200,7 +4473,7 @@
                 <w:color w:val="595959"/>
                 <w:sz w:val="18"/>
               </w:rPr>
-              <w:t>•  Employment Practices Liability (EPL)</w:t>
+              <w:t>•  Employment Practices Liability (EPLI)</w:t>
             </w:r>
           </w:p>
           <w:p>
@@ -4217,22 +4490,6 @@
                 <w:sz w:val="18"/>
               </w:rPr>
               <w:t>•  Fiduciary Liability</w:t>
-            </w:r>
-          </w:p>
-          <w:p>
-            <w:pPr>
-              <w:spacing w:before="40" w:after="40"/>
-              <w:ind w:left="200"/>
-            </w:pPr>
-            <w:r>
-              <w:rPr>
-                <w:rFonts w:ascii="Arial" w:hAnsi="Arial"/>
-                <w:b w:val="0"/>
-                <w:i w:val="0"/>
-                <w:color w:val="595959"/>
-                <w:sz w:val="18"/>
-              </w:rPr>
-              <w:t>•  Wage &amp; Hour Defense</w:t>
             </w:r>
           </w:p>
         </w:tc>
@@ -4285,22 +4542,6 @@
                 <w:color w:val="595959"/>
                 <w:sz w:val="18"/>
               </w:rPr>
-              <w:t>•  Contractors Pollution Liability</w:t>
-            </w:r>
-          </w:p>
-          <w:p>
-            <w:pPr>
-              <w:spacing w:before="40" w:after="40"/>
-              <w:ind w:left="200"/>
-            </w:pPr>
-            <w:r>
-              <w:rPr>
-                <w:rFonts w:ascii="Arial" w:hAnsi="Arial"/>
-                <w:b w:val="0"/>
-                <w:i w:val="0"/>
-                <w:color w:val="595959"/>
-                <w:sz w:val="18"/>
-              </w:rPr>
               <w:t>•  Professional Liability / E&amp;O</w:t>
             </w:r>
           </w:p>
@@ -4317,7 +4558,7 @@
                 <w:color w:val="595959"/>
                 <w:sz w:val="18"/>
               </w:rPr>
-              <w:t>•  Design-Build Professional</w:t>
+              <w:t>•  Contractors Professional Liability</w:t>
             </w:r>
           </w:p>
           <w:p>
@@ -4333,7 +4574,7 @@
                 <w:color w:val="595959"/>
                 <w:sz w:val="18"/>
               </w:rPr>
-              <w:t>•  Technology E&amp;O</w:t>
+              <w:t>•  Design-Build Professional Liability</w:t>
             </w:r>
           </w:p>
         </w:tc>
@@ -4350,23 +4591,57 @@
         </w:sectPr>
       </w:pPr>
     </w:p>
-    <w:p>
-      <w:pPr>
-        <w:shd w:val="clear" w:color="auto" w:fill="1F3864"/>
-        <w:spacing w:before="160" w:after="160"/>
-        <w:ind w:left="280"/>
-      </w:pPr>
-      <w:r>
-        <w:rPr>
-          <w:rFonts w:ascii="Arial" w:hAnsi="Arial"/>
-          <w:b/>
-          <w:i w:val="0"/>
-          <w:color w:val="FFFFFF"/>
-          <w:sz w:val="26"/>
-        </w:rPr>
-        <w:t>Coverage Recommendations (continued)</w:t>
-      </w:r>
-    </w:p>
+    <w:tbl>
+      <w:tblPr>
+        <w:tblW w:type="auto" w:w="0"/>
+        <w:tblLook w:firstColumn="1" w:firstRow="1" w:lastColumn="0" w:lastRow="0" w:noHBand="0" w:noVBand="1" w:val="04A0"/>
+        <w:tblBorders>
+          <w:top w:val="none" w:sz="0" w:space="0" w:color="auto"/>
+          <w:left w:val="none" w:sz="0" w:space="0" w:color="auto"/>
+          <w:bottom w:val="none" w:sz="0" w:space="0" w:color="auto"/>
+          <w:right w:val="none" w:sz="0" w:space="0" w:color="auto"/>
+          <w:insideH w:val="none" w:sz="0" w:space="0" w:color="auto"/>
+          <w:insideV w:val="none" w:sz="0" w:space="0" w:color="auto"/>
+        </w:tblBorders>
+        <w:tblW w:w="9360" w:type="dxa"/>
+      </w:tblPr>
+      <w:tblGrid>
+        <w:gridCol w:w="9360"/>
+      </w:tblGrid>
+      <w:tr>
+        <w:trPr>
+          <w:trHeight w:val="400" w:hRule="exact"/>
+        </w:trPr>
+        <w:tc>
+          <w:tcPr>
+            <w:tcW w:type="dxa" w:w="9360"/>
+            <w:shd w:val="clear" w:color="auto" w:fill="1F3864"/>
+            <w:tcMar>
+              <w:top w:w="60" w:type="dxa"/>
+              <w:bottom w:w="60" w:type="dxa"/>
+              <w:left w:w="115" w:type="dxa"/>
+              <w:right w:w="115" w:type="dxa"/>
+            </w:tcMar>
+            <w:vAlign w:val="center"/>
+          </w:tcPr>
+          <w:p>
+            <w:pPr>
+              <w:jc w:val="left"/>
+            </w:pPr>
+            <w:r>
+              <w:rPr>
+                <w:rFonts w:ascii="Arial" w:hAnsi="Arial"/>
+                <w:b/>
+                <w:i w:val="0"/>
+                <w:color w:val="FFFFFF"/>
+                <w:sz w:val="26"/>
+              </w:rPr>
+              <w:t>Coverage Recommendations (continued)</w:t>
+            </w:r>
+          </w:p>
+        </w:tc>
+      </w:tr>
+    </w:tbl>
     <w:p>
       <w:pPr>
         <w:spacing w:before="280" w:after="160"/>
@@ -4437,7 +4712,7 @@
                 <w:color w:val="2E75B6"/>
                 <w:sz w:val="20"/>
               </w:rPr>
-              <w:t>Wind / Hail Coverage</w:t>
+              <w:t>Wind / Hail, Earthquake, Flood</w:t>
             </w:r>
           </w:p>
           <w:p>
@@ -4453,7 +4728,7 @@
                 <w:color w:val="595959"/>
                 <w:sz w:val="18"/>
               </w:rPr>
-              <w:t>•  Standalone Windstorm / Hail</w:t>
+              <w:t>•  Wind &amp; Hail Coverage</w:t>
             </w:r>
           </w:p>
           <w:p>
@@ -4469,7 +4744,7 @@
                 <w:color w:val="595959"/>
                 <w:sz w:val="18"/>
               </w:rPr>
-              <w:t>•  Parametric Wind Insurance</w:t>
+              <w:t>•  Earthquake Coverage</w:t>
             </w:r>
           </w:p>
           <w:p>
@@ -4485,7 +4760,7 @@
                 <w:color w:val="595959"/>
                 <w:sz w:val="18"/>
               </w:rPr>
-              <w:t>•  Builder’s Risk — Wind Extension</w:t>
+              <w:t>•  Flood Coverage (NFIP or Private)</w:t>
             </w:r>
           </w:p>
         </w:tc>
@@ -4538,7 +4813,7 @@
                 <w:color w:val="595959"/>
                 <w:sz w:val="18"/>
               </w:rPr>
-              <w:t>•  Foreign General Liability</w:t>
+              <w:t>•  Foreign Voluntary Workers’ Compensation</w:t>
             </w:r>
           </w:p>
           <w:p>
@@ -4554,7 +4829,7 @@
                 <w:color w:val="595959"/>
                 <w:sz w:val="18"/>
               </w:rPr>
-              <w:t>•  Foreign Workers’ Compensation</w:t>
+              <w:t>•  Foreign General Liability</w:t>
             </w:r>
           </w:p>
           <w:p>
@@ -4586,7 +4861,7 @@
                 <w:color w:val="595959"/>
                 <w:sz w:val="18"/>
               </w:rPr>
-              <w:t>•  Foreign Voluntary Compensation</w:t>
+              <w:t>•  Foreign Package Policy</w:t>
             </w:r>
           </w:p>
         </w:tc>
@@ -4641,6 +4916,22 @@
                 <w:color w:val="595959"/>
                 <w:sz w:val="18"/>
               </w:rPr>
+              <w:t>•  Contractors Pollution Liability</w:t>
+            </w:r>
+          </w:p>
+          <w:p>
+            <w:pPr>
+              <w:spacing w:before="40" w:after="40"/>
+              <w:ind w:left="200"/>
+            </w:pPr>
+            <w:r>
+              <w:rPr>
+                <w:rFonts w:ascii="Arial" w:hAnsi="Arial"/>
+                <w:b w:val="0"/>
+                <w:i w:val="0"/>
+                <w:color w:val="595959"/>
+                <w:sz w:val="18"/>
+              </w:rPr>
               <w:t>•  Environmental Impairment Liability</w:t>
             </w:r>
           </w:p>
@@ -4658,38 +4949,6 @@
                 <w:sz w:val="18"/>
               </w:rPr>
               <w:t>•  Site Pollution Legal Liability</w:t>
-            </w:r>
-          </w:p>
-          <w:p>
-            <w:pPr>
-              <w:spacing w:before="40" w:after="40"/>
-              <w:ind w:left="200"/>
-            </w:pPr>
-            <w:r>
-              <w:rPr>
-                <w:rFonts w:ascii="Arial" w:hAnsi="Arial"/>
-                <w:b w:val="0"/>
-                <w:i w:val="0"/>
-                <w:color w:val="595959"/>
-                <w:sz w:val="18"/>
-              </w:rPr>
-              <w:t>•  Contractor’s Pollution Liability</w:t>
-            </w:r>
-          </w:p>
-          <w:p>
-            <w:pPr>
-              <w:spacing w:before="40" w:after="40"/>
-              <w:ind w:left="200"/>
-            </w:pPr>
-            <w:r>
-              <w:rPr>
-                <w:rFonts w:ascii="Arial" w:hAnsi="Arial"/>
-                <w:b w:val="0"/>
-                <w:i w:val="0"/>
-                <w:color w:val="595959"/>
-                <w:sz w:val="18"/>
-              </w:rPr>
-              <w:t>•  Storage Tank Liability</w:t>
             </w:r>
           </w:p>
         </w:tc>
@@ -4711,23 +4970,6 @@
             </w:tcBorders>
           </w:tcPr>
           <w:p/>
-          <w:p>
-            <w:pPr>
-              <w:spacing w:before="200" w:after="80"/>
-              <w:pBdr>
-                <w:bottom w:val="single" w:sz="4" w:space="4" w:color="CCCCCC"/>
-              </w:pBdr>
-            </w:pPr>
-            <w:r>
-              <w:rPr>
-                <w:rFonts w:ascii="Arial" w:hAnsi="Arial"/>
-                <w:b/>
-                <w:i w:val="0"/>
-                <w:color w:val="2E75B6"/>
-                <w:sz w:val="20"/>
-              </w:rPr>
-            </w:r>
-          </w:p>
         </w:tc>
       </w:tr>
     </w:tbl>
@@ -4817,7 +5059,7 @@
                 <w:color w:val="595959"/>
                 <w:sz w:val="18"/>
               </w:rPr>
-              <w:t>•  Homeowners / Renters Insurance</w:t>
+              <w:t>•  Automobile</w:t>
             </w:r>
           </w:p>
           <w:p>
@@ -4833,7 +5075,23 @@
                 <w:color w:val="595959"/>
                 <w:sz w:val="18"/>
               </w:rPr>
-              <w:t>•  High-Value Home (agreed value)</w:t>
+              <w:t>•  Home / Homeowners</w:t>
+            </w:r>
+          </w:p>
+          <w:p>
+            <w:pPr>
+              <w:spacing w:before="40" w:after="40"/>
+              <w:ind w:left="200"/>
+            </w:pPr>
+            <w:r>
+              <w:rPr>
+                <w:rFonts w:ascii="Arial" w:hAnsi="Arial"/>
+                <w:b w:val="0"/>
+                <w:i w:val="0"/>
+                <w:color w:val="595959"/>
+                <w:sz w:val="18"/>
+              </w:rPr>
+              <w:t>•  Flood / Earthquake</w:t>
             </w:r>
           </w:p>
           <w:p>
@@ -4850,38 +5108,6 @@
                 <w:sz w:val="18"/>
               </w:rPr>
               <w:t>•  Personal Umbrella</w:t>
-            </w:r>
-          </w:p>
-          <w:p>
-            <w:pPr>
-              <w:spacing w:before="40" w:after="40"/>
-              <w:ind w:left="200"/>
-            </w:pPr>
-            <w:r>
-              <w:rPr>
-                <w:rFonts w:ascii="Arial" w:hAnsi="Arial"/>
-                <w:b w:val="0"/>
-                <w:i w:val="0"/>
-                <w:color w:val="595959"/>
-                <w:sz w:val="18"/>
-              </w:rPr>
-              <w:t>•  Valuable Articles / Collections</w:t>
-            </w:r>
-          </w:p>
-          <w:p>
-            <w:pPr>
-              <w:spacing w:before="40" w:after="40"/>
-              <w:ind w:left="200"/>
-            </w:pPr>
-            <w:r>
-              <w:rPr>
-                <w:rFonts w:ascii="Arial" w:hAnsi="Arial"/>
-                <w:b w:val="0"/>
-                <w:i w:val="0"/>
-                <w:color w:val="595959"/>
-                <w:sz w:val="18"/>
-              </w:rPr>
-              <w:t>•  Watercraft</w:t>
             </w:r>
           </w:p>
         </w:tc>
@@ -4905,20 +5131,18 @@
           <w:p/>
           <w:p>
             <w:pPr>
-              <w:spacing w:before="200" w:after="80"/>
-              <w:pBdr>
-                <w:bottom w:val="single" w:sz="4" w:space="4" w:color="CCCCCC"/>
-              </w:pBdr>
+              <w:spacing w:before="40" w:after="40"/>
+              <w:ind w:left="200"/>
             </w:pPr>
             <w:r>
               <w:rPr>
                 <w:rFonts w:ascii="Arial" w:hAnsi="Arial"/>
-                <w:b/>
+                <w:b w:val="0"/>
                 <w:i w:val="0"/>
-                <w:color w:val="2E75B6"/>
-                <w:sz w:val="20"/>
+                <w:color w:val="595959"/>
+                <w:sz w:val="18"/>
               </w:rPr>
-              <w:t>Farm &amp; Ranch</w:t>
+              <w:t>•  Farm &amp; Ranch</w:t>
             </w:r>
           </w:p>
           <w:p>
@@ -4934,7 +5158,7 @@
                 <w:color w:val="595959"/>
                 <w:sz w:val="18"/>
               </w:rPr>
-              <w:t>•  Farm Owners Coverage</w:t>
+              <w:t>•  Watercraft / Recreational Vehicles</w:t>
             </w:r>
           </w:p>
           <w:p>
@@ -4950,23 +5174,7 @@
                 <w:color w:val="595959"/>
                 <w:sz w:val="18"/>
               </w:rPr>
-              <w:t>•  Ranch Liability</w:t>
-            </w:r>
-          </w:p>
-          <w:p>
-            <w:pPr>
-              <w:spacing w:before="40" w:after="40"/>
-              <w:ind w:left="200"/>
-            </w:pPr>
-            <w:r>
-              <w:rPr>
-                <w:rFonts w:ascii="Arial" w:hAnsi="Arial"/>
-                <w:b w:val="0"/>
-                <w:i w:val="0"/>
-                <w:color w:val="595959"/>
-                <w:sz w:val="18"/>
-              </w:rPr>
-              <w:t>•  Crop / Livestock Coverage</w:t>
+              <w:t>•  Personal Articles Floater</w:t>
             </w:r>
           </w:p>
         </w:tc>
@@ -5058,7 +5266,7 @@
                 <w:color w:val="595959"/>
                 <w:sz w:val="18"/>
               </w:rPr>
-              <w:t>•  Performance &amp; Payment Bonds</w:t>
+              <w:t>•  Contract Bond</w:t>
             </w:r>
           </w:p>
           <w:p>
@@ -5074,7 +5282,7 @@
                 <w:color w:val="595959"/>
                 <w:sz w:val="18"/>
               </w:rPr>
-              <w:t>•  Bid Bonds</w:t>
+              <w:t>•  Court Bond</w:t>
             </w:r>
           </w:p>
           <w:p>
@@ -5090,7 +5298,7 @@
                 <w:color w:val="595959"/>
                 <w:sz w:val="18"/>
               </w:rPr>
-              <w:t>•  Subdivision / Site Improvement Bonds</w:t>
+              <w:t>•  Fidelity Bond</w:t>
             </w:r>
           </w:p>
           <w:p>
@@ -5106,7 +5314,7 @@
                 <w:color w:val="595959"/>
                 <w:sz w:val="18"/>
               </w:rPr>
-              <w:t>•  Supply Bonds</w:t>
+              <w:t>•  Financial Institution Bond</w:t>
             </w:r>
           </w:p>
         </w:tc>
@@ -5130,20 +5338,18 @@
           <w:p/>
           <w:p>
             <w:pPr>
-              <w:spacing w:before="200" w:after="80"/>
-              <w:pBdr>
-                <w:bottom w:val="single" w:sz="4" w:space="4" w:color="CCCCCC"/>
-              </w:pBdr>
+              <w:spacing w:before="40" w:after="40"/>
+              <w:ind w:left="200"/>
             </w:pPr>
             <w:r>
               <w:rPr>
                 <w:rFonts w:ascii="Arial" w:hAnsi="Arial"/>
-                <w:b/>
+                <w:b w:val="0"/>
                 <w:i w:val="0"/>
-                <w:color w:val="2E75B6"/>
-                <w:sz w:val="20"/>
+                <w:color w:val="595959"/>
+                <w:sz w:val="18"/>
               </w:rPr>
-              <w:t>License &amp; Permit Bonds</w:t>
+              <w:t>•  License &amp; Permit Bond</w:t>
             </w:r>
           </w:p>
           <w:p>
@@ -5159,7 +5365,7 @@
                 <w:color w:val="595959"/>
                 <w:sz w:val="18"/>
               </w:rPr>
-              <w:t>•  Contractor License Bonds</w:t>
+              <w:t>•  Probate Bond</w:t>
             </w:r>
           </w:p>
           <w:p>
@@ -5175,7 +5381,7 @@
                 <w:color w:val="595959"/>
                 <w:sz w:val="18"/>
               </w:rPr>
-              <w:t>•  Permit Bonds</w:t>
+              <w:t>•  Public Official Bond</w:t>
             </w:r>
           </w:p>
           <w:p>
@@ -5191,23 +5397,7 @@
                 <w:color w:val="595959"/>
                 <w:sz w:val="18"/>
               </w:rPr>
-              <w:t>•  Court / Fiduciary Bonds</w:t>
-            </w:r>
-          </w:p>
-          <w:p>
-            <w:pPr>
-              <w:spacing w:before="40" w:after="40"/>
-              <w:ind w:left="200"/>
-            </w:pPr>
-            <w:r>
-              <w:rPr>
-                <w:rFonts w:ascii="Arial" w:hAnsi="Arial"/>
-                <w:b w:val="0"/>
-                <w:i w:val="0"/>
-                <w:color w:val="595959"/>
-                <w:sz w:val="18"/>
-              </w:rPr>
-              <w:t>•  Commercial Blanket Bonds</w:t>
+              <w:t>•  Surety Bond</w:t>
             </w:r>
           </w:p>
         </w:tc>
@@ -5224,23 +5414,57 @@
         </w:sectPr>
       </w:pPr>
     </w:p>
-    <w:p>
-      <w:pPr>
-        <w:shd w:val="clear" w:color="auto" w:fill="1F3864"/>
-        <w:spacing w:before="160" w:after="160"/>
-        <w:ind w:left="280"/>
-      </w:pPr>
-      <w:r>
-        <w:rPr>
-          <w:rFonts w:ascii="Arial" w:hAnsi="Arial"/>
-          <w:b/>
-          <w:i w:val="0"/>
-          <w:color w:val="FFFFFF"/>
-          <w:sz w:val="28"/>
-        </w:rPr>
-        <w:t>Employee Benefits Recommendations</w:t>
-      </w:r>
-    </w:p>
+    <w:tbl>
+      <w:tblPr>
+        <w:tblW w:type="auto" w:w="0"/>
+        <w:tblLook w:firstColumn="1" w:firstRow="1" w:lastColumn="0" w:lastRow="0" w:noHBand="0" w:noVBand="1" w:val="04A0"/>
+        <w:tblBorders>
+          <w:top w:val="none" w:sz="0" w:space="0" w:color="auto"/>
+          <w:left w:val="none" w:sz="0" w:space="0" w:color="auto"/>
+          <w:bottom w:val="none" w:sz="0" w:space="0" w:color="auto"/>
+          <w:right w:val="none" w:sz="0" w:space="0" w:color="auto"/>
+          <w:insideH w:val="none" w:sz="0" w:space="0" w:color="auto"/>
+          <w:insideV w:val="none" w:sz="0" w:space="0" w:color="auto"/>
+        </w:tblBorders>
+        <w:tblW w:w="9360" w:type="dxa"/>
+      </w:tblPr>
+      <w:tblGrid>
+        <w:gridCol w:w="9360"/>
+      </w:tblGrid>
+      <w:tr>
+        <w:trPr>
+          <w:trHeight w:val="400" w:hRule="exact"/>
+        </w:trPr>
+        <w:tc>
+          <w:tcPr>
+            <w:tcW w:type="dxa" w:w="9360"/>
+            <w:shd w:val="clear" w:color="auto" w:fill="1F3864"/>
+            <w:tcMar>
+              <w:top w:w="60" w:type="dxa"/>
+              <w:bottom w:w="60" w:type="dxa"/>
+              <w:left w:w="115" w:type="dxa"/>
+              <w:right w:w="115" w:type="dxa"/>
+            </w:tcMar>
+            <w:vAlign w:val="center"/>
+          </w:tcPr>
+          <w:p>
+            <w:pPr>
+              <w:jc w:val="left"/>
+            </w:pPr>
+            <w:r>
+              <w:rPr>
+                <w:rFonts w:ascii="Arial" w:hAnsi="Arial"/>
+                <w:b/>
+                <w:i w:val="0"/>
+                <w:color w:val="FFFFFF"/>
+                <w:sz w:val="28"/>
+              </w:rPr>
+              <w:t>Employee Benefits Recommendations</w:t>
+            </w:r>
+          </w:p>
+        </w:tc>
+      </w:tr>
+    </w:tbl>
     <w:p>
       <w:pPr>
         <w:spacing w:before="160" w:after="160"/>
@@ -5254,7 +5478,7 @@
           <w:color w:val="595959"/>
           <w:sz w:val="19"/>
         </w:rPr>
-        <w:t>NBAIS can connect you with specialists for group benefits, life insurance, and retirement planning. The following is an overview of available employee benefit programs.</w:t>
+        <w:t>Group benefits, life planning, and retirement plan services available through NBAIS for member consideration.</w:t>
       </w:r>
     </w:p>
     <w:p>
@@ -5343,7 +5567,23 @@
                 <w:color w:val="595959"/>
                 <w:sz w:val="18"/>
               </w:rPr>
-              <w:t>•  Group Health Insurance (Medical)</w:t>
+              <w:t>•  HR Services</w:t>
+            </w:r>
+          </w:p>
+          <w:p>
+            <w:pPr>
+              <w:spacing w:before="40" w:after="40"/>
+              <w:ind w:left="200"/>
+            </w:pPr>
+            <w:r>
+              <w:rPr>
+                <w:rFonts w:ascii="Arial" w:hAnsi="Arial"/>
+                <w:b w:val="0"/>
+                <w:i w:val="0"/>
+                <w:color w:val="595959"/>
+                <w:sz w:val="18"/>
+              </w:rPr>
+              <w:t>•  Group Medical</w:t>
             </w:r>
           </w:p>
           <w:p>
@@ -5375,7 +5615,7 @@
                 <w:color w:val="595959"/>
                 <w:sz w:val="18"/>
               </w:rPr>
-              <w:t>•  Group Vision</w:t>
+              <w:t>•  Vision</w:t>
             </w:r>
           </w:p>
           <w:p>
@@ -5391,39 +5631,7 @@
                 <w:color w:val="595959"/>
                 <w:sz w:val="18"/>
               </w:rPr>
-              <w:t>•  Flexible Spending Accounts (FSA)</w:t>
-            </w:r>
-          </w:p>
-          <w:p>
-            <w:pPr>
-              <w:spacing w:before="40" w:after="40"/>
-              <w:ind w:left="200"/>
-            </w:pPr>
-            <w:r>
-              <w:rPr>
-                <w:rFonts w:ascii="Arial" w:hAnsi="Arial"/>
-                <w:b w:val="0"/>
-                <w:i w:val="0"/>
-                <w:color w:val="595959"/>
-                <w:sz w:val="18"/>
-              </w:rPr>
-              <w:t>•  Health Reimbursement Arrangements (HRA)</w:t>
-            </w:r>
-          </w:p>
-          <w:p>
-            <w:pPr>
-              <w:spacing w:before="40" w:after="40"/>
-              <w:ind w:left="200"/>
-            </w:pPr>
-            <w:r>
-              <w:rPr>
-                <w:rFonts w:ascii="Arial" w:hAnsi="Arial"/>
-                <w:b w:val="0"/>
-                <w:i w:val="0"/>
-                <w:color w:val="595959"/>
-                <w:sz w:val="18"/>
-              </w:rPr>
-              <w:t>•  Health Savings Accounts (HSA)</w:t>
+              <w:t>•  Group Life and Accidental Death &amp; Dismemberment (AD&amp;D)</w:t>
             </w:r>
           </w:p>
         </w:tc>
@@ -5476,7 +5684,7 @@
                 <w:color w:val="595959"/>
                 <w:sz w:val="18"/>
               </w:rPr>
-              <w:t>•  Short-Term Disability</w:t>
+              <w:t>•  Long Term Care</w:t>
             </w:r>
           </w:p>
           <w:p>
@@ -5492,7 +5700,7 @@
                 <w:color w:val="595959"/>
                 <w:sz w:val="18"/>
               </w:rPr>
-              <w:t>•  Long-Term Disability</w:t>
+              <w:t>•  Short Term Disability</w:t>
             </w:r>
           </w:p>
           <w:p>
@@ -5508,7 +5716,7 @@
                 <w:color w:val="595959"/>
                 <w:sz w:val="18"/>
               </w:rPr>
-              <w:t>•  Group Accident Insurance</w:t>
+              <w:t>•  Section 125 Cafeteria Plans</w:t>
             </w:r>
           </w:p>
           <w:p>
@@ -5524,23 +5732,7 @@
                 <w:color w:val="595959"/>
                 <w:sz w:val="18"/>
               </w:rPr>
-              <w:t>•  Critical Illness Coverage</w:t>
-            </w:r>
-          </w:p>
-          <w:p>
-            <w:pPr>
-              <w:spacing w:before="40" w:after="40"/>
-              <w:ind w:left="200"/>
-            </w:pPr>
-            <w:r>
-              <w:rPr>
-                <w:rFonts w:ascii="Arial" w:hAnsi="Arial"/>
-                <w:b w:val="0"/>
-                <w:i w:val="0"/>
-                <w:color w:val="595959"/>
-                <w:sz w:val="18"/>
-              </w:rPr>
-              <w:t>•  Hospital Indemnity</w:t>
+              <w:t>•  Individual Medical / Dental</w:t>
             </w:r>
           </w:p>
         </w:tc>
@@ -5603,20 +5795,18 @@
           <w:p/>
           <w:p>
             <w:pPr>
-              <w:spacing w:before="200" w:after="80"/>
-              <w:pBdr>
-                <w:bottom w:val="single" w:sz="4" w:space="4" w:color="CCCCCC"/>
-              </w:pBdr>
+              <w:spacing w:before="40" w:after="40"/>
+              <w:ind w:left="200"/>
             </w:pPr>
             <w:r>
               <w:rPr>
                 <w:rFonts w:ascii="Arial" w:hAnsi="Arial"/>
-                <w:b/>
+                <w:b w:val="0"/>
                 <w:i w:val="0"/>
-                <w:color w:val="2E75B6"/>
-                <w:sz w:val="20"/>
+                <w:color w:val="595959"/>
+                <w:sz w:val="18"/>
               </w:rPr>
-              <w:t>Business Planning</w:t>
+              <w:t>•  Business Planning</w:t>
             </w:r>
           </w:p>
           <w:p>
@@ -5632,55 +5822,7 @@
                 <w:color w:val="595959"/>
                 <w:sz w:val="18"/>
               </w:rPr>
-              <w:t>•  Key Person Life Insurance</w:t>
-            </w:r>
-          </w:p>
-          <w:p>
-            <w:pPr>
-              <w:spacing w:before="40" w:after="40"/>
-              <w:ind w:left="200"/>
-            </w:pPr>
-            <w:r>
-              <w:rPr>
-                <w:rFonts w:ascii="Arial" w:hAnsi="Arial"/>
-                <w:b w:val="0"/>
-                <w:i w:val="0"/>
-                <w:color w:val="595959"/>
-                <w:sz w:val="18"/>
-              </w:rPr>
-              <w:t>•  Buy-Sell Agreement Funding</w:t>
-            </w:r>
-          </w:p>
-          <w:p>
-            <w:pPr>
-              <w:spacing w:before="40" w:after="40"/>
-              <w:ind w:left="200"/>
-            </w:pPr>
-            <w:r>
-              <w:rPr>
-                <w:rFonts w:ascii="Arial" w:hAnsi="Arial"/>
-                <w:b w:val="0"/>
-                <w:i w:val="0"/>
-                <w:color w:val="595959"/>
-                <w:sz w:val="18"/>
-              </w:rPr>
-              <w:t>•  Business Continuation Planning</w:t>
-            </w:r>
-          </w:p>
-          <w:p>
-            <w:pPr>
-              <w:spacing w:before="40" w:after="40"/>
-              <w:ind w:left="200"/>
-            </w:pPr>
-            <w:r>
-              <w:rPr>
-                <w:rFonts w:ascii="Arial" w:hAnsi="Arial"/>
-                <w:b w:val="0"/>
-                <w:i w:val="0"/>
-                <w:color w:val="595959"/>
-                <w:sz w:val="18"/>
-              </w:rPr>
-              <w:t>•  Executive Bonus Plans</w:t>
+              <w:t>•  Estate Planning</w:t>
             </w:r>
           </w:p>
         </w:tc>
@@ -5702,88 +5844,6 @@
             </w:tcBorders>
           </w:tcPr>
           <w:p/>
-          <w:p>
-            <w:pPr>
-              <w:spacing w:before="200" w:after="80"/>
-              <w:pBdr>
-                <w:bottom w:val="single" w:sz="4" w:space="4" w:color="CCCCCC"/>
-              </w:pBdr>
-            </w:pPr>
-            <w:r>
-              <w:rPr>
-                <w:rFonts w:ascii="Arial" w:hAnsi="Arial"/>
-                <w:b/>
-                <w:i w:val="0"/>
-                <w:color w:val="2E75B6"/>
-                <w:sz w:val="20"/>
-              </w:rPr>
-              <w:t>Estate Planning</w:t>
-            </w:r>
-          </w:p>
-          <w:p>
-            <w:pPr>
-              <w:spacing w:before="40" w:after="40"/>
-              <w:ind w:left="200"/>
-            </w:pPr>
-            <w:r>
-              <w:rPr>
-                <w:rFonts w:ascii="Arial" w:hAnsi="Arial"/>
-                <w:b w:val="0"/>
-                <w:i w:val="0"/>
-                <w:color w:val="595959"/>
-                <w:sz w:val="18"/>
-              </w:rPr>
-              <w:t>•  Individual Life Insurance</w:t>
-            </w:r>
-          </w:p>
-          <w:p>
-            <w:pPr>
-              <w:spacing w:before="40" w:after="40"/>
-              <w:ind w:left="200"/>
-            </w:pPr>
-            <w:r>
-              <w:rPr>
-                <w:rFonts w:ascii="Arial" w:hAnsi="Arial"/>
-                <w:b w:val="0"/>
-                <w:i w:val="0"/>
-                <w:color w:val="595959"/>
-                <w:sz w:val="18"/>
-              </w:rPr>
-              <w:t>•  Survivorship / Second-to-Die Policies</w:t>
-            </w:r>
-          </w:p>
-          <w:p>
-            <w:pPr>
-              <w:spacing w:before="40" w:after="40"/>
-              <w:ind w:left="200"/>
-            </w:pPr>
-            <w:r>
-              <w:rPr>
-                <w:rFonts w:ascii="Arial" w:hAnsi="Arial"/>
-                <w:b w:val="0"/>
-                <w:i w:val="0"/>
-                <w:color w:val="595959"/>
-                <w:sz w:val="18"/>
-              </w:rPr>
-              <w:t>•  Irrevocable Life Insurance Trust (ILIT)</w:t>
-            </w:r>
-          </w:p>
-          <w:p>
-            <w:pPr>
-              <w:spacing w:before="40" w:after="40"/>
-              <w:ind w:left="200"/>
-            </w:pPr>
-            <w:r>
-              <w:rPr>
-                <w:rFonts w:ascii="Arial" w:hAnsi="Arial"/>
-                <w:b w:val="0"/>
-                <w:i w:val="0"/>
-                <w:color w:val="595959"/>
-                <w:sz w:val="18"/>
-              </w:rPr>
-              <w:t>•  Charitable Giving Strategies</w:t>
-            </w:r>
-          </w:p>
         </w:tc>
       </w:tr>
     </w:tbl>
@@ -5844,20 +5904,18 @@
           <w:p/>
           <w:p>
             <w:pPr>
-              <w:spacing w:before="200" w:after="80"/>
-              <w:pBdr>
-                <w:bottom w:val="single" w:sz="4" w:space="4" w:color="CCCCCC"/>
-              </w:pBdr>
+              <w:spacing w:before="40" w:after="40"/>
+              <w:ind w:left="200"/>
             </w:pPr>
             <w:r>
               <w:rPr>
                 <w:rFonts w:ascii="Arial" w:hAnsi="Arial"/>
-                <w:b/>
+                <w:b w:val="0"/>
                 <w:i w:val="0"/>
-                <w:color w:val="2E75B6"/>
-                <w:sz w:val="20"/>
+                <w:color w:val="595959"/>
+                <w:sz w:val="18"/>
               </w:rPr>
-              <w:t>Qualified Plans</w:t>
+              <w:t>•  Qualified Plans</w:t>
             </w:r>
           </w:p>
           <w:p>
@@ -5873,71 +5931,7 @@
                 <w:color w:val="595959"/>
                 <w:sz w:val="18"/>
               </w:rPr>
-              <w:t>•  401(k) Plan Design &amp; Administration</w:t>
-            </w:r>
-          </w:p>
-          <w:p>
-            <w:pPr>
-              <w:spacing w:before="40" w:after="40"/>
-              <w:ind w:left="200"/>
-            </w:pPr>
-            <w:r>
-              <w:rPr>
-                <w:rFonts w:ascii="Arial" w:hAnsi="Arial"/>
-                <w:b w:val="0"/>
-                <w:i w:val="0"/>
-                <w:color w:val="595959"/>
-                <w:sz w:val="18"/>
-              </w:rPr>
-              <w:t>•  SIMPLE IRA</w:t>
-            </w:r>
-          </w:p>
-          <w:p>
-            <w:pPr>
-              <w:spacing w:before="40" w:after="40"/>
-              <w:ind w:left="200"/>
-            </w:pPr>
-            <w:r>
-              <w:rPr>
-                <w:rFonts w:ascii="Arial" w:hAnsi="Arial"/>
-                <w:b w:val="0"/>
-                <w:i w:val="0"/>
-                <w:color w:val="595959"/>
-                <w:sz w:val="18"/>
-              </w:rPr>
-              <w:t>•  SEP IRA</w:t>
-            </w:r>
-          </w:p>
-          <w:p>
-            <w:pPr>
-              <w:spacing w:before="40" w:after="40"/>
-              <w:ind w:left="200"/>
-            </w:pPr>
-            <w:r>
-              <w:rPr>
-                <w:rFonts w:ascii="Arial" w:hAnsi="Arial"/>
-                <w:b w:val="0"/>
-                <w:i w:val="0"/>
-                <w:color w:val="595959"/>
-                <w:sz w:val="18"/>
-              </w:rPr>
-              <w:t>•  Defined Benefit / Pension Plans</w:t>
-            </w:r>
-          </w:p>
-          <w:p>
-            <w:pPr>
-              <w:spacing w:before="40" w:after="40"/>
-              <w:ind w:left="200"/>
-            </w:pPr>
-            <w:r>
-              <w:rPr>
-                <w:rFonts w:ascii="Arial" w:hAnsi="Arial"/>
-                <w:b w:val="0"/>
-                <w:i w:val="0"/>
-                <w:color w:val="595959"/>
-                <w:sz w:val="18"/>
-              </w:rPr>
-              <w:t>•  Profit-Sharing Plans</w:t>
+              <w:t>•  Non-Qualified Plans</w:t>
             </w:r>
           </w:p>
         </w:tc>
@@ -5959,72 +5953,6 @@
             </w:tcBorders>
           </w:tcPr>
           <w:p/>
-          <w:p>
-            <w:pPr>
-              <w:spacing w:before="200" w:after="80"/>
-              <w:pBdr>
-                <w:bottom w:val="single" w:sz="4" w:space="4" w:color="CCCCCC"/>
-              </w:pBdr>
-            </w:pPr>
-            <w:r>
-              <w:rPr>
-                <w:rFonts w:ascii="Arial" w:hAnsi="Arial"/>
-                <w:b/>
-                <w:i w:val="0"/>
-                <w:color w:val="2E75B6"/>
-                <w:sz w:val="20"/>
-              </w:rPr>
-              <w:t>Non-Qualified Plans</w:t>
-            </w:r>
-          </w:p>
-          <w:p>
-            <w:pPr>
-              <w:spacing w:before="40" w:after="40"/>
-              <w:ind w:left="200"/>
-            </w:pPr>
-            <w:r>
-              <w:rPr>
-                <w:rFonts w:ascii="Arial" w:hAnsi="Arial"/>
-                <w:b w:val="0"/>
-                <w:i w:val="0"/>
-                <w:color w:val="595959"/>
-                <w:sz w:val="18"/>
-              </w:rPr>
-              <w:t>•  Deferred Compensation Plans</w:t>
-            </w:r>
-          </w:p>
-          <w:p>
-            <w:pPr>
-              <w:spacing w:before="40" w:after="40"/>
-              <w:ind w:left="200"/>
-            </w:pPr>
-            <w:r>
-              <w:rPr>
-                <w:rFonts w:ascii="Arial" w:hAnsi="Arial"/>
-                <w:b w:val="0"/>
-                <w:i w:val="0"/>
-                <w:color w:val="595959"/>
-                <w:sz w:val="18"/>
-              </w:rPr>
-              <w:t>•  Executive Supplemental Retirement (SERP)</w:t>
-            </w:r>
-          </w:p>
-          <w:p>
-            <w:pPr>
-              <w:spacing w:before="40" w:after="40"/>
-              <w:ind w:left="200"/>
-            </w:pPr>
-            <w:r>
-              <w:rPr>
-                <w:rFonts w:ascii="Arial" w:hAnsi="Arial"/>
-                <w:b w:val="0"/>
-                <w:i w:val="0"/>
-                <w:color w:val="595959"/>
-                <w:sz w:val="18"/>
-              </w:rPr>
-              <w:t>•  Split-Dollar Life Insurance</w:t>
-            </w:r>
-          </w:p>
         </w:tc>
       </w:tr>
     </w:tbl>
@@ -6037,12 +5965,22 @@
       <w:r>
         <w:rPr>
           <w:rFonts w:ascii="Arial" w:hAnsi="Arial"/>
-          <w:b w:val="0"/>
-          <w:i/>
+          <w:b/>
+          <w:i w:val="0"/>
           <w:color w:val="1F3864"/>
           <w:sz w:val="18"/>
         </w:rPr>
-        <w:t>Your NBAIS producer can help you assess your employee benefits needs and develop a comprehensive program. Contact Dianne Slater to schedule a benefits review.</w:t>
+        <w:t xml:space="preserve">Discuss with your producer. </w:t>
+      </w:r>
+      <w:r>
+        <w:rPr>
+          <w:rFonts w:ascii="Arial" w:hAnsi="Arial"/>
+          <w:b w:val="0"/>
+          <w:i w:val="0"/>
+          <w:color w:val="1F3864"/>
+          <w:sz w:val="18"/>
+        </w:rPr>
+        <w:t>Your NBAIS producer can help you assess which of these coverage lines apply to your operation and identify any potential gaps in your current insurance program.</w:t>
       </w:r>
     </w:p>
     <w:sectPr>

</xml_diff>

<commit_message>
fix(ADO#2632): cover header/footer sections, logo aspect ratio, column widths, contact box gap, signature lines, callout box border
</commit_message>
<xml_diff>
--- a/services/proposal-generator/templates/verticals/nbais-wc/master.docx
+++ b/services/proposal-generator/templates/verticals/nbais-wc/master.docx
@@ -2,46 +2,6 @@
 <file path=word/document.xml><?xml version="1.0" encoding="utf-8"?>
 <w:document xmlns:wpc="http://schemas.microsoft.com/office/word/2010/wordprocessingCanvas" xmlns:mo="http://schemas.microsoft.com/office/mac/office/2008/main" xmlns:mc="http://schemas.openxmlformats.org/markup-compatibility/2006" xmlns:mv="urn:schemas-microsoft-com:mac:vml" xmlns:o="urn:schemas-microsoft-com:office:office" xmlns:r="http://schemas.openxmlformats.org/officeDocument/2006/relationships" xmlns:m="http://schemas.openxmlformats.org/officeDocument/2006/math" xmlns:v="urn:schemas-microsoft-com:vml" xmlns:wp14="http://schemas.microsoft.com/office/word/2010/wordprocessingDrawing" xmlns:wp="http://schemas.openxmlformats.org/drawingml/2006/wordprocessingDrawing" xmlns:w10="urn:schemas-microsoft-com:office:word" xmlns:w="http://schemas.openxmlformats.org/wordprocessingml/2006/main" xmlns:w14="http://schemas.microsoft.com/office/word/2010/wordml" xmlns:wpg="http://schemas.microsoft.com/office/word/2010/wordprocessingGroup" xmlns:wpi="http://schemas.microsoft.com/office/word/2010/wordprocessingInk" xmlns:wne="http://schemas.microsoft.com/office/word/2006/wordml" xmlns:wps="http://schemas.microsoft.com/office/word/2010/wordprocessingShape" mc:Ignorable="w14 wp14">
   <w:body>
-    <w:tbl>
-      <w:tblPr>
-        <w:tblW w:type="auto" w:w="0"/>
-        <w:tblLook w:firstColumn="1" w:firstRow="1" w:lastColumn="0" w:lastRow="0" w:noHBand="0" w:noVBand="1" w:val="04A0"/>
-        <w:tblBorders>
-          <w:top w:val="none" w:sz="0" w:space="0" w:color="auto"/>
-          <w:left w:val="none" w:sz="0" w:space="0" w:color="auto"/>
-          <w:bottom w:val="none" w:sz="0" w:space="0" w:color="auto"/>
-          <w:right w:val="none" w:sz="0" w:space="0" w:color="auto"/>
-          <w:insideH w:val="none" w:sz="0" w:space="0" w:color="auto"/>
-          <w:insideV w:val="none" w:sz="0" w:space="0" w:color="auto"/>
-        </w:tblBorders>
-        <w:tblW w:w="12240" w:type="dxa"/>
-      </w:tblPr>
-      <w:tblGrid>
-        <w:gridCol w:w="9360"/>
-      </w:tblGrid>
-      <w:tr>
-        <w:trPr>
-          <w:trHeight w:val="460" w:hRule="exact"/>
-        </w:trPr>
-        <w:tc>
-          <w:tcPr>
-            <w:tcW w:type="dxa" w:w="9360"/>
-            <w:shd w:val="clear" w:color="auto" w:fill="1F3864"/>
-            <w:tcMar>
-              <w:top w:w="0" w:type="dxa"/>
-              <w:bottom w:w="0" w:type="dxa"/>
-              <w:left w:w="0" w:type="dxa"/>
-              <w:right w:w="0" w:type="dxa"/>
-            </w:tcMar>
-          </w:tcPr>
-          <w:p>
-            <w:pPr>
-              <w:spacing w:before="0" w:after="0"/>
-            </w:pPr>
-          </w:p>
-        </w:tc>
-      </w:tr>
-    </w:tbl>
     <w:p>
       <w:pPr>
         <w:spacing w:before="280" w:after="80"/>
@@ -64,14 +24,38 @@
         <w:jc w:val="center"/>
       </w:pPr>
       <w:r>
-        <w:rPr>
-          <w:rFonts w:ascii="Arial" w:hAnsi="Arial"/>
-          <w:b w:val="0"/>
-          <w:i w:val="0"/>
-          <w:color w:val="1F3864"/>
-          <w:sz w:val="20"/>
-        </w:rPr>
-        <w:t>{%stackedLogoBase64}</w:t>
+        <w:drawing>
+          <wp:inline xmlns:a="http://schemas.openxmlformats.org/drawingml/2006/main" xmlns:pic="http://schemas.openxmlformats.org/drawingml/2006/picture">
+            <wp:extent cx="2286000" cy="2177796"/>
+            <wp:docPr id="1" name="Picture 1"/>
+            <wp:cNvGraphicFramePr>
+              <a:graphicFrameLocks noChangeAspect="1"/>
+            </wp:cNvGraphicFramePr>
+            <a:graphic>
+              <a:graphicData uri="http://schemas.openxmlformats.org/drawingml/2006/picture">
+                <pic:pic>
+                  <pic:nvPicPr>
+                    <pic:cNvPr id="0" name="logo_stacked.png"/>
+                    <pic:cNvPicPr/>
+                  </pic:nvPicPr>
+                  <pic:blipFill>
+                    <a:blip r:embed="rId11"/>
+                    <a:stretch>
+                      <a:fillRect/>
+                    </a:stretch>
+                  </pic:blipFill>
+                  <pic:spPr>
+                    <a:xfrm>
+                      <a:off x="0" y="0"/>
+                      <a:ext cx="2286000" cy="2177796"/>
+                    </a:xfrm>
+                    <a:prstGeom prst="rect"/>
+                  </pic:spPr>
+                </pic:pic>
+              </a:graphicData>
+            </a:graphic>
+          </wp:inline>
+        </w:drawing>
       </w:r>
     </w:p>
     <w:p>
@@ -123,7 +107,6 @@
       <w:tblPr>
         <w:tblW w:type="auto" w:w="0"/>
         <w:tblLook w:firstColumn="1" w:firstRow="1" w:lastColumn="0" w:lastRow="0" w:noHBand="0" w:noVBand="1" w:val="04A0"/>
-        <w:jc w:val="center"/>
         <w:tblBorders>
           <w:top w:val="none" w:sz="0" w:space="0" w:color="auto"/>
           <w:left w:val="none" w:sz="0" w:space="0" w:color="auto"/>
@@ -132,7 +115,8 @@
           <w:insideH w:val="none" w:sz="0" w:space="0" w:color="auto"/>
           <w:insideV w:val="none" w:sz="0" w:space="0" w:color="auto"/>
         </w:tblBorders>
-        <w:tblW w:w="9360" w:type="dxa"/>
+        <w:tblW w:w="5400" w:type="dxa"/>
+        <w:jc w:val="center"/>
       </w:tblPr>
       <w:tblGrid>
         <w:gridCol w:w="4680"/>
@@ -142,17 +126,18 @@
         <w:tc>
           <w:tcPr>
             <w:tcW w:type="dxa" w:w="4680"/>
-            <w:tcW w:w="3276" w:type="dxa"/>
+            <w:tcW w:w="1889" w:type="dxa"/>
             <w:tcMar>
               <w:top w:w="40" w:type="dxa"/>
               <w:bottom w:w="40" w:type="dxa"/>
               <w:left w:w="80" w:type="dxa"/>
               <w:right w:w="60" w:type="dxa"/>
             </w:tcMar>
+            <w:vAlign w:val="center"/>
           </w:tcPr>
           <w:p>
             <w:pPr>
-              <w:jc w:val="right"/>
+              <w:jc w:val="left"/>
             </w:pPr>
             <w:r>
               <w:rPr>
@@ -169,13 +154,14 @@
         <w:tc>
           <w:tcPr>
             <w:tcW w:type="dxa" w:w="4680"/>
-            <w:tcW w:w="6084" w:type="dxa"/>
+            <w:tcW w:w="3511" w:type="dxa"/>
             <w:tcMar>
               <w:top w:w="40" w:type="dxa"/>
               <w:bottom w:w="40" w:type="dxa"/>
               <w:left w:w="60" w:type="dxa"/>
               <w:right w:w="80" w:type="dxa"/>
             </w:tcMar>
+            <w:vAlign w:val="center"/>
           </w:tcPr>
           <w:p>
             <w:r>
@@ -195,17 +181,18 @@
         <w:tc>
           <w:tcPr>
             <w:tcW w:type="dxa" w:w="4680"/>
-            <w:tcW w:w="3276" w:type="dxa"/>
+            <w:tcW w:w="1889" w:type="dxa"/>
             <w:tcMar>
               <w:top w:w="40" w:type="dxa"/>
               <w:bottom w:w="40" w:type="dxa"/>
               <w:left w:w="80" w:type="dxa"/>
               <w:right w:w="60" w:type="dxa"/>
             </w:tcMar>
+            <w:vAlign w:val="center"/>
           </w:tcPr>
           <w:p>
             <w:pPr>
-              <w:jc w:val="right"/>
+              <w:jc w:val="left"/>
             </w:pPr>
             <w:r>
               <w:rPr>
@@ -222,13 +209,14 @@
         <w:tc>
           <w:tcPr>
             <w:tcW w:type="dxa" w:w="4680"/>
-            <w:tcW w:w="6084" w:type="dxa"/>
+            <w:tcW w:w="3511" w:type="dxa"/>
             <w:tcMar>
               <w:top w:w="40" w:type="dxa"/>
               <w:bottom w:w="40" w:type="dxa"/>
               <w:left w:w="60" w:type="dxa"/>
               <w:right w:w="80" w:type="dxa"/>
             </w:tcMar>
+            <w:vAlign w:val="center"/>
           </w:tcPr>
           <w:p>
             <w:r>
@@ -248,17 +236,18 @@
         <w:tc>
           <w:tcPr>
             <w:tcW w:type="dxa" w:w="4680"/>
-            <w:tcW w:w="3276" w:type="dxa"/>
+            <w:tcW w:w="1889" w:type="dxa"/>
             <w:tcMar>
               <w:top w:w="40" w:type="dxa"/>
               <w:bottom w:w="40" w:type="dxa"/>
               <w:left w:w="80" w:type="dxa"/>
               <w:right w:w="60" w:type="dxa"/>
             </w:tcMar>
+            <w:vAlign w:val="center"/>
           </w:tcPr>
           <w:p>
             <w:pPr>
-              <w:jc w:val="right"/>
+              <w:jc w:val="left"/>
             </w:pPr>
             <w:r>
               <w:rPr>
@@ -275,13 +264,14 @@
         <w:tc>
           <w:tcPr>
             <w:tcW w:type="dxa" w:w="4680"/>
-            <w:tcW w:w="6084" w:type="dxa"/>
+            <w:tcW w:w="3511" w:type="dxa"/>
             <w:tcMar>
               <w:top w:w="40" w:type="dxa"/>
               <w:bottom w:w="40" w:type="dxa"/>
               <w:left w:w="60" w:type="dxa"/>
               <w:right w:w="80" w:type="dxa"/>
             </w:tcMar>
+            <w:vAlign w:val="center"/>
           </w:tcPr>
           <w:p>
             <w:r>
@@ -301,17 +291,18 @@
         <w:tc>
           <w:tcPr>
             <w:tcW w:type="dxa" w:w="4680"/>
-            <w:tcW w:w="3276" w:type="dxa"/>
+            <w:tcW w:w="1889" w:type="dxa"/>
             <w:tcMar>
               <w:top w:w="40" w:type="dxa"/>
               <w:bottom w:w="40" w:type="dxa"/>
               <w:left w:w="80" w:type="dxa"/>
               <w:right w:w="60" w:type="dxa"/>
             </w:tcMar>
+            <w:vAlign w:val="center"/>
           </w:tcPr>
           <w:p>
             <w:pPr>
-              <w:jc w:val="right"/>
+              <w:jc w:val="left"/>
             </w:pPr>
             <w:r>
               <w:rPr>
@@ -328,13 +319,14 @@
         <w:tc>
           <w:tcPr>
             <w:tcW w:type="dxa" w:w="4680"/>
-            <w:tcW w:w="6084" w:type="dxa"/>
+            <w:tcW w:w="3511" w:type="dxa"/>
             <w:tcMar>
               <w:top w:w="40" w:type="dxa"/>
               <w:bottom w:w="40" w:type="dxa"/>
               <w:left w:w="60" w:type="dxa"/>
               <w:right w:w="80" w:type="dxa"/>
             </w:tcMar>
+            <w:vAlign w:val="center"/>
           </w:tcPr>
           <w:p>
             <w:r>
@@ -354,17 +346,18 @@
         <w:tc>
           <w:tcPr>
             <w:tcW w:type="dxa" w:w="4680"/>
-            <w:tcW w:w="3276" w:type="dxa"/>
+            <w:tcW w:w="1889" w:type="dxa"/>
             <w:tcMar>
               <w:top w:w="40" w:type="dxa"/>
               <w:bottom w:w="40" w:type="dxa"/>
               <w:left w:w="80" w:type="dxa"/>
               <w:right w:w="60" w:type="dxa"/>
             </w:tcMar>
+            <w:vAlign w:val="center"/>
           </w:tcPr>
           <w:p>
             <w:pPr>
-              <w:jc w:val="right"/>
+              <w:jc w:val="left"/>
             </w:pPr>
             <w:r>
               <w:rPr>
@@ -381,13 +374,14 @@
         <w:tc>
           <w:tcPr>
             <w:tcW w:type="dxa" w:w="4680"/>
-            <w:tcW w:w="6084" w:type="dxa"/>
+            <w:tcW w:w="3511" w:type="dxa"/>
             <w:tcMar>
               <w:top w:w="40" w:type="dxa"/>
               <w:bottom w:w="40" w:type="dxa"/>
               <w:left w:w="60" w:type="dxa"/>
               <w:right w:w="80" w:type="dxa"/>
             </w:tcMar>
+            <w:vAlign w:val="center"/>
           </w:tcPr>
           <w:p>
             <w:r>
@@ -404,45 +398,6 @@
         </w:tc>
       </w:tr>
     </w:tbl>
-    <w:p>
-      <w:pPr>
-        <w:spacing w:before="0" w:after="0"/>
-      </w:pPr>
-    </w:p>
-    <w:p>
-      <w:pPr>
-        <w:spacing w:before="0" w:after="0"/>
-      </w:pPr>
-    </w:p>
-    <w:p>
-      <w:pPr>
-        <w:spacing w:before="0" w:after="0"/>
-      </w:pPr>
-    </w:p>
-    <w:p>
-      <w:pPr>
-        <w:spacing w:before="0" w:after="0"/>
-      </w:pPr>
-    </w:p>
-    <w:p>
-      <w:pPr>
-        <w:spacing w:before="400" w:after="0"/>
-        <w:jc w:val="center"/>
-        <w:pBdr>
-          <w:top w:val="single" w:sz="12" w:space="4" w:color="1F3864"/>
-        </w:pBdr>
-      </w:pPr>
-      <w:r>
-        <w:rPr>
-          <w:rFonts w:ascii="Arial" w:hAnsi="Arial"/>
-          <w:b w:val="0"/>
-          <w:i/>
-          <w:color w:val="595959"/>
-          <w:sz w:val="17"/>
-        </w:rPr>
-        <w:t>Confidential — Prepared for the named member’s exclusive use</w:t>
-      </w:r>
-    </w:p>
     <w:p>
       <w:pPr>
         <w:sectPr>
@@ -911,8 +866,8 @@
     <w:p>
       <w:pPr>
         <w:sectPr>
-          <w:headerReference w:type="default" r:id="rId11"/>
-          <w:footerReference w:type="default" r:id="rId12"/>
+          <w:headerReference w:type="default" r:id="rId12"/>
+          <w:footerReference w:type="default" r:id="rId13"/>
           <w:pgSz w:w="12240" w:h="15840"/>
           <w:pgMar w:top="1440" w:right="1440" w:bottom="1440" w:left="1440" w:header="432" w:footer="432" w:gutter="0"/>
           <w:cols w:space="720"/>
@@ -1019,6 +974,7 @@
               <w:left w:w="100" w:type="dxa"/>
               <w:right w:w="80" w:type="dxa"/>
             </w:tcMar>
+            <w:vAlign w:val="center"/>
           </w:tcPr>
           <w:p>
             <w:r>
@@ -1523,6 +1479,7 @@
               <w:left w:w="80" w:type="dxa"/>
               <w:right w:w="60" w:type="dxa"/>
             </w:tcMar>
+            <w:vAlign w:val="center"/>
           </w:tcPr>
           <w:p>
             <w:r>
@@ -1547,6 +1504,7 @@
               <w:left w:w="80" w:type="dxa"/>
               <w:right w:w="60" w:type="dxa"/>
             </w:tcMar>
+            <w:vAlign w:val="center"/>
           </w:tcPr>
           <w:p>
             <w:r>
@@ -1572,6 +1530,7 @@
               <w:left w:w="80" w:type="dxa"/>
               <w:right w:w="60" w:type="dxa"/>
             </w:tcMar>
+            <w:vAlign w:val="center"/>
           </w:tcPr>
           <w:p>
             <w:r>
@@ -1595,6 +1554,7 @@
               <w:left w:w="80" w:type="dxa"/>
               <w:right w:w="60" w:type="dxa"/>
             </w:tcMar>
+            <w:vAlign w:val="center"/>
           </w:tcPr>
           <w:p>
             <w:r>
@@ -1744,7 +1704,7 @@
         <w:tc>
           <w:tcPr>
             <w:tcW w:type="dxa" w:w="4680"/>
-            <w:tcW w:w="3276" w:type="dxa"/>
+            <w:tcW w:w="2808" w:type="dxa"/>
             <w:tcMar>
               <w:top w:w="80" w:type="dxa"/>
               <w:bottom w:w="80" w:type="dxa"/>
@@ -1770,7 +1730,7 @@
         <w:tc>
           <w:tcPr>
             <w:tcW w:type="dxa" w:w="4680"/>
-            <w:tcW w:w="6084" w:type="dxa"/>
+            <w:tcW w:w="6552" w:type="dxa"/>
             <w:tcMar>
               <w:top w:w="80" w:type="dxa"/>
               <w:bottom w:w="80" w:type="dxa"/>
@@ -1798,7 +1758,7 @@
         <w:tc>
           <w:tcPr>
             <w:tcW w:type="dxa" w:w="4680"/>
-            <w:tcW w:w="3276" w:type="dxa"/>
+            <w:tcW w:w="2808" w:type="dxa"/>
             <w:tcMar>
               <w:top w:w="80" w:type="dxa"/>
               <w:bottom w:w="80" w:type="dxa"/>
@@ -1823,7 +1783,7 @@
         <w:tc>
           <w:tcPr>
             <w:tcW w:type="dxa" w:w="4680"/>
-            <w:tcW w:w="6084" w:type="dxa"/>
+            <w:tcW w:w="6552" w:type="dxa"/>
             <w:tcMar>
               <w:top w:w="80" w:type="dxa"/>
               <w:bottom w:w="80" w:type="dxa"/>
@@ -1850,7 +1810,7 @@
         <w:tc>
           <w:tcPr>
             <w:tcW w:type="dxa" w:w="4680"/>
-            <w:tcW w:w="3276" w:type="dxa"/>
+            <w:tcW w:w="2808" w:type="dxa"/>
             <w:tcMar>
               <w:top w:w="80" w:type="dxa"/>
               <w:bottom w:w="80" w:type="dxa"/>
@@ -1876,7 +1836,7 @@
         <w:tc>
           <w:tcPr>
             <w:tcW w:type="dxa" w:w="4680"/>
-            <w:tcW w:w="6084" w:type="dxa"/>
+            <w:tcW w:w="6552" w:type="dxa"/>
             <w:tcMar>
               <w:top w:w="80" w:type="dxa"/>
               <w:bottom w:w="80" w:type="dxa"/>
@@ -1904,7 +1864,7 @@
         <w:tc>
           <w:tcPr>
             <w:tcW w:type="dxa" w:w="4680"/>
-            <w:tcW w:w="3276" w:type="dxa"/>
+            <w:tcW w:w="2808" w:type="dxa"/>
             <w:tcMar>
               <w:top w:w="80" w:type="dxa"/>
               <w:bottom w:w="80" w:type="dxa"/>
@@ -1929,7 +1889,7 @@
         <w:tc>
           <w:tcPr>
             <w:tcW w:type="dxa" w:w="4680"/>
-            <w:tcW w:w="6084" w:type="dxa"/>
+            <w:tcW w:w="6552" w:type="dxa"/>
             <w:tcMar>
               <w:top w:w="80" w:type="dxa"/>
               <w:bottom w:w="80" w:type="dxa"/>
@@ -1956,7 +1916,7 @@
         <w:tc>
           <w:tcPr>
             <w:tcW w:type="dxa" w:w="4680"/>
-            <w:tcW w:w="3276" w:type="dxa"/>
+            <w:tcW w:w="2808" w:type="dxa"/>
             <w:tcMar>
               <w:top w:w="80" w:type="dxa"/>
               <w:bottom w:w="80" w:type="dxa"/>
@@ -1982,7 +1942,7 @@
         <w:tc>
           <w:tcPr>
             <w:tcW w:type="dxa" w:w="4680"/>
-            <w:tcW w:w="6084" w:type="dxa"/>
+            <w:tcW w:w="6552" w:type="dxa"/>
             <w:tcMar>
               <w:top w:w="80" w:type="dxa"/>
               <w:bottom w:w="80" w:type="dxa"/>
@@ -2010,7 +1970,7 @@
         <w:tc>
           <w:tcPr>
             <w:tcW w:type="dxa" w:w="4680"/>
-            <w:tcW w:w="3276" w:type="dxa"/>
+            <w:tcW w:w="2808" w:type="dxa"/>
             <w:tcMar>
               <w:top w:w="80" w:type="dxa"/>
               <w:bottom w:w="80" w:type="dxa"/>
@@ -2035,7 +1995,7 @@
         <w:tc>
           <w:tcPr>
             <w:tcW w:type="dxa" w:w="4680"/>
-            <w:tcW w:w="6084" w:type="dxa"/>
+            <w:tcW w:w="6552" w:type="dxa"/>
             <w:tcMar>
               <w:top w:w="80" w:type="dxa"/>
               <w:bottom w:w="80" w:type="dxa"/>
@@ -2142,6 +2102,7 @@
               <w:left w:w="80" w:type="dxa"/>
               <w:right w:w="60" w:type="dxa"/>
             </w:tcMar>
+            <w:vAlign w:val="center"/>
           </w:tcPr>
           <w:p>
             <w:r>
@@ -2165,6 +2126,7 @@
               <w:left w:w="80" w:type="dxa"/>
               <w:right w:w="60" w:type="dxa"/>
             </w:tcMar>
+            <w:vAlign w:val="center"/>
           </w:tcPr>
           <w:p>
             <w:r>
@@ -2438,7 +2400,7 @@
     <w:p>
       <w:pPr>
         <w:sectPr>
-          <w:footerReference w:type="default" r:id="rId13"/>
+          <w:footerReference w:type="default" r:id="rId14"/>
           <w:pgSz w:w="12240" w:h="15840"/>
           <w:pgMar w:top="1440" w:right="1440" w:bottom="1440" w:left="1440" w:header="432" w:footer="432" w:gutter="0"/>
           <w:cols w:space="720"/>
@@ -2552,6 +2514,7 @@
               <w:left w:w="60" w:type="dxa"/>
               <w:right w:w="60" w:type="dxa"/>
             </w:tcMar>
+            <w:vAlign w:val="center"/>
           </w:tcPr>
           <w:p>
             <w:r>
@@ -2577,6 +2540,7 @@
               <w:left w:w="60" w:type="dxa"/>
               <w:right w:w="60" w:type="dxa"/>
             </w:tcMar>
+            <w:vAlign w:val="center"/>
           </w:tcPr>
           <w:p>
             <w:r>
@@ -2602,6 +2566,7 @@
               <w:left w:w="60" w:type="dxa"/>
               <w:right w:w="60" w:type="dxa"/>
             </w:tcMar>
+            <w:vAlign w:val="center"/>
           </w:tcPr>
           <w:p>
             <w:r>
@@ -2627,6 +2592,7 @@
               <w:left w:w="60" w:type="dxa"/>
               <w:right w:w="60" w:type="dxa"/>
             </w:tcMar>
+            <w:vAlign w:val="center"/>
           </w:tcPr>
           <w:p>
             <w:r>
@@ -2652,6 +2618,7 @@
               <w:left w:w="60" w:type="dxa"/>
               <w:right w:w="60" w:type="dxa"/>
             </w:tcMar>
+            <w:vAlign w:val="center"/>
           </w:tcPr>
           <w:p>
             <w:r>
@@ -2677,6 +2644,7 @@
               <w:left w:w="60" w:type="dxa"/>
               <w:right w:w="60" w:type="dxa"/>
             </w:tcMar>
+            <w:vAlign w:val="center"/>
           </w:tcPr>
           <w:p>
             <w:r>
@@ -2881,6 +2849,7 @@
               <w:left w:w="60" w:type="dxa"/>
               <w:right w:w="60" w:type="dxa"/>
             </w:tcMar>
+            <w:vAlign w:val="center"/>
           </w:tcPr>
           <w:p>
             <w:pPr>
@@ -2909,6 +2878,7 @@
               <w:left w:w="60" w:type="dxa"/>
               <w:right w:w="60" w:type="dxa"/>
             </w:tcMar>
+            <w:vAlign w:val="center"/>
           </w:tcPr>
           <w:p>
             <w:r>
@@ -3006,6 +2976,7 @@
               <w:left w:w="80" w:type="dxa"/>
               <w:right w:w="60" w:type="dxa"/>
             </w:tcMar>
+            <w:vAlign w:val="center"/>
           </w:tcPr>
           <w:p>
             <w:r>
@@ -3029,6 +3000,7 @@
               <w:left w:w="80" w:type="dxa"/>
               <w:right w:w="60" w:type="dxa"/>
             </w:tcMar>
+            <w:vAlign w:val="center"/>
           </w:tcPr>
           <w:p>
             <w:r>
@@ -3047,7 +3019,7 @@
         <w:tc>
           <w:tcPr>
             <w:tcW w:type="dxa" w:w="4680"/>
-            <w:tcW w:w="4680" w:type="dxa"/>
+            <w:tcW w:w="2808" w:type="dxa"/>
             <w:tcMar>
               <w:top w:w="60" w:type="dxa"/>
               <w:bottom w:w="60" w:type="dxa"/>
@@ -3084,7 +3056,7 @@
         <w:tc>
           <w:tcPr>
             <w:tcW w:type="dxa" w:w="4680"/>
-            <w:tcW w:w="4680" w:type="dxa"/>
+            <w:tcW w:w="6552" w:type="dxa"/>
             <w:tcMar>
               <w:top w:w="60" w:type="dxa"/>
               <w:bottom w:w="60" w:type="dxa"/>
@@ -3197,6 +3169,7 @@
               <w:left w:w="130" w:type="dxa"/>
               <w:right w:w="100" w:type="dxa"/>
             </w:tcMar>
+            <w:vAlign w:val="center"/>
             <w:tcBorders>
               <w:left w:val="single" w:sz="24" w:space="0" w:color="2E75B6"/>
               <w:top w:val="none" w:sz="0" w:space="0" w:color="auto"/>
@@ -3222,7 +3195,7 @@
     <w:p>
       <w:pPr>
         <w:sectPr>
-          <w:footerReference w:type="default" r:id="rId14"/>
+          <w:footerReference w:type="default" r:id="rId15"/>
           <w:pgSz w:w="12240" w:h="15840"/>
           <w:pgMar w:top="1440" w:right="1440" w:bottom="1440" w:left="1440" w:header="432" w:footer="432" w:gutter="0"/>
           <w:cols w:space="720"/>
@@ -3310,19 +3283,17 @@
           <w:insideV w:val="none" w:sz="0" w:space="0" w:color="auto"/>
         </w:tblBorders>
         <w:tblW w:w="9360" w:type="dxa"/>
-        <w:tblBorders>
-          <w:insideV w:val="single" w:sz="4" w:space="0" w:color="CCCCCC"/>
-        </w:tblBorders>
       </w:tblPr>
       <w:tblGrid>
-        <w:gridCol w:w="4680"/>
-        <w:gridCol w:w="4680"/>
+        <w:gridCol w:w="3120"/>
+        <w:gridCol w:w="3120"/>
+        <w:gridCol w:w="3120"/>
       </w:tblGrid>
       <w:tr>
         <w:tc>
           <w:tcPr>
-            <w:tcW w:type="dxa" w:w="4680"/>
-            <w:tcW w:w="4680" w:type="dxa"/>
+            <w:tcW w:type="dxa" w:w="3120"/>
+            <w:tcW w:w="4580" w:type="dxa"/>
             <w:shd w:val="clear" w:color="auto" w:fill="E8E8E8"/>
             <w:tcMar>
               <w:top w:w="100" w:type="dxa"/>
@@ -3330,6 +3301,13 @@
               <w:left w:w="100" w:type="dxa"/>
               <w:right w:w="100" w:type="dxa"/>
             </w:tcMar>
+            <w:tcBorders>
+              <w:top w:val="none" w:sz="0" w:space="0" w:color="auto"/>
+              <w:left w:val="none" w:sz="0" w:space="0" w:color="auto"/>
+              <w:bottom w:val="none" w:sz="0" w:space="0" w:color="auto"/>
+              <w:right w:val="none" w:sz="0" w:space="0" w:color="auto"/>
+            </w:tcBorders>
+            <w:vAlign w:val="center"/>
           </w:tcPr>
           <w:p>
             <w:r>
@@ -3394,8 +3372,21 @@
         </w:tc>
         <w:tc>
           <w:tcPr>
-            <w:tcW w:type="dxa" w:w="4680"/>
-            <w:tcW w:w="4680" w:type="dxa"/>
+            <w:tcW w:type="dxa" w:w="3120"/>
+            <w:tcW w:w="200" w:type="dxa"/>
+            <w:tcBorders>
+              <w:top w:val="none" w:sz="0" w:space="0" w:color="auto"/>
+              <w:left w:val="none" w:sz="0" w:space="0" w:color="auto"/>
+              <w:bottom w:val="none" w:sz="0" w:space="0" w:color="auto"/>
+              <w:right w:val="none" w:sz="0" w:space="0" w:color="auto"/>
+            </w:tcBorders>
+          </w:tcPr>
+          <w:p/>
+        </w:tc>
+        <w:tc>
+          <w:tcPr>
+            <w:tcW w:type="dxa" w:w="3120"/>
+            <w:tcW w:w="4580" w:type="dxa"/>
             <w:shd w:val="clear" w:color="auto" w:fill="E8E8E8"/>
             <w:tcMar>
               <w:top w:w="100" w:type="dxa"/>
@@ -3403,6 +3394,13 @@
               <w:left w:w="100" w:type="dxa"/>
               <w:right w:w="100" w:type="dxa"/>
             </w:tcMar>
+            <w:tcBorders>
+              <w:top w:val="none" w:sz="0" w:space="0" w:color="auto"/>
+              <w:left w:val="none" w:sz="0" w:space="0" w:color="auto"/>
+              <w:bottom w:val="none" w:sz="0" w:space="0" w:color="auto"/>
+              <w:right w:val="none" w:sz="0" w:space="0" w:color="auto"/>
+            </w:tcBorders>
+            <w:vAlign w:val="center"/>
           </w:tcPr>
           <w:p>
             <w:r>
@@ -3511,13 +3509,14 @@
         <w:tc>
           <w:tcPr>
             <w:tcW w:type="dxa" w:w="4680"/>
-            <w:tcW w:w="2340" w:type="dxa"/>
+            <w:tcW w:w="1872" w:type="dxa"/>
             <w:tcMar>
               <w:top w:w="80" w:type="dxa"/>
               <w:bottom w:w="80" w:type="dxa"/>
               <w:left w:w="0" w:type="dxa"/>
               <w:right w:w="60" w:type="dxa"/>
             </w:tcMar>
+            <w:vAlign w:val="center"/>
           </w:tcPr>
           <w:p>
             <w:r>
@@ -3535,15 +3534,16 @@
         <w:tc>
           <w:tcPr>
             <w:tcW w:type="dxa" w:w="4680"/>
-            <w:tcW w:w="7020" w:type="dxa"/>
+            <w:tcW w:w="7488" w:type="dxa"/>
             <w:tcMar>
               <w:top w:w="80" w:type="dxa"/>
               <w:bottom w:w="80" w:type="dxa"/>
               <w:left w:w="60" w:type="dxa"/>
               <w:right w:w="0" w:type="dxa"/>
             </w:tcMar>
+            <w:vAlign w:val="center"/>
             <w:tcBorders>
-              <w:bottom w:val="single" w:sz="6" w:space="0" w:color="CCCCCC"/>
+              <w:bottom w:val="single" w:sz="6" w:space="0" w:color="000000"/>
             </w:tcBorders>
           </w:tcPr>
           <w:p>
@@ -3555,13 +3555,14 @@
         <w:tc>
           <w:tcPr>
             <w:tcW w:type="dxa" w:w="4680"/>
-            <w:tcW w:w="2340" w:type="dxa"/>
+            <w:tcW w:w="1872" w:type="dxa"/>
             <w:tcMar>
               <w:top w:w="80" w:type="dxa"/>
               <w:bottom w:w="80" w:type="dxa"/>
               <w:left w:w="0" w:type="dxa"/>
               <w:right w:w="60" w:type="dxa"/>
             </w:tcMar>
+            <w:vAlign w:val="center"/>
           </w:tcPr>
           <w:p>
             <w:r>
@@ -3579,15 +3580,16 @@
         <w:tc>
           <w:tcPr>
             <w:tcW w:type="dxa" w:w="4680"/>
-            <w:tcW w:w="7020" w:type="dxa"/>
+            <w:tcW w:w="7488" w:type="dxa"/>
             <w:tcMar>
               <w:top w:w="80" w:type="dxa"/>
               <w:bottom w:w="80" w:type="dxa"/>
               <w:left w:w="60" w:type="dxa"/>
               <w:right w:w="0" w:type="dxa"/>
             </w:tcMar>
+            <w:vAlign w:val="center"/>
             <w:tcBorders>
-              <w:bottom w:val="single" w:sz="6" w:space="0" w:color="CCCCCC"/>
+              <w:bottom w:val="single" w:sz="6" w:space="0" w:color="000000"/>
             </w:tcBorders>
           </w:tcPr>
           <w:p>
@@ -3599,13 +3601,14 @@
         <w:tc>
           <w:tcPr>
             <w:tcW w:type="dxa" w:w="4680"/>
-            <w:tcW w:w="2340" w:type="dxa"/>
+            <w:tcW w:w="1872" w:type="dxa"/>
             <w:tcMar>
               <w:top w:w="80" w:type="dxa"/>
               <w:bottom w:w="80" w:type="dxa"/>
               <w:left w:w="0" w:type="dxa"/>
               <w:right w:w="60" w:type="dxa"/>
             </w:tcMar>
+            <w:vAlign w:val="center"/>
           </w:tcPr>
           <w:p>
             <w:r>
@@ -3623,15 +3626,16 @@
         <w:tc>
           <w:tcPr>
             <w:tcW w:type="dxa" w:w="4680"/>
-            <w:tcW w:w="7020" w:type="dxa"/>
+            <w:tcW w:w="7488" w:type="dxa"/>
             <w:tcMar>
               <w:top w:w="80" w:type="dxa"/>
               <w:bottom w:w="80" w:type="dxa"/>
               <w:left w:w="60" w:type="dxa"/>
               <w:right w:w="0" w:type="dxa"/>
             </w:tcMar>
+            <w:vAlign w:val="center"/>
             <w:tcBorders>
-              <w:bottom w:val="single" w:sz="6" w:space="0" w:color="CCCCCC"/>
+              <w:bottom w:val="single" w:sz="6" w:space="0" w:color="000000"/>
             </w:tcBorders>
           </w:tcPr>
           <w:p>
@@ -3643,13 +3647,14 @@
         <w:tc>
           <w:tcPr>
             <w:tcW w:type="dxa" w:w="4680"/>
-            <w:tcW w:w="2340" w:type="dxa"/>
+            <w:tcW w:w="1872" w:type="dxa"/>
             <w:tcMar>
               <w:top w:w="80" w:type="dxa"/>
               <w:bottom w:w="80" w:type="dxa"/>
               <w:left w:w="0" w:type="dxa"/>
               <w:right w:w="60" w:type="dxa"/>
             </w:tcMar>
+            <w:vAlign w:val="center"/>
           </w:tcPr>
           <w:p>
             <w:r>
@@ -3667,15 +3672,16 @@
         <w:tc>
           <w:tcPr>
             <w:tcW w:type="dxa" w:w="4680"/>
-            <w:tcW w:w="7020" w:type="dxa"/>
+            <w:tcW w:w="7488" w:type="dxa"/>
             <w:tcMar>
               <w:top w:w="80" w:type="dxa"/>
               <w:bottom w:w="80" w:type="dxa"/>
               <w:left w:w="60" w:type="dxa"/>
               <w:right w:w="0" w:type="dxa"/>
             </w:tcMar>
+            <w:vAlign w:val="center"/>
             <w:tcBorders>
-              <w:bottom w:val="single" w:sz="6" w:space="0" w:color="CCCCCC"/>
+              <w:bottom w:val="single" w:sz="6" w:space="0" w:color="000000"/>
             </w:tcBorders>
           </w:tcPr>
           <w:p>
@@ -3703,7 +3709,7 @@
     <w:p>
       <w:pPr>
         <w:sectPr>
-          <w:footerReference w:type="default" r:id="rId15"/>
+          <w:footerReference w:type="default" r:id="rId16"/>
           <w:pgSz w:w="12240" w:h="15840"/>
           <w:pgMar w:top="1440" w:right="1440" w:bottom="1440" w:left="1440" w:header="432" w:footer="432" w:gutter="0"/>
           <w:cols w:space="720"/>
@@ -3830,6 +3836,7 @@
               <w:bottom w:val="none" w:sz="0" w:space="0" w:color="auto"/>
               <w:right w:val="none" w:sz="0" w:space="0" w:color="auto"/>
             </w:tcBorders>
+            <w:vAlign w:val="center"/>
           </w:tcPr>
           <w:p/>
           <w:p>
@@ -3963,6 +3970,7 @@
               <w:bottom w:val="none" w:sz="0" w:space="0" w:color="auto"/>
               <w:right w:val="none" w:sz="0" w:space="0" w:color="auto"/>
             </w:tcBorders>
+            <w:vAlign w:val="center"/>
           </w:tcPr>
           <w:p/>
           <w:p>
@@ -4066,6 +4074,7 @@
               <w:bottom w:val="none" w:sz="0" w:space="0" w:color="auto"/>
               <w:right w:val="none" w:sz="0" w:space="0" w:color="auto"/>
             </w:tcBorders>
+            <w:vAlign w:val="center"/>
           </w:tcPr>
           <w:p/>
           <w:p>
@@ -4167,6 +4176,7 @@
               <w:bottom w:val="none" w:sz="0" w:space="0" w:color="auto"/>
               <w:right w:val="none" w:sz="0" w:space="0" w:color="auto"/>
             </w:tcBorders>
+            <w:vAlign w:val="center"/>
           </w:tcPr>
           <w:p/>
           <w:p>
@@ -4270,6 +4280,7 @@
               <w:bottom w:val="none" w:sz="0" w:space="0" w:color="auto"/>
               <w:right w:val="none" w:sz="0" w:space="0" w:color="auto"/>
             </w:tcBorders>
+            <w:vAlign w:val="center"/>
           </w:tcPr>
           <w:p/>
           <w:p>
@@ -4355,6 +4366,7 @@
               <w:bottom w:val="none" w:sz="0" w:space="0" w:color="auto"/>
               <w:right w:val="none" w:sz="0" w:space="0" w:color="auto"/>
             </w:tcBorders>
+            <w:vAlign w:val="center"/>
           </w:tcPr>
           <w:p/>
           <w:p>
@@ -4426,6 +4438,7 @@
               <w:bottom w:val="none" w:sz="0" w:space="0" w:color="auto"/>
               <w:right w:val="none" w:sz="0" w:space="0" w:color="auto"/>
             </w:tcBorders>
+            <w:vAlign w:val="center"/>
           </w:tcPr>
           <w:p/>
           <w:p>
@@ -4511,6 +4524,7 @@
               <w:bottom w:val="none" w:sz="0" w:space="0" w:color="auto"/>
               <w:right w:val="none" w:sz="0" w:space="0" w:color="auto"/>
             </w:tcBorders>
+            <w:vAlign w:val="center"/>
           </w:tcPr>
           <w:p/>
           <w:p>
@@ -4585,7 +4599,7 @@
     <w:p>
       <w:pPr>
         <w:sectPr>
-          <w:footerReference w:type="default" r:id="rId16"/>
+          <w:footerReference w:type="default" r:id="rId17"/>
           <w:pgSz w:w="12240" w:h="15840"/>
           <w:pgMar w:top="1440" w:right="1440" w:bottom="1440" w:left="1440" w:header="432" w:footer="432" w:gutter="0"/>
           <w:cols w:space="720"/>
@@ -4697,6 +4711,7 @@
               <w:bottom w:val="none" w:sz="0" w:space="0" w:color="auto"/>
               <w:right w:val="none" w:sz="0" w:space="0" w:color="auto"/>
             </w:tcBorders>
+            <w:vAlign w:val="center"/>
           </w:tcPr>
           <w:p/>
           <w:p>
@@ -4782,6 +4797,7 @@
               <w:bottom w:val="none" w:sz="0" w:space="0" w:color="auto"/>
               <w:right w:val="none" w:sz="0" w:space="0" w:color="auto"/>
             </w:tcBorders>
+            <w:vAlign w:val="center"/>
           </w:tcPr>
           <w:p/>
           <w:p>
@@ -4885,6 +4901,7 @@
               <w:bottom w:val="none" w:sz="0" w:space="0" w:color="auto"/>
               <w:right w:val="none" w:sz="0" w:space="0" w:color="auto"/>
             </w:tcBorders>
+            <w:vAlign w:val="center"/>
           </w:tcPr>
           <w:p/>
           <w:p>
@@ -4970,6 +4987,7 @@
               <w:bottom w:val="none" w:sz="0" w:space="0" w:color="auto"/>
               <w:right w:val="none" w:sz="0" w:space="0" w:color="auto"/>
             </w:tcBorders>
+            <w:vAlign w:val="center"/>
           </w:tcPr>
           <w:p/>
         </w:tc>
@@ -5028,6 +5046,7 @@
               <w:bottom w:val="none" w:sz="0" w:space="0" w:color="auto"/>
               <w:right w:val="none" w:sz="0" w:space="0" w:color="auto"/>
             </w:tcBorders>
+            <w:vAlign w:val="center"/>
           </w:tcPr>
           <w:p/>
           <w:p>
@@ -5129,6 +5148,7 @@
               <w:bottom w:val="none" w:sz="0" w:space="0" w:color="auto"/>
               <w:right w:val="none" w:sz="0" w:space="0" w:color="auto"/>
             </w:tcBorders>
+            <w:vAlign w:val="center"/>
           </w:tcPr>
           <w:p/>
           <w:p>
@@ -5235,6 +5255,7 @@
               <w:bottom w:val="none" w:sz="0" w:space="0" w:color="auto"/>
               <w:right w:val="none" w:sz="0" w:space="0" w:color="auto"/>
             </w:tcBorders>
+            <w:vAlign w:val="center"/>
           </w:tcPr>
           <w:p/>
           <w:p>
@@ -5336,6 +5357,7 @@
               <w:bottom w:val="none" w:sz="0" w:space="0" w:color="auto"/>
               <w:right w:val="none" w:sz="0" w:space="0" w:color="auto"/>
             </w:tcBorders>
+            <w:vAlign w:val="center"/>
           </w:tcPr>
           <w:p/>
           <w:p>
@@ -5408,7 +5430,7 @@
     <w:p>
       <w:pPr>
         <w:sectPr>
-          <w:footerReference w:type="default" r:id="rId17"/>
+          <w:footerReference w:type="default" r:id="rId18"/>
           <w:pgSz w:w="12240" w:h="15840"/>
           <w:pgMar w:top="1440" w:right="1440" w:bottom="1440" w:left="1440" w:header="432" w:footer="432" w:gutter="0"/>
           <w:cols w:space="720"/>
@@ -5536,6 +5558,7 @@
               <w:bottom w:val="none" w:sz="0" w:space="0" w:color="auto"/>
               <w:right w:val="none" w:sz="0" w:space="0" w:color="auto"/>
             </w:tcBorders>
+            <w:vAlign w:val="center"/>
           </w:tcPr>
           <w:p/>
           <w:p>
@@ -5653,6 +5676,7 @@
               <w:bottom w:val="none" w:sz="0" w:space="0" w:color="auto"/>
               <w:right w:val="none" w:sz="0" w:space="0" w:color="auto"/>
             </w:tcBorders>
+            <w:vAlign w:val="center"/>
           </w:tcPr>
           <w:p/>
           <w:p>
@@ -5793,6 +5817,7 @@
               <w:bottom w:val="none" w:sz="0" w:space="0" w:color="auto"/>
               <w:right w:val="none" w:sz="0" w:space="0" w:color="auto"/>
             </w:tcBorders>
+            <w:vAlign w:val="center"/>
           </w:tcPr>
           <w:p/>
           <w:p>
@@ -5844,6 +5869,7 @@
               <w:bottom w:val="none" w:sz="0" w:space="0" w:color="auto"/>
               <w:right w:val="none" w:sz="0" w:space="0" w:color="auto"/>
             </w:tcBorders>
+            <w:vAlign w:val="center"/>
           </w:tcPr>
           <w:p/>
         </w:tc>
@@ -5902,6 +5928,7 @@
               <w:bottom w:val="none" w:sz="0" w:space="0" w:color="auto"/>
               <w:right w:val="none" w:sz="0" w:space="0" w:color="auto"/>
             </w:tcBorders>
+            <w:vAlign w:val="center"/>
           </w:tcPr>
           <w:p/>
           <w:p>
@@ -5953,6 +5980,7 @@
               <w:bottom w:val="none" w:sz="0" w:space="0" w:color="auto"/>
               <w:right w:val="none" w:sz="0" w:space="0" w:color="auto"/>
             </w:tcBorders>
+            <w:vAlign w:val="center"/>
           </w:tcPr>
           <w:p/>
         </w:tc>
@@ -5960,33 +5988,77 @@
     </w:tbl>
     <w:p>
       <w:pPr>
-        <w:spacing w:before="280" w:after="80"/>
-        <w:ind w:left="280" w:right="280"/>
-        <w:shd w:val="clear" w:color="auto" w:fill="EBF3FB"/>
+        <w:spacing w:before="280" w:after="0"/>
       </w:pPr>
-      <w:r>
-        <w:rPr>
-          <w:rFonts w:ascii="Arial" w:hAnsi="Arial"/>
-          <w:b/>
-          <w:i w:val="0"/>
-          <w:color w:val="1F3864"/>
-          <w:sz w:val="18"/>
-        </w:rPr>
-        <w:t xml:space="preserve">Discuss with your producer. </w:t>
-      </w:r>
-      <w:r>
-        <w:rPr>
-          <w:rFonts w:ascii="Arial" w:hAnsi="Arial"/>
-          <w:b w:val="0"/>
-          <w:i w:val="0"/>
-          <w:color w:val="1F3864"/>
-          <w:sz w:val="18"/>
-        </w:rPr>
-        <w:t>Your NBAIS producer can help you assess which of these coverage lines apply to your operation and identify any potential gaps in your current insurance program.</w:t>
-      </w:r>
+    </w:p>
+    <w:tbl>
+      <w:tblPr>
+        <w:tblW w:type="auto" w:w="0"/>
+        <w:tblLook w:firstColumn="1" w:firstRow="1" w:lastColumn="0" w:lastRow="0" w:noHBand="0" w:noVBand="1" w:val="04A0"/>
+        <w:tblBorders>
+          <w:top w:val="none" w:sz="0" w:space="0" w:color="auto"/>
+          <w:left w:val="none" w:sz="0" w:space="0" w:color="auto"/>
+          <w:bottom w:val="none" w:sz="0" w:space="0" w:color="auto"/>
+          <w:right w:val="none" w:sz="0" w:space="0" w:color="auto"/>
+          <w:insideH w:val="none" w:sz="0" w:space="0" w:color="auto"/>
+          <w:insideV w:val="none" w:sz="0" w:space="0" w:color="auto"/>
+        </w:tblBorders>
+        <w:tblW w:w="9360" w:type="dxa"/>
+      </w:tblPr>
+      <w:tblGrid>
+        <w:gridCol w:w="9360"/>
+      </w:tblGrid>
+      <w:tr>
+        <w:tc>
+          <w:tcPr>
+            <w:tcW w:type="dxa" w:w="9360"/>
+            <w:shd w:val="clear" w:color="auto" w:fill="EBF3FF"/>
+            <w:tcMar>
+              <w:top w:w="120" w:type="dxa"/>
+              <w:bottom w:w="120" w:type="dxa"/>
+              <w:left w:w="160" w:type="dxa"/>
+              <w:right w:w="120" w:type="dxa"/>
+            </w:tcMar>
+            <w:vAlign w:val="center"/>
+            <w:tcBorders>
+              <w:left w:val="single" w:sz="36" w:space="0" w:color="1F3864"/>
+              <w:top w:val="none" w:sz="0" w:space="0" w:color="auto"/>
+              <w:bottom w:val="none" w:sz="0" w:space="0" w:color="auto"/>
+              <w:right w:val="none" w:sz="0" w:space="0" w:color="auto"/>
+            </w:tcBorders>
+          </w:tcPr>
+          <w:p>
+            <w:r>
+              <w:rPr>
+                <w:rFonts w:ascii="Arial" w:hAnsi="Arial"/>
+                <w:b/>
+                <w:i w:val="0"/>
+                <w:color w:val="1F3864"/>
+                <w:sz w:val="18"/>
+              </w:rPr>
+              <w:t xml:space="preserve">Discuss with your producer. </w:t>
+            </w:r>
+            <w:r>
+              <w:rPr>
+                <w:rFonts w:ascii="Arial" w:hAnsi="Arial"/>
+                <w:b w:val="0"/>
+                <w:i w:val="0"/>
+                <w:color w:val="1F3864"/>
+                <w:sz w:val="18"/>
+              </w:rPr>
+              <w:t>Your NBAIS producer can help you assess which of these coverage lines apply to your operation and identify any potential gaps in your current insurance program.</w:t>
+            </w:r>
+          </w:p>
+        </w:tc>
+      </w:tr>
+    </w:tbl>
+    <w:p>
+      <w:pPr>
+        <w:spacing w:before="80" w:after="0"/>
+      </w:pPr>
     </w:p>
     <w:sectPr>
-      <w:footerReference w:type="default" r:id="rId18"/>
+      <w:footerReference w:type="default" r:id="rId19"/>
       <w:pgSz w:w="12240" w:h="15840"/>
       <w:pgMar w:top="1440" w:right="1440" w:bottom="1440" w:left="1440" w:header="432" w:footer="432" w:gutter="0"/>
       <w:cols w:space="720"/>
@@ -6000,8 +6072,22 @@
 <w:ftr xmlns:m="http://schemas.openxmlformats.org/officeDocument/2006/math" xmlns:mc="http://schemas.openxmlformats.org/markup-compatibility/2006" xmlns:mo="http://schemas.microsoft.com/office/mac/office/2008/main" xmlns:mv="urn:schemas-microsoft-com:mac:vml" xmlns:o="urn:schemas-microsoft-com:office:office" xmlns:r="http://schemas.openxmlformats.org/officeDocument/2006/relationships" xmlns:v="urn:schemas-microsoft-com:vml" xmlns:w10="urn:schemas-microsoft-com:office:word" xmlns:w14="http://schemas.microsoft.com/office/word/2010/wordml" xmlns:w="http://schemas.openxmlformats.org/wordprocessingml/2006/main" xmlns:wne="http://schemas.microsoft.com/office/word/2006/wordml" xmlns:wp14="http://schemas.microsoft.com/office/word/2010/wordprocessingDrawing" xmlns:wp="http://schemas.openxmlformats.org/drawingml/2006/wordprocessingDrawing" xmlns:wpc="http://schemas.microsoft.com/office/word/2010/wordprocessingCanvas" xmlns:wpg="http://schemas.microsoft.com/office/word/2010/wordprocessingGroup" xmlns:wpi="http://schemas.microsoft.com/office/word/2010/wordprocessingInk" xmlns:wps="http://schemas.microsoft.com/office/word/2010/wordprocessingShape" mc:Ignorable="w14 wp14">
   <w:p>
     <w:pPr>
-      <w:pStyle w:val="Footer"/>
+      <w:spacing w:before="80" w:after="80"/>
+      <w:jc w:val="center"/>
+      <w:pBdr>
+        <w:top w:val="single" w:sz="12" w:space="4" w:color="1F3864"/>
+      </w:pBdr>
     </w:pPr>
+    <w:r>
+      <w:rPr>
+        <w:rFonts w:ascii="Arial" w:hAnsi="Arial"/>
+        <w:b w:val="0"/>
+        <w:i/>
+        <w:color w:val="595959"/>
+        <w:sz w:val="17"/>
+      </w:rPr>
+      <w:t>CONFIDENTIAL — This proposal is intended solely for the use of the named insured and their authorized representatives.</w:t>
+    </w:r>
   </w:p>
 </w:ftr>
 </file>
@@ -6281,11 +6367,58 @@
 
 <file path=word/header1.xml><?xml version="1.0" encoding="utf-8"?>
 <w:hdr xmlns:m="http://schemas.openxmlformats.org/officeDocument/2006/math" xmlns:mc="http://schemas.openxmlformats.org/markup-compatibility/2006" xmlns:mo="http://schemas.microsoft.com/office/mac/office/2008/main" xmlns:mv="urn:schemas-microsoft-com:mac:vml" xmlns:o="urn:schemas-microsoft-com:office:office" xmlns:r="http://schemas.openxmlformats.org/officeDocument/2006/relationships" xmlns:v="urn:schemas-microsoft-com:vml" xmlns:w10="urn:schemas-microsoft-com:office:word" xmlns:w14="http://schemas.microsoft.com/office/word/2010/wordml" xmlns:w="http://schemas.openxmlformats.org/wordprocessingml/2006/main" xmlns:wne="http://schemas.microsoft.com/office/word/2006/wordml" xmlns:wp14="http://schemas.microsoft.com/office/word/2010/wordprocessingDrawing" xmlns:wp="http://schemas.openxmlformats.org/drawingml/2006/wordprocessingDrawing" xmlns:wpc="http://schemas.microsoft.com/office/word/2010/wordprocessingCanvas" xmlns:wpg="http://schemas.microsoft.com/office/word/2010/wordprocessingGroup" xmlns:wpi="http://schemas.microsoft.com/office/word/2010/wordprocessingInk" xmlns:wps="http://schemas.microsoft.com/office/word/2010/wordprocessingShape" mc:Ignorable="w14 wp14">
-  <w:p>
-    <w:pPr>
-      <w:pStyle w:val="Header"/>
-    </w:pPr>
-  </w:p>
+  <w:tbl>
+    <w:tblPr>
+      <w:tblW w:type="auto" w:w="0"/>
+      <w:tblLook w:firstColumn="1" w:firstRow="1" w:lastColumn="0" w:lastRow="0" w:noHBand="0" w:noVBand="1" w:val="04A0"/>
+      <w:tblBorders>
+        <w:top w:val="none" w:sz="0" w:space="0" w:color="auto"/>
+        <w:left w:val="none" w:sz="0" w:space="0" w:color="auto"/>
+        <w:bottom w:val="none" w:sz="0" w:space="0" w:color="auto"/>
+        <w:right w:val="none" w:sz="0" w:space="0" w:color="auto"/>
+        <w:insideH w:val="none" w:sz="0" w:space="0" w:color="auto"/>
+        <w:insideV w:val="none" w:sz="0" w:space="0" w:color="auto"/>
+      </w:tblBorders>
+      <w:tblW w:w="12240" w:type="dxa"/>
+    </w:tblPr>
+    <w:tblGrid>
+      <w:gridCol w:w="12240"/>
+    </w:tblGrid>
+    <w:tr>
+      <w:trPr>
+        <w:trHeight w:val="460" w:hRule="exact"/>
+      </w:trPr>
+      <w:tc>
+        <w:tcPr>
+          <w:tcW w:type="dxa" w:w="12240"/>
+          <w:shd w:val="clear" w:color="auto" w:fill="1F3864"/>
+          <w:tcMar>
+            <w:top w:w="0" w:type="dxa"/>
+            <w:bottom w:w="0" w:type="dxa"/>
+            <w:left w:w="0" w:type="dxa"/>
+            <w:right w:w="0" w:type="dxa"/>
+          </w:tcMar>
+          <w:vAlign w:val="center"/>
+        </w:tcPr>
+        <w:p>
+          <w:pPr>
+            <w:spacing w:before="0" w:after="0"/>
+            <w:jc w:val="center"/>
+          </w:pPr>
+          <w:r>
+            <w:rPr>
+              <w:rFonts w:ascii="Arial" w:hAnsi="Arial"/>
+              <w:b/>
+              <w:i w:val="0"/>
+              <w:color w:val="FFFFFF"/>
+              <w:sz w:val="28"/>
+            </w:rPr>
+            <w:t>NBAIS Workers’ Compensation Program</w:t>
+          </w:r>
+        </w:p>
+      </w:tc>
+    </w:tr>
+  </w:tbl>
 </w:hdr>
 </file>
 

</xml_diff>

<commit_message>
fix(ADO#2695): cover header text/alignment, signature table 25% label width
- build_cover_first_page_header: remove decorative text (nav bar purely decorative),
  set TOP vertical alignment, set header_distance=0.1in for flush-to-top positioning
- build_next_steps_page: signature table label width 20% -> 25% per WI spec
- Regenerated master.docx and synced to S3
</commit_message>
<xml_diff>
--- a/services/proposal-generator/templates/verticals/nbais-wc/master.docx
+++ b/services/proposal-generator/templates/verticals/nbais-wc/master.docx
@@ -404,7 +404,7 @@
           <w:headerReference w:type="first" r:id="rId9"/>
           <w:footerReference w:type="first" r:id="rId10"/>
           <w:pgSz w:w="12240" w:h="15840"/>
-          <w:pgMar w:top="0" w:right="0" w:bottom="0" w:left="0" w:header="720" w:footer="720" w:gutter="0"/>
+          <w:pgMar w:top="0" w:right="0" w:bottom="0" w:left="0" w:header="144" w:footer="720" w:gutter="0"/>
           <w:cols w:space="720"/>
           <w:titlePg/>
           <w:docGrid w:linePitch="360"/>
@@ -3509,7 +3509,7 @@
         <w:tc>
           <w:tcPr>
             <w:tcW w:type="dxa" w:w="4680"/>
-            <w:tcW w:w="1872" w:type="dxa"/>
+            <w:tcW w:w="2340" w:type="dxa"/>
             <w:tcMar>
               <w:top w:w="80" w:type="dxa"/>
               <w:bottom w:w="80" w:type="dxa"/>
@@ -3534,7 +3534,7 @@
         <w:tc>
           <w:tcPr>
             <w:tcW w:type="dxa" w:w="4680"/>
-            <w:tcW w:w="7488" w:type="dxa"/>
+            <w:tcW w:w="7020" w:type="dxa"/>
             <w:tcMar>
               <w:top w:w="80" w:type="dxa"/>
               <w:bottom w:w="80" w:type="dxa"/>
@@ -3555,7 +3555,7 @@
         <w:tc>
           <w:tcPr>
             <w:tcW w:type="dxa" w:w="4680"/>
-            <w:tcW w:w="1872" w:type="dxa"/>
+            <w:tcW w:w="2340" w:type="dxa"/>
             <w:tcMar>
               <w:top w:w="80" w:type="dxa"/>
               <w:bottom w:w="80" w:type="dxa"/>
@@ -3580,7 +3580,7 @@
         <w:tc>
           <w:tcPr>
             <w:tcW w:type="dxa" w:w="4680"/>
-            <w:tcW w:w="7488" w:type="dxa"/>
+            <w:tcW w:w="7020" w:type="dxa"/>
             <w:tcMar>
               <w:top w:w="80" w:type="dxa"/>
               <w:bottom w:w="80" w:type="dxa"/>
@@ -3601,7 +3601,7 @@
         <w:tc>
           <w:tcPr>
             <w:tcW w:type="dxa" w:w="4680"/>
-            <w:tcW w:w="1872" w:type="dxa"/>
+            <w:tcW w:w="2340" w:type="dxa"/>
             <w:tcMar>
               <w:top w:w="80" w:type="dxa"/>
               <w:bottom w:w="80" w:type="dxa"/>
@@ -3626,7 +3626,7 @@
         <w:tc>
           <w:tcPr>
             <w:tcW w:type="dxa" w:w="4680"/>
-            <w:tcW w:w="7488" w:type="dxa"/>
+            <w:tcW w:w="7020" w:type="dxa"/>
             <w:tcMar>
               <w:top w:w="80" w:type="dxa"/>
               <w:bottom w:w="80" w:type="dxa"/>
@@ -3647,7 +3647,7 @@
         <w:tc>
           <w:tcPr>
             <w:tcW w:type="dxa" w:w="4680"/>
-            <w:tcW w:w="1872" w:type="dxa"/>
+            <w:tcW w:w="2340" w:type="dxa"/>
             <w:tcMar>
               <w:top w:w="80" w:type="dxa"/>
               <w:bottom w:w="80" w:type="dxa"/>
@@ -3672,7 +3672,7 @@
         <w:tc>
           <w:tcPr>
             <w:tcW w:type="dxa" w:w="4680"/>
-            <w:tcW w:w="7488" w:type="dxa"/>
+            <w:tcW w:w="7020" w:type="dxa"/>
             <w:tcMar>
               <w:top w:w="80" w:type="dxa"/>
               <w:bottom w:w="80" w:type="dxa"/>
@@ -6398,23 +6398,13 @@
             <w:left w:w="0" w:type="dxa"/>
             <w:right w:w="0" w:type="dxa"/>
           </w:tcMar>
-          <w:vAlign w:val="center"/>
+          <w:vAlign w:val="top"/>
         </w:tcPr>
         <w:p>
           <w:pPr>
             <w:spacing w:before="0" w:after="0"/>
-            <w:jc w:val="center"/>
+            <w:jc w:val="left"/>
           </w:pPr>
-          <w:r>
-            <w:rPr>
-              <w:rFonts w:ascii="Arial" w:hAnsi="Arial"/>
-              <w:b/>
-              <w:i w:val="0"/>
-              <w:color w:val="FFFFFF"/>
-              <w:sz w:val="28"/>
-            </w:rPr>
-            <w:t>NBAIS Workers’ Compensation Program</w:t>
-          </w:r>
         </w:p>
       </w:tc>
     </w:tr>

</xml_diff>

<commit_message>
fix(ADO#2696): fix signature table tblGrid to enforce 25/75 column proportions
- Add set_table_grid() helper to replace tblGrid gridCol elements
- Root cause: tblGrid overrides tcW; Word normalizes columns to tblGrid values
- Apply to sig table (25/75), cover meta table (35/65), contact table (3-col), add_kv_table
- Signature table tblGrid now: [2340, 7020] (was [4680, 4680])
</commit_message>
<xml_diff>
--- a/services/proposal-generator/templates/verticals/nbais-wc/master.docx
+++ b/services/proposal-generator/templates/verticals/nbais-wc/master.docx
@@ -105,7 +105,6 @@
     </w:p>
     <w:tbl>
       <w:tblPr>
-        <w:tblW w:type="auto" w:w="0"/>
         <w:tblLook w:firstColumn="1" w:firstRow="1" w:lastColumn="0" w:lastRow="0" w:noHBand="0" w:noVBand="1" w:val="04A0"/>
         <w:tblBorders>
           <w:top w:val="none" w:sz="0" w:space="0" w:color="auto"/>
@@ -119,13 +118,12 @@
         <w:jc w:val="center"/>
       </w:tblPr>
       <w:tblGrid>
-        <w:gridCol w:w="4680"/>
-        <w:gridCol w:w="4680"/>
+        <w:gridCol w:w="1889"/>
+        <w:gridCol w:w="3511"/>
       </w:tblGrid>
       <w:tr>
         <w:tc>
           <w:tcPr>
-            <w:tcW w:type="dxa" w:w="4680"/>
             <w:tcW w:w="1889" w:type="dxa"/>
             <w:tcMar>
               <w:top w:w="40" w:type="dxa"/>
@@ -153,7 +151,6 @@
         </w:tc>
         <w:tc>
           <w:tcPr>
-            <w:tcW w:type="dxa" w:w="4680"/>
             <w:tcW w:w="3511" w:type="dxa"/>
             <w:tcMar>
               <w:top w:w="40" w:type="dxa"/>
@@ -180,7 +177,6 @@
       <w:tr>
         <w:tc>
           <w:tcPr>
-            <w:tcW w:type="dxa" w:w="4680"/>
             <w:tcW w:w="1889" w:type="dxa"/>
             <w:tcMar>
               <w:top w:w="40" w:type="dxa"/>
@@ -208,7 +204,6 @@
         </w:tc>
         <w:tc>
           <w:tcPr>
-            <w:tcW w:type="dxa" w:w="4680"/>
             <w:tcW w:w="3511" w:type="dxa"/>
             <w:tcMar>
               <w:top w:w="40" w:type="dxa"/>
@@ -235,7 +230,6 @@
       <w:tr>
         <w:tc>
           <w:tcPr>
-            <w:tcW w:type="dxa" w:w="4680"/>
             <w:tcW w:w="1889" w:type="dxa"/>
             <w:tcMar>
               <w:top w:w="40" w:type="dxa"/>
@@ -263,7 +257,6 @@
         </w:tc>
         <w:tc>
           <w:tcPr>
-            <w:tcW w:type="dxa" w:w="4680"/>
             <w:tcW w:w="3511" w:type="dxa"/>
             <w:tcMar>
               <w:top w:w="40" w:type="dxa"/>
@@ -290,7 +283,6 @@
       <w:tr>
         <w:tc>
           <w:tcPr>
-            <w:tcW w:type="dxa" w:w="4680"/>
             <w:tcW w:w="1889" w:type="dxa"/>
             <w:tcMar>
               <w:top w:w="40" w:type="dxa"/>
@@ -318,7 +310,6 @@
         </w:tc>
         <w:tc>
           <w:tcPr>
-            <w:tcW w:type="dxa" w:w="4680"/>
             <w:tcW w:w="3511" w:type="dxa"/>
             <w:tcMar>
               <w:top w:w="40" w:type="dxa"/>
@@ -345,7 +336,6 @@
       <w:tr>
         <w:tc>
           <w:tcPr>
-            <w:tcW w:type="dxa" w:w="4680"/>
             <w:tcW w:w="1889" w:type="dxa"/>
             <w:tcMar>
               <w:top w:w="40" w:type="dxa"/>
@@ -373,7 +363,6 @@
         </w:tc>
         <w:tc>
           <w:tcPr>
-            <w:tcW w:type="dxa" w:w="4680"/>
             <w:tcW w:w="3511" w:type="dxa"/>
             <w:tcMar>
               <w:top w:w="40" w:type="dxa"/>
@@ -877,7 +866,6 @@
     </w:p>
     <w:tbl>
       <w:tblPr>
-        <w:tblW w:type="auto" w:w="0"/>
         <w:tblLook w:firstColumn="1" w:firstRow="1" w:lastColumn="0" w:lastRow="0" w:noHBand="0" w:noVBand="1" w:val="04A0"/>
         <w:tblBorders>
           <w:top w:val="none" w:sz="0" w:space="0" w:color="auto"/>
@@ -943,7 +931,6 @@
     </w:p>
     <w:tbl>
       <w:tblPr>
-        <w:tblW w:type="auto" w:w="0"/>
         <w:tblLook w:firstColumn="1" w:firstRow="1" w:lastColumn="0" w:lastRow="0" w:noHBand="0" w:noVBand="1" w:val="04A0"/>
         <w:tblBorders>
           <w:top w:val="single" w:sz="4" w:space="0" w:color="CCCCCC"/>
@@ -993,7 +980,6 @@
       <w:tr>
         <w:tc>
           <w:tcPr>
-            <w:tcW w:type="dxa" w:w="4680"/>
             <w:tcW w:w="3276" w:type="dxa"/>
             <w:tcMar>
               <w:top w:w="80" w:type="dxa"/>
@@ -1019,7 +1005,6 @@
         </w:tc>
         <w:tc>
           <w:tcPr>
-            <w:tcW w:type="dxa" w:w="4680"/>
             <w:tcW w:w="6084" w:type="dxa"/>
             <w:tcMar>
               <w:top w:w="80" w:type="dxa"/>
@@ -1047,7 +1032,6 @@
       <w:tr>
         <w:tc>
           <w:tcPr>
-            <w:tcW w:type="dxa" w:w="4680"/>
             <w:tcW w:w="3276" w:type="dxa"/>
             <w:tcMar>
               <w:top w:w="80" w:type="dxa"/>
@@ -1072,7 +1056,6 @@
         </w:tc>
         <w:tc>
           <w:tcPr>
-            <w:tcW w:type="dxa" w:w="4680"/>
             <w:tcW w:w="6084" w:type="dxa"/>
             <w:tcMar>
               <w:top w:w="80" w:type="dxa"/>
@@ -1099,7 +1082,6 @@
       <w:tr>
         <w:tc>
           <w:tcPr>
-            <w:tcW w:type="dxa" w:w="4680"/>
             <w:tcW w:w="3276" w:type="dxa"/>
             <w:tcMar>
               <w:top w:w="80" w:type="dxa"/>
@@ -1125,7 +1107,6 @@
         </w:tc>
         <w:tc>
           <w:tcPr>
-            <w:tcW w:type="dxa" w:w="4680"/>
             <w:tcW w:w="6084" w:type="dxa"/>
             <w:tcMar>
               <w:top w:w="80" w:type="dxa"/>
@@ -1153,7 +1134,6 @@
       <w:tr>
         <w:tc>
           <w:tcPr>
-            <w:tcW w:type="dxa" w:w="4680"/>
             <w:tcW w:w="3276" w:type="dxa"/>
             <w:tcMar>
               <w:top w:w="80" w:type="dxa"/>
@@ -1178,7 +1158,6 @@
         </w:tc>
         <w:tc>
           <w:tcPr>
-            <w:tcW w:type="dxa" w:w="4680"/>
             <w:tcW w:w="6084" w:type="dxa"/>
             <w:tcMar>
               <w:top w:w="80" w:type="dxa"/>
@@ -1205,7 +1184,6 @@
       <w:tr>
         <w:tc>
           <w:tcPr>
-            <w:tcW w:type="dxa" w:w="4680"/>
             <w:tcW w:w="3276" w:type="dxa"/>
             <w:tcMar>
               <w:top w:w="80" w:type="dxa"/>
@@ -1231,7 +1209,6 @@
         </w:tc>
         <w:tc>
           <w:tcPr>
-            <w:tcW w:type="dxa" w:w="4680"/>
             <w:tcW w:w="6084" w:type="dxa"/>
             <w:tcMar>
               <w:top w:w="80" w:type="dxa"/>
@@ -1259,7 +1236,6 @@
       <w:tr>
         <w:tc>
           <w:tcPr>
-            <w:tcW w:type="dxa" w:w="4680"/>
             <w:tcW w:w="3276" w:type="dxa"/>
             <w:tcMar>
               <w:top w:w="80" w:type="dxa"/>
@@ -1284,7 +1260,6 @@
         </w:tc>
         <w:tc>
           <w:tcPr>
-            <w:tcW w:type="dxa" w:w="4680"/>
             <w:tcW w:w="6084" w:type="dxa"/>
             <w:tcMar>
               <w:top w:w="80" w:type="dxa"/>
@@ -1311,7 +1286,6 @@
       <w:tr>
         <w:tc>
           <w:tcPr>
-            <w:tcW w:type="dxa" w:w="4680"/>
             <w:tcW w:w="3276" w:type="dxa"/>
             <w:tcMar>
               <w:top w:w="80" w:type="dxa"/>
@@ -1337,7 +1311,6 @@
         </w:tc>
         <w:tc>
           <w:tcPr>
-            <w:tcW w:type="dxa" w:w="4680"/>
             <w:tcW w:w="6084" w:type="dxa"/>
             <w:tcMar>
               <w:top w:w="80" w:type="dxa"/>
@@ -1365,7 +1338,6 @@
       <w:tr>
         <w:tc>
           <w:tcPr>
-            <w:tcW w:type="dxa" w:w="4680"/>
             <w:tcW w:w="3276" w:type="dxa"/>
             <w:tcMar>
               <w:top w:w="80" w:type="dxa"/>
@@ -1390,7 +1362,6 @@
         </w:tc>
         <w:tc>
           <w:tcPr>
-            <w:tcW w:type="dxa" w:w="4680"/>
             <w:tcW w:w="6084" w:type="dxa"/>
             <w:tcMar>
               <w:top w:w="80" w:type="dxa"/>
@@ -1417,7 +1388,6 @@
       <w:tr>
         <w:tc>
           <w:tcPr>
-            <w:tcW w:type="dxa" w:w="4680"/>
             <w:tcW w:w="3276" w:type="dxa"/>
             <w:tcMar>
               <w:top w:w="80" w:type="dxa"/>
@@ -1443,7 +1413,6 @@
         </w:tc>
         <w:tc>
           <w:tcPr>
-            <w:tcW w:type="dxa" w:w="4680"/>
             <w:tcW w:w="6084" w:type="dxa"/>
             <w:tcMar>
               <w:top w:w="80" w:type="dxa"/>
@@ -1615,7 +1584,6 @@
     </w:p>
     <w:tbl>
       <w:tblPr>
-        <w:tblW w:type="auto" w:w="0"/>
         <w:tblLook w:firstColumn="1" w:firstRow="1" w:lastColumn="0" w:lastRow="0" w:noHBand="0" w:noVBand="1" w:val="04A0"/>
         <w:tblBorders>
           <w:top w:val="none" w:sz="0" w:space="0" w:color="auto"/>
@@ -1684,7 +1652,6 @@
     </w:p>
     <w:tbl>
       <w:tblPr>
-        <w:tblW w:type="auto" w:w="0"/>
         <w:tblLook w:firstColumn="1" w:firstRow="1" w:lastColumn="0" w:lastRow="0" w:noHBand="0" w:noVBand="1" w:val="04A0"/>
         <w:tblBorders>
           <w:top w:val="single" w:sz="4" w:space="0" w:color="CCCCCC"/>
@@ -1697,13 +1664,12 @@
         <w:tblW w:w="9360" w:type="dxa"/>
       </w:tblPr>
       <w:tblGrid>
-        <w:gridCol w:w="4680"/>
-        <w:gridCol w:w="4680"/>
+        <w:gridCol w:w="2808"/>
+        <w:gridCol w:w="6552"/>
       </w:tblGrid>
       <w:tr>
         <w:tc>
           <w:tcPr>
-            <w:tcW w:type="dxa" w:w="4680"/>
             <w:tcW w:w="2808" w:type="dxa"/>
             <w:tcMar>
               <w:top w:w="80" w:type="dxa"/>
@@ -1729,7 +1695,6 @@
         </w:tc>
         <w:tc>
           <w:tcPr>
-            <w:tcW w:type="dxa" w:w="4680"/>
             <w:tcW w:w="6552" w:type="dxa"/>
             <w:tcMar>
               <w:top w:w="80" w:type="dxa"/>
@@ -1757,7 +1722,6 @@
       <w:tr>
         <w:tc>
           <w:tcPr>
-            <w:tcW w:type="dxa" w:w="4680"/>
             <w:tcW w:w="2808" w:type="dxa"/>
             <w:tcMar>
               <w:top w:w="80" w:type="dxa"/>
@@ -1782,7 +1746,6 @@
         </w:tc>
         <w:tc>
           <w:tcPr>
-            <w:tcW w:type="dxa" w:w="4680"/>
             <w:tcW w:w="6552" w:type="dxa"/>
             <w:tcMar>
               <w:top w:w="80" w:type="dxa"/>
@@ -1809,7 +1772,6 @@
       <w:tr>
         <w:tc>
           <w:tcPr>
-            <w:tcW w:type="dxa" w:w="4680"/>
             <w:tcW w:w="2808" w:type="dxa"/>
             <w:tcMar>
               <w:top w:w="80" w:type="dxa"/>
@@ -1835,7 +1797,6 @@
         </w:tc>
         <w:tc>
           <w:tcPr>
-            <w:tcW w:type="dxa" w:w="4680"/>
             <w:tcW w:w="6552" w:type="dxa"/>
             <w:tcMar>
               <w:top w:w="80" w:type="dxa"/>
@@ -1863,7 +1824,6 @@
       <w:tr>
         <w:tc>
           <w:tcPr>
-            <w:tcW w:type="dxa" w:w="4680"/>
             <w:tcW w:w="2808" w:type="dxa"/>
             <w:tcMar>
               <w:top w:w="80" w:type="dxa"/>
@@ -1888,7 +1848,6 @@
         </w:tc>
         <w:tc>
           <w:tcPr>
-            <w:tcW w:type="dxa" w:w="4680"/>
             <w:tcW w:w="6552" w:type="dxa"/>
             <w:tcMar>
               <w:top w:w="80" w:type="dxa"/>
@@ -1915,7 +1874,6 @@
       <w:tr>
         <w:tc>
           <w:tcPr>
-            <w:tcW w:type="dxa" w:w="4680"/>
             <w:tcW w:w="2808" w:type="dxa"/>
             <w:tcMar>
               <w:top w:w="80" w:type="dxa"/>
@@ -1941,7 +1899,6 @@
         </w:tc>
         <w:tc>
           <w:tcPr>
-            <w:tcW w:type="dxa" w:w="4680"/>
             <w:tcW w:w="6552" w:type="dxa"/>
             <w:tcMar>
               <w:top w:w="80" w:type="dxa"/>
@@ -1969,7 +1926,6 @@
       <w:tr>
         <w:tc>
           <w:tcPr>
-            <w:tcW w:type="dxa" w:w="4680"/>
             <w:tcW w:w="2808" w:type="dxa"/>
             <w:tcMar>
               <w:top w:w="80" w:type="dxa"/>
@@ -1994,7 +1950,6 @@
         </w:tc>
         <w:tc>
           <w:tcPr>
-            <w:tcW w:type="dxa" w:w="4680"/>
             <w:tcW w:w="6552" w:type="dxa"/>
             <w:tcMar>
               <w:top w:w="80" w:type="dxa"/>
@@ -2072,7 +2027,6 @@
     </w:p>
     <w:tbl>
       <w:tblPr>
-        <w:tblW w:type="auto" w:w="0"/>
         <w:tblLook w:firstColumn="1" w:firstRow="1" w:lastColumn="0" w:lastRow="0" w:noHBand="0" w:noVBand="1" w:val="04A0"/>
         <w:tblBorders>
           <w:top w:val="single" w:sz="4" w:space="0" w:color="CCCCCC"/>
@@ -2144,7 +2098,6 @@
       <w:tr>
         <w:tc>
           <w:tcPr>
-            <w:tcW w:type="dxa" w:w="4680"/>
             <w:tcW w:w="6084" w:type="dxa"/>
             <w:tcMar>
               <w:top w:w="60" w:type="dxa"/>
@@ -2170,7 +2123,6 @@
         </w:tc>
         <w:tc>
           <w:tcPr>
-            <w:tcW w:type="dxa" w:w="4680"/>
             <w:tcW w:w="3276" w:type="dxa"/>
             <w:tcMar>
               <w:top w:w="60" w:type="dxa"/>
@@ -2198,7 +2150,6 @@
       <w:tr>
         <w:tc>
           <w:tcPr>
-            <w:tcW w:type="dxa" w:w="4680"/>
             <w:tcW w:w="6084" w:type="dxa"/>
             <w:tcMar>
               <w:top w:w="60" w:type="dxa"/>
@@ -2223,7 +2174,6 @@
         </w:tc>
         <w:tc>
           <w:tcPr>
-            <w:tcW w:type="dxa" w:w="4680"/>
             <w:tcW w:w="3276" w:type="dxa"/>
             <w:tcMar>
               <w:top w:w="60" w:type="dxa"/>
@@ -2250,7 +2200,6 @@
       <w:tr>
         <w:tc>
           <w:tcPr>
-            <w:tcW w:type="dxa" w:w="4680"/>
             <w:tcW w:w="6084" w:type="dxa"/>
             <w:tcMar>
               <w:top w:w="60" w:type="dxa"/>
@@ -2276,7 +2225,6 @@
         </w:tc>
         <w:tc>
           <w:tcPr>
-            <w:tcW w:type="dxa" w:w="4680"/>
             <w:tcW w:w="3276" w:type="dxa"/>
             <w:tcMar>
               <w:top w:w="60" w:type="dxa"/>
@@ -2304,7 +2252,6 @@
       <w:tr>
         <w:tc>
           <w:tcPr>
-            <w:tcW w:type="dxa" w:w="4680"/>
             <w:tcW w:w="6084" w:type="dxa"/>
             <w:tcMar>
               <w:top w:w="60" w:type="dxa"/>
@@ -2329,7 +2276,6 @@
         </w:tc>
         <w:tc>
           <w:tcPr>
-            <w:tcW w:type="dxa" w:w="4680"/>
             <w:tcW w:w="3276" w:type="dxa"/>
             <w:tcMar>
               <w:top w:w="60" w:type="dxa"/>
@@ -2410,7 +2356,6 @@
     </w:p>
     <w:tbl>
       <w:tblPr>
-        <w:tblW w:type="auto" w:w="0"/>
         <w:tblLook w:firstColumn="1" w:firstRow="1" w:lastColumn="0" w:lastRow="0" w:noHBand="0" w:noVBand="1" w:val="04A0"/>
         <w:tblBorders>
           <w:top w:val="none" w:sz="0" w:space="0" w:color="auto"/>
@@ -2479,7 +2424,6 @@
     </w:p>
     <w:tbl>
       <w:tblPr>
-        <w:tblW w:type="auto" w:w="0"/>
         <w:tblLook w:firstColumn="1" w:firstRow="1" w:lastColumn="0" w:lastRow="0" w:noHBand="0" w:noVBand="1" w:val="04A0"/>
         <w:tblBorders>
           <w:top w:val="single" w:sz="4" w:space="0" w:color="CCCCCC"/>
@@ -2505,7 +2449,6 @@
         </w:trPr>
         <w:tc>
           <w:tcPr>
-            <w:tcW w:type="dxa" w:w="1560"/>
             <w:tcW w:w="655" w:type="dxa"/>
             <w:shd w:val="clear" w:color="auto" w:fill="1F3864"/>
             <w:tcMar>
@@ -2531,7 +2474,6 @@
         </w:tc>
         <w:tc>
           <w:tcPr>
-            <w:tcW w:type="dxa" w:w="1560"/>
             <w:tcW w:w="1123" w:type="dxa"/>
             <w:shd w:val="clear" w:color="auto" w:fill="1F3864"/>
             <w:tcMar>
@@ -2557,7 +2499,6 @@
         </w:tc>
         <w:tc>
           <w:tcPr>
-            <w:tcW w:type="dxa" w:w="1560"/>
             <w:tcW w:w="2620" w:type="dxa"/>
             <w:shd w:val="clear" w:color="auto" w:fill="1F3864"/>
             <w:tcMar>
@@ -2583,7 +2524,6 @@
         </w:tc>
         <w:tc>
           <w:tcPr>
-            <w:tcW w:type="dxa" w:w="1560"/>
             <w:tcW w:w="1965" w:type="dxa"/>
             <w:shd w:val="clear" w:color="auto" w:fill="1F3864"/>
             <w:tcMar>
@@ -2609,7 +2549,6 @@
         </w:tc>
         <w:tc>
           <w:tcPr>
-            <w:tcW w:type="dxa" w:w="1560"/>
             <w:tcW w:w="1123" w:type="dxa"/>
             <w:shd w:val="clear" w:color="auto" w:fill="1F3864"/>
             <w:tcMar>
@@ -2635,7 +2574,6 @@
         </w:tc>
         <w:tc>
           <w:tcPr>
-            <w:tcW w:type="dxa" w:w="1560"/>
             <w:tcW w:w="1874" w:type="dxa"/>
             <w:shd w:val="clear" w:color="auto" w:fill="1F3864"/>
             <w:tcMar>
@@ -2663,7 +2601,6 @@
       <w:tr>
         <w:tc>
           <w:tcPr>
-            <w:tcW w:type="dxa" w:w="1560"/>
             <w:tcW w:w="655" w:type="dxa"/>
             <w:tcMar>
               <w:top w:w="80" w:type="dxa"/>
@@ -2700,7 +2637,6 @@
         </w:tc>
         <w:tc>
           <w:tcPr>
-            <w:tcW w:type="dxa" w:w="1560"/>
             <w:tcW w:w="1123" w:type="dxa"/>
             <w:tcMar>
               <w:top w:w="80" w:type="dxa"/>
@@ -2725,7 +2661,6 @@
         </w:tc>
         <w:tc>
           <w:tcPr>
-            <w:tcW w:type="dxa" w:w="1560"/>
             <w:tcW w:w="2620" w:type="dxa"/>
             <w:tcMar>
               <w:top w:w="80" w:type="dxa"/>
@@ -2750,7 +2685,6 @@
         </w:tc>
         <w:tc>
           <w:tcPr>
-            <w:tcW w:type="dxa" w:w="1560"/>
             <w:tcW w:w="1965" w:type="dxa"/>
             <w:tcMar>
               <w:top w:w="80" w:type="dxa"/>
@@ -2775,7 +2709,6 @@
         </w:tc>
         <w:tc>
           <w:tcPr>
-            <w:tcW w:type="dxa" w:w="1560"/>
             <w:tcW w:w="1123" w:type="dxa"/>
             <w:tcMar>
               <w:top w:w="80" w:type="dxa"/>
@@ -2800,7 +2733,6 @@
         </w:tc>
         <w:tc>
           <w:tcPr>
-            <w:tcW w:type="dxa" w:w="1560"/>
             <w:tcW w:w="1874" w:type="dxa"/>
             <w:tcMar>
               <w:top w:w="80" w:type="dxa"/>
@@ -2839,8 +2771,7 @@
       <w:tr>
         <w:tc>
           <w:tcPr>
-            <w:tcW w:type="dxa" w:w="7800"/>
-            <w:tcW w:w="655" w:type="dxa"/>
+            <w:tcW w:w="7486" w:type="dxa"/>
             <w:gridSpan w:val="5"/>
             <w:shd w:val="clear" w:color="auto" w:fill="F5F5F5"/>
             <w:tcMar>
@@ -2869,7 +2800,6 @@
         </w:tc>
         <w:tc>
           <w:tcPr>
-            <w:tcW w:type="dxa" w:w="1560"/>
             <w:tcW w:w="1874" w:type="dxa"/>
             <w:shd w:val="clear" w:color="auto" w:fill="F5F5F5"/>
             <w:tcMar>
@@ -2946,7 +2876,6 @@
     </w:p>
     <w:tbl>
       <w:tblPr>
-        <w:tblW w:type="auto" w:w="0"/>
         <w:tblLook w:firstColumn="1" w:firstRow="1" w:lastColumn="0" w:lastRow="0" w:noHBand="0" w:noVBand="1" w:val="04A0"/>
         <w:tblBorders>
           <w:top w:val="single" w:sz="4" w:space="0" w:color="CCCCCC"/>
@@ -3018,7 +2947,6 @@
       <w:tr>
         <w:tc>
           <w:tcPr>
-            <w:tcW w:type="dxa" w:w="4680"/>
             <w:tcW w:w="2808" w:type="dxa"/>
             <w:tcMar>
               <w:top w:w="60" w:type="dxa"/>
@@ -3055,7 +2983,6 @@
         </w:tc>
         <w:tc>
           <w:tcPr>
-            <w:tcW w:type="dxa" w:w="4680"/>
             <w:tcW w:w="6552" w:type="dxa"/>
             <w:tcMar>
               <w:top w:w="60" w:type="dxa"/>
@@ -3143,7 +3070,6 @@
     </w:p>
     <w:tbl>
       <w:tblPr>
-        <w:tblW w:type="auto" w:w="0"/>
         <w:tblLook w:firstColumn="1" w:firstRow="1" w:lastColumn="0" w:lastRow="0" w:noHBand="0" w:noVBand="1" w:val="04A0"/>
         <w:tblBorders>
           <w:top w:val="none" w:sz="0" w:space="0" w:color="auto"/>
@@ -3205,7 +3131,6 @@
     </w:p>
     <w:tbl>
       <w:tblPr>
-        <w:tblW w:type="auto" w:w="0"/>
         <w:tblLook w:firstColumn="1" w:firstRow="1" w:lastColumn="0" w:lastRow="0" w:noHBand="0" w:noVBand="1" w:val="04A0"/>
         <w:tblBorders>
           <w:top w:val="none" w:sz="0" w:space="0" w:color="auto"/>
@@ -3272,7 +3197,6 @@
     </w:p>
     <w:tbl>
       <w:tblPr>
-        <w:tblW w:type="auto" w:w="0"/>
         <w:tblLook w:firstColumn="1" w:firstRow="1" w:lastColumn="0" w:lastRow="0" w:noHBand="0" w:noVBand="1" w:val="04A0"/>
         <w:tblBorders>
           <w:top w:val="none" w:sz="0" w:space="0" w:color="auto"/>
@@ -3285,14 +3209,13 @@
         <w:tblW w:w="9360" w:type="dxa"/>
       </w:tblPr>
       <w:tblGrid>
-        <w:gridCol w:w="3120"/>
-        <w:gridCol w:w="3120"/>
-        <w:gridCol w:w="3120"/>
+        <w:gridCol w:w="4580"/>
+        <w:gridCol w:w="200"/>
+        <w:gridCol w:w="4580"/>
       </w:tblGrid>
       <w:tr>
         <w:tc>
           <w:tcPr>
-            <w:tcW w:type="dxa" w:w="3120"/>
             <w:tcW w:w="4580" w:type="dxa"/>
             <w:shd w:val="clear" w:color="auto" w:fill="E8E8E8"/>
             <w:tcMar>
@@ -3372,7 +3295,6 @@
         </w:tc>
         <w:tc>
           <w:tcPr>
-            <w:tcW w:type="dxa" w:w="3120"/>
             <w:tcW w:w="200" w:type="dxa"/>
             <w:tcBorders>
               <w:top w:val="none" w:sz="0" w:space="0" w:color="auto"/>
@@ -3385,7 +3307,6 @@
         </w:tc>
         <w:tc>
           <w:tcPr>
-            <w:tcW w:type="dxa" w:w="3120"/>
             <w:tcW w:w="4580" w:type="dxa"/>
             <w:shd w:val="clear" w:color="auto" w:fill="E8E8E8"/>
             <w:tcMar>
@@ -3489,7 +3410,6 @@
     </w:p>
     <w:tbl>
       <w:tblPr>
-        <w:tblW w:type="auto" w:w="0"/>
         <w:tblLook w:firstColumn="1" w:firstRow="1" w:lastColumn="0" w:lastRow="0" w:noHBand="0" w:noVBand="1" w:val="04A0"/>
         <w:tblBorders>
           <w:top w:val="none" w:sz="0" w:space="0" w:color="auto"/>
@@ -3502,13 +3422,12 @@
         <w:tblW w:w="9360" w:type="dxa"/>
       </w:tblPr>
       <w:tblGrid>
-        <w:gridCol w:w="4680"/>
-        <w:gridCol w:w="4680"/>
+        <w:gridCol w:w="2340"/>
+        <w:gridCol w:w="7020"/>
       </w:tblGrid>
       <w:tr>
         <w:tc>
           <w:tcPr>
-            <w:tcW w:type="dxa" w:w="4680"/>
             <w:tcW w:w="2340" w:type="dxa"/>
             <w:tcMar>
               <w:top w:w="80" w:type="dxa"/>
@@ -3533,7 +3452,6 @@
         </w:tc>
         <w:tc>
           <w:tcPr>
-            <w:tcW w:type="dxa" w:w="4680"/>
             <w:tcW w:w="7020" w:type="dxa"/>
             <w:tcMar>
               <w:top w:w="80" w:type="dxa"/>
@@ -3554,7 +3472,6 @@
       <w:tr>
         <w:tc>
           <w:tcPr>
-            <w:tcW w:type="dxa" w:w="4680"/>
             <w:tcW w:w="2340" w:type="dxa"/>
             <w:tcMar>
               <w:top w:w="80" w:type="dxa"/>
@@ -3579,7 +3496,6 @@
         </w:tc>
         <w:tc>
           <w:tcPr>
-            <w:tcW w:type="dxa" w:w="4680"/>
             <w:tcW w:w="7020" w:type="dxa"/>
             <w:tcMar>
               <w:top w:w="80" w:type="dxa"/>
@@ -3600,7 +3516,6 @@
       <w:tr>
         <w:tc>
           <w:tcPr>
-            <w:tcW w:type="dxa" w:w="4680"/>
             <w:tcW w:w="2340" w:type="dxa"/>
             <w:tcMar>
               <w:top w:w="80" w:type="dxa"/>
@@ -3625,7 +3540,6 @@
         </w:tc>
         <w:tc>
           <w:tcPr>
-            <w:tcW w:type="dxa" w:w="4680"/>
             <w:tcW w:w="7020" w:type="dxa"/>
             <w:tcMar>
               <w:top w:w="80" w:type="dxa"/>
@@ -3646,7 +3560,6 @@
       <w:tr>
         <w:tc>
           <w:tcPr>
-            <w:tcW w:type="dxa" w:w="4680"/>
             <w:tcW w:w="2340" w:type="dxa"/>
             <w:tcMar>
               <w:top w:w="80" w:type="dxa"/>
@@ -3671,7 +3584,6 @@
         </w:tc>
         <w:tc>
           <w:tcPr>
-            <w:tcW w:type="dxa" w:w="4680"/>
             <w:tcW w:w="7020" w:type="dxa"/>
             <w:tcMar>
               <w:top w:w="80" w:type="dxa"/>
@@ -3719,7 +3631,6 @@
     </w:p>
     <w:tbl>
       <w:tblPr>
-        <w:tblW w:type="auto" w:w="0"/>
         <w:tblLook w:firstColumn="1" w:firstRow="1" w:lastColumn="0" w:lastRow="0" w:noHBand="0" w:noVBand="1" w:val="04A0"/>
         <w:tblBorders>
           <w:top w:val="none" w:sz="0" w:space="0" w:color="auto"/>
@@ -3803,7 +3714,6 @@
     </w:p>
     <w:tbl>
       <w:tblPr>
-        <w:tblW w:type="auto" w:w="0"/>
         <w:tblLook w:firstColumn="1" w:firstRow="1" w:lastColumn="0" w:lastRow="0" w:noHBand="0" w:noVBand="1" w:val="04A0"/>
         <w:tblBorders>
           <w:top w:val="none" w:sz="0" w:space="0" w:color="auto"/>
@@ -3822,7 +3732,6 @@
       <w:tr>
         <w:tc>
           <w:tcPr>
-            <w:tcW w:type="dxa" w:w="4680"/>
             <w:tcW w:w="4680" w:type="dxa"/>
             <w:tcMar>
               <w:top w:w="40" w:type="dxa"/>
@@ -3956,7 +3865,6 @@
         </w:tc>
         <w:tc>
           <w:tcPr>
-            <w:tcW w:type="dxa" w:w="4680"/>
             <w:tcW w:w="4680" w:type="dxa"/>
             <w:tcMar>
               <w:top w:w="40" w:type="dxa"/>
@@ -4060,7 +3968,6 @@
       <w:tr>
         <w:tc>
           <w:tcPr>
-            <w:tcW w:type="dxa" w:w="4680"/>
             <w:tcW w:w="4680" w:type="dxa"/>
             <w:tcMar>
               <w:top w:w="40" w:type="dxa"/>
@@ -4162,7 +4069,6 @@
         </w:tc>
         <w:tc>
           <w:tcPr>
-            <w:tcW w:type="dxa" w:w="4680"/>
             <w:tcW w:w="4680" w:type="dxa"/>
             <w:tcMar>
               <w:top w:w="40" w:type="dxa"/>
@@ -4266,7 +4172,6 @@
       <w:tr>
         <w:tc>
           <w:tcPr>
-            <w:tcW w:type="dxa" w:w="4680"/>
             <w:tcW w:w="4680" w:type="dxa"/>
             <w:tcMar>
               <w:top w:w="40" w:type="dxa"/>
@@ -4352,7 +4257,6 @@
         </w:tc>
         <w:tc>
           <w:tcPr>
-            <w:tcW w:type="dxa" w:w="4680"/>
             <w:tcW w:w="4680" w:type="dxa"/>
             <w:tcMar>
               <w:top w:w="40" w:type="dxa"/>
@@ -4424,7 +4328,6 @@
       <w:tr>
         <w:tc>
           <w:tcPr>
-            <w:tcW w:type="dxa" w:w="4680"/>
             <w:tcW w:w="4680" w:type="dxa"/>
             <w:tcMar>
               <w:top w:w="40" w:type="dxa"/>
@@ -4510,7 +4413,6 @@
         </w:tc>
         <w:tc>
           <w:tcPr>
-            <w:tcW w:type="dxa" w:w="4680"/>
             <w:tcW w:w="4680" w:type="dxa"/>
             <w:tcMar>
               <w:top w:w="40" w:type="dxa"/>
@@ -4609,7 +4511,6 @@
     </w:p>
     <w:tbl>
       <w:tblPr>
-        <w:tblW w:type="auto" w:w="0"/>
         <w:tblLook w:firstColumn="1" w:firstRow="1" w:lastColumn="0" w:lastRow="0" w:noHBand="0" w:noVBand="1" w:val="04A0"/>
         <w:tblBorders>
           <w:top w:val="none" w:sz="0" w:space="0" w:color="auto"/>
@@ -4678,7 +4579,6 @@
     </w:p>
     <w:tbl>
       <w:tblPr>
-        <w:tblW w:type="auto" w:w="0"/>
         <w:tblLook w:firstColumn="1" w:firstRow="1" w:lastColumn="0" w:lastRow="0" w:noHBand="0" w:noVBand="1" w:val="04A0"/>
         <w:tblBorders>
           <w:top w:val="none" w:sz="0" w:space="0" w:color="auto"/>
@@ -4697,7 +4597,6 @@
       <w:tr>
         <w:tc>
           <w:tcPr>
-            <w:tcW w:type="dxa" w:w="4680"/>
             <w:tcW w:w="4680" w:type="dxa"/>
             <w:tcMar>
               <w:top w:w="40" w:type="dxa"/>
@@ -4783,7 +4682,6 @@
         </w:tc>
         <w:tc>
           <w:tcPr>
-            <w:tcW w:type="dxa" w:w="4680"/>
             <w:tcW w:w="4680" w:type="dxa"/>
             <w:tcMar>
               <w:top w:w="40" w:type="dxa"/>
@@ -4887,7 +4785,6 @@
       <w:tr>
         <w:tc>
           <w:tcPr>
-            <w:tcW w:type="dxa" w:w="4680"/>
             <w:tcW w:w="4680" w:type="dxa"/>
             <w:tcMar>
               <w:top w:w="40" w:type="dxa"/>
@@ -4973,7 +4870,6 @@
         </w:tc>
         <w:tc>
           <w:tcPr>
-            <w:tcW w:type="dxa" w:w="4680"/>
             <w:tcW w:w="4680" w:type="dxa"/>
             <w:tcMar>
               <w:top w:w="40" w:type="dxa"/>
@@ -5013,7 +4909,6 @@
     </w:p>
     <w:tbl>
       <w:tblPr>
-        <w:tblW w:type="auto" w:w="0"/>
         <w:tblLook w:firstColumn="1" w:firstRow="1" w:lastColumn="0" w:lastRow="0" w:noHBand="0" w:noVBand="1" w:val="04A0"/>
         <w:tblBorders>
           <w:top w:val="none" w:sz="0" w:space="0" w:color="auto"/>
@@ -5032,7 +4927,6 @@
       <w:tr>
         <w:tc>
           <w:tcPr>
-            <w:tcW w:type="dxa" w:w="4680"/>
             <w:tcW w:w="4680" w:type="dxa"/>
             <w:tcMar>
               <w:top w:w="40" w:type="dxa"/>
@@ -5134,7 +5028,6 @@
         </w:tc>
         <w:tc>
           <w:tcPr>
-            <w:tcW w:type="dxa" w:w="4680"/>
             <w:tcW w:w="4680" w:type="dxa"/>
             <w:tcMar>
               <w:top w:w="40" w:type="dxa"/>
@@ -5222,7 +5115,6 @@
     </w:p>
     <w:tbl>
       <w:tblPr>
-        <w:tblW w:type="auto" w:w="0"/>
         <w:tblLook w:firstColumn="1" w:firstRow="1" w:lastColumn="0" w:lastRow="0" w:noHBand="0" w:noVBand="1" w:val="04A0"/>
         <w:tblBorders>
           <w:top w:val="none" w:sz="0" w:space="0" w:color="auto"/>
@@ -5241,7 +5133,6 @@
       <w:tr>
         <w:tc>
           <w:tcPr>
-            <w:tcW w:type="dxa" w:w="4680"/>
             <w:tcW w:w="4680" w:type="dxa"/>
             <w:tcMar>
               <w:top w:w="40" w:type="dxa"/>
@@ -5343,7 +5234,6 @@
         </w:tc>
         <w:tc>
           <w:tcPr>
-            <w:tcW w:type="dxa" w:w="4680"/>
             <w:tcW w:w="4680" w:type="dxa"/>
             <w:tcMar>
               <w:top w:w="40" w:type="dxa"/>
@@ -5440,7 +5330,6 @@
     </w:p>
     <w:tbl>
       <w:tblPr>
-        <w:tblW w:type="auto" w:w="0"/>
         <w:tblLook w:firstColumn="1" w:firstRow="1" w:lastColumn="0" w:lastRow="0" w:noHBand="0" w:noVBand="1" w:val="04A0"/>
         <w:tblBorders>
           <w:top w:val="none" w:sz="0" w:space="0" w:color="auto"/>
@@ -5525,7 +5414,6 @@
     </w:p>
     <w:tbl>
       <w:tblPr>
-        <w:tblW w:type="auto" w:w="0"/>
         <w:tblLook w:firstColumn="1" w:firstRow="1" w:lastColumn="0" w:lastRow="0" w:noHBand="0" w:noVBand="1" w:val="04A0"/>
         <w:tblBorders>
           <w:top w:val="none" w:sz="0" w:space="0" w:color="auto"/>
@@ -5544,7 +5432,6 @@
       <w:tr>
         <w:tc>
           <w:tcPr>
-            <w:tcW w:type="dxa" w:w="4680"/>
             <w:tcW w:w="4680" w:type="dxa"/>
             <w:tcMar>
               <w:top w:w="40" w:type="dxa"/>
@@ -5662,7 +5549,6 @@
         </w:tc>
         <w:tc>
           <w:tcPr>
-            <w:tcW w:type="dxa" w:w="4680"/>
             <w:tcW w:w="4680" w:type="dxa"/>
             <w:tcMar>
               <w:top w:w="40" w:type="dxa"/>
@@ -5784,7 +5670,6 @@
     </w:p>
     <w:tbl>
       <w:tblPr>
-        <w:tblW w:type="auto" w:w="0"/>
         <w:tblLook w:firstColumn="1" w:firstRow="1" w:lastColumn="0" w:lastRow="0" w:noHBand="0" w:noVBand="1" w:val="04A0"/>
         <w:tblBorders>
           <w:top w:val="none" w:sz="0" w:space="0" w:color="auto"/>
@@ -5803,7 +5688,6 @@
       <w:tr>
         <w:tc>
           <w:tcPr>
-            <w:tcW w:type="dxa" w:w="4680"/>
             <w:tcW w:w="4680" w:type="dxa"/>
             <w:tcMar>
               <w:top w:w="40" w:type="dxa"/>
@@ -5855,7 +5739,6 @@
         </w:tc>
         <w:tc>
           <w:tcPr>
-            <w:tcW w:type="dxa" w:w="4680"/>
             <w:tcW w:w="4680" w:type="dxa"/>
             <w:tcMar>
               <w:top w:w="40" w:type="dxa"/>
@@ -5895,7 +5778,6 @@
     </w:p>
     <w:tbl>
       <w:tblPr>
-        <w:tblW w:type="auto" w:w="0"/>
         <w:tblLook w:firstColumn="1" w:firstRow="1" w:lastColumn="0" w:lastRow="0" w:noHBand="0" w:noVBand="1" w:val="04A0"/>
         <w:tblBorders>
           <w:top w:val="none" w:sz="0" w:space="0" w:color="auto"/>
@@ -5914,7 +5796,6 @@
       <w:tr>
         <w:tc>
           <w:tcPr>
-            <w:tcW w:type="dxa" w:w="4680"/>
             <w:tcW w:w="4680" w:type="dxa"/>
             <w:tcMar>
               <w:top w:w="40" w:type="dxa"/>
@@ -5966,7 +5847,6 @@
         </w:tc>
         <w:tc>
           <w:tcPr>
-            <w:tcW w:type="dxa" w:w="4680"/>
             <w:tcW w:w="4680" w:type="dxa"/>
             <w:tcMar>
               <w:top w:w="40" w:type="dxa"/>
@@ -5993,7 +5873,6 @@
     </w:p>
     <w:tbl>
       <w:tblPr>
-        <w:tblW w:type="auto" w:w="0"/>
         <w:tblLook w:firstColumn="1" w:firstRow="1" w:lastColumn="0" w:lastRow="0" w:noHBand="0" w:noVBand="1" w:val="04A0"/>
         <w:tblBorders>
           <w:top w:val="none" w:sz="0" w:space="0" w:color="auto"/>
@@ -6369,7 +6248,6 @@
 <w:hdr xmlns:m="http://schemas.openxmlformats.org/officeDocument/2006/math" xmlns:mc="http://schemas.openxmlformats.org/markup-compatibility/2006" xmlns:mo="http://schemas.microsoft.com/office/mac/office/2008/main" xmlns:mv="urn:schemas-microsoft-com:mac:vml" xmlns:o="urn:schemas-microsoft-com:office:office" xmlns:r="http://schemas.openxmlformats.org/officeDocument/2006/relationships" xmlns:v="urn:schemas-microsoft-com:vml" xmlns:w10="urn:schemas-microsoft-com:office:word" xmlns:w14="http://schemas.microsoft.com/office/word/2010/wordml" xmlns:w="http://schemas.openxmlformats.org/wordprocessingml/2006/main" xmlns:wne="http://schemas.microsoft.com/office/word/2006/wordml" xmlns:wp14="http://schemas.microsoft.com/office/word/2010/wordprocessingDrawing" xmlns:wp="http://schemas.openxmlformats.org/drawingml/2006/wordprocessingDrawing" xmlns:wpc="http://schemas.microsoft.com/office/word/2010/wordprocessingCanvas" xmlns:wpg="http://schemas.microsoft.com/office/word/2010/wordprocessingGroup" xmlns:wpi="http://schemas.microsoft.com/office/word/2010/wordprocessingInk" xmlns:wps="http://schemas.microsoft.com/office/word/2010/wordprocessingShape" mc:Ignorable="w14 wp14">
   <w:tbl>
     <w:tblPr>
-      <w:tblW w:type="auto" w:w="0"/>
       <w:tblLook w:firstColumn="1" w:firstRow="1" w:lastColumn="0" w:lastRow="0" w:noHBand="0" w:noVBand="1" w:val="04A0"/>
       <w:tblBorders>
         <w:top w:val="none" w:sz="0" w:space="0" w:color="auto"/>

</xml_diff>

<commit_message>
fix(ADO#2696): add set_table_grid to 5 multi-column tables missing tblGrid
- add_two_col_rec_table: set_table_grid(tbl, [half, half])
- Coverage at a Glance: set_table_grid(tbl, [label_w, value_w])
- Coverage and Limits: set_table_grid(tbl_cov, [cov_label_w, cov_value_w])
- Class Schedule: set_table_grid(tbl_cs, col_ws)
- Excluded Persons: set_table_grid(tbl_ep, [ep_label_w, ep_value_w])

Co-Authored-By: Claude Sonnet 4.6 <noreply@anthropic.com>
</commit_message>
<xml_diff>
--- a/services/proposal-generator/templates/verticals/nbais-wc/master.docx
+++ b/services/proposal-generator/templates/verticals/nbais-wc/master.docx
@@ -943,8 +943,8 @@
         <w:tblW w:w="9360" w:type="dxa"/>
       </w:tblPr>
       <w:tblGrid>
-        <w:gridCol w:w="4680"/>
-        <w:gridCol w:w="4680"/>
+        <w:gridCol w:w="3276"/>
+        <w:gridCol w:w="6084"/>
       </w:tblGrid>
       <w:tr>
         <w:trPr>
@@ -2039,8 +2039,8 @@
         <w:tblW w:w="9360" w:type="dxa"/>
       </w:tblPr>
       <w:tblGrid>
-        <w:gridCol w:w="4680"/>
-        <w:gridCol w:w="4680"/>
+        <w:gridCol w:w="6084"/>
+        <w:gridCol w:w="3276"/>
       </w:tblGrid>
       <w:tr>
         <w:trPr>
@@ -2436,12 +2436,12 @@
         <w:tblW w:w="9360" w:type="dxa"/>
       </w:tblPr>
       <w:tblGrid>
-        <w:gridCol w:w="1560"/>
-        <w:gridCol w:w="1560"/>
-        <w:gridCol w:w="1560"/>
-        <w:gridCol w:w="1560"/>
-        <w:gridCol w:w="1560"/>
-        <w:gridCol w:w="1560"/>
+        <w:gridCol w:w="655"/>
+        <w:gridCol w:w="1123"/>
+        <w:gridCol w:w="2620"/>
+        <w:gridCol w:w="1965"/>
+        <w:gridCol w:w="1123"/>
+        <w:gridCol w:w="1874"/>
       </w:tblGrid>
       <w:tr>
         <w:trPr>
@@ -2888,8 +2888,8 @@
         <w:tblW w:w="9360" w:type="dxa"/>
       </w:tblPr>
       <w:tblGrid>
-        <w:gridCol w:w="4680"/>
-        <w:gridCol w:w="4680"/>
+        <w:gridCol w:w="2808"/>
+        <w:gridCol w:w="6552"/>
       </w:tblGrid>
       <w:tr>
         <w:trPr>

</xml_diff>

<commit_message>
fix(ADO#2704): add fix_cell_content to contact spacer cell; update cover bar to use fix_cell_content (Clint I1+N1)
</commit_message>
<xml_diff>
--- a/services/proposal-generator/templates/verticals/nbais-wc/master.docx
+++ b/services/proposal-generator/templates/verticals/nbais-wc/master.docx
@@ -135,6 +135,7 @@
           </w:tcPr>
           <w:p>
             <w:pPr>
+              <w:spacing w:before="0" w:after="0"/>
               <w:jc w:val="left"/>
             </w:pPr>
             <w:r>
@@ -161,6 +162,9 @@
             <w:vAlign w:val="center"/>
           </w:tcPr>
           <w:p>
+            <w:pPr>
+              <w:spacing w:before="0" w:after="0"/>
+            </w:pPr>
             <w:r>
               <w:rPr>
                 <w:rFonts w:ascii="Arial" w:hAnsi="Arial"/>
@@ -188,6 +192,7 @@
           </w:tcPr>
           <w:p>
             <w:pPr>
+              <w:spacing w:before="0" w:after="0"/>
               <w:jc w:val="left"/>
             </w:pPr>
             <w:r>
@@ -214,6 +219,9 @@
             <w:vAlign w:val="center"/>
           </w:tcPr>
           <w:p>
+            <w:pPr>
+              <w:spacing w:before="0" w:after="0"/>
+            </w:pPr>
             <w:r>
               <w:rPr>
                 <w:rFonts w:ascii="Arial" w:hAnsi="Arial"/>
@@ -241,6 +249,7 @@
           </w:tcPr>
           <w:p>
             <w:pPr>
+              <w:spacing w:before="0" w:after="0"/>
               <w:jc w:val="left"/>
             </w:pPr>
             <w:r>
@@ -267,6 +276,9 @@
             <w:vAlign w:val="center"/>
           </w:tcPr>
           <w:p>
+            <w:pPr>
+              <w:spacing w:before="0" w:after="0"/>
+            </w:pPr>
             <w:r>
               <w:rPr>
                 <w:rFonts w:ascii="Arial" w:hAnsi="Arial"/>
@@ -294,6 +306,7 @@
           </w:tcPr>
           <w:p>
             <w:pPr>
+              <w:spacing w:before="0" w:after="0"/>
               <w:jc w:val="left"/>
             </w:pPr>
             <w:r>
@@ -320,6 +333,9 @@
             <w:vAlign w:val="center"/>
           </w:tcPr>
           <w:p>
+            <w:pPr>
+              <w:spacing w:before="0" w:after="0"/>
+            </w:pPr>
             <w:r>
               <w:rPr>
                 <w:rFonts w:ascii="Arial" w:hAnsi="Arial"/>
@@ -347,6 +363,7 @@
           </w:tcPr>
           <w:p>
             <w:pPr>
+              <w:spacing w:before="0" w:after="0"/>
               <w:jc w:val="left"/>
             </w:pPr>
             <w:r>
@@ -373,6 +390,9 @@
             <w:vAlign w:val="center"/>
           </w:tcPr>
           <w:p>
+            <w:pPr>
+              <w:spacing w:before="0" w:after="0"/>
+            </w:pPr>
             <w:r>
               <w:rPr>
                 <w:rFonts w:ascii="Arial" w:hAnsi="Arial"/>
@@ -393,7 +413,7 @@
           <w:headerReference w:type="first" r:id="rId9"/>
           <w:footerReference w:type="first" r:id="rId10"/>
           <w:pgSz w:w="12240" w:h="15840"/>
-          <w:pgMar w:top="0" w:right="0" w:bottom="0" w:left="0" w:header="144" w:footer="720" w:gutter="0"/>
+          <w:pgMar w:top="0" w:right="0" w:bottom="0" w:left="0" w:header="0" w:footer="720" w:gutter="0"/>
           <w:cols w:space="720"/>
           <w:titlePg/>
           <w:docGrid w:linePitch="360"/>
@@ -898,6 +918,7 @@
           </w:tcPr>
           <w:p>
             <w:pPr>
+              <w:spacing w:before="0" w:after="0"/>
               <w:jc w:val="left"/>
             </w:pPr>
             <w:r>
@@ -964,6 +985,9 @@
             <w:vAlign w:val="center"/>
           </w:tcPr>
           <w:p>
+            <w:pPr>
+              <w:spacing w:before="0" w:after="0"/>
+            </w:pPr>
             <w:r>
               <w:rPr>
                 <w:rFonts w:ascii="Arial" w:hAnsi="Arial"/>
@@ -991,6 +1015,9 @@
             <w:shd w:val="clear" w:color="auto" w:fill="F5F5F5"/>
           </w:tcPr>
           <w:p>
+            <w:pPr>
+              <w:spacing w:before="0" w:after="0"/>
+            </w:pPr>
             <w:r>
               <w:rPr>
                 <w:rFonts w:ascii="Arial" w:hAnsi="Arial"/>
@@ -1016,6 +1043,9 @@
             <w:shd w:val="clear" w:color="auto" w:fill="F5F5F5"/>
           </w:tcPr>
           <w:p>
+            <w:pPr>
+              <w:spacing w:before="0" w:after="0"/>
+            </w:pPr>
             <w:r>
               <w:rPr>
                 <w:rFonts w:ascii="Arial" w:hAnsi="Arial"/>
@@ -1042,6 +1072,9 @@
             <w:vAlign w:val="center"/>
           </w:tcPr>
           <w:p>
+            <w:pPr>
+              <w:spacing w:before="0" w:after="0"/>
+            </w:pPr>
             <w:r>
               <w:rPr>
                 <w:rFonts w:ascii="Arial" w:hAnsi="Arial"/>
@@ -1066,6 +1099,9 @@
             <w:vAlign w:val="center"/>
           </w:tcPr>
           <w:p>
+            <w:pPr>
+              <w:spacing w:before="0" w:after="0"/>
+            </w:pPr>
             <w:r>
               <w:rPr>
                 <w:rFonts w:ascii="Arial" w:hAnsi="Arial"/>
@@ -1093,6 +1129,9 @@
             <w:shd w:val="clear" w:color="auto" w:fill="F5F5F5"/>
           </w:tcPr>
           <w:p>
+            <w:pPr>
+              <w:spacing w:before="0" w:after="0"/>
+            </w:pPr>
             <w:r>
               <w:rPr>
                 <w:rFonts w:ascii="Arial" w:hAnsi="Arial"/>
@@ -1118,6 +1157,9 @@
             <w:shd w:val="clear" w:color="auto" w:fill="F5F5F5"/>
           </w:tcPr>
           <w:p>
+            <w:pPr>
+              <w:spacing w:before="0" w:after="0"/>
+            </w:pPr>
             <w:r>
               <w:rPr>
                 <w:rFonts w:ascii="Arial" w:hAnsi="Arial"/>
@@ -1144,6 +1186,9 @@
             <w:vAlign w:val="center"/>
           </w:tcPr>
           <w:p>
+            <w:pPr>
+              <w:spacing w:before="0" w:after="0"/>
+            </w:pPr>
             <w:r>
               <w:rPr>
                 <w:rFonts w:ascii="Arial" w:hAnsi="Arial"/>
@@ -1168,6 +1213,9 @@
             <w:vAlign w:val="center"/>
           </w:tcPr>
           <w:p>
+            <w:pPr>
+              <w:spacing w:before="0" w:after="0"/>
+            </w:pPr>
             <w:r>
               <w:rPr>
                 <w:rFonts w:ascii="Arial" w:hAnsi="Arial"/>
@@ -1195,6 +1243,9 @@
             <w:shd w:val="clear" w:color="auto" w:fill="F5F5F5"/>
           </w:tcPr>
           <w:p>
+            <w:pPr>
+              <w:spacing w:before="0" w:after="0"/>
+            </w:pPr>
             <w:r>
               <w:rPr>
                 <w:rFonts w:ascii="Arial" w:hAnsi="Arial"/>
@@ -1220,6 +1271,9 @@
             <w:shd w:val="clear" w:color="auto" w:fill="F5F5F5"/>
           </w:tcPr>
           <w:p>
+            <w:pPr>
+              <w:spacing w:before="0" w:after="0"/>
+            </w:pPr>
             <w:r>
               <w:rPr>
                 <w:rFonts w:ascii="Arial" w:hAnsi="Arial"/>
@@ -1246,6 +1300,9 @@
             <w:vAlign w:val="center"/>
           </w:tcPr>
           <w:p>
+            <w:pPr>
+              <w:spacing w:before="0" w:after="0"/>
+            </w:pPr>
             <w:r>
               <w:rPr>
                 <w:rFonts w:ascii="Arial" w:hAnsi="Arial"/>
@@ -1270,6 +1327,9 @@
             <w:vAlign w:val="center"/>
           </w:tcPr>
           <w:p>
+            <w:pPr>
+              <w:spacing w:before="0" w:after="0"/>
+            </w:pPr>
             <w:r>
               <w:rPr>
                 <w:rFonts w:ascii="Arial" w:hAnsi="Arial"/>
@@ -1297,6 +1357,9 @@
             <w:shd w:val="clear" w:color="auto" w:fill="F5F5F5"/>
           </w:tcPr>
           <w:p>
+            <w:pPr>
+              <w:spacing w:before="0" w:after="0"/>
+            </w:pPr>
             <w:r>
               <w:rPr>
                 <w:rFonts w:ascii="Arial" w:hAnsi="Arial"/>
@@ -1322,6 +1385,9 @@
             <w:shd w:val="clear" w:color="auto" w:fill="F5F5F5"/>
           </w:tcPr>
           <w:p>
+            <w:pPr>
+              <w:spacing w:before="0" w:after="0"/>
+            </w:pPr>
             <w:r>
               <w:rPr>
                 <w:rFonts w:ascii="Arial" w:hAnsi="Arial"/>
@@ -1348,6 +1414,9 @@
             <w:vAlign w:val="center"/>
           </w:tcPr>
           <w:p>
+            <w:pPr>
+              <w:spacing w:before="0" w:after="0"/>
+            </w:pPr>
             <w:r>
               <w:rPr>
                 <w:rFonts w:ascii="Arial" w:hAnsi="Arial"/>
@@ -1372,6 +1441,9 @@
             <w:vAlign w:val="center"/>
           </w:tcPr>
           <w:p>
+            <w:pPr>
+              <w:spacing w:before="0" w:after="0"/>
+            </w:pPr>
             <w:r>
               <w:rPr>
                 <w:rFonts w:ascii="Arial" w:hAnsi="Arial"/>
@@ -1399,6 +1471,9 @@
             <w:shd w:val="clear" w:color="auto" w:fill="F5F5F5"/>
           </w:tcPr>
           <w:p>
+            <w:pPr>
+              <w:spacing w:before="0" w:after="0"/>
+            </w:pPr>
             <w:r>
               <w:rPr>
                 <w:rFonts w:ascii="Arial" w:hAnsi="Arial"/>
@@ -1424,6 +1499,9 @@
             <w:shd w:val="clear" w:color="auto" w:fill="F5F5F5"/>
           </w:tcPr>
           <w:p>
+            <w:pPr>
+              <w:spacing w:before="0" w:after="0"/>
+            </w:pPr>
             <w:r>
               <w:rPr>
                 <w:rFonts w:ascii="Arial" w:hAnsi="Arial"/>
@@ -1451,6 +1529,9 @@
             <w:vAlign w:val="center"/>
           </w:tcPr>
           <w:p>
+            <w:pPr>
+              <w:spacing w:before="0" w:after="0"/>
+            </w:pPr>
             <w:r>
               <w:rPr>
                 <w:rFonts w:ascii="Arial" w:hAnsi="Arial"/>
@@ -1476,6 +1557,9 @@
             <w:vAlign w:val="center"/>
           </w:tcPr>
           <w:p>
+            <w:pPr>
+              <w:spacing w:before="0" w:after="0"/>
+            </w:pPr>
             <w:r>
               <w:rPr>
                 <w:rFonts w:ascii="Arial" w:hAnsi="Arial"/>
@@ -1502,6 +1586,9 @@
             <w:vAlign w:val="center"/>
           </w:tcPr>
           <w:p>
+            <w:pPr>
+              <w:spacing w:before="0" w:after="0"/>
+            </w:pPr>
             <w:r>
               <w:rPr>
                 <w:rFonts w:ascii="Arial" w:hAnsi="Arial"/>
@@ -1526,6 +1613,9 @@
             <w:vAlign w:val="center"/>
           </w:tcPr>
           <w:p>
+            <w:pPr>
+              <w:spacing w:before="0" w:after="0"/>
+            </w:pPr>
             <w:r>
               <w:rPr>
                 <w:rFonts w:ascii="Arial" w:hAnsi="Arial"/>
@@ -1616,6 +1706,7 @@
           </w:tcPr>
           <w:p>
             <w:pPr>
+              <w:spacing w:before="0" w:after="0"/>
               <w:jc w:val="left"/>
             </w:pPr>
             <w:r>
@@ -1681,6 +1772,9 @@
             <w:shd w:val="clear" w:color="auto" w:fill="F5F5F5"/>
           </w:tcPr>
           <w:p>
+            <w:pPr>
+              <w:spacing w:before="0" w:after="0"/>
+            </w:pPr>
             <w:r>
               <w:rPr>
                 <w:rFonts w:ascii="Arial" w:hAnsi="Arial"/>
@@ -1706,6 +1800,9 @@
             <w:shd w:val="clear" w:color="auto" w:fill="F5F5F5"/>
           </w:tcPr>
           <w:p>
+            <w:pPr>
+              <w:spacing w:before="0" w:after="0"/>
+            </w:pPr>
             <w:r>
               <w:rPr>
                 <w:rFonts w:ascii="Arial" w:hAnsi="Arial"/>
@@ -1732,6 +1829,9 @@
             <w:vAlign w:val="center"/>
           </w:tcPr>
           <w:p>
+            <w:pPr>
+              <w:spacing w:before="0" w:after="0"/>
+            </w:pPr>
             <w:r>
               <w:rPr>
                 <w:rFonts w:ascii="Arial" w:hAnsi="Arial"/>
@@ -1756,6 +1856,9 @@
             <w:vAlign w:val="center"/>
           </w:tcPr>
           <w:p>
+            <w:pPr>
+              <w:spacing w:before="0" w:after="0"/>
+            </w:pPr>
             <w:r>
               <w:rPr>
                 <w:rFonts w:ascii="Arial" w:hAnsi="Arial"/>
@@ -1783,6 +1886,9 @@
             <w:shd w:val="clear" w:color="auto" w:fill="F5F5F5"/>
           </w:tcPr>
           <w:p>
+            <w:pPr>
+              <w:spacing w:before="0" w:after="0"/>
+            </w:pPr>
             <w:r>
               <w:rPr>
                 <w:rFonts w:ascii="Arial" w:hAnsi="Arial"/>
@@ -1808,6 +1914,9 @@
             <w:shd w:val="clear" w:color="auto" w:fill="F5F5F5"/>
           </w:tcPr>
           <w:p>
+            <w:pPr>
+              <w:spacing w:before="0" w:after="0"/>
+            </w:pPr>
             <w:r>
               <w:rPr>
                 <w:rFonts w:ascii="Arial" w:hAnsi="Arial"/>
@@ -1834,6 +1943,9 @@
             <w:vAlign w:val="center"/>
           </w:tcPr>
           <w:p>
+            <w:pPr>
+              <w:spacing w:before="0" w:after="0"/>
+            </w:pPr>
             <w:r>
               <w:rPr>
                 <w:rFonts w:ascii="Arial" w:hAnsi="Arial"/>
@@ -1858,6 +1970,9 @@
             <w:vAlign w:val="center"/>
           </w:tcPr>
           <w:p>
+            <w:pPr>
+              <w:spacing w:before="0" w:after="0"/>
+            </w:pPr>
             <w:r>
               <w:rPr>
                 <w:rFonts w:ascii="Arial" w:hAnsi="Arial"/>
@@ -1885,6 +2000,9 @@
             <w:shd w:val="clear" w:color="auto" w:fill="F5F5F5"/>
           </w:tcPr>
           <w:p>
+            <w:pPr>
+              <w:spacing w:before="0" w:after="0"/>
+            </w:pPr>
             <w:r>
               <w:rPr>
                 <w:rFonts w:ascii="Arial" w:hAnsi="Arial"/>
@@ -1910,6 +2028,9 @@
             <w:shd w:val="clear" w:color="auto" w:fill="F5F5F5"/>
           </w:tcPr>
           <w:p>
+            <w:pPr>
+              <w:spacing w:before="0" w:after="0"/>
+            </w:pPr>
             <w:r>
               <w:rPr>
                 <w:rFonts w:ascii="Arial" w:hAnsi="Arial"/>
@@ -1936,6 +2057,9 @@
             <w:vAlign w:val="center"/>
           </w:tcPr>
           <w:p>
+            <w:pPr>
+              <w:spacing w:before="0" w:after="0"/>
+            </w:pPr>
             <w:r>
               <w:rPr>
                 <w:rFonts w:ascii="Arial" w:hAnsi="Arial"/>
@@ -1960,6 +2084,9 @@
             <w:vAlign w:val="center"/>
           </w:tcPr>
           <w:p>
+            <w:pPr>
+              <w:spacing w:before="0" w:after="0"/>
+            </w:pPr>
             <w:r>
               <w:rPr>
                 <w:rFonts w:ascii="Arial" w:hAnsi="Arial"/>
@@ -2059,6 +2186,9 @@
             <w:vAlign w:val="center"/>
           </w:tcPr>
           <w:p>
+            <w:pPr>
+              <w:spacing w:before="0" w:after="0"/>
+            </w:pPr>
             <w:r>
               <w:rPr>
                 <w:rFonts w:ascii="Arial" w:hAnsi="Arial"/>
@@ -2083,6 +2213,9 @@
             <w:vAlign w:val="center"/>
           </w:tcPr>
           <w:p>
+            <w:pPr>
+              <w:spacing w:before="0" w:after="0"/>
+            </w:pPr>
             <w:r>
               <w:rPr>
                 <w:rFonts w:ascii="Arial" w:hAnsi="Arial"/>
@@ -2109,6 +2242,9 @@
             <w:shd w:val="clear" w:color="auto" w:fill="F5F5F5"/>
           </w:tcPr>
           <w:p>
+            <w:pPr>
+              <w:spacing w:before="0" w:after="0"/>
+            </w:pPr>
             <w:r>
               <w:rPr>
                 <w:rFonts w:ascii="Arial" w:hAnsi="Arial"/>
@@ -2134,6 +2270,9 @@
             <w:shd w:val="clear" w:color="auto" w:fill="F5F5F5"/>
           </w:tcPr>
           <w:p>
+            <w:pPr>
+              <w:spacing w:before="0" w:after="0"/>
+            </w:pPr>
             <w:r>
               <w:rPr>
                 <w:rFonts w:ascii="Arial" w:hAnsi="Arial"/>
@@ -2160,6 +2299,9 @@
             <w:vAlign w:val="center"/>
           </w:tcPr>
           <w:p>
+            <w:pPr>
+              <w:spacing w:before="0" w:after="0"/>
+            </w:pPr>
             <w:r>
               <w:rPr>
                 <w:rFonts w:ascii="Arial" w:hAnsi="Arial"/>
@@ -2184,6 +2326,9 @@
             <w:vAlign w:val="center"/>
           </w:tcPr>
           <w:p>
+            <w:pPr>
+              <w:spacing w:before="0" w:after="0"/>
+            </w:pPr>
             <w:r>
               <w:rPr>
                 <w:rFonts w:ascii="Arial" w:hAnsi="Arial"/>
@@ -2211,6 +2356,9 @@
             <w:shd w:val="clear" w:color="auto" w:fill="F5F5F5"/>
           </w:tcPr>
           <w:p>
+            <w:pPr>
+              <w:spacing w:before="0" w:after="0"/>
+            </w:pPr>
             <w:r>
               <w:rPr>
                 <w:rFonts w:ascii="Arial" w:hAnsi="Arial"/>
@@ -2236,6 +2384,9 @@
             <w:shd w:val="clear" w:color="auto" w:fill="F5F5F5"/>
           </w:tcPr>
           <w:p>
+            <w:pPr>
+              <w:spacing w:before="0" w:after="0"/>
+            </w:pPr>
             <w:r>
               <w:rPr>
                 <w:rFonts w:ascii="Arial" w:hAnsi="Arial"/>
@@ -2262,6 +2413,9 @@
             <w:vAlign w:val="center"/>
           </w:tcPr>
           <w:p>
+            <w:pPr>
+              <w:spacing w:before="0" w:after="0"/>
+            </w:pPr>
             <w:r>
               <w:rPr>
                 <w:rFonts w:ascii="Arial" w:hAnsi="Arial"/>
@@ -2286,6 +2440,9 @@
             <w:vAlign w:val="center"/>
           </w:tcPr>
           <w:p>
+            <w:pPr>
+              <w:spacing w:before="0" w:after="0"/>
+            </w:pPr>
             <w:r>
               <w:rPr>
                 <w:rFonts w:ascii="Arial" w:hAnsi="Arial"/>
@@ -2388,6 +2545,7 @@
           </w:tcPr>
           <w:p>
             <w:pPr>
+              <w:spacing w:before="0" w:after="0"/>
               <w:jc w:val="left"/>
             </w:pPr>
             <w:r>
@@ -2460,6 +2618,9 @@
             <w:vAlign w:val="center"/>
           </w:tcPr>
           <w:p>
+            <w:pPr>
+              <w:spacing w:before="0" w:after="0"/>
+            </w:pPr>
             <w:r>
               <w:rPr>
                 <w:rFonts w:ascii="Arial" w:hAnsi="Arial"/>
@@ -2485,6 +2646,9 @@
             <w:vAlign w:val="center"/>
           </w:tcPr>
           <w:p>
+            <w:pPr>
+              <w:spacing w:before="0" w:after="0"/>
+            </w:pPr>
             <w:r>
               <w:rPr>
                 <w:rFonts w:ascii="Arial" w:hAnsi="Arial"/>
@@ -2510,6 +2674,9 @@
             <w:vAlign w:val="center"/>
           </w:tcPr>
           <w:p>
+            <w:pPr>
+              <w:spacing w:before="0" w:after="0"/>
+            </w:pPr>
             <w:r>
               <w:rPr>
                 <w:rFonts w:ascii="Arial" w:hAnsi="Arial"/>
@@ -2535,6 +2702,9 @@
             <w:vAlign w:val="center"/>
           </w:tcPr>
           <w:p>
+            <w:pPr>
+              <w:spacing w:before="0" w:after="0"/>
+            </w:pPr>
             <w:r>
               <w:rPr>
                 <w:rFonts w:ascii="Arial" w:hAnsi="Arial"/>
@@ -2560,6 +2730,9 @@
             <w:vAlign w:val="center"/>
           </w:tcPr>
           <w:p>
+            <w:pPr>
+              <w:spacing w:before="0" w:after="0"/>
+            </w:pPr>
             <w:r>
               <w:rPr>
                 <w:rFonts w:ascii="Arial" w:hAnsi="Arial"/>
@@ -2585,6 +2758,9 @@
             <w:vAlign w:val="center"/>
           </w:tcPr>
           <w:p>
+            <w:pPr>
+              <w:spacing w:before="0" w:after="0"/>
+            </w:pPr>
             <w:r>
               <w:rPr>
                 <w:rFonts w:ascii="Arial" w:hAnsi="Arial"/>
@@ -2611,6 +2787,9 @@
             <w:vAlign w:val="center"/>
           </w:tcPr>
           <w:p>
+            <w:pPr>
+              <w:spacing w:before="0" w:after="0"/>
+            </w:pPr>
             <w:r>
               <w:rPr>
                 <w:rFonts w:ascii="Arial" w:hAnsi="Arial"/>
@@ -2647,6 +2826,9 @@
             <w:vAlign w:val="center"/>
           </w:tcPr>
           <w:p>
+            <w:pPr>
+              <w:spacing w:before="0" w:after="0"/>
+            </w:pPr>
             <w:r>
               <w:rPr>
                 <w:rFonts w:ascii="Arial" w:hAnsi="Arial"/>
@@ -2671,6 +2853,9 @@
             <w:vAlign w:val="center"/>
           </w:tcPr>
           <w:p>
+            <w:pPr>
+              <w:spacing w:before="0" w:after="0"/>
+            </w:pPr>
             <w:r>
               <w:rPr>
                 <w:rFonts w:ascii="Arial" w:hAnsi="Arial"/>
@@ -2695,6 +2880,9 @@
             <w:vAlign w:val="center"/>
           </w:tcPr>
           <w:p>
+            <w:pPr>
+              <w:spacing w:before="0" w:after="0"/>
+            </w:pPr>
             <w:r>
               <w:rPr>
                 <w:rFonts w:ascii="Arial" w:hAnsi="Arial"/>
@@ -2719,6 +2907,9 @@
             <w:vAlign w:val="center"/>
           </w:tcPr>
           <w:p>
+            <w:pPr>
+              <w:spacing w:before="0" w:after="0"/>
+            </w:pPr>
             <w:r>
               <w:rPr>
                 <w:rFonts w:ascii="Arial" w:hAnsi="Arial"/>
@@ -2743,6 +2934,9 @@
             <w:vAlign w:val="center"/>
           </w:tcPr>
           <w:p>
+            <w:pPr>
+              <w:spacing w:before="0" w:after="0"/>
+            </w:pPr>
             <w:r>
               <w:rPr>
                 <w:rFonts w:ascii="Arial" w:hAnsi="Arial"/>
@@ -2784,6 +2978,7 @@
           </w:tcPr>
           <w:p>
             <w:pPr>
+              <w:spacing w:before="0" w:after="0"/>
               <w:jc w:val="right"/>
             </w:pPr>
             <w:r>
@@ -2811,6 +3006,9 @@
             <w:vAlign w:val="center"/>
           </w:tcPr>
           <w:p>
+            <w:pPr>
+              <w:spacing w:before="0" w:after="0"/>
+            </w:pPr>
             <w:r>
               <w:rPr>
                 <w:rFonts w:ascii="Arial" w:hAnsi="Arial"/>
@@ -2908,6 +3106,9 @@
             <w:vAlign w:val="center"/>
           </w:tcPr>
           <w:p>
+            <w:pPr>
+              <w:spacing w:before="0" w:after="0"/>
+            </w:pPr>
             <w:r>
               <w:rPr>
                 <w:rFonts w:ascii="Arial" w:hAnsi="Arial"/>
@@ -2932,6 +3133,9 @@
             <w:vAlign w:val="center"/>
           </w:tcPr>
           <w:p>
+            <w:pPr>
+              <w:spacing w:before="0" w:after="0"/>
+            </w:pPr>
             <w:r>
               <w:rPr>
                 <w:rFonts w:ascii="Arial" w:hAnsi="Arial"/>
@@ -2957,6 +3161,9 @@
             <w:vAlign w:val="center"/>
           </w:tcPr>
           <w:p>
+            <w:pPr>
+              <w:spacing w:before="0" w:after="0"/>
+            </w:pPr>
             <w:r>
               <w:rPr>
                 <w:rFonts w:ascii="Arial" w:hAnsi="Arial"/>
@@ -2993,6 +3200,9 @@
             <w:vAlign w:val="center"/>
           </w:tcPr>
           <w:p>
+            <w:pPr>
+              <w:spacing w:before="0" w:after="0"/>
+            </w:pPr>
             <w:r>
               <w:rPr>
                 <w:rFonts w:ascii="Arial" w:hAnsi="Arial"/>
@@ -3104,6 +3314,9 @@
             </w:tcBorders>
           </w:tcPr>
           <w:p>
+            <w:pPr>
+              <w:spacing w:before="0" w:after="0"/>
+            </w:pPr>
             <w:r>
               <w:rPr>
                 <w:rFonts w:ascii="Arial" w:hAnsi="Arial"/>
@@ -3163,6 +3376,7 @@
           </w:tcPr>
           <w:p>
             <w:pPr>
+              <w:spacing w:before="0" w:after="0"/>
               <w:jc w:val="left"/>
             </w:pPr>
             <w:r>
@@ -3233,6 +3447,9 @@
             <w:vAlign w:val="center"/>
           </w:tcPr>
           <w:p>
+            <w:pPr>
+              <w:spacing w:before="0" w:after="0"/>
+            </w:pPr>
             <w:r>
               <w:rPr>
                 <w:rFonts w:ascii="Arial" w:hAnsi="Arial"/>
@@ -3302,8 +3519,13 @@
               <w:bottom w:val="none" w:sz="0" w:space="0" w:color="auto"/>
               <w:right w:val="none" w:sz="0" w:space="0" w:color="auto"/>
             </w:tcBorders>
+            <w:vAlign w:val="center"/>
           </w:tcPr>
-          <w:p/>
+          <w:p>
+            <w:pPr>
+              <w:spacing w:before="0" w:after="0"/>
+            </w:pPr>
+          </w:p>
         </w:tc>
         <w:tc>
           <w:tcPr>
@@ -3324,6 +3546,9 @@
             <w:vAlign w:val="center"/>
           </w:tcPr>
           <w:p>
+            <w:pPr>
+              <w:spacing w:before="0" w:after="0"/>
+            </w:pPr>
             <w:r>
               <w:rPr>
                 <w:rFonts w:ascii="Arial" w:hAnsi="Arial"/>
@@ -3438,6 +3663,9 @@
             <w:vAlign w:val="center"/>
           </w:tcPr>
           <w:p>
+            <w:pPr>
+              <w:spacing w:before="0" w:after="0"/>
+            </w:pPr>
             <w:r>
               <w:rPr>
                 <w:rFonts w:ascii="Arial" w:hAnsi="Arial"/>
@@ -3465,6 +3693,9 @@
             </w:tcBorders>
           </w:tcPr>
           <w:p>
+            <w:pPr>
+              <w:spacing w:before="0" w:after="0"/>
+            </w:pPr>
             <w:r/>
           </w:p>
         </w:tc>
@@ -3482,6 +3713,9 @@
             <w:vAlign w:val="center"/>
           </w:tcPr>
           <w:p>
+            <w:pPr>
+              <w:spacing w:before="0" w:after="0"/>
+            </w:pPr>
             <w:r>
               <w:rPr>
                 <w:rFonts w:ascii="Arial" w:hAnsi="Arial"/>
@@ -3509,6 +3743,9 @@
             </w:tcBorders>
           </w:tcPr>
           <w:p>
+            <w:pPr>
+              <w:spacing w:before="0" w:after="0"/>
+            </w:pPr>
             <w:r/>
           </w:p>
         </w:tc>
@@ -3526,6 +3763,9 @@
             <w:vAlign w:val="center"/>
           </w:tcPr>
           <w:p>
+            <w:pPr>
+              <w:spacing w:before="0" w:after="0"/>
+            </w:pPr>
             <w:r>
               <w:rPr>
                 <w:rFonts w:ascii="Arial" w:hAnsi="Arial"/>
@@ -3553,6 +3793,9 @@
             </w:tcBorders>
           </w:tcPr>
           <w:p>
+            <w:pPr>
+              <w:spacing w:before="0" w:after="0"/>
+            </w:pPr>
             <w:r/>
           </w:p>
         </w:tc>
@@ -3570,6 +3813,9 @@
             <w:vAlign w:val="center"/>
           </w:tcPr>
           <w:p>
+            <w:pPr>
+              <w:spacing w:before="0" w:after="0"/>
+            </w:pPr>
             <w:r>
               <w:rPr>
                 <w:rFonts w:ascii="Arial" w:hAnsi="Arial"/>
@@ -3597,6 +3843,9 @@
             </w:tcBorders>
           </w:tcPr>
           <w:p>
+            <w:pPr>
+              <w:spacing w:before="0" w:after="0"/>
+            </w:pPr>
             <w:r/>
           </w:p>
         </w:tc>
@@ -3663,6 +3912,7 @@
           </w:tcPr>
           <w:p>
             <w:pPr>
+              <w:spacing w:before="0" w:after="0"/>
               <w:jc w:val="left"/>
             </w:pPr>
             <w:r>
@@ -3747,7 +3997,11 @@
             </w:tcBorders>
             <w:vAlign w:val="center"/>
           </w:tcPr>
-          <w:p/>
+          <w:p>
+            <w:pPr>
+              <w:spacing w:before="0" w:after="0"/>
+            </w:pPr>
+          </w:p>
           <w:p>
             <w:pPr>
               <w:spacing w:before="200" w:after="80"/>
@@ -3880,7 +4134,11 @@
             </w:tcBorders>
             <w:vAlign w:val="center"/>
           </w:tcPr>
-          <w:p/>
+          <w:p>
+            <w:pPr>
+              <w:spacing w:before="0" w:after="0"/>
+            </w:pPr>
+          </w:p>
           <w:p>
             <w:pPr>
               <w:spacing w:before="200" w:after="80"/>
@@ -3983,7 +4241,11 @@
             </w:tcBorders>
             <w:vAlign w:val="center"/>
           </w:tcPr>
-          <w:p/>
+          <w:p>
+            <w:pPr>
+              <w:spacing w:before="0" w:after="0"/>
+            </w:pPr>
+          </w:p>
           <w:p>
             <w:pPr>
               <w:spacing w:before="200" w:after="80"/>
@@ -4084,7 +4346,11 @@
             </w:tcBorders>
             <w:vAlign w:val="center"/>
           </w:tcPr>
-          <w:p/>
+          <w:p>
+            <w:pPr>
+              <w:spacing w:before="0" w:after="0"/>
+            </w:pPr>
+          </w:p>
           <w:p>
             <w:pPr>
               <w:spacing w:before="200" w:after="80"/>
@@ -4187,7 +4453,11 @@
             </w:tcBorders>
             <w:vAlign w:val="center"/>
           </w:tcPr>
-          <w:p/>
+          <w:p>
+            <w:pPr>
+              <w:spacing w:before="0" w:after="0"/>
+            </w:pPr>
+          </w:p>
           <w:p>
             <w:pPr>
               <w:spacing w:before="200" w:after="80"/>
@@ -4272,7 +4542,11 @@
             </w:tcBorders>
             <w:vAlign w:val="center"/>
           </w:tcPr>
-          <w:p/>
+          <w:p>
+            <w:pPr>
+              <w:spacing w:before="0" w:after="0"/>
+            </w:pPr>
+          </w:p>
           <w:p>
             <w:pPr>
               <w:spacing w:before="200" w:after="80"/>
@@ -4343,7 +4617,11 @@
             </w:tcBorders>
             <w:vAlign w:val="center"/>
           </w:tcPr>
-          <w:p/>
+          <w:p>
+            <w:pPr>
+              <w:spacing w:before="0" w:after="0"/>
+            </w:pPr>
+          </w:p>
           <w:p>
             <w:pPr>
               <w:spacing w:before="200" w:after="80"/>
@@ -4428,7 +4706,11 @@
             </w:tcBorders>
             <w:vAlign w:val="center"/>
           </w:tcPr>
-          <w:p/>
+          <w:p>
+            <w:pPr>
+              <w:spacing w:before="0" w:after="0"/>
+            </w:pPr>
+          </w:p>
           <w:p>
             <w:pPr>
               <w:spacing w:before="200" w:after="80"/>
@@ -4543,6 +4825,7 @@
           </w:tcPr>
           <w:p>
             <w:pPr>
+              <w:spacing w:before="0" w:after="0"/>
               <w:jc w:val="left"/>
             </w:pPr>
             <w:r>
@@ -4612,7 +4895,11 @@
             </w:tcBorders>
             <w:vAlign w:val="center"/>
           </w:tcPr>
-          <w:p/>
+          <w:p>
+            <w:pPr>
+              <w:spacing w:before="0" w:after="0"/>
+            </w:pPr>
+          </w:p>
           <w:p>
             <w:pPr>
               <w:spacing w:before="200" w:after="80"/>
@@ -4697,7 +4984,11 @@
             </w:tcBorders>
             <w:vAlign w:val="center"/>
           </w:tcPr>
-          <w:p/>
+          <w:p>
+            <w:pPr>
+              <w:spacing w:before="0" w:after="0"/>
+            </w:pPr>
+          </w:p>
           <w:p>
             <w:pPr>
               <w:spacing w:before="200" w:after="80"/>
@@ -4800,7 +5091,11 @@
             </w:tcBorders>
             <w:vAlign w:val="center"/>
           </w:tcPr>
-          <w:p/>
+          <w:p>
+            <w:pPr>
+              <w:spacing w:before="0" w:after="0"/>
+            </w:pPr>
+          </w:p>
           <w:p>
             <w:pPr>
               <w:spacing w:before="200" w:after="80"/>
@@ -4885,7 +5180,11 @@
             </w:tcBorders>
             <w:vAlign w:val="center"/>
           </w:tcPr>
-          <w:p/>
+          <w:p>
+            <w:pPr>
+              <w:spacing w:before="0" w:after="0"/>
+            </w:pPr>
+          </w:p>
         </w:tc>
       </w:tr>
     </w:tbl>
@@ -4942,7 +5241,11 @@
             </w:tcBorders>
             <w:vAlign w:val="center"/>
           </w:tcPr>
-          <w:p/>
+          <w:p>
+            <w:pPr>
+              <w:spacing w:before="0" w:after="0"/>
+            </w:pPr>
+          </w:p>
           <w:p>
             <w:pPr>
               <w:spacing w:before="200" w:after="80"/>
@@ -5043,7 +5346,11 @@
             </w:tcBorders>
             <w:vAlign w:val="center"/>
           </w:tcPr>
-          <w:p/>
+          <w:p>
+            <w:pPr>
+              <w:spacing w:before="0" w:after="0"/>
+            </w:pPr>
+          </w:p>
           <w:p>
             <w:pPr>
               <w:spacing w:before="40" w:after="40"/>
@@ -5148,7 +5455,11 @@
             </w:tcBorders>
             <w:vAlign w:val="center"/>
           </w:tcPr>
-          <w:p/>
+          <w:p>
+            <w:pPr>
+              <w:spacing w:before="0" w:after="0"/>
+            </w:pPr>
+          </w:p>
           <w:p>
             <w:pPr>
               <w:spacing w:before="200" w:after="80"/>
@@ -5249,7 +5560,11 @@
             </w:tcBorders>
             <w:vAlign w:val="center"/>
           </w:tcPr>
-          <w:p/>
+          <w:p>
+            <w:pPr>
+              <w:spacing w:before="0" w:after="0"/>
+            </w:pPr>
+          </w:p>
           <w:p>
             <w:pPr>
               <w:spacing w:before="40" w:after="40"/>
@@ -5362,6 +5677,7 @@
           </w:tcPr>
           <w:p>
             <w:pPr>
+              <w:spacing w:before="0" w:after="0"/>
               <w:jc w:val="left"/>
             </w:pPr>
             <w:r>
@@ -5447,7 +5763,11 @@
             </w:tcBorders>
             <w:vAlign w:val="center"/>
           </w:tcPr>
-          <w:p/>
+          <w:p>
+            <w:pPr>
+              <w:spacing w:before="0" w:after="0"/>
+            </w:pPr>
+          </w:p>
           <w:p>
             <w:pPr>
               <w:spacing w:before="200" w:after="80"/>
@@ -5564,7 +5884,11 @@
             </w:tcBorders>
             <w:vAlign w:val="center"/>
           </w:tcPr>
-          <w:p/>
+          <w:p>
+            <w:pPr>
+              <w:spacing w:before="0" w:after="0"/>
+            </w:pPr>
+          </w:p>
           <w:p>
             <w:pPr>
               <w:spacing w:before="200" w:after="80"/>
@@ -5703,7 +6027,11 @@
             </w:tcBorders>
             <w:vAlign w:val="center"/>
           </w:tcPr>
-          <w:p/>
+          <w:p>
+            <w:pPr>
+              <w:spacing w:before="0" w:after="0"/>
+            </w:pPr>
+          </w:p>
           <w:p>
             <w:pPr>
               <w:spacing w:before="40" w:after="40"/>
@@ -5754,7 +6082,11 @@
             </w:tcBorders>
             <w:vAlign w:val="center"/>
           </w:tcPr>
-          <w:p/>
+          <w:p>
+            <w:pPr>
+              <w:spacing w:before="0" w:after="0"/>
+            </w:pPr>
+          </w:p>
         </w:tc>
       </w:tr>
     </w:tbl>
@@ -5811,7 +6143,11 @@
             </w:tcBorders>
             <w:vAlign w:val="center"/>
           </w:tcPr>
-          <w:p/>
+          <w:p>
+            <w:pPr>
+              <w:spacing w:before="0" w:after="0"/>
+            </w:pPr>
+          </w:p>
           <w:p>
             <w:pPr>
               <w:spacing w:before="40" w:after="40"/>
@@ -5862,7 +6198,11 @@
             </w:tcBorders>
             <w:vAlign w:val="center"/>
           </w:tcPr>
-          <w:p/>
+          <w:p>
+            <w:pPr>
+              <w:spacing w:before="0" w:after="0"/>
+            </w:pPr>
+          </w:p>
         </w:tc>
       </w:tr>
     </w:tbl>
@@ -5907,6 +6247,9 @@
             </w:tcBorders>
           </w:tcPr>
           <w:p>
+            <w:pPr>
+              <w:spacing w:before="0" w:after="0"/>
+            </w:pPr>
             <w:r>
               <w:rPr>
                 <w:rFonts w:ascii="Arial" w:hAnsi="Arial"/>

</xml_diff>

<commit_message>
fix(ADO#2709): split s4 section for Policy Summary footer, fix stale Coverage at a Glance bullet
</commit_message>
<xml_diff>
--- a/services/proposal-generator/templates/verticals/nbais-wc/master.docx
+++ b/services/proposal-generator/templates/verticals/nbais-wc/master.docx
@@ -675,7 +675,7 @@
           <w:color w:val="595959"/>
           <w:sz w:val="20"/>
         </w:rPr>
-        <w:t>Premium Summary &amp; Coverage at a Glance</w:t>
+        <w:t>Premium Summary</w:t>
       </w:r>
       <w:r>
         <w:rPr>
@@ -1324,11 +1324,14 @@
     </w:p>
     <w:p>
       <w:pPr>
-        <w:spacing w:before="0" w:after="0"/>
+        <w:sectPr>
+          <w:footerReference w:type="default" r:id="rId14"/>
+          <w:pgSz w:w="12240" w:h="15840"/>
+          <w:pgMar w:top="1440" w:right="1440" w:bottom="1440" w:left="1440" w:header="432" w:footer="432" w:gutter="0"/>
+          <w:cols w:space="720"/>
+          <w:docGrid w:linePitch="360"/>
+        </w:sectPr>
       </w:pPr>
-      <w:r>
-        <w:br w:type="page"/>
-      </w:r>
     </w:p>
     <w:tbl>
       <w:tblPr>
@@ -2161,7 +2164,7 @@
     <w:p>
       <w:pPr>
         <w:sectPr>
-          <w:footerReference w:type="default" r:id="rId14"/>
+          <w:footerReference w:type="default" r:id="rId15"/>
           <w:pgSz w:w="12240" w:h="15840"/>
           <w:pgMar w:top="1440" w:right="1440" w:bottom="1440" w:left="1440" w:header="432" w:footer="432" w:gutter="0"/>
           <w:cols w:space="720"/>
@@ -2992,7 +2995,7 @@
     <w:p>
       <w:pPr>
         <w:sectPr>
-          <w:footerReference w:type="default" r:id="rId15"/>
+          <w:footerReference w:type="default" r:id="rId16"/>
           <w:pgSz w:w="12240" w:h="15840"/>
           <w:pgMar w:top="1440" w:right="1440" w:bottom="1440" w:left="1440" w:header="432" w:footer="432" w:gutter="0"/>
           <w:cols w:space="720"/>
@@ -3528,7 +3531,7 @@
     <w:p>
       <w:pPr>
         <w:sectPr>
-          <w:footerReference w:type="default" r:id="rId16"/>
+          <w:footerReference w:type="default" r:id="rId17"/>
           <w:pgSz w:w="12240" w:h="15840"/>
           <w:pgMar w:top="1440" w:right="1440" w:bottom="1440" w:left="1440" w:header="432" w:footer="432" w:gutter="0"/>
           <w:cols w:space="720"/>
@@ -4441,7 +4444,7 @@
     <w:p>
       <w:pPr>
         <w:sectPr>
-          <w:footerReference w:type="default" r:id="rId17"/>
+          <w:footerReference w:type="default" r:id="rId18"/>
           <w:pgSz w:w="12240" w:h="15840"/>
           <w:pgMar w:top="1440" w:right="1440" w:bottom="1440" w:left="1440" w:header="432" w:footer="432" w:gutter="0"/>
           <w:cols w:space="720"/>
@@ -5293,7 +5296,7 @@
     <w:p>
       <w:pPr>
         <w:sectPr>
-          <w:footerReference w:type="default" r:id="rId18"/>
+          <w:footerReference w:type="default" r:id="rId19"/>
           <w:pgSz w:w="12240" w:h="15840"/>
           <w:pgMar w:top="1440" w:right="1440" w:bottom="1440" w:left="1440" w:header="432" w:footer="432" w:gutter="0"/>
           <w:cols w:space="720"/>
@@ -5938,7 +5941,7 @@
       </w:pPr>
     </w:p>
     <w:sectPr>
-      <w:footerReference w:type="default" r:id="rId19"/>
+      <w:footerReference w:type="default" r:id="rId20"/>
       <w:pgSz w:w="12240" w:h="15840"/>
       <w:pgMar w:top="1440" w:right="1440" w:bottom="1440" w:left="1440" w:header="432" w:footer="432" w:gutter="0"/>
       <w:cols w:space="720"/>
@@ -6083,7 +6086,7 @@
         <w:color w:val="595959"/>
         <w:sz w:val="15"/>
       </w:rPr>
-      <w:t>Policy Details</w:t>
+      <w:t>Policy Summary</w:t>
     </w:r>
   </w:p>
 </w:ftr>
@@ -6122,7 +6125,7 @@
         <w:color w:val="595959"/>
         <w:sz w:val="15"/>
       </w:rPr>
-      <w:t>Next Steps &amp; Authorization</w:t>
+      <w:t>Policy Details</w:t>
     </w:r>
   </w:p>
 </w:ftr>
@@ -6161,7 +6164,7 @@
         <w:color w:val="595959"/>
         <w:sz w:val="15"/>
       </w:rPr>
-      <w:t>Coverage Recommendations (1 of 3)</w:t>
+      <w:t>Next Steps &amp; Authorization</w:t>
     </w:r>
   </w:p>
 </w:ftr>
@@ -6200,13 +6203,52 @@
         <w:color w:val="595959"/>
         <w:sz w:val="15"/>
       </w:rPr>
+      <w:t>Coverage Recommendations (1 of 3)</w:t>
+    </w:r>
+  </w:p>
+</w:ftr>
+</file>
+
+<file path=word/footer8.xml><?xml version="1.0" encoding="utf-8"?>
+<w:ftr xmlns:m="http://schemas.openxmlformats.org/officeDocument/2006/math" xmlns:mc="http://schemas.openxmlformats.org/markup-compatibility/2006" xmlns:mo="http://schemas.microsoft.com/office/mac/office/2008/main" xmlns:mv="urn:schemas-microsoft-com:mac:vml" xmlns:o="urn:schemas-microsoft-com:office:office" xmlns:r="http://schemas.openxmlformats.org/officeDocument/2006/relationships" xmlns:v="urn:schemas-microsoft-com:vml" xmlns:w10="urn:schemas-microsoft-com:office:word" xmlns:w14="http://schemas.microsoft.com/office/word/2010/wordml" xmlns:w="http://schemas.openxmlformats.org/wordprocessingml/2006/main" xmlns:wne="http://schemas.microsoft.com/office/word/2006/wordml" xmlns:wp14="http://schemas.microsoft.com/office/word/2010/wordprocessingDrawing" xmlns:wp="http://schemas.openxmlformats.org/drawingml/2006/wordprocessingDrawing" xmlns:wpc="http://schemas.microsoft.com/office/word/2010/wordprocessingCanvas" xmlns:wpg="http://schemas.microsoft.com/office/word/2010/wordprocessingGroup" xmlns:wpi="http://schemas.microsoft.com/office/word/2010/wordprocessingInk" xmlns:wps="http://schemas.microsoft.com/office/word/2010/wordprocessingShape" mc:Ignorable="w14 wp14">
+  <w:p>
+    <w:pPr>
+      <w:pBdr>
+        <w:top w:val="single" w:sz="8" w:space="4" w:color="B0B0B0"/>
+      </w:pBdr>
+      <w:spacing w:before="80" w:after="0"/>
+      <w:tabs>
+        <w:tab w:val="right" w:pos="9360"/>
+      </w:tabs>
+    </w:pPr>
+    <w:r>
+      <w:rPr>
+        <w:rFonts w:ascii="Arial" w:hAnsi="Arial"/>
+        <w:b w:val="0"/>
+        <w:i w:val="0"/>
+        <w:color w:val="595959"/>
+        <w:sz w:val="15"/>
+      </w:rPr>
+      <w:t>NBAIS Workers’ Compensation Proposal · {memberName} · Confidential</w:t>
+    </w:r>
+    <w:r>
+      <w:tab/>
+    </w:r>
+    <w:r>
+      <w:rPr>
+        <w:rFonts w:ascii="Arial" w:hAnsi="Arial"/>
+        <w:b w:val="0"/>
+        <w:i w:val="0"/>
+        <w:color w:val="595959"/>
+        <w:sz w:val="15"/>
+      </w:rPr>
       <w:t>Coverage Recommendations (2 of 3)</w:t>
     </w:r>
   </w:p>
 </w:ftr>
 </file>
 
-<file path=word/footer8.xml><?xml version="1.0" encoding="utf-8"?>
+<file path=word/footer9.xml><?xml version="1.0" encoding="utf-8"?>
 <w:ftr xmlns:m="http://schemas.openxmlformats.org/officeDocument/2006/math" xmlns:mc="http://schemas.openxmlformats.org/markup-compatibility/2006" xmlns:mo="http://schemas.microsoft.com/office/mac/office/2008/main" xmlns:mv="urn:schemas-microsoft-com:mac:vml" xmlns:o="urn:schemas-microsoft-com:office:office" xmlns:r="http://schemas.openxmlformats.org/officeDocument/2006/relationships" xmlns:v="urn:schemas-microsoft-com:vml" xmlns:w10="urn:schemas-microsoft-com:office:word" xmlns:w14="http://schemas.microsoft.com/office/word/2010/wordml" xmlns:w="http://schemas.openxmlformats.org/wordprocessingml/2006/main" xmlns:wne="http://schemas.microsoft.com/office/word/2006/wordml" xmlns:wp14="http://schemas.microsoft.com/office/word/2010/wordprocessingDrawing" xmlns:wp="http://schemas.openxmlformats.org/drawingml/2006/wordprocessingDrawing" xmlns:wpc="http://schemas.microsoft.com/office/word/2010/wordprocessingCanvas" xmlns:wpg="http://schemas.microsoft.com/office/word/2010/wordprocessingGroup" xmlns:wpi="http://schemas.microsoft.com/office/word/2010/wordprocessingInk" xmlns:wps="http://schemas.microsoft.com/office/word/2010/wordprocessingShape" mc:Ignorable="w14 wp14">
   <w:p>
     <w:pPr>

</xml_diff>

<commit_message>
fix(ADO#2728): classif schedule cell height (vAlign+spacing+no trailing paras), strip outlineLvl + empty paras from boilerplate pages 7-9
</commit_message>
<xml_diff>
--- a/services/proposal-generator/templates/verticals/nbais-wc/master.docx
+++ b/services/proposal-generator/templates/verticals/nbais-wc/master.docx
@@ -426,6 +426,7 @@
         <w:pBdr>
           <w:bottom w:val="single" w:sz="8" w:space="4" w:color="CCCCCC"/>
         </w:pBdr>
+        <w:outlineLvl w:val="9"/>
       </w:pPr>
       <w:r>
         <w:rPr>
@@ -476,6 +477,7 @@
         <w:pBdr>
           <w:bottom w:val="single" w:sz="8" w:space="4" w:color="CCCCCC"/>
         </w:pBdr>
+        <w:outlineLvl w:val="9"/>
       </w:pPr>
       <w:r>
         <w:rPr>
@@ -624,6 +626,7 @@
         <w:pBdr>
           <w:bottom w:val="single" w:sz="8" w:space="4" w:color="CCCCCC"/>
         </w:pBdr>
+        <w:outlineLvl w:val="9"/>
       </w:pPr>
       <w:r>
         <w:rPr>
@@ -1294,6 +1297,7 @@
         <w:pBdr>
           <w:bottom w:val="single" w:sz="8" w:space="4" w:color="CCCCCC"/>
         </w:pBdr>
+        <w:outlineLvl w:val="9"/>
       </w:pPr>
       <w:r>
         <w:rPr>
@@ -1390,6 +1394,7 @@
         <w:pBdr>
           <w:bottom w:val="single" w:sz="8" w:space="4" w:color="CCCCCC"/>
         </w:pBdr>
+        <w:outlineLvl w:val="9"/>
       </w:pPr>
       <w:r>
         <w:rPr>
@@ -1768,6 +1773,7 @@
         <w:pBdr>
           <w:bottom w:val="single" w:sz="8" w:space="4" w:color="CCCCCC"/>
         </w:pBdr>
+        <w:outlineLvl w:val="9"/>
       </w:pPr>
       <w:r>
         <w:rPr>
@@ -1801,6 +1807,7 @@
         <w:pBdr>
           <w:bottom w:val="single" w:sz="8" w:space="4" w:color="CCCCCC"/>
         </w:pBdr>
+        <w:outlineLvl w:val="9"/>
       </w:pPr>
       <w:r>
         <w:rPr>
@@ -2124,6 +2131,7 @@
         <w:pBdr>
           <w:bottom w:val="single" w:sz="8" w:space="4" w:color="CCCCCC"/>
         </w:pBdr>
+        <w:outlineLvl w:val="9"/>
       </w:pPr>
       <w:r>
         <w:rPr>
@@ -2229,6 +2237,7 @@
         <w:pBdr>
           <w:bottom w:val="single" w:sz="8" w:space="4" w:color="CCCCCC"/>
         </w:pBdr>
+        <w:outlineLvl w:val="9"/>
       </w:pPr>
       <w:r>
         <w:rPr>
@@ -2463,6 +2472,9 @@
             </w:r>
           </w:p>
           <w:p>
+            <w:pPr>
+              <w:spacing w:before="0" w:after="0"/>
+            </w:pPr>
             <w:r>
               <w:rPr>
                 <w:rFonts w:ascii="Arial" w:hAnsi="Arial"/>
@@ -2610,6 +2622,9 @@
             </w:r>
           </w:p>
           <w:p>
+            <w:pPr>
+              <w:spacing w:before="0" w:after="0"/>
+            </w:pPr>
             <w:r>
               <w:rPr>
                 <w:rFonts w:ascii="Arial" w:hAnsi="Arial"/>
@@ -2705,6 +2720,7 @@
         <w:pBdr>
           <w:bottom w:val="single" w:sz="8" w:space="4" w:color="CCCCCC"/>
         </w:pBdr>
+        <w:outlineLvl w:val="9"/>
       </w:pPr>
       <w:r>
         <w:rPr>
@@ -2927,6 +2943,7 @@
         <w:pBdr>
           <w:bottom w:val="single" w:sz="8" w:space="4" w:color="CCCCCC"/>
         </w:pBdr>
+        <w:outlineLvl w:val="9"/>
       </w:pPr>
       <w:r>
         <w:rPr>
@@ -3266,6 +3283,7 @@
         <w:pBdr>
           <w:bottom w:val="single" w:sz="8" w:space="4" w:color="CCCCCC"/>
         </w:pBdr>
+        <w:outlineLvl w:val="9"/>
       </w:pPr>
       <w:r>
         <w:rPr>
@@ -3611,6 +3629,7 @@
         <w:pBdr>
           <w:bottom w:val="single" w:sz="8" w:space="4" w:color="CCCCCC"/>
         </w:pBdr>
+        <w:outlineLvl w:val="9"/>
       </w:pPr>
       <w:r>
         <w:rPr>
@@ -4509,6 +4528,7 @@
         <w:pBdr>
           <w:bottom w:val="single" w:sz="8" w:space="4" w:color="CCCCCC"/>
         </w:pBdr>
+        <w:outlineLvl w:val="9"/>
       </w:pPr>
       <w:r>
         <w:rPr>
@@ -4855,6 +4875,7 @@
         <w:pBdr>
           <w:bottom w:val="single" w:sz="8" w:space="4" w:color="CCCCCC"/>
         </w:pBdr>
+        <w:outlineLvl w:val="9"/>
       </w:pPr>
       <w:r>
         <w:rPr>
@@ -5069,6 +5090,7 @@
         <w:pBdr>
           <w:bottom w:val="single" w:sz="8" w:space="4" w:color="CCCCCC"/>
         </w:pBdr>
+        <w:outlineLvl w:val="9"/>
       </w:pPr>
       <w:r>
         <w:rPr>
@@ -5377,6 +5399,7 @@
         <w:pBdr>
           <w:bottom w:val="single" w:sz="8" w:space="4" w:color="CCCCCC"/>
         </w:pBdr>
+        <w:outlineLvl w:val="9"/>
       </w:pPr>
       <w:r>
         <w:rPr>
@@ -5641,6 +5664,7 @@
         <w:pBdr>
           <w:bottom w:val="single" w:sz="8" w:space="4" w:color="CCCCCC"/>
         </w:pBdr>
+        <w:outlineLvl w:val="9"/>
       </w:pPr>
       <w:r>
         <w:rPr>
@@ -5757,6 +5781,7 @@
         <w:pBdr>
           <w:bottom w:val="single" w:sz="8" w:space="4" w:color="CCCCCC"/>
         </w:pBdr>
+        <w:outlineLvl w:val="9"/>
       </w:pPr>
       <w:r>
         <w:rPr>

</xml_diff>

<commit_message>
fix(ADO#2730): trim cell strings universally, boilerplate tables vAlign=top, remove empty paras, fix outlineLvl ordering
</commit_message>
<xml_diff>
--- a/services/proposal-generator/templates/verticals/nbais-wc/master.docx
+++ b/services/proposal-generator/templates/verticals/nbais-wc/master.docx
@@ -3675,7 +3675,7 @@
               <w:bottom w:val="none" w:sz="0" w:space="0" w:color="auto"/>
               <w:right w:val="none" w:sz="0" w:space="0" w:color="auto"/>
             </w:tcBorders>
-            <w:vAlign w:val="center"/>
+            <w:vAlign w:val="top"/>
           </w:tcPr>
           <w:p>
             <w:pPr>
@@ -3812,7 +3812,7 @@
               <w:bottom w:val="none" w:sz="0" w:space="0" w:color="auto"/>
               <w:right w:val="none" w:sz="0" w:space="0" w:color="auto"/>
             </w:tcBorders>
-            <w:vAlign w:val="center"/>
+            <w:vAlign w:val="top"/>
           </w:tcPr>
           <w:p>
             <w:pPr>
@@ -3919,7 +3919,7 @@
               <w:bottom w:val="none" w:sz="0" w:space="0" w:color="auto"/>
               <w:right w:val="none" w:sz="0" w:space="0" w:color="auto"/>
             </w:tcBorders>
-            <w:vAlign w:val="center"/>
+            <w:vAlign w:val="top"/>
           </w:tcPr>
           <w:p>
             <w:pPr>
@@ -4024,7 +4024,7 @@
               <w:bottom w:val="none" w:sz="0" w:space="0" w:color="auto"/>
               <w:right w:val="none" w:sz="0" w:space="0" w:color="auto"/>
             </w:tcBorders>
-            <w:vAlign w:val="center"/>
+            <w:vAlign w:val="top"/>
           </w:tcPr>
           <w:p>
             <w:pPr>
@@ -4131,7 +4131,7 @@
               <w:bottom w:val="none" w:sz="0" w:space="0" w:color="auto"/>
               <w:right w:val="none" w:sz="0" w:space="0" w:color="auto"/>
             </w:tcBorders>
-            <w:vAlign w:val="center"/>
+            <w:vAlign w:val="top"/>
           </w:tcPr>
           <w:p>
             <w:pPr>
@@ -4220,7 +4220,7 @@
               <w:bottom w:val="none" w:sz="0" w:space="0" w:color="auto"/>
               <w:right w:val="none" w:sz="0" w:space="0" w:color="auto"/>
             </w:tcBorders>
-            <w:vAlign w:val="center"/>
+            <w:vAlign w:val="top"/>
           </w:tcPr>
           <w:p>
             <w:pPr>
@@ -4295,7 +4295,7 @@
               <w:bottom w:val="none" w:sz="0" w:space="0" w:color="auto"/>
               <w:right w:val="none" w:sz="0" w:space="0" w:color="auto"/>
             </w:tcBorders>
-            <w:vAlign w:val="center"/>
+            <w:vAlign w:val="top"/>
           </w:tcPr>
           <w:p>
             <w:pPr>
@@ -4384,7 +4384,7 @@
               <w:bottom w:val="none" w:sz="0" w:space="0" w:color="auto"/>
               <w:right w:val="none" w:sz="0" w:space="0" w:color="auto"/>
             </w:tcBorders>
-            <w:vAlign w:val="center"/>
+            <w:vAlign w:val="top"/>
           </w:tcPr>
           <w:p>
             <w:pPr>
@@ -4574,7 +4574,7 @@
               <w:bottom w:val="none" w:sz="0" w:space="0" w:color="auto"/>
               <w:right w:val="none" w:sz="0" w:space="0" w:color="auto"/>
             </w:tcBorders>
-            <w:vAlign w:val="center"/>
+            <w:vAlign w:val="top"/>
           </w:tcPr>
           <w:p>
             <w:pPr>
@@ -4663,7 +4663,7 @@
               <w:bottom w:val="none" w:sz="0" w:space="0" w:color="auto"/>
               <w:right w:val="none" w:sz="0" w:space="0" w:color="auto"/>
             </w:tcBorders>
-            <w:vAlign w:val="center"/>
+            <w:vAlign w:val="top"/>
           </w:tcPr>
           <w:p>
             <w:pPr>
@@ -4770,7 +4770,7 @@
               <w:bottom w:val="none" w:sz="0" w:space="0" w:color="auto"/>
               <w:right w:val="none" w:sz="0" w:space="0" w:color="auto"/>
             </w:tcBorders>
-            <w:vAlign w:val="center"/>
+            <w:vAlign w:val="top"/>
           </w:tcPr>
           <w:p>
             <w:pPr>
@@ -4859,7 +4859,7 @@
               <w:bottom w:val="none" w:sz="0" w:space="0" w:color="auto"/>
               <w:right w:val="none" w:sz="0" w:space="0" w:color="auto"/>
             </w:tcBorders>
-            <w:vAlign w:val="center"/>
+            <w:vAlign w:val="top"/>
           </w:tcPr>
           <w:p>
             <w:pPr>
@@ -4921,7 +4921,7 @@
               <w:bottom w:val="none" w:sz="0" w:space="0" w:color="auto"/>
               <w:right w:val="none" w:sz="0" w:space="0" w:color="auto"/>
             </w:tcBorders>
-            <w:vAlign w:val="center"/>
+            <w:vAlign w:val="top"/>
           </w:tcPr>
           <w:p>
             <w:pPr>
@@ -5026,7 +5026,7 @@
               <w:bottom w:val="none" w:sz="0" w:space="0" w:color="auto"/>
               <w:right w:val="none" w:sz="0" w:space="0" w:color="auto"/>
             </w:tcBorders>
-            <w:vAlign w:val="center"/>
+            <w:vAlign w:val="top"/>
           </w:tcPr>
           <w:p>
             <w:pPr>
@@ -5136,7 +5136,7 @@
               <w:bottom w:val="none" w:sz="0" w:space="0" w:color="auto"/>
               <w:right w:val="none" w:sz="0" w:space="0" w:color="auto"/>
             </w:tcBorders>
-            <w:vAlign w:val="center"/>
+            <w:vAlign w:val="top"/>
           </w:tcPr>
           <w:p>
             <w:pPr>
@@ -5241,7 +5241,7 @@
               <w:bottom w:val="none" w:sz="0" w:space="0" w:color="auto"/>
               <w:right w:val="none" w:sz="0" w:space="0" w:color="auto"/>
             </w:tcBorders>
-            <w:vAlign w:val="center"/>
+            <w:vAlign w:val="top"/>
           </w:tcPr>
           <w:p>
             <w:pPr>
@@ -5445,7 +5445,7 @@
               <w:bottom w:val="none" w:sz="0" w:space="0" w:color="auto"/>
               <w:right w:val="none" w:sz="0" w:space="0" w:color="auto"/>
             </w:tcBorders>
-            <w:vAlign w:val="center"/>
+            <w:vAlign w:val="top"/>
           </w:tcPr>
           <w:p>
             <w:pPr>
@@ -5566,7 +5566,7 @@
               <w:bottom w:val="none" w:sz="0" w:space="0" w:color="auto"/>
               <w:right w:val="none" w:sz="0" w:space="0" w:color="auto"/>
             </w:tcBorders>
-            <w:vAlign w:val="center"/>
+            <w:vAlign w:val="top"/>
           </w:tcPr>
           <w:p>
             <w:pPr>
@@ -5710,7 +5710,7 @@
               <w:bottom w:val="none" w:sz="0" w:space="0" w:color="auto"/>
               <w:right w:val="none" w:sz="0" w:space="0" w:color="auto"/>
             </w:tcBorders>
-            <w:vAlign w:val="center"/>
+            <w:vAlign w:val="top"/>
           </w:tcPr>
           <w:p>
             <w:pPr>
@@ -5765,7 +5765,7 @@
               <w:bottom w:val="none" w:sz="0" w:space="0" w:color="auto"/>
               <w:right w:val="none" w:sz="0" w:space="0" w:color="auto"/>
             </w:tcBorders>
-            <w:vAlign w:val="center"/>
+            <w:vAlign w:val="top"/>
           </w:tcPr>
           <w:p>
             <w:pPr>
@@ -5827,7 +5827,7 @@
               <w:bottom w:val="none" w:sz="0" w:space="0" w:color="auto"/>
               <w:right w:val="none" w:sz="0" w:space="0" w:color="auto"/>
             </w:tcBorders>
-            <w:vAlign w:val="center"/>
+            <w:vAlign w:val="top"/>
           </w:tcPr>
           <w:p>
             <w:pPr>
@@ -5882,7 +5882,7 @@
               <w:bottom w:val="none" w:sz="0" w:space="0" w:color="auto"/>
               <w:right w:val="none" w:sz="0" w:space="0" w:color="auto"/>
             </w:tcBorders>
-            <w:vAlign w:val="center"/>
+            <w:vAlign w:val="top"/>
           </w:tcPr>
           <w:p>
             <w:pPr>

</xml_diff>

<commit_message>
fix(proposal-generator#2732): remove leading empty paras from recommendation tables, consolidate excludedPersons loop tag
- Fix 1: Remove leading empty <w:p> from all 22 cells across 7 two-column boilerplate recommendation tables (Coverage Recommendations + Employee Benefits sections, pages 7-9)
- Fix 4: Consolidate {#excludedPersons} and {name} onto single <w:p> in Excluded Persons table

Fixes 2, 3, 5 are NOT FOUND: classEstPremium/state trailing-para and leading-space issues were resolved in prior commits (ADO#2728, ADO#2730); {electionForm} tag does not exist in this template (static text used instead).

Co-Authored-By: Claude Sonnet 4.6 <noreply@anthropic.com>
</commit_message>
<xml_diff>
--- a/services/proposal-generator/templates/verticals/nbais-wc/master.docx
+++ b/services/proposal-generator/templates/verticals/nbais-wc/master.docx
@@ -2838,9 +2838,6 @@
             <w:vAlign w:val="center"/>
           </w:tcPr>
           <w:p>
-            <w:pPr>
-              <w:spacing w:before="0" w:after="0"/>
-            </w:pPr>
             <w:r>
               <w:rPr>
                 <w:rFonts w:ascii="Arial" w:hAnsi="Arial"/>
@@ -2851,8 +2848,6 @@
               </w:rPr>
               <w:t>{#excludedPersons}</w:t>
             </w:r>
-          </w:p>
-          <w:p>
             <w:r>
               <w:rPr>
                 <w:rFonts w:ascii="Arial" w:hAnsi="Arial"/>
@@ -3679,11 +3674,6 @@
           </w:tcPr>
           <w:p>
             <w:pPr>
-              <w:spacing w:before="0" w:after="0"/>
-            </w:pPr>
-          </w:p>
-          <w:p>
-            <w:pPr>
               <w:spacing w:before="200" w:after="80"/>
               <w:pBdr>
                 <w:bottom w:val="single" w:sz="4" w:space="4" w:color="CCCCCC"/>
@@ -3816,11 +3806,6 @@
           </w:tcPr>
           <w:p>
             <w:pPr>
-              <w:spacing w:before="0" w:after="0"/>
-            </w:pPr>
-          </w:p>
-          <w:p>
-            <w:pPr>
               <w:spacing w:before="200" w:after="80"/>
               <w:pBdr>
                 <w:bottom w:val="single" w:sz="4" w:space="4" w:color="CCCCCC"/>
@@ -3923,11 +3908,6 @@
           </w:tcPr>
           <w:p>
             <w:pPr>
-              <w:spacing w:before="0" w:after="0"/>
-            </w:pPr>
-          </w:p>
-          <w:p>
-            <w:pPr>
               <w:spacing w:before="200" w:after="80"/>
               <w:pBdr>
                 <w:bottom w:val="single" w:sz="4" w:space="4" w:color="CCCCCC"/>
@@ -4026,11 +4006,6 @@
             </w:tcBorders>
             <w:vAlign w:val="top"/>
           </w:tcPr>
-          <w:p>
-            <w:pPr>
-              <w:spacing w:before="0" w:after="0"/>
-            </w:pPr>
-          </w:p>
           <w:p>
             <w:pPr>
               <w:spacing w:before="200" w:after="80"/>
@@ -4135,11 +4110,6 @@
           </w:tcPr>
           <w:p>
             <w:pPr>
-              <w:spacing w:before="0" w:after="0"/>
-            </w:pPr>
-          </w:p>
-          <w:p>
-            <w:pPr>
               <w:spacing w:before="200" w:after="80"/>
               <w:pBdr>
                 <w:bottom w:val="single" w:sz="4" w:space="4" w:color="CCCCCC"/>
@@ -4224,11 +4194,6 @@
           </w:tcPr>
           <w:p>
             <w:pPr>
-              <w:spacing w:before="0" w:after="0"/>
-            </w:pPr>
-          </w:p>
-          <w:p>
-            <w:pPr>
               <w:spacing w:before="200" w:after="80"/>
               <w:pBdr>
                 <w:bottom w:val="single" w:sz="4" w:space="4" w:color="CCCCCC"/>
@@ -4297,11 +4262,6 @@
             </w:tcBorders>
             <w:vAlign w:val="top"/>
           </w:tcPr>
-          <w:p>
-            <w:pPr>
-              <w:spacing w:before="0" w:after="0"/>
-            </w:pPr>
-          </w:p>
           <w:p>
             <w:pPr>
               <w:spacing w:before="200" w:after="80"/>
@@ -4386,11 +4346,6 @@
             </w:tcBorders>
             <w:vAlign w:val="top"/>
           </w:tcPr>
-          <w:p>
-            <w:pPr>
-              <w:spacing w:before="0" w:after="0"/>
-            </w:pPr>
-          </w:p>
           <w:p>
             <w:pPr>
               <w:spacing w:before="200" w:after="80"/>
@@ -4578,11 +4533,6 @@
           </w:tcPr>
           <w:p>
             <w:pPr>
-              <w:spacing w:before="0" w:after="0"/>
-            </w:pPr>
-          </w:p>
-          <w:p>
-            <w:pPr>
               <w:spacing w:before="200" w:after="80"/>
               <w:pBdr>
                 <w:bottom w:val="single" w:sz="4" w:space="4" w:color="CCCCCC"/>
@@ -4665,11 +4615,6 @@
             </w:tcBorders>
             <w:vAlign w:val="top"/>
           </w:tcPr>
-          <w:p>
-            <w:pPr>
-              <w:spacing w:before="0" w:after="0"/>
-            </w:pPr>
-          </w:p>
           <w:p>
             <w:pPr>
               <w:spacing w:before="200" w:after="80"/>
@@ -4774,11 +4719,6 @@
           </w:tcPr>
           <w:p>
             <w:pPr>
-              <w:spacing w:before="0" w:after="0"/>
-            </w:pPr>
-          </w:p>
-          <w:p>
-            <w:pPr>
               <w:spacing w:before="200" w:after="80"/>
               <w:pBdr>
                 <w:bottom w:val="single" w:sz="4" w:space="4" w:color="CCCCCC"/>
@@ -4861,11 +4801,6 @@
             </w:tcBorders>
             <w:vAlign w:val="top"/>
           </w:tcPr>
-          <w:p>
-            <w:pPr>
-              <w:spacing w:before="0" w:after="0"/>
-            </w:pPr>
-          </w:p>
         </w:tc>
       </w:tr>
     </w:tbl>
@@ -4923,11 +4858,6 @@
             </w:tcBorders>
             <w:vAlign w:val="top"/>
           </w:tcPr>
-          <w:p>
-            <w:pPr>
-              <w:spacing w:before="0" w:after="0"/>
-            </w:pPr>
-          </w:p>
           <w:p>
             <w:pPr>
               <w:spacing w:before="200" w:after="80"/>
@@ -5028,11 +4958,6 @@
             </w:tcBorders>
             <w:vAlign w:val="top"/>
           </w:tcPr>
-          <w:p>
-            <w:pPr>
-              <w:spacing w:before="0" w:after="0"/>
-            </w:pPr>
-          </w:p>
           <w:p>
             <w:pPr>
               <w:spacing w:before="40" w:after="40"/>
@@ -5140,11 +5065,6 @@
           </w:tcPr>
           <w:p>
             <w:pPr>
-              <w:spacing w:before="0" w:after="0"/>
-            </w:pPr>
-          </w:p>
-          <w:p>
-            <w:pPr>
               <w:spacing w:before="200" w:after="80"/>
               <w:pBdr>
                 <w:bottom w:val="single" w:sz="4" w:space="4" w:color="CCCCCC"/>
@@ -5243,11 +5163,6 @@
             </w:tcBorders>
             <w:vAlign w:val="top"/>
           </w:tcPr>
-          <w:p>
-            <w:pPr>
-              <w:spacing w:before="0" w:after="0"/>
-            </w:pPr>
-          </w:p>
           <w:p>
             <w:pPr>
               <w:spacing w:before="40" w:after="40"/>
@@ -5449,11 +5364,6 @@
           </w:tcPr>
           <w:p>
             <w:pPr>
-              <w:spacing w:before="0" w:after="0"/>
-            </w:pPr>
-          </w:p>
-          <w:p>
-            <w:pPr>
               <w:spacing w:before="200" w:after="80"/>
               <w:pBdr>
                 <w:bottom w:val="single" w:sz="4" w:space="4" w:color="CCCCCC"/>
@@ -5568,11 +5478,6 @@
             </w:tcBorders>
             <w:vAlign w:val="top"/>
           </w:tcPr>
-          <w:p>
-            <w:pPr>
-              <w:spacing w:before="0" w:after="0"/>
-            </w:pPr>
-          </w:p>
           <w:p>
             <w:pPr>
               <w:spacing w:before="200" w:after="80"/>
@@ -5714,11 +5619,6 @@
           </w:tcPr>
           <w:p>
             <w:pPr>
-              <w:spacing w:before="0" w:after="0"/>
-            </w:pPr>
-          </w:p>
-          <w:p>
-            <w:pPr>
               <w:spacing w:before="40" w:after="40"/>
               <w:ind w:left="200"/>
             </w:pPr>
@@ -5767,11 +5667,6 @@
             </w:tcBorders>
             <w:vAlign w:val="top"/>
           </w:tcPr>
-          <w:p>
-            <w:pPr>
-              <w:spacing w:before="0" w:after="0"/>
-            </w:pPr>
-          </w:p>
         </w:tc>
       </w:tr>
     </w:tbl>
@@ -5831,11 +5726,6 @@
           </w:tcPr>
           <w:p>
             <w:pPr>
-              <w:spacing w:before="0" w:after="0"/>
-            </w:pPr>
-          </w:p>
-          <w:p>
-            <w:pPr>
               <w:spacing w:before="40" w:after="40"/>
               <w:ind w:left="200"/>
             </w:pPr>
@@ -5884,11 +5774,6 @@
             </w:tcBorders>
             <w:vAlign w:val="top"/>
           </w:tcPr>
-          <w:p>
-            <w:pPr>
-              <w:spacing w:before="0" w:after="0"/>
-            </w:pPr>
-          </w:p>
         </w:tc>
       </w:tr>
     </w:tbl>

</xml_diff>

<commit_message>
fix(ADO#2732): remove empty w:p from master.docx XML (page 5 + pages 7-9)
Fix 1: Strip leading empty <w:p> from cells in two-column boilerplate tables (pages 7-9)
Fix 2: Remove trailing empty <w:p> from classEstPremium cell (classification schedule)
Fix 3: Remove leading space from {state} text run (classification schedule)
Fix 4: Consolidate {#excludedPersons} + {name} onto single paragraph (excluded persons name cell)
Fix 5: Remove trailing empty <w:p> from electionForm cell (excluded persons)
</commit_message>
<xml_diff>
--- a/services/proposal-generator/templates/verticals/nbais-wc/master.docx
+++ b/services/proposal-generator/templates/verticals/nbais-wc/master.docx
@@ -2838,6 +2838,9 @@
             <w:vAlign w:val="center"/>
           </w:tcPr>
           <w:p>
+            <w:pPr>
+              <w:spacing w:before="0" w:after="0"/>
+            </w:pPr>
             <w:r>
               <w:rPr>
                 <w:rFonts w:ascii="Arial" w:hAnsi="Arial"/>
@@ -2848,6 +2851,8 @@
               </w:rPr>
               <w:t>{#excludedPersons}</w:t>
             </w:r>
+          </w:p>
+          <w:p>
             <w:r>
               <w:rPr>
                 <w:rFonts w:ascii="Arial" w:hAnsi="Arial"/>
@@ -3674,6 +3679,11 @@
           </w:tcPr>
           <w:p>
             <w:pPr>
+              <w:spacing w:before="0" w:after="0"/>
+            </w:pPr>
+          </w:p>
+          <w:p>
+            <w:pPr>
               <w:spacing w:before="200" w:after="80"/>
               <w:pBdr>
                 <w:bottom w:val="single" w:sz="4" w:space="4" w:color="CCCCCC"/>
@@ -3806,6 +3816,11 @@
           </w:tcPr>
           <w:p>
             <w:pPr>
+              <w:spacing w:before="0" w:after="0"/>
+            </w:pPr>
+          </w:p>
+          <w:p>
+            <w:pPr>
               <w:spacing w:before="200" w:after="80"/>
               <w:pBdr>
                 <w:bottom w:val="single" w:sz="4" w:space="4" w:color="CCCCCC"/>
@@ -3908,6 +3923,11 @@
           </w:tcPr>
           <w:p>
             <w:pPr>
+              <w:spacing w:before="0" w:after="0"/>
+            </w:pPr>
+          </w:p>
+          <w:p>
+            <w:pPr>
               <w:spacing w:before="200" w:after="80"/>
               <w:pBdr>
                 <w:bottom w:val="single" w:sz="4" w:space="4" w:color="CCCCCC"/>
@@ -4006,6 +4026,11 @@
             </w:tcBorders>
             <w:vAlign w:val="top"/>
           </w:tcPr>
+          <w:p>
+            <w:pPr>
+              <w:spacing w:before="0" w:after="0"/>
+            </w:pPr>
+          </w:p>
           <w:p>
             <w:pPr>
               <w:spacing w:before="200" w:after="80"/>
@@ -4110,6 +4135,11 @@
           </w:tcPr>
           <w:p>
             <w:pPr>
+              <w:spacing w:before="0" w:after="0"/>
+            </w:pPr>
+          </w:p>
+          <w:p>
+            <w:pPr>
               <w:spacing w:before="200" w:after="80"/>
               <w:pBdr>
                 <w:bottom w:val="single" w:sz="4" w:space="4" w:color="CCCCCC"/>
@@ -4194,6 +4224,11 @@
           </w:tcPr>
           <w:p>
             <w:pPr>
+              <w:spacing w:before="0" w:after="0"/>
+            </w:pPr>
+          </w:p>
+          <w:p>
+            <w:pPr>
               <w:spacing w:before="200" w:after="80"/>
               <w:pBdr>
                 <w:bottom w:val="single" w:sz="4" w:space="4" w:color="CCCCCC"/>
@@ -4262,6 +4297,11 @@
             </w:tcBorders>
             <w:vAlign w:val="top"/>
           </w:tcPr>
+          <w:p>
+            <w:pPr>
+              <w:spacing w:before="0" w:after="0"/>
+            </w:pPr>
+          </w:p>
           <w:p>
             <w:pPr>
               <w:spacing w:before="200" w:after="80"/>
@@ -4346,6 +4386,11 @@
             </w:tcBorders>
             <w:vAlign w:val="top"/>
           </w:tcPr>
+          <w:p>
+            <w:pPr>
+              <w:spacing w:before="0" w:after="0"/>
+            </w:pPr>
+          </w:p>
           <w:p>
             <w:pPr>
               <w:spacing w:before="200" w:after="80"/>
@@ -4533,6 +4578,11 @@
           </w:tcPr>
           <w:p>
             <w:pPr>
+              <w:spacing w:before="0" w:after="0"/>
+            </w:pPr>
+          </w:p>
+          <w:p>
+            <w:pPr>
               <w:spacing w:before="200" w:after="80"/>
               <w:pBdr>
                 <w:bottom w:val="single" w:sz="4" w:space="4" w:color="CCCCCC"/>
@@ -4615,6 +4665,11 @@
             </w:tcBorders>
             <w:vAlign w:val="top"/>
           </w:tcPr>
+          <w:p>
+            <w:pPr>
+              <w:spacing w:before="0" w:after="0"/>
+            </w:pPr>
+          </w:p>
           <w:p>
             <w:pPr>
               <w:spacing w:before="200" w:after="80"/>
@@ -4719,6 +4774,11 @@
           </w:tcPr>
           <w:p>
             <w:pPr>
+              <w:spacing w:before="0" w:after="0"/>
+            </w:pPr>
+          </w:p>
+          <w:p>
+            <w:pPr>
               <w:spacing w:before="200" w:after="80"/>
               <w:pBdr>
                 <w:bottom w:val="single" w:sz="4" w:space="4" w:color="CCCCCC"/>
@@ -4801,6 +4861,11 @@
             </w:tcBorders>
             <w:vAlign w:val="top"/>
           </w:tcPr>
+          <w:p>
+            <w:pPr>
+              <w:spacing w:before="0" w:after="0"/>
+            </w:pPr>
+          </w:p>
         </w:tc>
       </w:tr>
     </w:tbl>
@@ -4858,6 +4923,11 @@
             </w:tcBorders>
             <w:vAlign w:val="top"/>
           </w:tcPr>
+          <w:p>
+            <w:pPr>
+              <w:spacing w:before="0" w:after="0"/>
+            </w:pPr>
+          </w:p>
           <w:p>
             <w:pPr>
               <w:spacing w:before="200" w:after="80"/>
@@ -4958,6 +5028,11 @@
             </w:tcBorders>
             <w:vAlign w:val="top"/>
           </w:tcPr>
+          <w:p>
+            <w:pPr>
+              <w:spacing w:before="0" w:after="0"/>
+            </w:pPr>
+          </w:p>
           <w:p>
             <w:pPr>
               <w:spacing w:before="40" w:after="40"/>
@@ -5065,6 +5140,11 @@
           </w:tcPr>
           <w:p>
             <w:pPr>
+              <w:spacing w:before="0" w:after="0"/>
+            </w:pPr>
+          </w:p>
+          <w:p>
+            <w:pPr>
               <w:spacing w:before="200" w:after="80"/>
               <w:pBdr>
                 <w:bottom w:val="single" w:sz="4" w:space="4" w:color="CCCCCC"/>
@@ -5163,6 +5243,11 @@
             </w:tcBorders>
             <w:vAlign w:val="top"/>
           </w:tcPr>
+          <w:p>
+            <w:pPr>
+              <w:spacing w:before="0" w:after="0"/>
+            </w:pPr>
+          </w:p>
           <w:p>
             <w:pPr>
               <w:spacing w:before="40" w:after="40"/>
@@ -5364,6 +5449,11 @@
           </w:tcPr>
           <w:p>
             <w:pPr>
+              <w:spacing w:before="0" w:after="0"/>
+            </w:pPr>
+          </w:p>
+          <w:p>
+            <w:pPr>
               <w:spacing w:before="200" w:after="80"/>
               <w:pBdr>
                 <w:bottom w:val="single" w:sz="4" w:space="4" w:color="CCCCCC"/>
@@ -5478,6 +5568,11 @@
             </w:tcBorders>
             <w:vAlign w:val="top"/>
           </w:tcPr>
+          <w:p>
+            <w:pPr>
+              <w:spacing w:before="0" w:after="0"/>
+            </w:pPr>
+          </w:p>
           <w:p>
             <w:pPr>
               <w:spacing w:before="200" w:after="80"/>
@@ -5619,6 +5714,11 @@
           </w:tcPr>
           <w:p>
             <w:pPr>
+              <w:spacing w:before="0" w:after="0"/>
+            </w:pPr>
+          </w:p>
+          <w:p>
+            <w:pPr>
               <w:spacing w:before="40" w:after="40"/>
               <w:ind w:left="200"/>
             </w:pPr>
@@ -5667,6 +5767,11 @@
             </w:tcBorders>
             <w:vAlign w:val="top"/>
           </w:tcPr>
+          <w:p>
+            <w:pPr>
+              <w:spacing w:before="0" w:after="0"/>
+            </w:pPr>
+          </w:p>
         </w:tc>
       </w:tr>
     </w:tbl>
@@ -5726,6 +5831,11 @@
           </w:tcPr>
           <w:p>
             <w:pPr>
+              <w:spacing w:before="0" w:after="0"/>
+            </w:pPr>
+          </w:p>
+          <w:p>
+            <w:pPr>
               <w:spacing w:before="40" w:after="40"/>
               <w:ind w:left="200"/>
             </w:pPr>
@@ -5774,6 +5884,11 @@
             </w:tcBorders>
             <w:vAlign w:val="top"/>
           </w:tcPr>
+          <w:p>
+            <w:pPr>
+              <w:spacing w:before="0" w:after="0"/>
+            </w:pPr>
+          </w:p>
         </w:tc>
       </w:tr>
     </w:tbl>

</xml_diff>

<commit_message>
fix(ADO#2732): apply Fixes 2+3+5 to master.docx from ce8a2b5 baseline
Revert regression from a64c6ab. Starting from ce8a2b5 baseline (Fix 1 + Fix 4 correct).
Fix 2: {#classSchedule}+{state} onto single para (Table 7 state cell)
Fix 3: {classEstPremium}+{/classSchedule} onto single para (Table 7 estPremium cell)
Fix 5: Form D-43+{/excludedPersons} onto single para (Table 8 electionForm cell)
Fix 1 (22 rec table cells) and Fix 4 (excludedPersons+name) retained from ce8a2b5.
All 5 fixes verified: 0 leading empty para issues, all loop-tag cells = 1 para.

Co-Authored-By: Claude Sonnet 4.6 <noreply@anthropic.com>
</commit_message>
<xml_diff>
--- a/services/proposal-generator/templates/verticals/nbais-wc/master.docx
+++ b/services/proposal-generator/templates/verticals/nbais-wc/master.docx
@@ -2470,11 +2470,6 @@
               </w:rPr>
               <w:t>{#classSchedule}</w:t>
             </w:r>
-          </w:p>
-          <w:p>
-            <w:pPr>
-              <w:spacing w:before="0" w:after="0"/>
-            </w:pPr>
             <w:r>
               <w:rPr>
                 <w:rFonts w:ascii="Arial" w:hAnsi="Arial"/>
@@ -2620,11 +2615,6 @@
               </w:rPr>
               <w:t>{classEstPremium}</w:t>
             </w:r>
-          </w:p>
-          <w:p>
-            <w:pPr>
-              <w:spacing w:before="0" w:after="0"/>
-            </w:pPr>
             <w:r>
               <w:rPr>
                 <w:rFonts w:ascii="Arial" w:hAnsi="Arial"/>
@@ -2838,9 +2828,6 @@
             <w:vAlign w:val="center"/>
           </w:tcPr>
           <w:p>
-            <w:pPr>
-              <w:spacing w:before="0" w:after="0"/>
-            </w:pPr>
             <w:r>
               <w:rPr>
                 <w:rFonts w:ascii="Arial" w:hAnsi="Arial"/>
@@ -2851,8 +2838,6 @@
               </w:rPr>
               <w:t>{#excludedPersons}</w:t>
             </w:r>
-          </w:p>
-          <w:p>
             <w:r>
               <w:rPr>
                 <w:rFonts w:ascii="Arial" w:hAnsi="Arial"/>
@@ -2890,8 +2875,6 @@
               </w:rPr>
               <w:t>Form D-43 — Election to Reject Coverage</w:t>
             </w:r>
-          </w:p>
-          <w:p>
             <w:r>
               <w:rPr>
                 <w:rFonts w:ascii="Arial" w:hAnsi="Arial"/>
@@ -3679,11 +3662,6 @@
           </w:tcPr>
           <w:p>
             <w:pPr>
-              <w:spacing w:before="0" w:after="0"/>
-            </w:pPr>
-          </w:p>
-          <w:p>
-            <w:pPr>
               <w:spacing w:before="200" w:after="80"/>
               <w:pBdr>
                 <w:bottom w:val="single" w:sz="4" w:space="4" w:color="CCCCCC"/>
@@ -3816,11 +3794,6 @@
           </w:tcPr>
           <w:p>
             <w:pPr>
-              <w:spacing w:before="0" w:after="0"/>
-            </w:pPr>
-          </w:p>
-          <w:p>
-            <w:pPr>
               <w:spacing w:before="200" w:after="80"/>
               <w:pBdr>
                 <w:bottom w:val="single" w:sz="4" w:space="4" w:color="CCCCCC"/>
@@ -3923,11 +3896,6 @@
           </w:tcPr>
           <w:p>
             <w:pPr>
-              <w:spacing w:before="0" w:after="0"/>
-            </w:pPr>
-          </w:p>
-          <w:p>
-            <w:pPr>
               <w:spacing w:before="200" w:after="80"/>
               <w:pBdr>
                 <w:bottom w:val="single" w:sz="4" w:space="4" w:color="CCCCCC"/>
@@ -4026,11 +3994,6 @@
             </w:tcBorders>
             <w:vAlign w:val="top"/>
           </w:tcPr>
-          <w:p>
-            <w:pPr>
-              <w:spacing w:before="0" w:after="0"/>
-            </w:pPr>
-          </w:p>
           <w:p>
             <w:pPr>
               <w:spacing w:before="200" w:after="80"/>
@@ -4135,11 +4098,6 @@
           </w:tcPr>
           <w:p>
             <w:pPr>
-              <w:spacing w:before="0" w:after="0"/>
-            </w:pPr>
-          </w:p>
-          <w:p>
-            <w:pPr>
               <w:spacing w:before="200" w:after="80"/>
               <w:pBdr>
                 <w:bottom w:val="single" w:sz="4" w:space="4" w:color="CCCCCC"/>
@@ -4224,11 +4182,6 @@
           </w:tcPr>
           <w:p>
             <w:pPr>
-              <w:spacing w:before="0" w:after="0"/>
-            </w:pPr>
-          </w:p>
-          <w:p>
-            <w:pPr>
               <w:spacing w:before="200" w:after="80"/>
               <w:pBdr>
                 <w:bottom w:val="single" w:sz="4" w:space="4" w:color="CCCCCC"/>
@@ -4297,11 +4250,6 @@
             </w:tcBorders>
             <w:vAlign w:val="top"/>
           </w:tcPr>
-          <w:p>
-            <w:pPr>
-              <w:spacing w:before="0" w:after="0"/>
-            </w:pPr>
-          </w:p>
           <w:p>
             <w:pPr>
               <w:spacing w:before="200" w:after="80"/>
@@ -4386,11 +4334,6 @@
             </w:tcBorders>
             <w:vAlign w:val="top"/>
           </w:tcPr>
-          <w:p>
-            <w:pPr>
-              <w:spacing w:before="0" w:after="0"/>
-            </w:pPr>
-          </w:p>
           <w:p>
             <w:pPr>
               <w:spacing w:before="200" w:after="80"/>
@@ -4578,11 +4521,6 @@
           </w:tcPr>
           <w:p>
             <w:pPr>
-              <w:spacing w:before="0" w:after="0"/>
-            </w:pPr>
-          </w:p>
-          <w:p>
-            <w:pPr>
               <w:spacing w:before="200" w:after="80"/>
               <w:pBdr>
                 <w:bottom w:val="single" w:sz="4" w:space="4" w:color="CCCCCC"/>
@@ -4665,11 +4603,6 @@
             </w:tcBorders>
             <w:vAlign w:val="top"/>
           </w:tcPr>
-          <w:p>
-            <w:pPr>
-              <w:spacing w:before="0" w:after="0"/>
-            </w:pPr>
-          </w:p>
           <w:p>
             <w:pPr>
               <w:spacing w:before="200" w:after="80"/>
@@ -4774,11 +4707,6 @@
           </w:tcPr>
           <w:p>
             <w:pPr>
-              <w:spacing w:before="0" w:after="0"/>
-            </w:pPr>
-          </w:p>
-          <w:p>
-            <w:pPr>
               <w:spacing w:before="200" w:after="80"/>
               <w:pBdr>
                 <w:bottom w:val="single" w:sz="4" w:space="4" w:color="CCCCCC"/>
@@ -4861,11 +4789,6 @@
             </w:tcBorders>
             <w:vAlign w:val="top"/>
           </w:tcPr>
-          <w:p>
-            <w:pPr>
-              <w:spacing w:before="0" w:after="0"/>
-            </w:pPr>
-          </w:p>
         </w:tc>
       </w:tr>
     </w:tbl>
@@ -4923,11 +4846,6 @@
             </w:tcBorders>
             <w:vAlign w:val="top"/>
           </w:tcPr>
-          <w:p>
-            <w:pPr>
-              <w:spacing w:before="0" w:after="0"/>
-            </w:pPr>
-          </w:p>
           <w:p>
             <w:pPr>
               <w:spacing w:before="200" w:after="80"/>
@@ -5028,11 +4946,6 @@
             </w:tcBorders>
             <w:vAlign w:val="top"/>
           </w:tcPr>
-          <w:p>
-            <w:pPr>
-              <w:spacing w:before="0" w:after="0"/>
-            </w:pPr>
-          </w:p>
           <w:p>
             <w:pPr>
               <w:spacing w:before="40" w:after="40"/>
@@ -5140,11 +5053,6 @@
           </w:tcPr>
           <w:p>
             <w:pPr>
-              <w:spacing w:before="0" w:after="0"/>
-            </w:pPr>
-          </w:p>
-          <w:p>
-            <w:pPr>
               <w:spacing w:before="200" w:after="80"/>
               <w:pBdr>
                 <w:bottom w:val="single" w:sz="4" w:space="4" w:color="CCCCCC"/>
@@ -5243,11 +5151,6 @@
             </w:tcBorders>
             <w:vAlign w:val="top"/>
           </w:tcPr>
-          <w:p>
-            <w:pPr>
-              <w:spacing w:before="0" w:after="0"/>
-            </w:pPr>
-          </w:p>
           <w:p>
             <w:pPr>
               <w:spacing w:before="40" w:after="40"/>
@@ -5449,11 +5352,6 @@
           </w:tcPr>
           <w:p>
             <w:pPr>
-              <w:spacing w:before="0" w:after="0"/>
-            </w:pPr>
-          </w:p>
-          <w:p>
-            <w:pPr>
               <w:spacing w:before="200" w:after="80"/>
               <w:pBdr>
                 <w:bottom w:val="single" w:sz="4" w:space="4" w:color="CCCCCC"/>
@@ -5568,11 +5466,6 @@
             </w:tcBorders>
             <w:vAlign w:val="top"/>
           </w:tcPr>
-          <w:p>
-            <w:pPr>
-              <w:spacing w:before="0" w:after="0"/>
-            </w:pPr>
-          </w:p>
           <w:p>
             <w:pPr>
               <w:spacing w:before="200" w:after="80"/>
@@ -5714,11 +5607,6 @@
           </w:tcPr>
           <w:p>
             <w:pPr>
-              <w:spacing w:before="0" w:after="0"/>
-            </w:pPr>
-          </w:p>
-          <w:p>
-            <w:pPr>
               <w:spacing w:before="40" w:after="40"/>
               <w:ind w:left="200"/>
             </w:pPr>
@@ -5767,11 +5655,6 @@
             </w:tcBorders>
             <w:vAlign w:val="top"/>
           </w:tcPr>
-          <w:p>
-            <w:pPr>
-              <w:spacing w:before="0" w:after="0"/>
-            </w:pPr>
-          </w:p>
         </w:tc>
       </w:tr>
     </w:tbl>
@@ -5831,11 +5714,6 @@
           </w:tcPr>
           <w:p>
             <w:pPr>
-              <w:spacing w:before="0" w:after="0"/>
-            </w:pPr>
-          </w:p>
-          <w:p>
-            <w:pPr>
               <w:spacing w:before="40" w:after="40"/>
               <w:ind w:left="200"/>
             </w:pPr>
@@ -5884,11 +5762,6 @@
             </w:tcBorders>
             <w:vAlign w:val="top"/>
           </w:tcPr>
-          <w:p>
-            <w:pPr>
-              <w:spacing w:before="0" w:after="0"/>
-            </w:pPr>
-          </w:p>
         </w:tc>
       </w:tr>
     </w:tbl>

</xml_diff>

<commit_message>
fix(ADO#2732): section heading after-spacing 160->0, Personal Lines col2 first-item before 40->200
</commit_message>
<xml_diff>
--- a/services/proposal-generator/templates/verticals/nbais-wc/master.docx
+++ b/services/proposal-generator/templates/verticals/nbais-wc/master.docx
@@ -3608,7 +3608,7 @@
     </w:p>
     <w:p>
       <w:pPr>
-        <w:spacing w:before="280" w:after="160"/>
+        <w:spacing w:before="280" w:after="0"/>
         <w:pBdr>
           <w:bottom w:val="single" w:sz="8" w:space="4" w:color="CCCCCC"/>
         </w:pBdr>
@@ -4467,7 +4467,7 @@
     </w:tbl>
     <w:p>
       <w:pPr>
-        <w:spacing w:before="280" w:after="160"/>
+        <w:spacing w:before="280" w:after="0"/>
         <w:pBdr>
           <w:bottom w:val="single" w:sz="8" w:space="4" w:color="CCCCCC"/>
         </w:pBdr>
@@ -4794,7 +4794,7 @@
     </w:tbl>
     <w:p>
       <w:pPr>
-        <w:spacing w:before="280" w:after="160"/>
+        <w:spacing w:before="280" w:after="0"/>
         <w:pBdr>
           <w:bottom w:val="single" w:sz="8" w:space="4" w:color="CCCCCC"/>
         </w:pBdr>
@@ -4948,7 +4948,7 @@
           </w:tcPr>
           <w:p>
             <w:pPr>
-              <w:spacing w:before="40" w:after="40"/>
+              <w:spacing w:before="200" w:after="40"/>
               <w:ind w:left="200"/>
             </w:pPr>
             <w:r>
@@ -4999,7 +4999,7 @@
     </w:tbl>
     <w:p>
       <w:pPr>
-        <w:spacing w:before="280" w:after="160"/>
+        <w:spacing w:before="280" w:after="0"/>
         <w:pBdr>
           <w:bottom w:val="single" w:sz="8" w:space="4" w:color="CCCCCC"/>
         </w:pBdr>
@@ -5298,7 +5298,7 @@
     </w:p>
     <w:p>
       <w:pPr>
-        <w:spacing w:before="280" w:after="160"/>
+        <w:spacing w:before="280" w:after="0"/>
         <w:pBdr>
           <w:bottom w:val="single" w:sz="8" w:space="4" w:color="CCCCCC"/>
         </w:pBdr>
@@ -5553,7 +5553,7 @@
     </w:tbl>
     <w:p>
       <w:pPr>
-        <w:spacing w:before="280" w:after="160"/>
+        <w:spacing w:before="280" w:after="0"/>
         <w:pBdr>
           <w:bottom w:val="single" w:sz="8" w:space="4" w:color="CCCCCC"/>
         </w:pBdr>
@@ -5660,7 +5660,7 @@
     </w:tbl>
     <w:p>
       <w:pPr>
-        <w:spacing w:before="280" w:after="160"/>
+        <w:spacing w:before="280" w:after="0"/>
         <w:pBdr>
           <w:bottom w:val="single" w:sz="8" w:space="4" w:color="CCCCCC"/>
         </w:pBdr>

</xml_diff>

<commit_message>
fix(ADO#2732): col2 first-bullet before 560twips for Personal Lines + Bond alignment
</commit_message>
<xml_diff>
--- a/services/proposal-generator/templates/verticals/nbais-wc/master.docx
+++ b/services/proposal-generator/templates/verticals/nbais-wc/master.docx
@@ -4948,7 +4948,7 @@
           </w:tcPr>
           <w:p>
             <w:pPr>
-              <w:spacing w:before="200" w:after="40"/>
+              <w:spacing w:before="560" w:after="40"/>
               <w:ind w:left="200"/>
             </w:pPr>
             <w:r>
@@ -5153,7 +5153,7 @@
           </w:tcPr>
           <w:p>
             <w:pPr>
-              <w:spacing w:before="40" w:after="40"/>
+              <w:spacing w:before="560" w:after="40"/>
               <w:ind w:left="200"/>
             </w:pPr>
             <w:r>

</xml_diff>

<commit_message>
fix(nbais-wc): update Program Highlights bullets; add emr to test payload
- Replace 5 generic Program Highlights bullets with Jay's 9-item list
  (Company Nurse, Prodigy Care, CCMSI, Applied Risk Solutions, Reli, Lusense, etc.)
- Add emr=0.95 attribute to Integrity Roofing test payload (was missing,
  causing EMR row and math to not render)
- Template synced to S3: fip-proposal-templates/verticals/nbais-wc/master.docx
- Integrity Roofing v3 doc added to docs/
</commit_message>
<xml_diff>
--- a/services/proposal-generator/templates/verticals/nbais-wc/master.docx
+++ b/services/proposal-generator/templates/verticals/nbais-wc/master.docx
@@ -15,7 +15,7 @@
           <w:color w:val="595959"/>
           <w:sz w:val="18"/>
         </w:rPr>
-        <w:t>Nevada Builders Alliance Insurance Solutions</w:t>
+        <w:t>Nevada Builders Alliance Insurance Solutions, LLC</w:t>
       </w:r>
     </w:p>
     <w:p>
@@ -452,7 +452,7 @@
           <w:color w:val="595959"/>
           <w:sz w:val="20"/>
         </w:rPr>
-        <w:t>On behalf of Nevada Builders Alliance Insurance Services (NBAIS), we are pleased to present this Workers’ Compensation Insurance proposal exclusively for members of the Nevada Builders Alliance (NBA). This proposal has been prepared specifically for your organization and reflects the competitive program rates and enhanced coverage options available through your NBA membership.</w:t>
+        <w:t>On behalf of Nevada Builders Alliance Insurance Solutions (NBAIS), we are pleased to present this Workers’ Compensation Insurance proposal exclusively for members of the Nevada Builders Alliance (NBA). This proposal has been prepared specifically for your organization and reflects the competitive program rates and enhanced coverage options available through your NBA membership.</w:t>
       </w:r>
     </w:p>
     <w:p>
@@ -487,7 +487,7 @@
           <w:color w:val="1F3864"/>
           <w:sz w:val="22"/>
         </w:rPr>
-        <w:t>Program highlights</w:t>
+        <w:t>Program Highlights</w:t>
       </w:r>
     </w:p>
     <w:p>
@@ -539,7 +539,7 @@
           <w:color w:val="595959"/>
           <w:sz w:val="20"/>
         </w:rPr>
-        <w:t>Construction-class expertise — underwriting specialists who understand your trade</w:t>
+        <w:t>Construction-class expertise — underwriting built around Nevada’s trades, not a one-size-fits-all program</w:t>
       </w:r>
     </w:p>
     <w:p>
@@ -565,7 +565,7 @@
           <w:color w:val="595959"/>
           <w:sz w:val="20"/>
         </w:rPr>
-        <w:t>Dividend potential — SIG participation with return of premium for favorable loss performance</w:t>
+        <w:t>24/7 nurse triage and incident reporting through Company Nurse</w:t>
       </w:r>
     </w:p>
     <w:p>
@@ -591,7 +591,7 @@
           <w:color w:val="595959"/>
           <w:sz w:val="20"/>
         </w:rPr>
-        <w:t>Loss control resources — proactive safety and claims management support</w:t>
+        <w:t>Prescription benefits through Prodigy Care Services — First Fill card means $0 out of pocket at the pharmacy</w:t>
       </w:r>
     </w:p>
     <w:p>
@@ -617,7 +617,111 @@
           <w:color w:val="595959"/>
           <w:sz w:val="20"/>
         </w:rPr>
-        <w:t>Dedicated service team — NBAIS producers with direct carrier access</w:t>
+        <w:t>Claims management by CCMSI focused on fast return-to-work outcomes</w:t>
+      </w:r>
+    </w:p>
+    <w:p>
+      <w:pPr>
+        <w:spacing w:before="40" w:after="40"/>
+        <w:ind w:left="360"/>
+      </w:pPr>
+      <w:r>
+        <w:rPr>
+          <w:rFonts w:ascii="Arial" w:hAnsi="Arial"/>
+          <w:b w:val="0"/>
+          <w:i w:val="0"/>
+          <w:color w:val="595959"/>
+          <w:sz w:val="20"/>
+        </w:rPr>
+        <w:t xml:space="preserve">•  </w:t>
+      </w:r>
+      <w:r>
+        <w:rPr>
+          <w:rFonts w:ascii="Arial" w:hAnsi="Arial"/>
+          <w:b w:val="0"/>
+          <w:i w:val="0"/>
+          <w:color w:val="595959"/>
+          <w:sz w:val="20"/>
+        </w:rPr>
+        <w:t>Safety and risk management services through Applied Risk Solutions, including OSHA 10/30 training</w:t>
+      </w:r>
+    </w:p>
+    <w:p>
+      <w:pPr>
+        <w:spacing w:before="40" w:after="40"/>
+        <w:ind w:left="360"/>
+      </w:pPr>
+      <w:r>
+        <w:rPr>
+          <w:rFonts w:ascii="Arial" w:hAnsi="Arial"/>
+          <w:b w:val="0"/>
+          <w:i w:val="0"/>
+          <w:color w:val="595959"/>
+          <w:sz w:val="20"/>
+        </w:rPr>
+        <w:t xml:space="preserve">•  </w:t>
+      </w:r>
+      <w:r>
+        <w:rPr>
+          <w:rFonts w:ascii="Arial" w:hAnsi="Arial"/>
+          <w:b w:val="0"/>
+          <w:i w:val="0"/>
+          <w:color w:val="595959"/>
+          <w:sz w:val="20"/>
+        </w:rPr>
+        <w:t>Concierge medical scheduling and care coordination through Reli</w:t>
+      </w:r>
+    </w:p>
+    <w:p>
+      <w:pPr>
+        <w:spacing w:before="40" w:after="40"/>
+        <w:ind w:left="360"/>
+      </w:pPr>
+      <w:r>
+        <w:rPr>
+          <w:rFonts w:ascii="Arial" w:hAnsi="Arial"/>
+          <w:b w:val="0"/>
+          <w:i w:val="0"/>
+          <w:color w:val="595959"/>
+          <w:sz w:val="20"/>
+        </w:rPr>
+        <w:t xml:space="preserve">•  </w:t>
+      </w:r>
+      <w:r>
+        <w:rPr>
+          <w:rFonts w:ascii="Arial" w:hAnsi="Arial"/>
+          <w:b w:val="0"/>
+          <w:i w:val="0"/>
+          <w:color w:val="595959"/>
+          <w:sz w:val="20"/>
+        </w:rPr>
+        <w:t>Program administration and member portal through Lusense</w:t>
+      </w:r>
+    </w:p>
+    <w:p>
+      <w:pPr>
+        <w:spacing w:before="40" w:after="40"/>
+        <w:ind w:left="360"/>
+      </w:pPr>
+      <w:r>
+        <w:rPr>
+          <w:rFonts w:ascii="Arial" w:hAnsi="Arial"/>
+          <w:b w:val="0"/>
+          <w:i w:val="0"/>
+          <w:color w:val="595959"/>
+          <w:sz w:val="20"/>
+        </w:rPr>
+        <w:t xml:space="preserve">•  </w:t>
+      </w:r>
+      <w:r>
+        <w:rPr>
+          <w:rFonts w:ascii="Arial" w:hAnsi="Arial"/>
+          <w:b w:val="0"/>
+          <w:i w:val="0"/>
+          <w:color w:val="595959"/>
+          <w:sz w:val="20"/>
+        </w:rPr>
+        <w:t>Dedicated producer support — direct access to your NBAIS team throughout the policy period</w:t>
       </w:r>
     </w:p>
     <w:p>
@@ -953,7 +1057,7 @@
                 <w:color w:val="1F3864"/>
                 <w:sz w:val="20"/>
               </w:rPr>
-              <w:t>Base Premium</w:t>
+              <w:t>Estimated Manual Premium</w:t>
             </w:r>
           </w:p>
         </w:tc>
@@ -981,7 +1085,65 @@
                 <w:color w:val="595959"/>
                 <w:sz w:val="20"/>
               </w:rPr>
-              <w:t>{basePremium}</w:t>
+              <w:t>{manualPremium}</w:t>
+            </w:r>
+          </w:p>
+        </w:tc>
+      </w:tr>
+      <w:tr>
+        <w:tc>
+          <w:tcPr>
+            <w:tcW w:w="3276" w:type="dxa"/>
+            <w:tcMar>
+              <w:top w:w="80" w:type="dxa"/>
+              <w:bottom w:w="80" w:type="dxa"/>
+              <w:left w:w="115" w:type="dxa"/>
+              <w:right w:w="115" w:type="dxa"/>
+            </w:tcMar>
+            <w:vAlign w:val="center"/>
+            <w:shd w:val="clear" w:color="auto" w:fill="F5F5F5"/>
+          </w:tcPr>
+          <w:p>
+            <w:pPr>
+              <w:spacing w:before="0" w:after="0"/>
+            </w:pPr>
+            <w:r>
+              <w:rPr>
+                <w:rFonts w:ascii="Arial" w:hAnsi="Arial"/>
+                <w:b/>
+                <w:i w:val="0"/>
+                <w:color w:val="1F3864"/>
+                <w:sz w:val="20"/>
+              </w:rPr>
+              <w:t>{#hasEmr}Experience Modification Rate</w:t>
+            </w:r>
+          </w:p>
+        </w:tc>
+        <w:tc>
+          <w:tcPr>
+            <w:tcW w:w="6084" w:type="dxa"/>
+            <w:tcMar>
+              <w:top w:w="80" w:type="dxa"/>
+              <w:bottom w:w="80" w:type="dxa"/>
+              <w:left w:w="115" w:type="dxa"/>
+              <w:right w:w="115" w:type="dxa"/>
+            </w:tcMar>
+            <w:vAlign w:val="center"/>
+            <w:shd w:val="clear" w:color="auto" w:fill="F5F5F5"/>
+          </w:tcPr>
+          <w:p>
+            <w:pPr>
+              <w:spacing w:before="0" w:after="0"/>
+            </w:pPr>
+            <w:r>
+              <w:rPr>
+                <w:rFonts w:ascii="Arial" w:hAnsi="Arial"/>
+                <w:b w:val="0"/>
+                <w:i w:val="0"/>
+                <w:color w:val="595959"/>
+                <w:sz w:val="20"/>
+              </w:rPr>
+              <w:t>{emr}{/hasEmr}</w:t>
             </w:r>
           </w:p>
         </w:tc>
@@ -1037,7 +1199,7 @@
                 <w:color w:val="595959"/>
                 <w:sz w:val="20"/>
               </w:rPr>
-              <w:t>{estPremium}</w:t>
+              <w:t>{annualPremium}</w:t>
             </w:r>
           </w:p>
         </w:tc>
@@ -1209,7 +1371,7 @@
                 <w:color w:val="1F3864"/>
                 <w:sz w:val="22"/>
               </w:rPr>
-              <w:t>{totalEstimatedPremium}</w:t>
+              <w:t>{totalEstimatedCost}</w:t>
             </w:r>
           </w:p>
         </w:tc>
@@ -1291,6 +1453,50 @@
         </w:tc>
       </w:tr>
     </w:tbl>
+    <w:p>
+      <w:pPr>
+        <w:spacing w:before="240" w:after="120"/>
+        <w:pBdr>
+          <w:bottom w:val="single" w:sz="8" w:space="4" w:color="CCCCCC"/>
+        </w:pBdr>
+        <w:outlineLvl w:val="9"/>
+      </w:pPr>
+      <w:r>
+        <w:rPr>
+          <w:rFonts w:ascii="Arial" w:hAnsi="Arial"/>
+          <w:b/>
+          <w:i w:val="0"/>
+          <w:color w:val="1F3864"/>
+          <w:sz w:val="22"/>
+        </w:rPr>
+        <w:t>Surplus Contribution</w:t>
+      </w:r>
+    </w:p>
+    <w:p>
+      <w:pPr>
+        <w:spacing w:before="80" w:after="80"/>
+      </w:pPr>
+      <w:r>
+        <w:rPr>
+          <w:rFonts w:ascii="Arial" w:hAnsi="Arial"/>
+          <w:b w:val="0"/>
+          <w:i w:val="0"/>
+          <w:color w:val="595959"/>
+          <w:sz w:val="20"/>
+        </w:rPr>
+        <w:t xml:space="preserve">As a self-insured group (SIG), BAWNSIG requires a surplus contribution in addition to the estimated premium. This contribution — calculated at 8% of the estimated premium — is a regulatory requirement for SIG participation in Nevada and supports the financial reserves of the group. </w:t>
+      </w:r>
+      <w:r>
+        <w:rPr>
+          <w:rFonts w:ascii="Arial" w:hAnsi="Arial"/>
+          <w:b/>
+          <w:i w:val="0"/>
+          <w:color w:val="595959"/>
+          <w:sz w:val="20"/>
+        </w:rPr>
+        <w:t>It is not a fee retained by NBAIS or your producer.</w:t>
+      </w:r>
+    </w:p>
     <w:p>
       <w:pPr>
         <w:spacing w:before="240" w:after="120"/>
@@ -1591,7 +1797,7 @@
                 <w:color w:val="595959"/>
                 <w:sz w:val="20"/>
               </w:rPr>
-              <w:t>Nevada Builders Alliance Insurance Services (NBAIS) via Higginbotham</w:t>
+              <w:t>Nevada Builders Alliance Insurance Solutions (NBAIS) via Higginbotham</w:t>
             </w:r>
           </w:p>
         </w:tc>
@@ -2127,50 +2333,6 @@
     </w:tbl>
     <w:p>
       <w:pPr>
-        <w:spacing w:before="240" w:after="120"/>
-        <w:pBdr>
-          <w:bottom w:val="single" w:sz="8" w:space="4" w:color="CCCCCC"/>
-        </w:pBdr>
-        <w:outlineLvl w:val="9"/>
-      </w:pPr>
-      <w:r>
-        <w:rPr>
-          <w:rFonts w:ascii="Arial" w:hAnsi="Arial"/>
-          <w:b/>
-          <w:i w:val="0"/>
-          <w:color w:val="1F3864"/>
-          <w:sz w:val="22"/>
-        </w:rPr>
-        <w:t>Surplus Contribution</w:t>
-      </w:r>
-    </w:p>
-    <w:p>
-      <w:pPr>
-        <w:spacing w:before="80" w:after="80"/>
-      </w:pPr>
-      <w:r>
-        <w:rPr>
-          <w:rFonts w:ascii="Arial" w:hAnsi="Arial"/>
-          <w:b w:val="0"/>
-          <w:i w:val="0"/>
-          <w:color w:val="595959"/>
-          <w:sz w:val="20"/>
-        </w:rPr>
-        <w:t xml:space="preserve">As a self-insured group (SIG), BAWNSIG requires a surplus contribution in addition to the estimated premium. This contribution — calculated at 8% of the estimated premium — is a regulatory requirement for SIG participation in Nevada and supports the financial reserves of the group. </w:t>
-      </w:r>
-      <w:r>
-        <w:rPr>
-          <w:rFonts w:ascii="Arial" w:hAnsi="Arial"/>
-          <w:b/>
-          <w:i w:val="0"/>
-          <w:color w:val="595959"/>
-          <w:sz w:val="20"/>
-        </w:rPr>
-        <w:t>It is not a fee retained by NBAIS or your producer.</w:t>
-      </w:r>
-    </w:p>
-    <w:p>
-      <w:pPr>
         <w:sectPr>
           <w:footerReference w:type="default" r:id="rId15"/>
           <w:pgSz w:w="12240" w:h="15840"/>
@@ -2655,7 +2817,7 @@
                 <w:color w:val="1F3864"/>
                 <w:sz w:val="20"/>
               </w:rPr>
-              <w:t>Total Estimated Premium</w:t>
+              <w:t>Total Estimated Manual Premium</w:t>
             </w:r>
           </w:p>
         </w:tc>
@@ -2683,7 +2845,7 @@
                 <w:color w:val="1F3864"/>
                 <w:sz w:val="20"/>
               </w:rPr>
-              <w:t>{totalEstimatedPremium}</w:t>
+              <w:t>{manualPremium}</w:t>
             </w:r>
           </w:p>
         </w:tc>
@@ -2896,13 +3058,35 @@
       </w:pPr>
       <w:r>
         <w:rPr>
-          <w:rFonts w:ascii="Arial" w:hAnsi="Arial"/>
-          <w:b w:val="0"/>
+          <w:b/>
           <w:i/>
-          <w:color w:val="595959"/>
-          <w:sz w:val="17"/>
         </w:rPr>
-        <w:t>Note: Officers or members electing to reject coverage must file Form D-43 with the Nevada Division of Industrial Relations. Rejection is effective upon filing. These individuals will not be covered under this policy for work-related injuries.</w:t>
+        <w:t xml:space="preserve">D-43 form required: </w:t>
+      </w:r>
+      <w:r>
+        <w:rPr>
+          <w:i/>
+        </w:rPr>
+        <w:t>A completed and signed Form D-43 is required for each individual listed above prior to binding. Coverage cannot be excluded without a signed D-43 on file.</w:t>
+      </w:r>
+    </w:p>
+    <w:p>
+      <w:pPr>
+        <w:spacing w:before="80" w:after="80"/>
+        <w:jc w:val="left"/>
+      </w:pPr>
+      <w:r>
+        <w:rPr>
+          <w:b/>
+          <w:i/>
+        </w:rPr>
+        <w:t xml:space="preserve">Important: </w:t>
+      </w:r>
+      <w:r>
+        <w:rPr>
+          <w:i/>
+        </w:rPr>
+        <w:t>Excluded individuals are not covered under this workers’ compensation policy. Please confirm these elections are accurate prior to binding.</w:t>
       </w:r>
     </w:p>
     <w:p>
@@ -3155,7 +3339,7 @@
                 <w:color w:val="595959"/>
                 <w:sz w:val="20"/>
               </w:rPr>
-              <w:t>(775) 555-0100</w:t>
+              <w:t>877-888-4140</w:t>
             </w:r>
           </w:p>
           <w:p>
@@ -3167,7 +3351,7 @@
                 <w:color w:val="595959"/>
                 <w:sz w:val="20"/>
               </w:rPr>
-              <w:t>dslater@nbais.com</w:t>
+              <w:t>dslater@nbainsurancesolutions.com</w:t>
             </w:r>
           </w:p>
         </w:tc>
@@ -3230,7 +3414,7 @@
                 <w:color w:val="595959"/>
                 <w:sz w:val="20"/>
               </w:rPr>
-              <w:t>Nevada Builders Alliance Insurance Services</w:t>
+              <w:t>Nevada Builders Alliance Insurance Solutions</w:t>
             </w:r>
           </w:p>
           <w:p>
@@ -3242,7 +3426,7 @@
                 <w:color w:val="595959"/>
                 <w:sz w:val="20"/>
               </w:rPr>
-              <w:t>1234 Builder’s Way, Reno, NV 89501</w:t>
+              <w:t>603 South Carson Street, Carson City, NV 89701</w:t>
             </w:r>
           </w:p>
           <w:p>
@@ -3254,7 +3438,7 @@
                 <w:color w:val="595959"/>
                 <w:sz w:val="20"/>
               </w:rPr>
-              <w:t>www.nbais.com</w:t>
+              <w:t>nbainsurancesolutions.com</w:t>
             </w:r>
           </w:p>
         </w:tc>
@@ -3292,7 +3476,7 @@
           <w:color w:val="595959"/>
           <w:sz w:val="20"/>
         </w:rPr>
-        <w:t>By signing below, the undersigned acknowledges receipt of this Workers’ Compensation Insurance proposal and authorizes Nevada Builders Alliance Insurance Services (NBAIS) to bind coverage as described herein, effective on the policy period stated above. The undersigned confirms that the payroll, classification codes, and excluded persons listed in this proposal are accurate to the best of their knowledge and understands that final premium is subject to audit. The required initial down payment will be remitted online via the secure payment link provided upon binding.</w:t>
+        <w:t>By signing below, the undersigned acknowledges receipt of this Workers’ Compensation Insurance proposal and authorizes Nevada Builders Alliance Insurance Solutions (NBAIS) to bind coverage as described herein, effective on the policy period stated above. The undersigned confirms that the payroll, classification codes, and excluded persons listed in this proposal are accurate to the best of their knowledge and understands that final premium is subject to audit. The required initial down payment will be remitted online via the secure payment link provided upon binding.</w:t>
       </w:r>
     </w:p>
     <w:tbl>
@@ -3526,7 +3710,7 @@
           <w:color w:val="595959"/>
           <w:sz w:val="17"/>
         </w:rPr>
-        <w:t>This proposal is not a binder or guarantee of coverage. All coverage is subject to underwriting approval, policy terms, conditions, and exclusions. Premium estimates are subject to final payroll audit. NBAIS is an insurance program administered on behalf of Nevada Builders Alliance members.</w:t>
+        <w:t>This proposal is not a binder or guarantee of coverage. All coverage is subject to underwriting approval, policy terms, conditions, and exclusions. Premium estimates are subject to final payroll audit. NBA Insurance Solutions, LLC is an insurance program administered on behalf of Nevada Builders Alliance members.</w:t>
       </w:r>
     </w:p>
     <w:p>
@@ -5381,7 +5565,7 @@
                 <w:color w:val="595959"/>
                 <w:sz w:val="18"/>
               </w:rPr>
-              <w:t>•  HR Services</w:t>
+              <w:t>•  HR Solutions</w:t>
             </w:r>
           </w:p>
           <w:p>
@@ -5674,7 +5858,7 @@
           <w:color w:val="1F3864"/>
           <w:sz w:val="24"/>
         </w:rPr>
-        <w:t>Retirement Plan Services</w:t>
+        <w:t>Retirement Plan Solutions</w:t>
       </w:r>
     </w:p>
     <w:tbl>

</xml_diff>